<commit_message>
docs: record saspa f0 formal pass
</commit_message>
<xml_diff>
--- a/docs/TRKH_5CLASS_RESEARCH_PROCESS_STATUS.docx
+++ b/docs/TRKH_5CLASS_RESEARCH_PROCESS_STATUS.docx
@@ -75,7 +75,7 @@
           <w:color w:val="202124"/>
           <w:sz w:val="21"/>
         </w:rPr>
-        <w:t>2026-07-23 | Revision 3</w:t>
+        <w:t>2026-07-24 | Revision 4</w:t>
       </w:r>
     </w:p>
     <w:p>
@@ -97,7 +97,7 @@
           <w:color w:val="202124"/>
           <w:sz w:val="21"/>
         </w:rPr>
-        <w:t>Đang nghiên cứu - JPEG-DL A0 đã bị loại; synthetic A0 là hướng kế tiếp</w:t>
+        <w:t>Đang nghiên cứu - SaSPA F0 đã pass; F1 giới hạn 10 ảnh train-only</w:t>
       </w:r>
     </w:p>
     <w:p>
@@ -340,7 +340,7 @@
                 <w:color w:val="5F6368"/>
                 <w:sz w:val="16"/>
               </w:rPr>
-              <w:t>JPEG-DL A0</w:t>
+              <w:t>SASPA SYNTHETIC F0</w:t>
             </w:r>
           </w:p>
           <w:p>
@@ -354,7 +354,7 @@
                 <w:color w:val="1F4D78"/>
                 <w:sz w:val="28"/>
               </w:rPr>
-              <w:t>Rejected</w:t>
+              <w:t>Pass (no-output)</w:t>
             </w:r>
           </w:p>
           <w:p>
@@ -367,7 +367,7 @@
                 <w:color w:val="202124"/>
                 <w:sz w:val="17"/>
               </w:rPr>
-              <w:t>Replay exact; metric và XAI đều không đạt gate</w:t>
+              <w:t>Replay pass; F1 chỉ được sinh 10 ảnh train-only</w:t>
             </w:r>
           </w:p>
         </w:tc>
@@ -412,7 +412,7 @@
           <w:color w:val="202124"/>
           <w:sz w:val="21"/>
         </w:rPr>
-        <w:t>Giữ nguyên keeper hiện tại và file lệnh full-train tốt nhất. Full train random-init 30 epoch không thắng validation gate; JPEG-DL A0 đã bị loại sau formal, replay độc lập và duyệt XAI. Hướng kế tiếp là một synthetic-data feasibility/A0 source-disjoint, chưa phải full generation hay full train.</w:t>
+        <w:t>Giữ nguyên keeper hiện tại và file lệnh full-train tốt nhất. Full train random-init 30 epoch không thắng validation gate; JPEG-DL A0 đã bị loại. SaSPA synthetic F0 no-output đã pass formal và replay, chỉ mở quyền F1 sinh đúng 10 ảnh train-only; đây chưa phải bằng chứng cải thiện mô hình hay quyền full generation/full train.</w:t>
       </w:r>
     </w:p>
     <w:p>
@@ -2782,7 +2782,7 @@
                 <w:color w:val="202124"/>
                 <w:sz w:val="18"/>
               </w:rPr>
-              <w:t>RTX 4060 8 GB, RAM 15,6 GB và Windows loader có thể nghẽn.</w:t>
+              <w:t>RTX 4060 8 GB, RAM 15,6 GB; SaSPA F0 pass với peak RSS 6,794 GiB và NVML 556 MiB.</w:t>
             </w:r>
           </w:p>
         </w:tc>
@@ -2809,7 +2809,7 @@
                 <w:color w:val="202124"/>
                 <w:sz w:val="18"/>
               </w:rPr>
-              <w:t>Feasibility/memory gate trước diffusion hoặc full train.</w:t>
+              <w:t>Dùng worker cô lập và resource gate trước diffusion hoặc full train.</w:t>
             </w:r>
           </w:p>
         </w:tc>
@@ -4090,6 +4090,47 @@
     <w:p>
       <w:pPr>
         <w:widowControl/>
+      </w:pPr>
+      <w:r>
+        <w:rPr>
+          <w:rFonts w:ascii="Calibri" w:hAnsi="Calibri" w:eastAsia="Calibri"/>
+          <w:color w:val="202124"/>
+          <w:sz w:val="22"/>
+        </w:rPr>
+        <w:t>SaSPA F0 đã pass từ clean pushed commit 51efa72b. Formal xác minh 36 package, snapshot 7.688.436.558 byte, cohort 10 hàng train-only với 20 leakage group duy nhất và pipeline CPU-offload không sinh pixel. Load time là 9,28 giây; peak RSS/VMS/NVML là 6,794/8,917 GiB/556 MiB. Replay độc lập và final manifest đều pass.</w:t>
+      </w:r>
+    </w:p>
+    <w:p>
+      <w:pPr>
+        <w:keepLines/>
+        <w:spacing w:before="80" w:after="160" w:line="264" w:lineRule="auto"/>
+        <w:ind w:left="180" w:right="160"/>
+        <w:shd w:fill="FFF4CE"/>
+        <w:pBdr>
+          <w:left w:val="single" w:sz="18" w:space="6" w:color="2E74B5"/>
+        </w:pBdr>
+      </w:pPr>
+      <w:r>
+        <w:rPr>
+          <w:rFonts w:ascii="Calibri" w:hAnsi="Calibri" w:eastAsia="Calibri"/>
+          <w:b/>
+          <w:color w:val="1F4D78"/>
+          <w:sz w:val="21"/>
+        </w:rPr>
+        <w:t xml:space="preserve">Lưu ý: </w:t>
+      </w:r>
+      <w:r>
+        <w:rPr>
+          <w:rFonts w:ascii="Calibri" w:hAnsi="Calibri" w:eastAsia="Calibri"/>
+          <w:color w:val="202124"/>
+          <w:sz w:val="21"/>
+        </w:rPr>
+        <w:t>F0 chỉ cho phép F1 sinh 10 ảnh, 2 ảnh mỗi lớp, theo source/prompt/seed đã khóa. F1 vẫn phải pass provenance, resource, class-fidelity, blind review, exact hash, pHash, DINO near-duplicate và XAI trước khi được cân nhắc A1 5%.</w:t>
+      </w:r>
+    </w:p>
+    <w:p>
+      <w:pPr>
+        <w:widowControl/>
         <w:numPr>
           <w:ilvl w:val="0"/>
           <w:numId w:val="13"/>
@@ -5081,6 +5122,92 @@
           </w:p>
         </w:tc>
       </w:tr>
+      <w:tr>
+        <w:trPr>
+          <w:cantSplit/>
+        </w:trPr>
+        <w:tc>
+          <w:tcPr>
+            <w:tcW w:type="dxa" w:w="2550"/>
+            <w:tcMar>
+              <w:top w:w="80" w:type="dxa"/>
+              <w:start w:w="120" w:type="dxa"/>
+              <w:bottom w:w="80" w:type="dxa"/>
+              <w:end w:w="120" w:type="dxa"/>
+            </w:tcMar>
+            <w:vAlign w:val="center"/>
+          </w:tcPr>
+          <w:p>
+            <w:pPr>
+              <w:widowControl/>
+              <w:spacing w:after="0" w:line="247" w:lineRule="auto"/>
+              <w:jc w:val="left"/>
+            </w:pPr>
+            <w:r>
+              <w:rPr>
+                <w:rFonts w:ascii="Calibri" w:hAnsi="Calibri" w:eastAsia="Calibri"/>
+                <w:color w:val="202124"/>
+                <w:sz w:val="18"/>
+              </w:rPr>
+              <w:t>Process isolation cho diffusion</w:t>
+            </w:r>
+          </w:p>
+        </w:tc>
+        <w:tc>
+          <w:tcPr>
+            <w:tcW w:type="dxa" w:w="3810"/>
+            <w:tcMar>
+              <w:top w:w="80" w:type="dxa"/>
+              <w:start w:w="120" w:type="dxa"/>
+              <w:bottom w:w="80" w:type="dxa"/>
+              <w:end w:w="120" w:type="dxa"/>
+            </w:tcMar>
+            <w:vAlign w:val="center"/>
+          </w:tcPr>
+          <w:p>
+            <w:pPr>
+              <w:widowControl/>
+              <w:spacing w:after="0" w:line="247" w:lineRule="auto"/>
+              <w:jc w:val="left"/>
+            </w:pPr>
+            <w:r>
+              <w:rPr>
+                <w:rFonts w:ascii="Calibri" w:hAnsi="Calibri" w:eastAsia="Calibri"/>
+                <w:color w:val="202124"/>
+                <w:sz w:val="18"/>
+              </w:rPr>
+              <w:t>Dựng pipeline trong worker con, giữ peak telemetry rồi gate parent sau khi worker thoát.</w:t>
+            </w:r>
+          </w:p>
+        </w:tc>
+        <w:tc>
+          <w:tcPr>
+            <w:tcW w:type="dxa" w:w="3000"/>
+            <w:tcMar>
+              <w:top w:w="80" w:type="dxa"/>
+              <w:start w:w="120" w:type="dxa"/>
+              <w:bottom w:w="80" w:type="dxa"/>
+              <w:end w:w="120" w:type="dxa"/>
+            </w:tcMar>
+            <w:vAlign w:val="center"/>
+          </w:tcPr>
+          <w:p>
+            <w:pPr>
+              <w:widowControl/>
+              <w:spacing w:after="0" w:line="247" w:lineRule="auto"/>
+              <w:jc w:val="left"/>
+            </w:pPr>
+            <w:r>
+              <w:rPr>
+                <w:rFonts w:ascii="Calibri" w:hAnsi="Calibri" w:eastAsia="Calibri"/>
+                <w:color w:val="202124"/>
+                <w:sz w:val="18"/>
+              </w:rPr>
+              <w:t>Trả RAM ổn định, tránh false failure và vẫn phát hiện PID lạ.</w:t>
+            </w:r>
+          </w:p>
+        </w:tc>
+      </w:tr>
     </w:tbl>
     <w:p>
       <w:pPr>
@@ -5129,7 +5256,7 @@
           <w:color w:val="202124"/>
           <w:sz w:val="22"/>
         </w:rPr>
-        <w:t>Viết protocol synthetic A0 dựa trên SaSPA/BOB/DiffuseMix trước khi sinh ảnh: khóa source folds, generator revision, filter, duplicate thresholds, tỷ lệ và failure criteria.</w:t>
+        <w:t>Giữ protocol SaSPA A0 revision 2 và F0 formal/replay đã pass làm khóa đầu vào; không thay source, generator revision, prompt, seed, filter hoặc threshold sau khi xem output.</w:t>
       </w:r>
     </w:p>
     <w:p>
@@ -5147,7 +5274,7 @@
           <w:color w:val="202124"/>
           <w:sz w:val="22"/>
         </w:rPr>
-        <w:t>Chạy no-output hoặc tiny-output feasibility trên RTX 4060 8 GB để đo VRAM, offload, thời gian và license; không dùng validation/test và chưa full generation.</w:t>
+        <w:t>Triển khai F1 fail-closed và sinh đúng 10 ảnh train-only, 2 ảnh mỗi lớp, tuần tự bằng model CPU offload; ghi đầy đủ provenance, latency, RAM/VRAM và output hash.</w:t>
       </w:r>
     </w:p>
     <w:p>
@@ -5165,7 +5292,7 @@
           <w:color w:val="202124"/>
           <w:sz w:val="22"/>
         </w:rPr>
-        <w:t>Nếu feasibility pass, sinh một tập train-only nhỏ 5-10% theo source-disjoint fold, chạy hash/pHash/embedding near-duplicate, class-fidelity/XAI manual review và matched real-only A0.</w:t>
+        <w:t>Chạy class-fidelity, blind review, exact-hash, pHash, DINO near-duplicate và fixed XAI trên đủ 10 ảnh. Chỉ khi tất cả pass mới khóa A1 ở 5% mỗi lớp và matched real-only equal-iteration control.</w:t>
       </w:r>
     </w:p>
     <w:p>
@@ -5815,7 +5942,7 @@
           <w:color w:val="202124"/>
           <w:sz w:val="22"/>
         </w:rPr>
-        <w:t>Revision 1: tạo báo cáo Word tái lập; ghi nhận full train 30e, trạng thái JPEG-DL formal, nghiên cứu competition và chính sách synthetic train-only chống leak. Revision 2: khóa JPEG-DL A0 ở VisualFail với replay exact, ghi metric/XAI/SHAs cuối và chuyển kế hoạch sang synthetic feasibility source-disjoint. Revision 3: retention pass trên 822 thư mục/51 manifests, giữ formal 2,614 MiB; sửa odd/even header-footer và reset numbering theo từng block sau render QA.</w:t>
+        <w:t>Revision 1: tạo báo cáo Word tái lập; ghi nhận full train 30e, trạng thái JPEG-DL formal, nghiên cứu competition và chính sách synthetic train-only chống leak. Revision 2: khóa JPEG-DL A0 ở VisualFail với replay exact, ghi metric/XAI/SHAs cuối và chuyển kế hoạch sang synthetic feasibility source-disjoint. Revision 3: retention pass trên 822 thư mục/51 manifests, giữ formal 2,614 MiB; sửa odd/even header-footer và reset numbering theo từng block sau render QA. Revision 4: SaSPA F0 no-output pass formal/replay trên RTX 4060 8 GB; ghi telemetry, process isolation, hash artifact và chỉ mở quyền F1 10 ảnh train-only.</w:t>
       </w:r>
     </w:p>
     <w:p>

</xml_diff>

<commit_message>
research: close LP-A3 hard-positive A0
</commit_message>
<xml_diff>
--- a/docs/TRKH_5CLASS_RESEARCH_PROCESS_STATUS.docx
+++ b/docs/TRKH_5CLASS_RESEARCH_PROCESS_STATUS.docx
@@ -75,7 +75,7 @@
           <w:color w:val="202124"/>
           <w:sz w:val="21"/>
         </w:rPr>
-        <w:t>2026-07-24 | Revision 4</w:t>
+        <w:t>2026-07-24 | Revision 6</w:t>
       </w:r>
     </w:p>
     <w:p>
@@ -97,7 +97,7 @@
           <w:color w:val="202124"/>
           <w:sz w:val="21"/>
         </w:rPr>
-        <w:t>Đang nghiên cứu - SaSPA F0 đã pass; F1 giới hạn 10 ảnh train-only</w:t>
+        <w:t>Đang nghiên cứu - LP-A3 A0 đã bị loại; chưa có checkpoint mới</w:t>
       </w:r>
     </w:p>
     <w:p>
@@ -340,7 +340,7 @@
                 <w:color w:val="5F6368"/>
                 <w:sz w:val="16"/>
               </w:rPr>
-              <w:t>SASPA SYNTHETIC F0</w:t>
+              <w:t>LP-A3 HARD-POSITIVE A0</w:t>
             </w:r>
           </w:p>
           <w:p>
@@ -354,7 +354,7 @@
                 <w:color w:val="1F4D78"/>
                 <w:sz w:val="28"/>
               </w:rPr>
-              <w:t>Pass (no-output)</w:t>
+              <w:t>Rejected</w:t>
             </w:r>
           </w:p>
           <w:p>
@@ -367,7 +367,7 @@
                 <w:color w:val="202124"/>
                 <w:sz w:val="17"/>
               </w:rPr>
-              <w:t>Replay pass; F1 chỉ được sinh 10 ảnh train-only</w:t>
+              <w:t>TP 0,9922; rival 0,9648; FP reject 0,0315</w:t>
             </w:r>
           </w:p>
         </w:tc>
@@ -412,7 +412,7 @@
           <w:color w:val="202124"/>
           <w:sz w:val="21"/>
         </w:rPr>
-        <w:t>Giữ nguyên keeper hiện tại và file lệnh full-train tốt nhất. Full train random-init 30 epoch không thắng validation gate; JPEG-DL A0 đã bị loại. SaSPA synthetic F0 no-output đã pass formal và replay, chỉ mở quyền F1 sinh đúng 10 ảnh train-only; đây chưa phải bằng chứng cải thiện mô hình hay quyền full generation/full train.</w:t>
+        <w:t>Giữ nguyên keeper hiện tại và file lệnh full-train tốt nhất. Full train random-init 30 epoch không thắng validation gate; JPEG-DL, SaSPA synthetic và LP-A3-inspired hard-positive A0 đều đã bị loại. LP-A3 dùng đủ 9.215 train rows, không mở validation/test và replay exact, nhưng chỉ loại 7/222 restricted FP, tạo 9 FP mới, phá 2 TP và không chứng minh tác dụng nhân quả của label hinge; trainer và full train không được mở.</w:t>
       </w:r>
     </w:p>
     <w:p>
@@ -1613,6 +1613,286 @@
           </w:p>
         </w:tc>
       </w:tr>
+      <w:tr>
+        <w:trPr>
+          <w:cantSplit/>
+        </w:trPr>
+        <w:tc>
+          <w:tcPr>
+            <w:tcW w:type="dxa" w:w="1500"/>
+            <w:tcMar>
+              <w:top w:w="80" w:type="dxa"/>
+              <w:start w:w="120" w:type="dxa"/>
+              <w:bottom w:w="80" w:type="dxa"/>
+              <w:end w:w="120" w:type="dxa"/>
+            </w:tcMar>
+            <w:vAlign w:val="center"/>
+          </w:tcPr>
+          <w:p>
+            <w:pPr>
+              <w:widowControl/>
+              <w:spacing w:after="0" w:line="247" w:lineRule="auto"/>
+              <w:jc w:val="left"/>
+            </w:pPr>
+            <w:r>
+              <w:rPr>
+                <w:rFonts w:ascii="Calibri" w:hAnsi="Calibri" w:eastAsia="Calibri"/>
+                <w:color w:val="202124"/>
+                <w:sz w:val="18"/>
+              </w:rPr>
+              <w:t>SaSPA synthetic F1</w:t>
+            </w:r>
+          </w:p>
+        </w:tc>
+        <w:tc>
+          <w:tcPr>
+            <w:tcW w:type="dxa" w:w="2250"/>
+            <w:tcMar>
+              <w:top w:w="80" w:type="dxa"/>
+              <w:start w:w="120" w:type="dxa"/>
+              <w:bottom w:w="80" w:type="dxa"/>
+              <w:end w:w="120" w:type="dxa"/>
+            </w:tcMar>
+            <w:vAlign w:val="center"/>
+          </w:tcPr>
+          <w:p>
+            <w:pPr>
+              <w:widowControl/>
+              <w:spacing w:after="0" w:line="247" w:lineRule="auto"/>
+              <w:jc w:val="left"/>
+            </w:pPr>
+            <w:r>
+              <w:rPr>
+                <w:rFonts w:ascii="Calibri" w:hAnsi="Calibri" w:eastAsia="Calibri"/>
+                <w:color w:val="202124"/>
+                <w:sz w:val="18"/>
+              </w:rPr>
+              <w:t>10 ảnh train-only, không train</w:t>
+            </w:r>
+          </w:p>
+        </w:tc>
+        <w:tc>
+          <w:tcPr>
+            <w:tcW w:type="dxa" w:w="1050"/>
+            <w:tcMar>
+              <w:top w:w="80" w:type="dxa"/>
+              <w:start w:w="120" w:type="dxa"/>
+              <w:bottom w:w="80" w:type="dxa"/>
+              <w:end w:w="120" w:type="dxa"/>
+            </w:tcMar>
+            <w:vAlign w:val="center"/>
+          </w:tcPr>
+          <w:p>
+            <w:pPr>
+              <w:widowControl/>
+              <w:spacing w:after="0" w:line="247" w:lineRule="auto"/>
+              <w:jc w:val="center"/>
+            </w:pPr>
+            <w:r>
+              <w:rPr>
+                <w:rFonts w:ascii="Calibri" w:hAnsi="Calibri" w:eastAsia="Calibri"/>
+                <w:color w:val="202124"/>
+                <w:sz w:val="18"/>
+              </w:rPr>
+              <w:t>N/A</w:t>
+            </w:r>
+          </w:p>
+        </w:tc>
+        <w:tc>
+          <w:tcPr>
+            <w:tcW w:type="dxa" w:w="2450"/>
+            <w:tcMar>
+              <w:top w:w="80" w:type="dxa"/>
+              <w:start w:w="120" w:type="dxa"/>
+              <w:bottom w:w="80" w:type="dxa"/>
+              <w:end w:w="120" w:type="dxa"/>
+            </w:tcMar>
+            <w:vAlign w:val="center"/>
+          </w:tcPr>
+          <w:p>
+            <w:pPr>
+              <w:widowControl/>
+              <w:spacing w:after="0" w:line="247" w:lineRule="auto"/>
+              <w:jc w:val="left"/>
+            </w:pPr>
+            <w:r>
+              <w:rPr>
+                <w:rFonts w:ascii="Calibri" w:hAnsi="Calibri" w:eastAsia="Calibri"/>
+                <w:color w:val="202124"/>
+                <w:sz w:val="18"/>
+              </w:rPr>
+              <w:t>Fidelity 0/10; blind 7/10; XAI 6/10</w:t>
+            </w:r>
+          </w:p>
+        </w:tc>
+        <w:tc>
+          <w:tcPr>
+            <w:tcW w:type="dxa" w:w="2110"/>
+            <w:tcMar>
+              <w:top w:w="80" w:type="dxa"/>
+              <w:start w:w="120" w:type="dxa"/>
+              <w:bottom w:w="80" w:type="dxa"/>
+              <w:end w:w="120" w:type="dxa"/>
+            </w:tcMar>
+            <w:vAlign w:val="center"/>
+          </w:tcPr>
+          <w:p>
+            <w:pPr>
+              <w:widowControl/>
+              <w:spacing w:after="0" w:line="247" w:lineRule="auto"/>
+              <w:jc w:val="center"/>
+            </w:pPr>
+            <w:r>
+              <w:rPr>
+                <w:rFonts w:ascii="Calibri" w:hAnsi="Calibri" w:eastAsia="Calibri"/>
+                <w:color w:val="202124"/>
+                <w:sz w:val="18"/>
+              </w:rPr>
+              <w:t>Rejected trước A1</w:t>
+            </w:r>
+          </w:p>
+        </w:tc>
+      </w:tr>
+      <w:tr>
+        <w:trPr>
+          <w:cantSplit/>
+        </w:trPr>
+        <w:tc>
+          <w:tcPr>
+            <w:tcW w:type="dxa" w:w="1500"/>
+            <w:tcMar>
+              <w:top w:w="80" w:type="dxa"/>
+              <w:start w:w="120" w:type="dxa"/>
+              <w:bottom w:w="80" w:type="dxa"/>
+              <w:end w:w="120" w:type="dxa"/>
+            </w:tcMar>
+            <w:vAlign w:val="center"/>
+          </w:tcPr>
+          <w:p>
+            <w:pPr>
+              <w:widowControl/>
+              <w:spacing w:after="0" w:line="247" w:lineRule="auto"/>
+              <w:jc w:val="left"/>
+            </w:pPr>
+            <w:r>
+              <w:rPr>
+                <w:rFonts w:ascii="Calibri" w:hAnsi="Calibri" w:eastAsia="Calibri"/>
+                <w:color w:val="202124"/>
+                <w:sz w:val="18"/>
+              </w:rPr>
+              <w:t>LP-A3 hard-positive A0</w:t>
+            </w:r>
+          </w:p>
+        </w:tc>
+        <w:tc>
+          <w:tcPr>
+            <w:tcW w:type="dxa" w:w="2250"/>
+            <w:tcMar>
+              <w:top w:w="80" w:type="dxa"/>
+              <w:start w:w="120" w:type="dxa"/>
+              <w:bottom w:w="80" w:type="dxa"/>
+              <w:end w:w="120" w:type="dxa"/>
+            </w:tcMar>
+            <w:vAlign w:val="center"/>
+          </w:tcPr>
+          <w:p>
+            <w:pPr>
+              <w:widowControl/>
+              <w:spacing w:after="0" w:line="247" w:lineRule="auto"/>
+              <w:jc w:val="left"/>
+            </w:pPr>
+            <w:r>
+              <w:rPr>
+                <w:rFonts w:ascii="Calibri" w:hAnsi="Calibri" w:eastAsia="Calibri"/>
+                <w:color w:val="202124"/>
+                <w:sz w:val="18"/>
+              </w:rPr>
+              <w:t>9.215 train; cohort 734; không train</w:t>
+            </w:r>
+          </w:p>
+        </w:tc>
+        <w:tc>
+          <w:tcPr>
+            <w:tcW w:type="dxa" w:w="1050"/>
+            <w:tcMar>
+              <w:top w:w="80" w:type="dxa"/>
+              <w:start w:w="120" w:type="dxa"/>
+              <w:bottom w:w="80" w:type="dxa"/>
+              <w:end w:w="120" w:type="dxa"/>
+            </w:tcMar>
+            <w:vAlign w:val="center"/>
+          </w:tcPr>
+          <w:p>
+            <w:pPr>
+              <w:widowControl/>
+              <w:spacing w:after="0" w:line="247" w:lineRule="auto"/>
+              <w:jc w:val="center"/>
+            </w:pPr>
+            <w:r>
+              <w:rPr>
+                <w:rFonts w:ascii="Calibri" w:hAnsi="Calibri" w:eastAsia="Calibri"/>
+                <w:color w:val="202124"/>
+                <w:sz w:val="18"/>
+              </w:rPr>
+              <w:t>N/A</w:t>
+            </w:r>
+          </w:p>
+        </w:tc>
+        <w:tc>
+          <w:tcPr>
+            <w:tcW w:type="dxa" w:w="2450"/>
+            <w:tcMar>
+              <w:top w:w="80" w:type="dxa"/>
+              <w:start w:w="120" w:type="dxa"/>
+              <w:bottom w:w="80" w:type="dxa"/>
+              <w:end w:w="120" w:type="dxa"/>
+            </w:tcMar>
+            <w:vAlign w:val="center"/>
+          </w:tcPr>
+          <w:p>
+            <w:pPr>
+              <w:widowControl/>
+              <w:spacing w:after="0" w:line="247" w:lineRule="auto"/>
+              <w:jc w:val="left"/>
+            </w:pPr>
+            <w:r>
+              <w:rPr>
+                <w:rFonts w:ascii="Calibri" w:hAnsi="Calibri" w:eastAsia="Calibri"/>
+                <w:color w:val="202124"/>
+                <w:sz w:val="18"/>
+              </w:rPr>
+              <w:t>TP/rival/FP reject 0,9922 / 0,9648 / 0,0315</w:t>
+            </w:r>
+          </w:p>
+        </w:tc>
+        <w:tc>
+          <w:tcPr>
+            <w:tcW w:type="dxa" w:w="2110"/>
+            <w:tcMar>
+              <w:top w:w="80" w:type="dxa"/>
+              <w:start w:w="120" w:type="dxa"/>
+              <w:bottom w:w="80" w:type="dxa"/>
+              <w:end w:w="120" w:type="dxa"/>
+            </w:tcMar>
+            <w:vAlign w:val="center"/>
+          </w:tcPr>
+          <w:p>
+            <w:pPr>
+              <w:widowControl/>
+              <w:spacing w:after="0" w:line="247" w:lineRule="auto"/>
+              <w:jc w:val="left"/>
+            </w:pPr>
+            <w:r>
+              <w:rPr>
+                <w:rFonts w:ascii="Calibri" w:hAnsi="Calibri" w:eastAsia="Calibri"/>
+                <w:color w:val="202124"/>
+                <w:sz w:val="18"/>
+              </w:rPr>
+              <w:t>Rejected trước integration</w:t>
+            </w:r>
+          </w:p>
+        </w:tc>
+      </w:tr>
     </w:tbl>
     <w:p>
       <w:pPr>
@@ -2782,7 +3062,7 @@
                 <w:color w:val="202124"/>
                 <w:sz w:val="18"/>
               </w:rPr>
-              <w:t>RTX 4060 8 GB, RAM 15,6 GB; SaSPA F0 pass với peak RSS 6,794 GiB và NVML 556 MiB.</w:t>
+              <w:t>RTX 4060 8 GB, RAM 15,6 GB; SaSPA F0/F1 chạy ổn bằng worker cô lập và model CPU offload.</w:t>
             </w:r>
           </w:p>
         </w:tc>
@@ -2809,7 +3089,7 @@
                 <w:color w:val="202124"/>
                 <w:sz w:val="18"/>
               </w:rPr>
-              <w:t>Dùng worker cô lập và resource gate trước diffusion hoặc full train.</w:t>
+              <w:t>Dùng process/resource gate trước diffusion hoặc full train.</w:t>
             </w:r>
           </w:p>
         </w:tc>
@@ -2868,7 +3148,7 @@
                 <w:color w:val="202124"/>
                 <w:sz w:val="18"/>
               </w:rPr>
-              <w:t>Fine-grained label dễ đổi khi generator sửa màu/bề mặt.</w:t>
+              <w:t>SaSPA F1 không bị trùng/leak nhưng 0/10 ảnh vượt fidelity; blind review có 4 severe artifacts.</w:t>
             </w:r>
           </w:p>
         </w:tc>
@@ -2895,7 +3175,93 @@
                 <w:color w:val="202124"/>
                 <w:sz w:val="18"/>
               </w:rPr>
-              <w:t>Lọc fold-safe, tỷ lệ thấp và audit near-duplicate bắt buộc.</w:t>
+              <w:t>Không đồng nhất duplicate-safety với bảo toàn nhãn fine-grained.</w:t>
+            </w:r>
+          </w:p>
+        </w:tc>
+      </w:tr>
+      <w:tr>
+        <w:trPr>
+          <w:cantSplit/>
+        </w:trPr>
+        <w:tc>
+          <w:tcPr>
+            <w:tcW w:type="dxa" w:w="1900"/>
+            <w:tcMar>
+              <w:top w:w="80" w:type="dxa"/>
+              <w:start w:w="120" w:type="dxa"/>
+              <w:bottom w:w="80" w:type="dxa"/>
+              <w:end w:w="120" w:type="dxa"/>
+            </w:tcMar>
+            <w:vAlign w:val="center"/>
+          </w:tcPr>
+          <w:p>
+            <w:pPr>
+              <w:widowControl/>
+              <w:spacing w:after="0" w:line="247" w:lineRule="auto"/>
+              <w:jc w:val="left"/>
+            </w:pPr>
+            <w:r>
+              <w:rPr>
+                <w:rFonts w:ascii="Calibri" w:hAnsi="Calibri" w:eastAsia="Calibri"/>
+                <w:color w:val="202124"/>
+                <w:sz w:val="18"/>
+              </w:rPr>
+              <w:t>Nhiễu hard-positive</w:t>
+            </w:r>
+          </w:p>
+        </w:tc>
+        <w:tc>
+          <w:tcPr>
+            <w:tcW w:type="dxa" w:w="4000"/>
+            <w:tcMar>
+              <w:top w:w="80" w:type="dxa"/>
+              <w:start w:w="120" w:type="dxa"/>
+              <w:bottom w:w="80" w:type="dxa"/>
+              <w:end w:w="120" w:type="dxa"/>
+            </w:tcMar>
+            <w:vAlign w:val="center"/>
+          </w:tcPr>
+          <w:p>
+            <w:pPr>
+              <w:widowControl/>
+              <w:spacing w:after="0" w:line="247" w:lineRule="auto"/>
+              <w:jc w:val="left"/>
+            </w:pPr>
+            <w:r>
+              <w:rPr>
+                <w:rFonts w:ascii="Calibri" w:hAnsi="Calibri" w:eastAsia="Calibri"/>
+                <w:color w:val="202124"/>
+                <w:sz w:val="18"/>
+              </w:rPr>
+              <w:t>LP-A3 candidate chỉ khác feature-only 6/734 hàng; delta khuếch đại là speckle cao tần phủ bbox.</w:t>
+            </w:r>
+          </w:p>
+        </w:tc>
+        <w:tc>
+          <w:tcPr>
+            <w:tcW w:type="dxa" w:w="3460"/>
+            <w:tcMar>
+              <w:top w:w="80" w:type="dxa"/>
+              <w:start w:w="120" w:type="dxa"/>
+              <w:bottom w:w="80" w:type="dxa"/>
+              <w:end w:w="120" w:type="dxa"/>
+            </w:tcMar>
+            <w:vAlign w:val="center"/>
+          </w:tcPr>
+          <w:p>
+            <w:pPr>
+              <w:widowControl/>
+              <w:spacing w:after="0" w:line="247" w:lineRule="auto"/>
+              <w:jc w:val="left"/>
+            </w:pPr>
+            <w:r>
+              <w:rPr>
+                <w:rFonts w:ascii="Calibri" w:hAnsi="Calibri" w:eastAsia="Calibri"/>
+                <w:color w:val="202124"/>
+                <w:sz w:val="18"/>
+              </w:rPr>
+              <w:t>Ràng buộc nhãn số học không bảo đảm tín hiệu bề mặt có cấu trúc hay cải thiện precision.</w:t>
             </w:r>
           </w:p>
         </w:tc>
@@ -3107,6 +3473,24 @@
           <w:sz w:val="22"/>
         </w:rPr>
         <w:t>OOF soft-label/label-repair trực tiếp: đã thử nhiều biến thể và bị loại; kết quả competition không đủ lý do để lặp lại nếu không có tín hiệu mới.</w:t>
+      </w:r>
+    </w:p>
+    <w:p>
+      <w:pPr>
+        <w:widowControl/>
+        <w:numPr>
+          <w:ilvl w:val="0"/>
+          <w:numId w:val="10"/>
+        </w:numPr>
+        <w:spacing w:after="160" w:line="280" w:lineRule="auto"/>
+      </w:pPr>
+      <w:r>
+        <w:rPr>
+          <w:rFonts w:ascii="Calibri" w:hAnsi="Calibri" w:eastAsia="Calibri"/>
+          <w:color w:val="202124"/>
+          <w:sz w:val="22"/>
+        </w:rPr>
+        <w:t>LP-A3-inspired hard positive: giữ TP cao nhưng FP rejection thấp, rival retention dưới gate và label hinge không hơn feature-only; không sweep radius/step/margin/lambda/noise/layer/erosion.</w:t>
       </w:r>
     </w:p>
     <w:p>
@@ -3854,7 +4238,7 @@
                 <w:color w:val="202124"/>
                 <w:sz w:val="18"/>
               </w:rPr>
-              <w:t>Ứng viên synthetic chính, nhưng phải feasibility 8 GB, tỷ lệ thấp và filter fold-safe trước.</w:t>
+              <w:t>Exact F1 đã bị loại: resource/duplicate pass nhưng fidelity, blind và XAI không đạt.</w:t>
             </w:r>
           </w:p>
         </w:tc>
@@ -4031,6 +4415,92 @@
           </w:p>
         </w:tc>
       </w:tr>
+      <w:tr>
+        <w:trPr>
+          <w:cantSplit/>
+        </w:trPr>
+        <w:tc>
+          <w:tcPr>
+            <w:tcW w:type="dxa" w:w="1900"/>
+            <w:tcMar>
+              <w:top w:w="80" w:type="dxa"/>
+              <w:start w:w="120" w:type="dxa"/>
+              <w:bottom w:w="80" w:type="dxa"/>
+              <w:end w:w="120" w:type="dxa"/>
+            </w:tcMar>
+            <w:vAlign w:val="center"/>
+          </w:tcPr>
+          <w:p>
+            <w:pPr>
+              <w:widowControl/>
+              <w:spacing w:after="0" w:line="247" w:lineRule="auto"/>
+              <w:jc w:val="left"/>
+            </w:pPr>
+            <w:r>
+              <w:rPr>
+                <w:rFonts w:ascii="Calibri" w:hAnsi="Calibri" w:eastAsia="Calibri"/>
+                <w:color w:val="202124"/>
+                <w:sz w:val="18"/>
+              </w:rPr>
+              <w:t>LP-A3, NeurIPS 2022</w:t>
+            </w:r>
+          </w:p>
+        </w:tc>
+        <w:tc>
+          <w:tcPr>
+            <w:tcW w:type="dxa" w:w="3600"/>
+            <w:tcMar>
+              <w:top w:w="80" w:type="dxa"/>
+              <w:start w:w="120" w:type="dxa"/>
+              <w:bottom w:w="80" w:type="dxa"/>
+              <w:end w:w="120" w:type="dxa"/>
+            </w:tcMar>
+            <w:vAlign w:val="center"/>
+          </w:tcPr>
+          <w:p>
+            <w:pPr>
+              <w:widowControl/>
+              <w:spacing w:after="0" w:line="247" w:lineRule="auto"/>
+              <w:jc w:val="left"/>
+            </w:pPr>
+            <w:r>
+              <w:rPr>
+                <w:rFonts w:ascii="Calibri" w:hAnsi="Calibri" w:eastAsia="Calibri"/>
+                <w:color w:val="202124"/>
+                <w:sz w:val="18"/>
+              </w:rPr>
+              <w:t>Tối đa khoảng cách feature của hard positive dưới ràng buộc log-prob nhãn thật; chọn mẫu theo time consistency.</w:t>
+            </w:r>
+          </w:p>
+        </w:tc>
+        <w:tc>
+          <w:tcPr>
+            <w:tcW w:type="dxa" w:w="3860"/>
+            <w:tcMar>
+              <w:top w:w="80" w:type="dxa"/>
+              <w:start w:w="120" w:type="dxa"/>
+              <w:bottom w:w="80" w:type="dxa"/>
+              <w:end w:w="120" w:type="dxa"/>
+            </w:tcMar>
+            <w:vAlign w:val="center"/>
+          </w:tcPr>
+          <w:p>
+            <w:pPr>
+              <w:widowControl/>
+              <w:spacing w:after="0" w:line="247" w:lineRule="auto"/>
+              <w:jc w:val="left"/>
+            </w:pPr>
+            <w:r>
+              <w:rPr>
+                <w:rFonts w:ascii="Calibri" w:hAnsi="Calibri" w:eastAsia="Calibri"/>
+                <w:color w:val="202124"/>
+                <w:sz w:val="18"/>
+              </w:rPr>
+              <w:t>A0 độc lập đã bị loại: hinge gần như không khác feature-only và delta không có cấu trúc bề mặt.</w:t>
+            </w:r>
+          </w:p>
+        </w:tc>
+      </w:tr>
     </w:tbl>
     <w:p>
       <w:pPr>
@@ -4097,7 +4567,7 @@
           <w:color w:val="202124"/>
           <w:sz w:val="22"/>
         </w:rPr>
-        <w:t>SaSPA F0 đã pass từ clean pushed commit 51efa72b. Formal xác minh 36 package, snapshot 7.688.436.558 byte, cohort 10 hàng train-only với 20 leakage group duy nhất và pipeline CPU-offload không sinh pixel. Load time là 9,28 giây; peak RSS/VMS/NVML là 6,794/8,917 GiB/556 MiB. Replay độc lập và final manifest đều pass.</w:t>
+        <w:t>SaSPA F0 đã pass từ clean pushed commit 51efa72b và F1 sau đó sinh đúng 10 ảnh train-only bằng model CPU offload. Generation, provenance, resource và replay đều pass; duplicate audit cũng pass exact decoded-RGB, pHash và DINOv2 trên 24.996 file của mọi split mà không lưu reference pixels/embeddings.</w:t>
       </w:r>
     </w:p>
     <w:p>
@@ -4125,7 +4595,7 @@
           <w:color w:val="202124"/>
           <w:sz w:val="21"/>
         </w:rPr>
-        <w:t>F0 chỉ cho phép F1 sinh 10 ảnh, 2 ảnh mỗi lớp, theo source/prompt/seed đã khóa. F1 vẫn phải pass provenance, resource, class-fidelity, blind review, exact hash, pHash, DINO near-duplicate và XAI trước khi được cân nhắc A1 5%.</w:t>
+        <w:t>F1 bị loại trước A1: class-fidelity pass 0/10; blind review đúng 7/10, class 1 là 1/2, có 4 severe artifacts; frozen keeper đúng 6/10 và chỉ 4/10 Grad-CAM đặt ít nhất nửa khối lượng trong bbox. Không được đổi prompt, seed, steps/guidance, threshold, blind limit hoặc synthetic ratio sau kết quả này.</w:t>
       </w:r>
     </w:p>
     <w:p>
@@ -5208,6 +5678,178 @@
           </w:p>
         </w:tc>
       </w:tr>
+      <w:tr>
+        <w:trPr>
+          <w:cantSplit/>
+        </w:trPr>
+        <w:tc>
+          <w:tcPr>
+            <w:tcW w:type="dxa" w:w="2550"/>
+            <w:tcMar>
+              <w:top w:w="80" w:type="dxa"/>
+              <w:start w:w="120" w:type="dxa"/>
+              <w:bottom w:w="80" w:type="dxa"/>
+              <w:end w:w="120" w:type="dxa"/>
+            </w:tcMar>
+            <w:vAlign w:val="center"/>
+          </w:tcPr>
+          <w:p>
+            <w:pPr>
+              <w:widowControl/>
+              <w:spacing w:after="0" w:line="247" w:lineRule="auto"/>
+              <w:jc w:val="left"/>
+            </w:pPr>
+            <w:r>
+              <w:rPr>
+                <w:rFonts w:ascii="Calibri" w:hAnsi="Calibri" w:eastAsia="Calibri"/>
+                <w:color w:val="202124"/>
+                <w:sz w:val="18"/>
+              </w:rPr>
+              <w:t>Gate synthetic nhiều tầng</w:t>
+            </w:r>
+          </w:p>
+        </w:tc>
+        <w:tc>
+          <w:tcPr>
+            <w:tcW w:type="dxa" w:w="3810"/>
+            <w:tcMar>
+              <w:top w:w="80" w:type="dxa"/>
+              <w:start w:w="120" w:type="dxa"/>
+              <w:bottom w:w="80" w:type="dxa"/>
+              <w:end w:w="120" w:type="dxa"/>
+            </w:tcMar>
+            <w:vAlign w:val="center"/>
+          </w:tcPr>
+          <w:p>
+            <w:pPr>
+              <w:widowControl/>
+              <w:spacing w:after="0" w:line="247" w:lineRule="auto"/>
+              <w:jc w:val="left"/>
+            </w:pPr>
+            <w:r>
+              <w:rPr>
+                <w:rFonts w:ascii="Calibri" w:hAnsi="Calibri" w:eastAsia="Calibri"/>
+                <w:color w:val="202124"/>
+                <w:sz w:val="18"/>
+              </w:rPr>
+              <w:t>Khóa fidelity, blind review, duplicate-safety và XAI theo thứ tự; XAI không được cứu gate đã fail.</w:t>
+            </w:r>
+          </w:p>
+        </w:tc>
+        <w:tc>
+          <w:tcPr>
+            <w:tcW w:type="dxa" w:w="3000"/>
+            <w:tcMar>
+              <w:top w:w="80" w:type="dxa"/>
+              <w:start w:w="120" w:type="dxa"/>
+              <w:bottom w:w="80" w:type="dxa"/>
+              <w:end w:w="120" w:type="dxa"/>
+            </w:tcMar>
+            <w:vAlign w:val="center"/>
+          </w:tcPr>
+          <w:p>
+            <w:pPr>
+              <w:widowControl/>
+              <w:spacing w:after="0" w:line="247" w:lineRule="auto"/>
+              <w:jc w:val="left"/>
+            </w:pPr>
+            <w:r>
+              <w:rPr>
+                <w:rFonts w:ascii="Calibri" w:hAnsi="Calibri" w:eastAsia="Calibri"/>
+                <w:color w:val="202124"/>
+                <w:sz w:val="18"/>
+              </w:rPr>
+              <w:t>Phân biệt rõ không trùng dữ liệu với bảo toàn semantics và giá trị huấn luyện.</w:t>
+            </w:r>
+          </w:p>
+        </w:tc>
+      </w:tr>
+      <w:tr>
+        <w:trPr>
+          <w:cantSplit/>
+        </w:trPr>
+        <w:tc>
+          <w:tcPr>
+            <w:tcW w:type="dxa" w:w="2550"/>
+            <w:tcMar>
+              <w:top w:w="80" w:type="dxa"/>
+              <w:start w:w="120" w:type="dxa"/>
+              <w:bottom w:w="80" w:type="dxa"/>
+              <w:end w:w="120" w:type="dxa"/>
+            </w:tcMar>
+            <w:vAlign w:val="center"/>
+          </w:tcPr>
+          <w:p>
+            <w:pPr>
+              <w:widowControl/>
+              <w:spacing w:after="0" w:line="247" w:lineRule="auto"/>
+              <w:jc w:val="left"/>
+            </w:pPr>
+            <w:r>
+              <w:rPr>
+                <w:rFonts w:ascii="Calibri" w:hAnsi="Calibri" w:eastAsia="Calibri"/>
+                <w:color w:val="202124"/>
+                <w:sz w:val="18"/>
+              </w:rPr>
+              <w:t>Causal control cho augmentation</w:t>
+            </w:r>
+          </w:p>
+        </w:tc>
+        <w:tc>
+          <w:tcPr>
+            <w:tcW w:type="dxa" w:w="3810"/>
+            <w:tcMar>
+              <w:top w:w="80" w:type="dxa"/>
+              <w:start w:w="120" w:type="dxa"/>
+              <w:bottom w:w="80" w:type="dxa"/>
+              <w:end w:w="120" w:type="dxa"/>
+            </w:tcMar>
+            <w:vAlign w:val="center"/>
+          </w:tcPr>
+          <w:p>
+            <w:pPr>
+              <w:widowControl/>
+              <w:spacing w:after="0" w:line="247" w:lineRule="auto"/>
+              <w:jc w:val="left"/>
+            </w:pPr>
+            <w:r>
+              <w:rPr>
+                <w:rFonts w:ascii="Calibri" w:hAnsi="Calibri" w:eastAsia="Calibri"/>
+                <w:color w:val="202124"/>
+                <w:sz w:val="18"/>
+              </w:rPr>
+              <w:t>Khớp radius/mask với baseline, seed theo sample index, so random-feasible và objective ablation trước trainer.</w:t>
+            </w:r>
+          </w:p>
+        </w:tc>
+        <w:tc>
+          <w:tcPr>
+            <w:tcW w:type="dxa" w:w="3000"/>
+            <w:tcMar>
+              <w:top w:w="80" w:type="dxa"/>
+              <w:start w:w="120" w:type="dxa"/>
+              <w:bottom w:w="80" w:type="dxa"/>
+              <w:end w:w="120" w:type="dxa"/>
+            </w:tcMar>
+            <w:vAlign w:val="center"/>
+          </w:tcPr>
+          <w:p>
+            <w:pPr>
+              <w:widowControl/>
+              <w:spacing w:after="0" w:line="247" w:lineRule="auto"/>
+              <w:jc w:val="left"/>
+            </w:pPr>
+            <w:r>
+              <w:rPr>
+                <w:rFonts w:ascii="Calibri" w:hAnsi="Calibri" w:eastAsia="Calibri"/>
+                <w:color w:val="202124"/>
+                <w:sz w:val="18"/>
+              </w:rPr>
+              <w:t>Phát hiện LP-A3 hinge không tạo khác biệt dù metric feature-distance cao hơn random.</w:t>
+            </w:r>
+          </w:p>
+        </w:tc>
+      </w:tr>
     </w:tbl>
     <w:p>
       <w:pPr>
@@ -5238,7 +5880,7 @@
           <w:color w:val="202124"/>
           <w:sz w:val="22"/>
         </w:rPr>
-        <w:t>Giữ nguyên bộ JPEG-DL formal 2,614 MiB. Retention đã pass 822 thư mục, đủ 51 compaction manifests, 233 originals expected-absent và blockers=[]; chỉ cleanup tiếp theo bằng manifest riêng.</w:t>
+        <w:t>Giữ nguyên các closure JPEG-DL, SaSPA F1 và LP-A3 A0 có giá trị tái lập; cleanup artifact tạm bằng manifest riêng.</w:t>
       </w:r>
     </w:p>
     <w:p>
@@ -5256,7 +5898,7 @@
           <w:color w:val="202124"/>
           <w:sz w:val="22"/>
         </w:rPr>
-        <w:t>Giữ protocol SaSPA A0 revision 2 và F0 formal/replay đã pass làm khóa đầu vào; không thay source, generator revision, prompt, seed, filter hoặc threshold sau khi xem output.</w:t>
+        <w:t>Đóng exact SaSPA và LP-A3 neighborhoods đã khóa; không mở lại bằng sweep prompt/seed hoặc radius/step/margin/lambda.</w:t>
       </w:r>
     </w:p>
     <w:p>
@@ -5274,7 +5916,7 @@
           <w:color w:val="202124"/>
           <w:sz w:val="22"/>
         </w:rPr>
-        <w:t>Triển khai F1 fail-closed và sinh đúng 10 ảnh train-only, 2 ảnh mỗi lớp, tuần tự bằng model CPU offload; ghi đầy đủ provenance, latency, RAM/VRAM và output hash.</w:t>
+        <w:t>Tra cứu và prospectively khóa một cơ chế train-only mới có biến đổi bề mặt/tổn thương có cấu trúc, licensed và equation-distinct; không lặp KeepAugment/AugMax/PRIME nếu thiếu class-pair causal target mới.</w:t>
       </w:r>
     </w:p>
     <w:p>
@@ -5292,7 +5934,7 @@
           <w:color w:val="202124"/>
           <w:sz w:val="22"/>
         </w:rPr>
-        <w:t>Chạy class-fidelity, blind review, exact-hash, pHash, DINO near-duplicate và fixed XAI trên đủ 10 ảnh. Chỉ khi tất cả pass mới khóa A1 ở 5% mỗi lớp và matched real-only equal-iteration control.</w:t>
+        <w:t>Trước trainer integration, candidate mới phải bảo vệ class-1 TP, loại restricted FP tốt hơn matched simple control và không dùng validation/test để fit/chọn tham số.</w:t>
       </w:r>
     </w:p>
     <w:p>
@@ -5942,7 +6584,7 @@
           <w:color w:val="202124"/>
           <w:sz w:val="22"/>
         </w:rPr>
-        <w:t>Revision 1: tạo báo cáo Word tái lập; ghi nhận full train 30e, trạng thái JPEG-DL formal, nghiên cứu competition và chính sách synthetic train-only chống leak. Revision 2: khóa JPEG-DL A0 ở VisualFail với replay exact, ghi metric/XAI/SHAs cuối và chuyển kế hoạch sang synthetic feasibility source-disjoint. Revision 3: retention pass trên 822 thư mục/51 manifests, giữ formal 2,614 MiB; sửa odd/even header-footer và reset numbering theo từng block sau render QA. Revision 4: SaSPA F0 no-output pass formal/replay trên RTX 4060 8 GB; ghi telemetry, process isolation, hash artifact và chỉ mở quyền F1 10 ảnh train-only.</w:t>
+        <w:t>Revision 1: tạo báo cáo Word tái lập; ghi nhận full train 30e, trạng thái JPEG-DL formal, nghiên cứu competition và chính sách synthetic train-only chống leak. Revision 2: khóa JPEG-DL A0 ở VisualFail với replay exact, ghi metric/XAI/SHAs cuối và chuyển kế hoạch sang synthetic feasibility source-disjoint. Revision 3: retention pass trên 822 thư mục/51 manifests, giữ formal 2,614 MiB; sửa odd/even header-footer và reset numbering theo từng block sau render QA. Revision 4: SaSPA F0 no-output pass formal/replay trên RTX 4060 8 GB; ghi telemetry, process isolation, hash artifact và chỉ mở quyền F1 10 ảnh train-only. Revision 5: đóng SaSPA F1 ở Rejected sau fidelity 0/10, blind 7/10, duplicate-safety pass và frozen-keeper XAI 6/10; giữ nguyên keeper/lệnh full-train tốt nhất; bỏ running header-footer để khóa lề 1 inch ổn định giữa Word và LibreOffice sau render QA. Revision 6: đóng LP-A3-inspired A0 sau audit train-only 9.215 hàng, replay exact, 19/23 automated gates và manual delta review; ghi causal-control fail 6/734, không integration hoặc command update.</w:t>
       </w:r>
     </w:p>
     <w:p>
@@ -5981,7 +6623,7 @@
         </w:rPr>
         <w:t xml:space="preserve"> - Paper chính cho candidate input quantization. </w:t>
       </w:r>
-      <w:hyperlink r:id="rId13">
+      <w:hyperlink r:id="rId9">
         <w:r>
           <w:rPr>
             <w:rFonts w:ascii="Calibri" w:hAnsi="Calibri" w:eastAsia="Calibri"/>
@@ -6019,7 +6661,7 @@
         </w:rPr>
         <w:t xml:space="preserve"> - Repository tham chiếu, pin commit 894fdb651326b7c68f13967886fea2ee04831b3a. </w:t>
       </w:r>
-      <w:hyperlink r:id="rId14">
+      <w:hyperlink r:id="rId10">
         <w:r>
           <w:rPr>
             <w:rFonts w:ascii="Calibri" w:hAnsi="Calibri" w:eastAsia="Calibri"/>
@@ -6057,7 +6699,7 @@
         </w:rPr>
         <w:t xml:space="preserve"> - OOF repair, 5-fold, non-square input và augmentation. </w:t>
       </w:r>
-      <w:hyperlink r:id="rId15">
+      <w:hyperlink r:id="rId11">
         <w:r>
           <w:rPr>
             <w:rFonts w:ascii="Calibri" w:hAnsi="Calibri" w:eastAsia="Calibri"/>
@@ -6095,7 +6737,7 @@
         </w:rPr>
         <w:t xml:space="preserve"> - Fold ensemble, soft-label rule, multi-label mixing, balancing và TTA. </w:t>
       </w:r>
-      <w:hyperlink r:id="rId16">
+      <w:hyperlink r:id="rId12">
         <w:r>
           <w:rPr>
             <w:rFonts w:ascii="Calibri" w:hAnsi="Calibri" w:eastAsia="Calibri"/>
@@ -6133,7 +6775,7 @@
         </w:rPr>
         <w:t xml:space="preserve"> - Ví dụ domain-pretrained CropNet và protocol khác scratch. </w:t>
       </w:r>
-      <w:hyperlink r:id="rId17">
+      <w:hyperlink r:id="rId13">
         <w:r>
           <w:rPr>
             <w:rFonts w:ascii="Calibri" w:hAnsi="Calibri" w:eastAsia="Calibri"/>
@@ -6171,7 +6813,7 @@
         </w:rPr>
         <w:t xml:space="preserve"> - Đặc điểm ảnh nông nghiệp hiện trường và unlabeled-data setting. </w:t>
       </w:r>
-      <w:hyperlink r:id="rId18">
+      <w:hyperlink r:id="rId14">
         <w:r>
           <w:rPr>
             <w:rFonts w:ascii="Calibri" w:hAnsi="Calibri" w:eastAsia="Calibri"/>
@@ -6209,7 +6851,7 @@
         </w:rPr>
         <w:t xml:space="preserve"> - Ứng viên synthetic fine-grained chính. </w:t>
       </w:r>
-      <w:hyperlink r:id="rId19">
+      <w:hyperlink r:id="rId15">
         <w:r>
           <w:rPr>
             <w:rFonts w:ascii="Calibri" w:hAnsi="Calibri" w:eastAsia="Calibri"/>
@@ -6247,7 +6889,7 @@
         </w:rPr>
         <w:t xml:space="preserve"> - Implementation tham khảo cho feasibility/provenance. </w:t>
       </w:r>
-      <w:hyperlink r:id="rId20">
+      <w:hyperlink r:id="rId16">
         <w:r>
           <w:rPr>
             <w:rFonts w:ascii="Calibri" w:hAnsi="Calibri" w:eastAsia="Calibri"/>
@@ -6285,7 +6927,7 @@
         </w:rPr>
         <w:t xml:space="preserve"> - Diffusion augmentation hướng label-preserving. </w:t>
       </w:r>
-      <w:hyperlink r:id="rId21">
+      <w:hyperlink r:id="rId17">
         <w:r>
           <w:rPr>
             <w:rFonts w:ascii="Calibri" w:hAnsi="Calibri" w:eastAsia="Calibri"/>
@@ -6323,7 +6965,83 @@
         </w:rPr>
         <w:t xml:space="preserve"> - Class-agnostic context/pose conditioning cho fine-grained synthetic data. </w:t>
       </w:r>
-      <w:hyperlink r:id="rId22">
+      <w:hyperlink r:id="rId18">
+        <w:r>
+          <w:rPr>
+            <w:rFonts w:ascii="Calibri" w:hAnsi="Calibri" w:eastAsia="Calibri"/>
+            <w:color w:val="2E74B5"/>
+            <w:u w:val="single"/>
+          </w:rPr>
+          <w:t>Mở nguồn</w:t>
+        </w:r>
+      </w:hyperlink>
+    </w:p>
+    <w:p>
+      <w:pPr>
+        <w:keepLines/>
+        <w:widowControl/>
+        <w:numPr>
+          <w:ilvl w:val="0"/>
+          <w:numId w:val="15"/>
+        </w:numPr>
+        <w:spacing w:after="160" w:line="280" w:lineRule="auto"/>
+      </w:pPr>
+      <w:r>
+        <w:rPr>
+          <w:rFonts w:ascii="Calibri" w:hAnsi="Calibri" w:eastAsia="Calibri"/>
+          <w:b/>
+          <w:color w:val="202124"/>
+          <w:sz w:val="21"/>
+        </w:rPr>
+        <w:t>Adversarial Auto-Augment with Label Preservation, NeurIPS 2022</w:t>
+      </w:r>
+      <w:r>
+        <w:rPr>
+          <w:rFonts w:ascii="Calibri" w:hAnsi="Calibri" w:eastAsia="Calibri"/>
+          <w:color w:val="202124"/>
+          <w:sz w:val="21"/>
+        </w:rPr>
+        <w:t xml:space="preserve"> - Nguồn phương trình hard-positive và label-preserving constraint cho LP-A3 A0. </w:t>
+      </w:r>
+      <w:hyperlink r:id="rId19">
+        <w:r>
+          <w:rPr>
+            <w:rFonts w:ascii="Calibri" w:hAnsi="Calibri" w:eastAsia="Calibri"/>
+            <w:color w:val="2E74B5"/>
+            <w:u w:val="single"/>
+          </w:rPr>
+          <w:t>Mở nguồn</w:t>
+        </w:r>
+      </w:hyperlink>
+    </w:p>
+    <w:p>
+      <w:pPr>
+        <w:keepLines/>
+        <w:widowControl/>
+        <w:numPr>
+          <w:ilvl w:val="0"/>
+          <w:numId w:val="15"/>
+        </w:numPr>
+        <w:spacing w:after="160" w:line="280" w:lineRule="auto"/>
+      </w:pPr>
+      <w:r>
+        <w:rPr>
+          <w:rFonts w:ascii="Calibri" w:hAnsi="Calibri" w:eastAsia="Calibri"/>
+          <w:b/>
+          <w:color w:val="202124"/>
+          <w:sz w:val="21"/>
+        </w:rPr>
+        <w:t>LP-A3 official reference repository</w:t>
+      </w:r>
+      <w:r>
+        <w:rPr>
+          <w:rFonts w:ascii="Calibri" w:hAnsi="Calibri" w:eastAsia="Calibri"/>
+          <w:color w:val="202124"/>
+          <w:sz w:val="21"/>
+        </w:rPr>
+        <w:t xml:space="preserve"> - Pin commit 7059ca393b5cdfa04cf3304bb86c4c79712adfa3; không thấy license nên không copy/import code. </w:t>
+      </w:r>
+      <w:hyperlink r:id="rId20">
         <w:r>
           <w:rPr>
             <w:rFonts w:ascii="Calibri" w:hAnsi="Calibri" w:eastAsia="Calibri"/>
@@ -6335,10 +7053,6 @@
       </w:hyperlink>
     </w:p>
     <w:sectPr>
-      <w:headerReference w:type="default" r:id="rId9"/>
-      <w:headerReference w:type="even" r:id="rId10"/>
-      <w:footerReference w:type="default" r:id="rId11"/>
-      <w:footerReference w:type="even" r:id="rId12"/>
       <w:pgSz w:w="12240" w:h="15840"/>
       <w:pgMar w:top="1440" w:right="1440" w:bottom="1440" w:left="1440" w:header="605" w:footer="605" w:gutter="0"/>
       <w:cols w:space="720"/>
@@ -6346,160 +7060,6 @@
     </w:sectPr>
   </w:body>
 </w:document>
-</file>
-
-<file path=word/footer1.xml><?xml version="1.0" encoding="utf-8"?>
-<w:ftr xmlns:m="http://schemas.openxmlformats.org/officeDocument/2006/math" xmlns:mc="http://schemas.openxmlformats.org/markup-compatibility/2006" xmlns:mo="http://schemas.microsoft.com/office/mac/office/2008/main" xmlns:mv="urn:schemas-microsoft-com:mac:vml" xmlns:o="urn:schemas-microsoft-com:office:office" xmlns:r="http://schemas.openxmlformats.org/officeDocument/2006/relationships" xmlns:v="urn:schemas-microsoft-com:vml" xmlns:w10="urn:schemas-microsoft-com:office:word" xmlns:w14="http://schemas.microsoft.com/office/word/2010/wordml" xmlns:w="http://schemas.openxmlformats.org/wordprocessingml/2006/main" xmlns:wne="http://schemas.microsoft.com/office/word/2006/wordml" xmlns:wp14="http://schemas.microsoft.com/office/word/2010/wordprocessingDrawing" xmlns:wp="http://schemas.openxmlformats.org/drawingml/2006/wordprocessingDrawing" xmlns:wpc="http://schemas.microsoft.com/office/word/2010/wordprocessingCanvas" xmlns:wpg="http://schemas.microsoft.com/office/word/2010/wordprocessingGroup" xmlns:wpi="http://schemas.microsoft.com/office/word/2010/wordprocessingInk" xmlns:wps="http://schemas.microsoft.com/office/word/2010/wordprocessingShape" mc:Ignorable="w14 wp14">
-  <w:p>
-    <w:pPr>
-      <w:pStyle w:val="Footer"/>
-      <w:tabs>
-        <w:tab w:pos="9360" w:val="right"/>
-      </w:tabs>
-      <w:spacing w:before="0" w:after="0"/>
-      <w:jc w:val="left"/>
-    </w:pPr>
-    <w:r>
-      <w:rPr>
-        <w:rFonts w:ascii="Calibri" w:hAnsi="Calibri" w:eastAsia="Calibri"/>
-        <w:color w:val="5F6368"/>
-        <w:sz w:val="18"/>
-      </w:rPr>
-      <w:t>Research process &amp; status</w:t>
-    </w:r>
-    <w:r>
-      <w:rPr>
-        <w:rFonts w:ascii="Calibri" w:hAnsi="Calibri" w:eastAsia="Calibri"/>
-        <w:color w:val="5F6368"/>
-        <w:sz w:val="18"/>
-      </w:rPr>
-      <w:tab/>
-      <w:t xml:space="preserve">Trang </w:t>
-    </w:r>
-    <w:r>
-      <w:rPr>
-        <w:rFonts w:ascii="Calibri" w:hAnsi="Calibri" w:eastAsia="Calibri"/>
-        <w:color w:val="5F6368"/>
-        <w:sz w:val="18"/>
-      </w:rPr>
-      <w:fldChar w:fldCharType="begin"/>
-      <w:instrText xml:space="preserve"> PAGE </w:instrText>
-      <w:fldChar w:fldCharType="separate"/>
-      <w:t>1</w:t>
-      <w:fldChar w:fldCharType="end"/>
-    </w:r>
-  </w:p>
-</w:ftr>
-</file>
-
-<file path=word/footer2.xml><?xml version="1.0" encoding="utf-8"?>
-<w:ftr xmlns:m="http://schemas.openxmlformats.org/officeDocument/2006/math" xmlns:mc="http://schemas.openxmlformats.org/markup-compatibility/2006" xmlns:mo="http://schemas.microsoft.com/office/mac/office/2008/main" xmlns:mv="urn:schemas-microsoft-com:mac:vml" xmlns:o="urn:schemas-microsoft-com:office:office" xmlns:r="http://schemas.openxmlformats.org/officeDocument/2006/relationships" xmlns:v="urn:schemas-microsoft-com:vml" xmlns:w10="urn:schemas-microsoft-com:office:word" xmlns:w14="http://schemas.microsoft.com/office/word/2010/wordml" xmlns:w="http://schemas.openxmlformats.org/wordprocessingml/2006/main" xmlns:wne="http://schemas.microsoft.com/office/word/2006/wordml" xmlns:wp14="http://schemas.microsoft.com/office/word/2010/wordprocessingDrawing" xmlns:wp="http://schemas.openxmlformats.org/drawingml/2006/wordprocessingDrawing" xmlns:wpc="http://schemas.microsoft.com/office/word/2010/wordprocessingCanvas" xmlns:wpg="http://schemas.microsoft.com/office/word/2010/wordprocessingGroup" xmlns:wpi="http://schemas.microsoft.com/office/word/2010/wordprocessingInk" xmlns:wps="http://schemas.microsoft.com/office/word/2010/wordprocessingShape" mc:Ignorable="w14 wp14">
-  <w:p>
-    <w:pPr>
-      <w:pStyle w:val="Footer"/>
-      <w:tabs>
-        <w:tab w:pos="9360" w:val="right"/>
-      </w:tabs>
-      <w:spacing w:before="0" w:after="0"/>
-      <w:jc w:val="left"/>
-    </w:pPr>
-    <w:r>
-      <w:rPr>
-        <w:rFonts w:ascii="Calibri" w:hAnsi="Calibri" w:eastAsia="Calibri"/>
-        <w:color w:val="5F6368"/>
-        <w:sz w:val="18"/>
-      </w:rPr>
-      <w:t>Research process &amp; status</w:t>
-    </w:r>
-    <w:r>
-      <w:rPr>
-        <w:rFonts w:ascii="Calibri" w:hAnsi="Calibri" w:eastAsia="Calibri"/>
-        <w:color w:val="5F6368"/>
-        <w:sz w:val="18"/>
-      </w:rPr>
-      <w:tab/>
-      <w:t xml:space="preserve">Trang </w:t>
-    </w:r>
-    <w:r>
-      <w:rPr>
-        <w:rFonts w:ascii="Calibri" w:hAnsi="Calibri" w:eastAsia="Calibri"/>
-        <w:color w:val="5F6368"/>
-        <w:sz w:val="18"/>
-      </w:rPr>
-      <w:fldChar w:fldCharType="begin"/>
-      <w:instrText xml:space="preserve"> PAGE </w:instrText>
-      <w:fldChar w:fldCharType="separate"/>
-      <w:t>1</w:t>
-      <w:fldChar w:fldCharType="end"/>
-    </w:r>
-  </w:p>
-</w:ftr>
-</file>
-
-<file path=word/header1.xml><?xml version="1.0" encoding="utf-8"?>
-<w:hdr xmlns:m="http://schemas.openxmlformats.org/officeDocument/2006/math" xmlns:mc="http://schemas.openxmlformats.org/markup-compatibility/2006" xmlns:mo="http://schemas.microsoft.com/office/mac/office/2008/main" xmlns:mv="urn:schemas-microsoft-com:mac:vml" xmlns:o="urn:schemas-microsoft-com:office:office" xmlns:r="http://schemas.openxmlformats.org/officeDocument/2006/relationships" xmlns:v="urn:schemas-microsoft-com:vml" xmlns:w10="urn:schemas-microsoft-com:office:word" xmlns:w14="http://schemas.microsoft.com/office/word/2010/wordml" xmlns:w="http://schemas.openxmlformats.org/wordprocessingml/2006/main" xmlns:wne="http://schemas.microsoft.com/office/word/2006/wordml" xmlns:wp14="http://schemas.microsoft.com/office/word/2010/wordprocessingDrawing" xmlns:wp="http://schemas.openxmlformats.org/drawingml/2006/wordprocessingDrawing" xmlns:wpc="http://schemas.microsoft.com/office/word/2010/wordprocessingCanvas" xmlns:wpg="http://schemas.microsoft.com/office/word/2010/wordprocessingGroup" xmlns:wpi="http://schemas.microsoft.com/office/word/2010/wordprocessingInk" xmlns:wps="http://schemas.microsoft.com/office/word/2010/wordprocessingShape" mc:Ignorable="w14 wp14">
-  <w:p>
-    <w:pPr>
-      <w:pStyle w:val="Header"/>
-      <w:tabs>
-        <w:tab w:pos="9360" w:val="right"/>
-      </w:tabs>
-      <w:spacing w:after="0"/>
-      <w:jc w:val="left"/>
-    </w:pPr>
-    <w:r>
-      <w:rPr>
-        <w:rFonts w:ascii="Calibri" w:hAnsi="Calibri" w:eastAsia="Calibri"/>
-        <w:b/>
-        <w:color w:val="5F6368"/>
-        <w:sz w:val="17"/>
-      </w:rPr>
-      <w:t>TRKH 5-CLASS RESEARCH</w:t>
-    </w:r>
-    <w:r>
-      <w:rPr>
-        <w:rFonts w:ascii="Calibri" w:hAnsi="Calibri" w:eastAsia="Calibri"/>
-        <w:color w:val="5F6368"/>
-        <w:sz w:val="17"/>
-      </w:rPr>
-      <w:tab/>
-      <w:t>classification-only-research</w:t>
-    </w:r>
-  </w:p>
-</w:hdr>
-</file>
-
-<file path=word/header2.xml><?xml version="1.0" encoding="utf-8"?>
-<w:hdr xmlns:m="http://schemas.openxmlformats.org/officeDocument/2006/math" xmlns:mc="http://schemas.openxmlformats.org/markup-compatibility/2006" xmlns:mo="http://schemas.microsoft.com/office/mac/office/2008/main" xmlns:mv="urn:schemas-microsoft-com:mac:vml" xmlns:o="urn:schemas-microsoft-com:office:office" xmlns:r="http://schemas.openxmlformats.org/officeDocument/2006/relationships" xmlns:v="urn:schemas-microsoft-com:vml" xmlns:w10="urn:schemas-microsoft-com:office:word" xmlns:w14="http://schemas.microsoft.com/office/word/2010/wordml" xmlns:w="http://schemas.openxmlformats.org/wordprocessingml/2006/main" xmlns:wne="http://schemas.microsoft.com/office/word/2006/wordml" xmlns:wp14="http://schemas.microsoft.com/office/word/2010/wordprocessingDrawing" xmlns:wp="http://schemas.openxmlformats.org/drawingml/2006/wordprocessingDrawing" xmlns:wpc="http://schemas.microsoft.com/office/word/2010/wordprocessingCanvas" xmlns:wpg="http://schemas.microsoft.com/office/word/2010/wordprocessingGroup" xmlns:wpi="http://schemas.microsoft.com/office/word/2010/wordprocessingInk" xmlns:wps="http://schemas.microsoft.com/office/word/2010/wordprocessingShape" mc:Ignorable="w14 wp14">
-  <w:p>
-    <w:pPr>
-      <w:pStyle w:val="Header"/>
-      <w:tabs>
-        <w:tab w:pos="9360" w:val="right"/>
-      </w:tabs>
-      <w:spacing w:after="0"/>
-      <w:jc w:val="left"/>
-    </w:pPr>
-    <w:r>
-      <w:rPr>
-        <w:rFonts w:ascii="Calibri" w:hAnsi="Calibri" w:eastAsia="Calibri"/>
-        <w:b/>
-        <w:color w:val="5F6368"/>
-        <w:sz w:val="17"/>
-      </w:rPr>
-      <w:t>TRKH 5-CLASS RESEARCH</w:t>
-    </w:r>
-    <w:r>
-      <w:rPr>
-        <w:rFonts w:ascii="Calibri" w:hAnsi="Calibri" w:eastAsia="Calibri"/>
-        <w:color w:val="5F6368"/>
-        <w:sz w:val="17"/>
-      </w:rPr>
-      <w:tab/>
-      <w:t>classification-only-research</w:t>
-    </w:r>
-  </w:p>
-</w:hdr>
 </file>
 
 <file path=word/numbering.xml><?xml version="1.0" encoding="utf-8"?>

</xml_diff>

<commit_message>
docs: close NSA A0 and refresh research status
</commit_message>
<xml_diff>
--- a/docs/TRKH_5CLASS_RESEARCH_PROCESS_STATUS.docx
+++ b/docs/TRKH_5CLASS_RESEARCH_PROCESS_STATUS.docx
@@ -75,7 +75,7 @@
           <w:color w:val="202124"/>
           <w:sz w:val="21"/>
         </w:rPr>
-        <w:t>2026-07-24 | Revision 6</w:t>
+        <w:t>2026-07-24 | Revision 7</w:t>
       </w:r>
     </w:p>
     <w:p>
@@ -97,7 +97,7 @@
           <w:color w:val="202124"/>
           <w:sz w:val="21"/>
         </w:rPr>
-        <w:t>Đang nghiên cứu - LP-A3 A0 đã bị loại; chưa có checkpoint mới</w:t>
+        <w:t>Đang nghiên cứu - NSA A0 đã bị loại; đang khóa RN-LISDA train-only</w:t>
       </w:r>
     </w:p>
     <w:p>
@@ -340,7 +340,7 @@
                 <w:color w:val="5F6368"/>
                 <w:sz w:val="16"/>
               </w:rPr>
-              <w:t>LP-A3 HARD-POSITIVE A0</w:t>
+              <w:t>NSA POISSON A0</w:t>
             </w:r>
           </w:p>
           <w:p>
@@ -367,7 +367,7 @@
                 <w:color w:val="202124"/>
                 <w:sz w:val="17"/>
               </w:rPr>
-              <w:t>TP 0,9922; rival 0,9648; FP reject 0,0315</w:t>
+              <w:t>AUROC 0,8214; TP 0,9754; FP reject 0,1396</w:t>
             </w:r>
           </w:p>
         </w:tc>
@@ -412,7 +412,7 @@
           <w:color w:val="202124"/>
           <w:sz w:val="21"/>
         </w:rPr>
-        <w:t>Giữ nguyên keeper hiện tại và file lệnh full-train tốt nhất. Full train random-init 30 epoch không thắng validation gate; JPEG-DL, SaSPA synthetic và LP-A3-inspired hard-positive A0 đều đã bị loại. LP-A3 dùng đủ 9.215 train rows, không mở validation/test và replay exact, nhưng chỉ loại 7/222 restricted FP, tạo 9 FP mới, phá 2 TP và không chứng minh tác dụng nhân quả của label hinge; trainer và full train không được mở.</w:t>
+        <w:t>Giữ nguyên keeper hiện tại và file lệnh full-train tốt nhất. Full train random-init 30 epoch không thắng validation gate; JPEG-DL, SaSPA synthetic, LP-A3 hard-positive và NSA class-pair Poisson A0 đều đã bị loại. NSA dùng đủ 9.215 train rows với năm source-held fold, không mở validation/test; candidate không hơn clean/no-query/permuted controls, chỉ đạt AUROC 0,821398, giữ 0,975379 TP và loại 0,139640 restricted FP. Trainer, validation và full train không được mở từ kết quả này.</w:t>
       </w:r>
     </w:p>
     <w:p>
@@ -1893,6 +1893,146 @@
           </w:p>
         </w:tc>
       </w:tr>
+      <w:tr>
+        <w:trPr>
+          <w:cantSplit/>
+        </w:trPr>
+        <w:tc>
+          <w:tcPr>
+            <w:tcW w:type="dxa" w:w="1500"/>
+            <w:tcMar>
+              <w:top w:w="80" w:type="dxa"/>
+              <w:start w:w="120" w:type="dxa"/>
+              <w:bottom w:w="80" w:type="dxa"/>
+              <w:end w:w="120" w:type="dxa"/>
+            </w:tcMar>
+            <w:vAlign w:val="center"/>
+          </w:tcPr>
+          <w:p>
+            <w:pPr>
+              <w:widowControl/>
+              <w:spacing w:after="0" w:line="247" w:lineRule="auto"/>
+              <w:jc w:val="left"/>
+            </w:pPr>
+            <w:r>
+              <w:rPr>
+                <w:rFonts w:ascii="Calibri" w:hAnsi="Calibri" w:eastAsia="Calibri"/>
+                <w:color w:val="202124"/>
+                <w:sz w:val="18"/>
+              </w:rPr>
+              <w:t>NSA class-pair Poisson A0</w:t>
+            </w:r>
+          </w:p>
+        </w:tc>
+        <w:tc>
+          <w:tcPr>
+            <w:tcW w:type="dxa" w:w="2250"/>
+            <w:tcMar>
+              <w:top w:w="80" w:type="dxa"/>
+              <w:start w:w="120" w:type="dxa"/>
+              <w:bottom w:w="80" w:type="dxa"/>
+              <w:end w:w="120" w:type="dxa"/>
+            </w:tcMar>
+            <w:vAlign w:val="center"/>
+          </w:tcPr>
+          <w:p>
+            <w:pPr>
+              <w:widowControl/>
+              <w:spacing w:after="0" w:line="247" w:lineRule="auto"/>
+              <w:jc w:val="left"/>
+            </w:pPr>
+            <w:r>
+              <w:rPr>
+                <w:rFonts w:ascii="Calibri" w:hAnsi="Calibri" w:eastAsia="Calibri"/>
+                <w:color w:val="202124"/>
+                <w:sz w:val="18"/>
+              </w:rPr>
+              <w:t>9.215 train; 5 source-held folds</w:t>
+            </w:r>
+          </w:p>
+        </w:tc>
+        <w:tc>
+          <w:tcPr>
+            <w:tcW w:type="dxa" w:w="1050"/>
+            <w:tcMar>
+              <w:top w:w="80" w:type="dxa"/>
+              <w:start w:w="120" w:type="dxa"/>
+              <w:bottom w:w="80" w:type="dxa"/>
+              <w:end w:w="120" w:type="dxa"/>
+            </w:tcMar>
+            <w:vAlign w:val="center"/>
+          </w:tcPr>
+          <w:p>
+            <w:pPr>
+              <w:widowControl/>
+              <w:spacing w:after="0" w:line="247" w:lineRule="auto"/>
+              <w:jc w:val="center"/>
+            </w:pPr>
+            <w:r>
+              <w:rPr>
+                <w:rFonts w:ascii="Calibri" w:hAnsi="Calibri" w:eastAsia="Calibri"/>
+                <w:color w:val="202124"/>
+                <w:sz w:val="18"/>
+              </w:rPr>
+              <w:t>N/A</w:t>
+            </w:r>
+          </w:p>
+        </w:tc>
+        <w:tc>
+          <w:tcPr>
+            <w:tcW w:type="dxa" w:w="2450"/>
+            <w:tcMar>
+              <w:top w:w="80" w:type="dxa"/>
+              <w:start w:w="120" w:type="dxa"/>
+              <w:bottom w:w="80" w:type="dxa"/>
+              <w:end w:w="120" w:type="dxa"/>
+            </w:tcMar>
+            <w:vAlign w:val="center"/>
+          </w:tcPr>
+          <w:p>
+            <w:pPr>
+              <w:widowControl/>
+              <w:spacing w:after="0" w:line="247" w:lineRule="auto"/>
+              <w:jc w:val="left"/>
+            </w:pPr>
+            <w:r>
+              <w:rPr>
+                <w:rFonts w:ascii="Calibri" w:hAnsi="Calibri" w:eastAsia="Calibri"/>
+                <w:color w:val="202124"/>
+                <w:sz w:val="18"/>
+              </w:rPr>
+              <w:t>AUROC/TP/FP reject 0,8214 / 0,9754 / 0,1396</w:t>
+            </w:r>
+          </w:p>
+        </w:tc>
+        <w:tc>
+          <w:tcPr>
+            <w:tcW w:type="dxa" w:w="2110"/>
+            <w:tcMar>
+              <w:top w:w="80" w:type="dxa"/>
+              <w:start w:w="120" w:type="dxa"/>
+              <w:bottom w:w="80" w:type="dxa"/>
+              <w:end w:w="120" w:type="dxa"/>
+            </w:tcMar>
+            <w:vAlign w:val="center"/>
+          </w:tcPr>
+          <w:p>
+            <w:pPr>
+              <w:widowControl/>
+              <w:spacing w:after="0" w:line="247" w:lineRule="auto"/>
+              <w:jc w:val="left"/>
+            </w:pPr>
+            <w:r>
+              <w:rPr>
+                <w:rFonts w:ascii="Calibri" w:hAnsi="Calibri" w:eastAsia="Calibri"/>
+                <w:color w:val="202124"/>
+                <w:sz w:val="18"/>
+              </w:rPr>
+              <w:t>Rejected; maps diffuse, không hơn controls</w:t>
+            </w:r>
+          </w:p>
+        </w:tc>
+      </w:tr>
     </w:tbl>
     <w:p>
       <w:pPr>
@@ -2036,7 +2176,43 @@
           <w:color w:val="202124"/>
           <w:sz w:val="22"/>
         </w:rPr>
-        <w:t>Augmentation, preprocessing và synthetic data sinh từ dữ liệu hiện có được phép, với điều kiện chỉ dùng phía train và có provenance đầy đủ.</w:t>
+        <w:t>Augmentation, preprocessing và synthetic data sinh từ dữ liệu hiện có được phép, với điều kiện chỉ dùng fitting-train của từng fold và có provenance đầy đủ.</w:t>
+      </w:r>
+    </w:p>
+    <w:p>
+      <w:pPr>
+        <w:widowControl/>
+        <w:numPr>
+          <w:ilvl w:val="0"/>
+          <w:numId w:val="10"/>
+        </w:numPr>
+        <w:spacing w:after="160" w:line="280" w:lineRule="auto"/>
+      </w:pPr>
+      <w:r>
+        <w:rPr>
+          <w:rFonts w:ascii="Calibri" w:hAnsi="Calibri" w:eastAsia="Calibri"/>
+          <w:color w:val="202124"/>
+          <w:sz w:val="22"/>
+        </w:rPr>
+        <w:t>Mọi child kế thừa source-group, split và fold của toàn bộ parent; child nhiều parent kế thừa hợp các ràng buộc nên không thể vượt qua bất kỳ biên nguồn nào.</w:t>
+      </w:r>
+    </w:p>
+    <w:p>
+      <w:pPr>
+        <w:widowControl/>
+        <w:numPr>
+          <w:ilvl w:val="0"/>
+          <w:numId w:val="10"/>
+        </w:numPr>
+        <w:spacing w:after="160" w:line="280" w:lineRule="auto"/>
+      </w:pPr>
+      <w:r>
+        <w:rPr>
+          <w:rFonts w:ascii="Calibri" w:hAnsi="Calibri" w:eastAsia="Calibri"/>
+          <w:color w:val="202124"/>
+          <w:sz w:val="22"/>
+        </w:rPr>
+        <w:t>Corpus dẫn xuất phải được đóng băng trước cross-split duplicate audit. Match với validation/test chỉ được vô hiệu hóa toàn bộ corpus hoặc phương pháp; không được loại riêng row, sinh bù, đổi generator hay phản hồi threshold vào training.</w:t>
       </w:r>
     </w:p>
     <w:p>
@@ -2064,7 +2240,7 @@
           <w:color w:val="202124"/>
           <w:sz w:val="21"/>
         </w:rPr>
-        <w:t>Validation/test không được tham gia fit generator, tạo prompt, chọn ảnh synthetic, huấn luyện bộ lọc, chọn tỷ lệ synthetic, chọn threshold hoặc quyết định kiến trúc. Mọi ngoại lệ làm mất hiệu lực gate.</w:t>
+        <w:t>Validation/test không được tham gia fit generator, tạo prompt, chọn child, huấn luyện bộ lọc, chọn tỷ lệ synthetic, chọn threshold hoặc quyết định kiến trúc. Candidate train-only phải cài file-open ledger trước lần đọc đầu tiên, chặn mọi path component val/valid/validation/test và replay exact access digest. Validation chỉ được mở bởi auditor riêng sau khi candidate, corpus và quyết định promotion đã đóng băng.</w:t>
       </w:r>
     </w:p>
     <w:p>
@@ -3293,6 +3469,92 @@
                 <w:color w:val="202124"/>
                 <w:sz w:val="18"/>
               </w:rPr>
+              <w:t>Synthetic tự nhiên nhưng phi nhân quả</w:t>
+            </w:r>
+          </w:p>
+        </w:tc>
+        <w:tc>
+          <w:tcPr>
+            <w:tcW w:type="dxa" w:w="4000"/>
+            <w:tcMar>
+              <w:top w:w="80" w:type="dxa"/>
+              <w:start w:w="120" w:type="dxa"/>
+              <w:bottom w:w="80" w:type="dxa"/>
+              <w:end w:w="120" w:type="dxa"/>
+            </w:tcMar>
+            <w:vAlign w:val="center"/>
+          </w:tcPr>
+          <w:p>
+            <w:pPr>
+              <w:widowControl/>
+              <w:spacing w:after="0" w:line="247" w:lineRule="auto"/>
+              <w:jc w:val="left"/>
+            </w:pPr>
+            <w:r>
+              <w:rPr>
+                <w:rFonts w:ascii="Calibri" w:hAnsi="Calibri" w:eastAsia="Calibri"/>
+                <w:color w:val="202124"/>
+                <w:sz w:val="18"/>
+              </w:rPr>
+              <w:t>NSA tạo composite Poisson tự nhiên nhưng AUROC 0,821398, TP retention 0,975379 và cross-map mass trong target chỉ 0,092528.</w:t>
+            </w:r>
+          </w:p>
+        </w:tc>
+        <w:tc>
+          <w:tcPr>
+            <w:tcW w:type="dxa" w:w="3460"/>
+            <w:tcMar>
+              <w:top w:w="80" w:type="dxa"/>
+              <w:start w:w="120" w:type="dxa"/>
+              <w:bottom w:w="80" w:type="dxa"/>
+              <w:end w:w="120" w:type="dxa"/>
+            </w:tcMar>
+            <w:vAlign w:val="center"/>
+          </w:tcPr>
+          <w:p>
+            <w:pPr>
+              <w:widowControl/>
+              <w:spacing w:after="0" w:line="247" w:lineRule="auto"/>
+              <w:jc w:val="left"/>
+            </w:pPr>
+            <w:r>
+              <w:rPr>
+                <w:rFonts w:ascii="Calibri" w:hAnsi="Calibri" w:eastAsia="Calibri"/>
+                <w:color w:val="202124"/>
+                <w:sz w:val="18"/>
+              </w:rPr>
+              <w:t>Hình học hợp lệ không đủ; cơ chế phải hơn clean/no-query/permuted controls và định vị đúng tín hiệu.</w:t>
+            </w:r>
+          </w:p>
+        </w:tc>
+      </w:tr>
+      <w:tr>
+        <w:trPr>
+          <w:cantSplit/>
+        </w:trPr>
+        <w:tc>
+          <w:tcPr>
+            <w:tcW w:type="dxa" w:w="1900"/>
+            <w:tcMar>
+              <w:top w:w="80" w:type="dxa"/>
+              <w:start w:w="120" w:type="dxa"/>
+              <w:bottom w:w="80" w:type="dxa"/>
+              <w:end w:w="120" w:type="dxa"/>
+            </w:tcMar>
+            <w:vAlign w:val="center"/>
+          </w:tcPr>
+          <w:p>
+            <w:pPr>
+              <w:widowControl/>
+              <w:spacing w:after="0" w:line="247" w:lineRule="auto"/>
+              <w:jc w:val="left"/>
+            </w:pPr>
+            <w:r>
+              <w:rPr>
+                <w:rFonts w:ascii="Calibri" w:hAnsi="Calibri" w:eastAsia="Calibri"/>
+                <w:color w:val="202124"/>
+                <w:sz w:val="18"/>
+              </w:rPr>
               <w:t>Worktree bẩn</w:t>
             </w:r>
           </w:p>
@@ -3491,6 +3753,24 @@
           <w:sz w:val="22"/>
         </w:rPr>
         <w:t>LP-A3-inspired hard positive: giữ TP cao nhưng FP rejection thấp, rival retention dưới gate và label hinge không hơn feature-only; không sweep radius/step/margin/lambda/noise/layer/erosion.</w:t>
+      </w:r>
+    </w:p>
+    <w:p>
+      <w:pPr>
+        <w:widowControl/>
+        <w:numPr>
+          <w:ilvl w:val="0"/>
+          <w:numId w:val="10"/>
+        </w:numPr>
+        <w:spacing w:after="160" w:line="280" w:lineRule="auto"/>
+      </w:pPr>
+      <w:r>
+        <w:rPr>
+          <w:rFonts w:ascii="Calibri" w:hAnsi="Calibri" w:eastAsia="Calibri"/>
+          <w:color w:val="202124"/>
+          <w:sz w:val="22"/>
+        </w:rPr>
+        <w:t>NSA class-pair Poisson: đóng exact geometry/query/adapter/readout neighborhood; không sweep support, Poisson mode, query width, epoch, readout hoặc metric gate sau khi candidate không hơn controls.</w:t>
       </w:r>
     </w:p>
     <w:p>
@@ -4501,6 +4781,350 @@
           </w:p>
         </w:tc>
       </w:tr>
+      <w:tr>
+        <w:trPr>
+          <w:cantSplit/>
+        </w:trPr>
+        <w:tc>
+          <w:tcPr>
+            <w:tcW w:type="dxa" w:w="1900"/>
+            <w:tcMar>
+              <w:top w:w="80" w:type="dxa"/>
+              <w:start w:w="120" w:type="dxa"/>
+              <w:bottom w:w="80" w:type="dxa"/>
+              <w:end w:w="120" w:type="dxa"/>
+            </w:tcMar>
+            <w:vAlign w:val="center"/>
+          </w:tcPr>
+          <w:p>
+            <w:pPr>
+              <w:widowControl/>
+              <w:spacing w:after="0" w:line="247" w:lineRule="auto"/>
+              <w:jc w:val="left"/>
+            </w:pPr>
+            <w:r>
+              <w:rPr>
+                <w:rFonts w:ascii="Calibri" w:hAnsi="Calibri" w:eastAsia="Calibri"/>
+                <w:color w:val="202124"/>
+                <w:sz w:val="18"/>
+              </w:rPr>
+              <w:t>NSA, ECCV 2022</w:t>
+            </w:r>
+          </w:p>
+        </w:tc>
+        <w:tc>
+          <w:tcPr>
+            <w:tcW w:type="dxa" w:w="3600"/>
+            <w:tcMar>
+              <w:top w:w="80" w:type="dxa"/>
+              <w:start w:w="120" w:type="dxa"/>
+              <w:bottom w:w="80" w:type="dxa"/>
+              <w:end w:w="120" w:type="dxa"/>
+            </w:tcMar>
+            <w:vAlign w:val="center"/>
+          </w:tcPr>
+          <w:p>
+            <w:pPr>
+              <w:widowControl/>
+              <w:spacing w:after="0" w:line="247" w:lineRule="auto"/>
+              <w:jc w:val="left"/>
+            </w:pPr>
+            <w:r>
+              <w:rPr>
+                <w:rFonts w:ascii="Calibri" w:hAnsi="Calibri" w:eastAsia="Calibri"/>
+                <w:color w:val="202124"/>
+                <w:sz w:val="18"/>
+              </w:rPr>
+              <w:t>Poisson patch từ ảnh nguồn khác tạo anomaly tự nhiên và giữ cấu trúc cục bộ.</w:t>
+            </w:r>
+          </w:p>
+        </w:tc>
+        <w:tc>
+          <w:tcPr>
+            <w:tcW w:type="dxa" w:w="3860"/>
+            <w:tcMar>
+              <w:top w:w="80" w:type="dxa"/>
+              <w:start w:w="120" w:type="dxa"/>
+              <w:bottom w:w="80" w:type="dxa"/>
+              <w:end w:w="120" w:type="dxa"/>
+            </w:tcMar>
+            <w:vAlign w:val="center"/>
+          </w:tcPr>
+          <w:p>
+            <w:pPr>
+              <w:widowControl/>
+              <w:spacing w:after="0" w:line="247" w:lineRule="auto"/>
+              <w:jc w:val="left"/>
+            </w:pPr>
+            <w:r>
+              <w:rPr>
+                <w:rFonts w:ascii="Calibri" w:hAnsi="Calibri" w:eastAsia="Calibri"/>
+                <w:color w:val="202124"/>
+                <w:sz w:val="18"/>
+              </w:rPr>
+              <w:t>A0 class-pair độc lập tạo ảnh tự nhiên nhưng mismatch map diffuse và không hơn ba matched controls; đóng neighborhood exact.</w:t>
+            </w:r>
+          </w:p>
+        </w:tc>
+      </w:tr>
+      <w:tr>
+        <w:trPr>
+          <w:cantSplit/>
+        </w:trPr>
+        <w:tc>
+          <w:tcPr>
+            <w:tcW w:type="dxa" w:w="1900"/>
+            <w:tcMar>
+              <w:top w:w="80" w:type="dxa"/>
+              <w:start w:w="120" w:type="dxa"/>
+              <w:bottom w:w="80" w:type="dxa"/>
+              <w:end w:w="120" w:type="dxa"/>
+            </w:tcMar>
+            <w:vAlign w:val="center"/>
+          </w:tcPr>
+          <w:p>
+            <w:pPr>
+              <w:widowControl/>
+              <w:spacing w:after="0" w:line="247" w:lineRule="auto"/>
+              <w:jc w:val="left"/>
+            </w:pPr>
+            <w:r>
+              <w:rPr>
+                <w:rFonts w:ascii="Calibri" w:hAnsi="Calibri" w:eastAsia="Calibri"/>
+                <w:color w:val="202124"/>
+                <w:sz w:val="18"/>
+              </w:rPr>
+              <w:t>ISDA, NeurIPS 2019</w:t>
+            </w:r>
+          </w:p>
+        </w:tc>
+        <w:tc>
+          <w:tcPr>
+            <w:tcW w:type="dxa" w:w="3600"/>
+            <w:tcMar>
+              <w:top w:w="80" w:type="dxa"/>
+              <w:start w:w="120" w:type="dxa"/>
+              <w:bottom w:w="80" w:type="dxa"/>
+              <w:end w:w="120" w:type="dxa"/>
+            </w:tcMar>
+            <w:vAlign w:val="center"/>
+          </w:tcPr>
+          <w:p>
+            <w:pPr>
+              <w:widowControl/>
+              <w:spacing w:after="0" w:line="247" w:lineRule="auto"/>
+              <w:jc w:val="left"/>
+            </w:pPr>
+            <w:r>
+              <w:rPr>
+                <w:rFonts w:ascii="Calibri" w:hAnsi="Calibri" w:eastAsia="Calibri"/>
+                <w:color w:val="202124"/>
+                <w:sz w:val="18"/>
+              </w:rPr>
+              <w:t>Ước lượng covariance theo lớp trong feature space và tối ưu robust CE tương đương semantic augmentation vô hạn.</w:t>
+            </w:r>
+          </w:p>
+        </w:tc>
+        <w:tc>
+          <w:tcPr>
+            <w:tcW w:type="dxa" w:w="3860"/>
+            <w:tcMar>
+              <w:top w:w="80" w:type="dxa"/>
+              <w:start w:w="120" w:type="dxa"/>
+              <w:bottom w:w="80" w:type="dxa"/>
+              <w:end w:w="120" w:type="dxa"/>
+            </w:tcMar>
+            <w:vAlign w:val="center"/>
+          </w:tcPr>
+          <w:p>
+            <w:pPr>
+              <w:widowControl/>
+              <w:spacing w:after="0" w:line="247" w:lineRule="auto"/>
+              <w:jc w:val="left"/>
+            </w:pPr>
+            <w:r>
+              <w:rPr>
+                <w:rFonts w:ascii="Calibri" w:hAnsi="Calibri" w:eastAsia="Calibri"/>
+                <w:color w:val="202124"/>
+                <w:sz w:val="18"/>
+              </w:rPr>
+              <w:t>Fixed class-wise ISDA tăng áp lực precision lớp 1 nhưng giảm recall; dùng làm control, không tự coi là winner.</w:t>
+            </w:r>
+          </w:p>
+        </w:tc>
+      </w:tr>
+      <w:tr>
+        <w:trPr>
+          <w:cantSplit/>
+        </w:trPr>
+        <w:tc>
+          <w:tcPr>
+            <w:tcW w:type="dxa" w:w="1900"/>
+            <w:tcMar>
+              <w:top w:w="80" w:type="dxa"/>
+              <w:start w:w="120" w:type="dxa"/>
+              <w:bottom w:w="80" w:type="dxa"/>
+              <w:end w:w="120" w:type="dxa"/>
+            </w:tcMar>
+            <w:vAlign w:val="center"/>
+          </w:tcPr>
+          <w:p>
+            <w:pPr>
+              <w:widowControl/>
+              <w:spacing w:after="0" w:line="247" w:lineRule="auto"/>
+              <w:jc w:val="left"/>
+            </w:pPr>
+            <w:r>
+              <w:rPr>
+                <w:rFonts w:ascii="Calibri" w:hAnsi="Calibri" w:eastAsia="Calibri"/>
+                <w:color w:val="202124"/>
+                <w:sz w:val="18"/>
+              </w:rPr>
+              <w:t>MetaSAug, CVPR 2021</w:t>
+            </w:r>
+          </w:p>
+        </w:tc>
+        <w:tc>
+          <w:tcPr>
+            <w:tcW w:type="dxa" w:w="3600"/>
+            <w:tcMar>
+              <w:top w:w="80" w:type="dxa"/>
+              <w:start w:w="120" w:type="dxa"/>
+              <w:bottom w:w="80" w:type="dxa"/>
+              <w:end w:w="120" w:type="dxa"/>
+            </w:tcMar>
+            <w:vAlign w:val="center"/>
+          </w:tcPr>
+          <w:p>
+            <w:pPr>
+              <w:widowControl/>
+              <w:spacing w:after="0" w:line="247" w:lineRule="auto"/>
+              <w:jc w:val="left"/>
+            </w:pPr>
+            <w:r>
+              <w:rPr>
+                <w:rFonts w:ascii="Calibri" w:hAnsi="Calibri" w:eastAsia="Calibri"/>
+                <w:color w:val="202124"/>
+                <w:sz w:val="18"/>
+              </w:rPr>
+              <w:t>Meta-learn hệ số semantic augmentation từ balanced meta objective cho dữ liệu long-tail.</w:t>
+            </w:r>
+          </w:p>
+        </w:tc>
+        <w:tc>
+          <w:tcPr>
+            <w:tcW w:type="dxa" w:w="3860"/>
+            <w:tcMar>
+              <w:top w:w="80" w:type="dxa"/>
+              <w:start w:w="120" w:type="dxa"/>
+              <w:bottom w:w="80" w:type="dxa"/>
+              <w:end w:w="120" w:type="dxa"/>
+            </w:tcMar>
+            <w:vAlign w:val="center"/>
+          </w:tcPr>
+          <w:p>
+            <w:pPr>
+              <w:widowControl/>
+              <w:spacing w:after="0" w:line="247" w:lineRule="auto"/>
+              <w:jc w:val="left"/>
+            </w:pPr>
+            <w:r>
+              <w:rPr>
+                <w:rFonts w:ascii="Calibri" w:hAnsi="Calibri" w:eastAsia="Calibri"/>
+                <w:color w:val="202124"/>
+                <w:sz w:val="18"/>
+              </w:rPr>
+              <w:t>Dùng source-held balanced meta rows chỉ từ train; real head batches vẫn giữ phân phối tự nhiên.</w:t>
+            </w:r>
+          </w:p>
+        </w:tc>
+      </w:tr>
+      <w:tr>
+        <w:trPr>
+          <w:cantSplit/>
+        </w:trPr>
+        <w:tc>
+          <w:tcPr>
+            <w:tcW w:type="dxa" w:w="1900"/>
+            <w:tcMar>
+              <w:top w:w="80" w:type="dxa"/>
+              <w:start w:w="120" w:type="dxa"/>
+              <w:bottom w:w="80" w:type="dxa"/>
+              <w:end w:w="120" w:type="dxa"/>
+            </w:tcMar>
+            <w:vAlign w:val="center"/>
+          </w:tcPr>
+          <w:p>
+            <w:pPr>
+              <w:widowControl/>
+              <w:spacing w:after="0" w:line="247" w:lineRule="auto"/>
+              <w:jc w:val="left"/>
+            </w:pPr>
+            <w:r>
+              <w:rPr>
+                <w:rFonts w:ascii="Calibri" w:hAnsi="Calibri" w:eastAsia="Calibri"/>
+                <w:color w:val="202124"/>
+                <w:sz w:val="18"/>
+              </w:rPr>
+              <w:t>LearnableISDA, IEEE TIP 2024</w:t>
+            </w:r>
+          </w:p>
+        </w:tc>
+        <w:tc>
+          <w:tcPr>
+            <w:tcW w:type="dxa" w:w="3600"/>
+            <w:tcMar>
+              <w:top w:w="80" w:type="dxa"/>
+              <w:start w:w="120" w:type="dxa"/>
+              <w:bottom w:w="80" w:type="dxa"/>
+              <w:end w:w="120" w:type="dxa"/>
+            </w:tcMar>
+            <w:vAlign w:val="center"/>
+          </w:tcPr>
+          <w:p>
+            <w:pPr>
+              <w:widowControl/>
+              <w:spacing w:after="0" w:line="247" w:lineRule="auto"/>
+              <w:jc w:val="left"/>
+            </w:pPr>
+            <w:r>
+              <w:rPr>
+                <w:rFonts w:ascii="Calibri" w:hAnsi="Calibri" w:eastAsia="Calibri"/>
+                <w:color w:val="202124"/>
+                <w:sz w:val="18"/>
+              </w:rPr>
+              <w:t>Học covariance/scale theo mẫu thay vì chỉ covariance cố định theo lớp.</w:t>
+            </w:r>
+          </w:p>
+        </w:tc>
+        <w:tc>
+          <w:tcPr>
+            <w:tcW w:type="dxa" w:w="3860"/>
+            <w:tcMar>
+              <w:top w:w="80" w:type="dxa"/>
+              <w:start w:w="120" w:type="dxa"/>
+              <w:bottom w:w="80" w:type="dxa"/>
+              <w:end w:w="120" w:type="dxa"/>
+            </w:tcMar>
+            <w:vAlign w:val="center"/>
+          </w:tcPr>
+          <w:p>
+            <w:pPr>
+              <w:widowControl/>
+              <w:spacing w:after="0" w:line="247" w:lineRule="auto"/>
+              <w:jc w:val="left"/>
+            </w:pPr>
+            <w:r>
+              <w:rPr>
+                <w:rFonts w:ascii="Calibri" w:hAnsi="Calibri" w:eastAsia="Calibri"/>
+                <w:color w:val="202124"/>
+                <w:sz w:val="18"/>
+              </w:rPr>
+              <w:t>Ứng viên kế tiếp là restricted-negative RN-LISDA frozen-embedding A0, tám role và replay khóa trước; tự cài phương trình, không copy code thiếu license.</w:t>
+            </w:r>
+          </w:p>
+        </w:tc>
+      </w:tr>
     </w:tbl>
     <w:p>
       <w:pPr>
@@ -4613,7 +5237,7 @@
           <w:color w:val="202124"/>
           <w:sz w:val="22"/>
         </w:rPr>
-        <w:t>Khóa split và source_group_id trước khi sinh. A0 dùng source-disjoint train folds; generator chỉ thấy fitting fold.</w:t>
+        <w:t>Khóa split và source_group_id trước khi sinh. A0 dùng source-disjoint train folds; generator chỉ thấy fitting fold; mỗi child kế thừa hợp source/fold của mọi parent.</w:t>
       </w:r>
     </w:p>
     <w:p>
@@ -4667,7 +5291,7 @@
           <w:color w:val="202124"/>
           <w:sz w:val="22"/>
         </w:rPr>
-        <w:t>Chạy exact-hash, perceptual-hash và embedding near-duplicate so với toàn bộ train/validation/test; loại mọi synthetic quá gần validation/test và báo threshold.</w:t>
+        <w:t>Đóng băng toàn bộ corpus rồi chạy exact-hash, perceptual-hash và embedding near-duplicate một chiều so với mọi split. Match validation/test chỉ được làm fail toàn bộ corpus/phương pháp; cấm loại riêng child, sinh bù, đổi generator hoặc tune threshold từ kết quả.</w:t>
       </w:r>
     </w:p>
     <w:p>
@@ -5388,7 +6012,7 @@
                 <w:color w:val="202124"/>
                 <w:sz w:val="18"/>
               </w:rPr>
-              <w:t>Hash/tóm tắt trước khi xóa chính xác artifact obsolete.</w:t>
+              <w:t>Hash/tóm tắt trước khi xóa chính xác artifact obsolete; hậu NSA pass 847 thư mục, 36/36 nguồn compact đã vắng.</w:t>
             </w:r>
           </w:p>
         </w:tc>
@@ -5415,7 +6039,7 @@
                 <w:color w:val="202124"/>
                 <w:sz w:val="18"/>
               </w:rPr>
-              <w:t>Giải phóng dung lượng mà không mất bằng chứng.</w:t>
+              <w:t>Giải phóng dung lượng mà không mất bằng chứng; 0 blocker và 88,918 GiB còn trống.</w:t>
             </w:r>
           </w:p>
         </w:tc>
@@ -5850,6 +6474,264 @@
           </w:p>
         </w:tc>
       </w:tr>
+      <w:tr>
+        <w:trPr>
+          <w:cantSplit/>
+        </w:trPr>
+        <w:tc>
+          <w:tcPr>
+            <w:tcW w:type="dxa" w:w="2550"/>
+            <w:tcMar>
+              <w:top w:w="80" w:type="dxa"/>
+              <w:start w:w="120" w:type="dxa"/>
+              <w:bottom w:w="80" w:type="dxa"/>
+              <w:end w:w="120" w:type="dxa"/>
+            </w:tcMar>
+            <w:vAlign w:val="center"/>
+          </w:tcPr>
+          <w:p>
+            <w:pPr>
+              <w:widowControl/>
+              <w:spacing w:after="0" w:line="247" w:lineRule="auto"/>
+              <w:jc w:val="left"/>
+            </w:pPr>
+            <w:r>
+              <w:rPr>
+                <w:rFonts w:ascii="Calibri" w:hAnsi="Calibri" w:eastAsia="Calibri"/>
+                <w:color w:val="202124"/>
+                <w:sz w:val="18"/>
+              </w:rPr>
+              <w:t>Canonical replay order</w:t>
+            </w:r>
+          </w:p>
+        </w:tc>
+        <w:tc>
+          <w:tcPr>
+            <w:tcW w:type="dxa" w:w="3810"/>
+            <w:tcMar>
+              <w:top w:w="80" w:type="dxa"/>
+              <w:start w:w="120" w:type="dxa"/>
+              <w:bottom w:w="80" w:type="dxa"/>
+              <w:end w:w="120" w:type="dxa"/>
+            </w:tcMar>
+            <w:vAlign w:val="center"/>
+          </w:tcPr>
+          <w:p>
+            <w:pPr>
+              <w:widowControl/>
+              <w:spacing w:after="0" w:line="247" w:lineRule="auto"/>
+              <w:jc w:val="left"/>
+            </w:pPr>
+            <w:r>
+              <w:rPr>
+                <w:rFonts w:ascii="Calibri" w:hAnsi="Calibri" w:eastAsia="Calibri"/>
+                <w:color w:val="202124"/>
+                <w:sz w:val="18"/>
+              </w:rPr>
+              <w:t>Định nghĩa thứ tự record bằng sample identity/role trước khi băm, thay vì phụ thuộc cách gom batch.</w:t>
+            </w:r>
+          </w:p>
+        </w:tc>
+        <w:tc>
+          <w:tcPr>
+            <w:tcW w:type="dxa" w:w="3000"/>
+            <w:tcMar>
+              <w:top w:w="80" w:type="dxa"/>
+              <w:start w:w="120" w:type="dxa"/>
+              <w:bottom w:w="80" w:type="dxa"/>
+              <w:end w:w="120" w:type="dxa"/>
+            </w:tcMar>
+            <w:vAlign w:val="center"/>
+          </w:tcPr>
+          <w:p>
+            <w:pPr>
+              <w:widowControl/>
+              <w:spacing w:after="0" w:line="247" w:lineRule="auto"/>
+              <w:jc w:val="left"/>
+            </w:pPr>
+            <w:r>
+              <w:rPr>
+                <w:rFonts w:ascii="Calibri" w:hAnsi="Calibri" w:eastAsia="Calibri"/>
+                <w:color w:val="202124"/>
+                <w:sz w:val="18"/>
+              </w:rPr>
+              <w:t>Tránh báo nhầm nondeterminism như lỗi ordered-hash của NSA.</w:t>
+            </w:r>
+          </w:p>
+        </w:tc>
+      </w:tr>
+      <w:tr>
+        <w:trPr>
+          <w:cantSplit/>
+        </w:trPr>
+        <w:tc>
+          <w:tcPr>
+            <w:tcW w:type="dxa" w:w="2550"/>
+            <w:tcMar>
+              <w:top w:w="80" w:type="dxa"/>
+              <w:start w:w="120" w:type="dxa"/>
+              <w:bottom w:w="80" w:type="dxa"/>
+              <w:end w:w="120" w:type="dxa"/>
+            </w:tcMar>
+            <w:vAlign w:val="center"/>
+          </w:tcPr>
+          <w:p>
+            <w:pPr>
+              <w:widowControl/>
+              <w:spacing w:after="0" w:line="247" w:lineRule="auto"/>
+              <w:jc w:val="left"/>
+            </w:pPr>
+            <w:r>
+              <w:rPr>
+                <w:rFonts w:ascii="Calibri" w:hAnsi="Calibri" w:eastAsia="Calibri"/>
+                <w:color w:val="202124"/>
+                <w:sz w:val="18"/>
+              </w:rPr>
+              <w:t>Dynamic train-only access ledger</w:t>
+            </w:r>
+          </w:p>
+        </w:tc>
+        <w:tc>
+          <w:tcPr>
+            <w:tcW w:type="dxa" w:w="3810"/>
+            <w:tcMar>
+              <w:top w:w="80" w:type="dxa"/>
+              <w:start w:w="120" w:type="dxa"/>
+              <w:bottom w:w="80" w:type="dxa"/>
+              <w:end w:w="120" w:type="dxa"/>
+            </w:tcMar>
+            <w:vAlign w:val="center"/>
+          </w:tcPr>
+          <w:p>
+            <w:pPr>
+              <w:widowControl/>
+              <w:spacing w:after="0" w:line="247" w:lineRule="auto"/>
+              <w:jc w:val="left"/>
+            </w:pPr>
+            <w:r>
+              <w:rPr>
+                <w:rFonts w:ascii="Calibri" w:hAnsi="Calibri" w:eastAsia="Calibri"/>
+                <w:color w:val="202124"/>
+                <w:sz w:val="18"/>
+              </w:rPr>
+              <w:t>Cài process-wide audit hook trước input đầu tiên, allowlist artifact và block val/test trước open; replay access digest.</w:t>
+            </w:r>
+          </w:p>
+        </w:tc>
+        <w:tc>
+          <w:tcPr>
+            <w:tcW w:type="dxa" w:w="3000"/>
+            <w:tcMar>
+              <w:top w:w="80" w:type="dxa"/>
+              <w:start w:w="120" w:type="dxa"/>
+              <w:bottom w:w="80" w:type="dxa"/>
+              <w:end w:w="120" w:type="dxa"/>
+            </w:tcMar>
+            <w:vAlign w:val="center"/>
+          </w:tcPr>
+          <w:p>
+            <w:pPr>
+              <w:widowControl/>
+              <w:spacing w:after="0" w:line="247" w:lineRule="auto"/>
+              <w:jc w:val="left"/>
+            </w:pPr>
+            <w:r>
+              <w:rPr>
+                <w:rFonts w:ascii="Calibri" w:hAnsi="Calibri" w:eastAsia="Calibri"/>
+                <w:color w:val="202124"/>
+                <w:sz w:val="18"/>
+              </w:rPr>
+              <w:t>Bổ sung bằng chứng runtime cho split isolation ngoài counter tự khai báo.</w:t>
+            </w:r>
+          </w:p>
+        </w:tc>
+      </w:tr>
+      <w:tr>
+        <w:trPr>
+          <w:cantSplit/>
+        </w:trPr>
+        <w:tc>
+          <w:tcPr>
+            <w:tcW w:type="dxa" w:w="2550"/>
+            <w:tcMar>
+              <w:top w:w="80" w:type="dxa"/>
+              <w:start w:w="120" w:type="dxa"/>
+              <w:bottom w:w="80" w:type="dxa"/>
+              <w:end w:w="120" w:type="dxa"/>
+            </w:tcMar>
+            <w:vAlign w:val="center"/>
+          </w:tcPr>
+          <w:p>
+            <w:pPr>
+              <w:widowControl/>
+              <w:spacing w:after="0" w:line="247" w:lineRule="auto"/>
+              <w:jc w:val="left"/>
+            </w:pPr>
+            <w:r>
+              <w:rPr>
+                <w:rFonts w:ascii="Calibri" w:hAnsi="Calibri" w:eastAsia="Calibri"/>
+                <w:color w:val="202124"/>
+                <w:sz w:val="18"/>
+              </w:rPr>
+              <w:t>Source-aware meta schedule</w:t>
+            </w:r>
+          </w:p>
+        </w:tc>
+        <w:tc>
+          <w:tcPr>
+            <w:tcW w:type="dxa" w:w="3810"/>
+            <w:tcMar>
+              <w:top w:w="80" w:type="dxa"/>
+              <w:start w:w="120" w:type="dxa"/>
+              <w:bottom w:w="80" w:type="dxa"/>
+              <w:end w:w="120" w:type="dxa"/>
+            </w:tcMar>
+            <w:vAlign w:val="center"/>
+          </w:tcPr>
+          <w:p>
+            <w:pPr>
+              <w:widowControl/>
+              <w:spacing w:after="0" w:line="247" w:lineRule="auto"/>
+              <w:jc w:val="left"/>
+            </w:pPr>
+            <w:r>
+              <w:rPr>
+                <w:rFonts w:ascii="Calibri" w:hAnsi="Calibri" w:eastAsia="Calibri"/>
+                <w:color w:val="202124"/>
+                <w:sz w:val="18"/>
+              </w:rPr>
+              <w:t>Meta rows cân bằng lớp nhưng source-disjoint với outer-fit; child feature kế thừa source/fold và RNG theo sample identity.</w:t>
+            </w:r>
+          </w:p>
+        </w:tc>
+        <w:tc>
+          <w:tcPr>
+            <w:tcW w:type="dxa" w:w="3000"/>
+            <w:tcMar>
+              <w:top w:w="80" w:type="dxa"/>
+              <w:start w:w="120" w:type="dxa"/>
+              <w:bottom w:w="80" w:type="dxa"/>
+              <w:end w:w="120" w:type="dxa"/>
+            </w:tcMar>
+            <w:vAlign w:val="center"/>
+          </w:tcPr>
+          <w:p>
+            <w:pPr>
+              <w:widowControl/>
+              <w:spacing w:after="0" w:line="247" w:lineRule="auto"/>
+              <w:jc w:val="left"/>
+            </w:pPr>
+            <w:r>
+              <w:rPr>
+                <w:rFonts w:ascii="Calibri" w:hAnsi="Calibri" w:eastAsia="Calibri"/>
+                <w:color w:val="202124"/>
+                <w:sz w:val="18"/>
+              </w:rPr>
+              <w:t>Cho phép augmentation/synthetic hợp lệ mà không tạo leakage hoặc đổi phân phối real head batch.</w:t>
+            </w:r>
+          </w:p>
+        </w:tc>
+      </w:tr>
     </w:tbl>
     <w:p>
       <w:pPr>
@@ -5880,7 +6762,7 @@
           <w:color w:val="202124"/>
           <w:sz w:val="22"/>
         </w:rPr>
-        <w:t>Giữ nguyên các closure JPEG-DL, SaSPA F1 và LP-A3 A0 có giá trị tái lập; cleanup artifact tạm bằng manifest riêng.</w:t>
+        <w:t>Giữ nguyên các closure JPEG-DL, SaSPA F1, LP-A3 và NSA A0 có giá trị tái lập; cleanup artifact tạm bằng manifest riêng.</w:t>
       </w:r>
     </w:p>
     <w:p>
@@ -5898,7 +6780,7 @@
           <w:color w:val="202124"/>
           <w:sz w:val="22"/>
         </w:rPr>
-        <w:t>Đóng exact SaSPA và LP-A3 neighborhoods đã khóa; không mở lại bằng sweep prompt/seed hoặc radius/step/margin/lambda.</w:t>
+        <w:t>Đóng exact SaSPA, LP-A3 và NSA neighborhoods đã khóa; không mở lại bằng sweep prompt/seed, radius/step/margin/lambda hoặc query/Poisson/readout.</w:t>
       </w:r>
     </w:p>
     <w:p>
@@ -5916,7 +6798,7 @@
           <w:color w:val="202124"/>
           <w:sz w:val="22"/>
         </w:rPr>
-        <w:t>Tra cứu và prospectively khóa một cơ chế train-only mới có biến đổi bề mặt/tổn thương có cấu trúc, licensed và equation-distinct; không lặp KeepAugment/AugMax/PRIME nếu thiếu class-pair causal target mới.</w:t>
+        <w:t>Commit/push prospective RN-LISDA protocol và machine lock trước candidate metrics: tám matched roles, 65 source partitions, balanced meta schedules, file-access ledger, resource limit, visuals và conjunctive gates.</w:t>
       </w:r>
     </w:p>
     <w:p>
@@ -5934,7 +6816,7 @@
           <w:color w:val="202124"/>
           <w:sz w:val="22"/>
         </w:rPr>
-        <w:t>Trước trainer integration, candidate mới phải bảo vệ class-1 TP, loại restricted FP tốt hơn matched simple control và không dùng validation/test để fit/chọn tham số.</w:t>
+        <w:t>Chạy RN-LISDA frozen-embedding A0 chỉ trên yolo_f/train; candidate phải giữ class-1 TP, loại restricted FP tốt hơn fixed-ISDA/CovNet/deranged/joint controls và replay exact trước trainer integration.</w:t>
       </w:r>
     </w:p>
     <w:p>
@@ -6584,7 +7466,7 @@
           <w:color w:val="202124"/>
           <w:sz w:val="22"/>
         </w:rPr>
-        <w:t>Revision 1: tạo báo cáo Word tái lập; ghi nhận full train 30e, trạng thái JPEG-DL formal, nghiên cứu competition và chính sách synthetic train-only chống leak. Revision 2: khóa JPEG-DL A0 ở VisualFail với replay exact, ghi metric/XAI/SHAs cuối và chuyển kế hoạch sang synthetic feasibility source-disjoint. Revision 3: retention pass trên 822 thư mục/51 manifests, giữ formal 2,614 MiB; sửa odd/even header-footer và reset numbering theo từng block sau render QA. Revision 4: SaSPA F0 no-output pass formal/replay trên RTX 4060 8 GB; ghi telemetry, process isolation, hash artifact và chỉ mở quyền F1 10 ảnh train-only. Revision 5: đóng SaSPA F1 ở Rejected sau fidelity 0/10, blind 7/10, duplicate-safety pass và frozen-keeper XAI 6/10; giữ nguyên keeper/lệnh full-train tốt nhất; bỏ running header-footer để khóa lề 1 inch ổn định giữa Word và LibreOffice sau render QA. Revision 6: đóng LP-A3-inspired A0 sau audit train-only 9.215 hàng, replay exact, 19/23 automated gates và manual delta review; ghi causal-control fail 6/734, không integration hoặc command update.</w:t>
+        <w:t>Revision 1: tạo báo cáo Word tái lập; ghi nhận full train 30e, trạng thái JPEG-DL formal, nghiên cứu competition và chính sách synthetic train-only chống leak. Revision 2: khóa JPEG-DL A0 ở VisualFail với replay exact, ghi metric/XAI/SHAs cuối và chuyển kế hoạch sang synthetic feasibility source-disjoint. Revision 3: retention pass trên 822 thư mục/51 manifests, giữ formal 2,614 MiB; sửa odd/even header-footer và reset numbering theo từng block sau render QA. Revision 4: SaSPA F0 no-output pass formal/replay trên RTX 4060 8 GB; ghi telemetry, process isolation, hash artifact và chỉ mở quyền F1 10 ảnh train-only. Revision 5: đóng SaSPA F1 ở Rejected sau fidelity 0/10, blind 7/10, duplicate-safety pass và frozen-keeper XAI 6/10; giữ nguyên keeper/lệnh full-train tốt nhất; bỏ running header-footer để khóa lề 1 inch ổn định giữa Word và LibreOffice sau render QA. Revision 6: đóng LP-A3-inspired A0 sau audit train-only 9.215 hàng, replay exact, 19/23 automated gates và manual delta review; ghi causal-control fail 6/734, không integration hoặc command update. Revision 7: đóng NSA class-pair Poisson A0 ở reject sau formal/replay/manual review; phân biệt checker-order defect với scientific failure, sửa duplicate audit thành whole-corpus invalidation một chiều, chạy retention 847 thư mục không blocker, full suite 1.852/1.852, và chọn RN-LISDA train-only làm route kế tiếp.</w:t>
       </w:r>
     </w:p>
     <w:p>
@@ -7042,6 +7924,196 @@
         <w:t xml:space="preserve"> - Pin commit 7059ca393b5cdfa04cf3304bb86c4c79712adfa3; không thấy license nên không copy/import code. </w:t>
       </w:r>
       <w:hyperlink r:id="rId20">
+        <w:r>
+          <w:rPr>
+            <w:rFonts w:ascii="Calibri" w:hAnsi="Calibri" w:eastAsia="Calibri"/>
+            <w:color w:val="2E74B5"/>
+            <w:u w:val="single"/>
+          </w:rPr>
+          <w:t>Mở nguồn</w:t>
+        </w:r>
+      </w:hyperlink>
+    </w:p>
+    <w:p>
+      <w:pPr>
+        <w:keepLines/>
+        <w:widowControl/>
+        <w:numPr>
+          <w:ilvl w:val="0"/>
+          <w:numId w:val="15"/>
+        </w:numPr>
+        <w:spacing w:after="160" w:line="280" w:lineRule="auto"/>
+      </w:pPr>
+      <w:r>
+        <w:rPr>
+          <w:rFonts w:ascii="Calibri" w:hAnsi="Calibri" w:eastAsia="Calibri"/>
+          <w:b/>
+          <w:color w:val="202124"/>
+          <w:sz w:val="21"/>
+        </w:rPr>
+        <w:t>Natural Synthetic Anomalies for Self-Supervised Anomaly Detection and Localization, ECCV 2022</w:t>
+      </w:r>
+      <w:r>
+        <w:rPr>
+          <w:rFonts w:ascii="Calibri" w:hAnsi="Calibri" w:eastAsia="Calibri"/>
+          <w:color w:val="202124"/>
+          <w:sz w:val="21"/>
+        </w:rPr>
+        <w:t xml:space="preserve"> - Nguồn Poisson synthetic geometry; TRKH adaptation độc lập đã bị loại ở A0. </w:t>
+      </w:r>
+      <w:hyperlink r:id="rId21">
+        <w:r>
+          <w:rPr>
+            <w:rFonts w:ascii="Calibri" w:hAnsi="Calibri" w:eastAsia="Calibri"/>
+            <w:color w:val="2E74B5"/>
+            <w:u w:val="single"/>
+          </w:rPr>
+          <w:t>Mở nguồn</w:t>
+        </w:r>
+      </w:hyperlink>
+    </w:p>
+    <w:p>
+      <w:pPr>
+        <w:keepLines/>
+        <w:widowControl/>
+        <w:numPr>
+          <w:ilvl w:val="0"/>
+          <w:numId w:val="15"/>
+        </w:numPr>
+        <w:spacing w:after="160" w:line="280" w:lineRule="auto"/>
+      </w:pPr>
+      <w:r>
+        <w:rPr>
+          <w:rFonts w:ascii="Calibri" w:hAnsi="Calibri" w:eastAsia="Calibri"/>
+          <w:b/>
+          <w:color w:val="202124"/>
+          <w:sz w:val="21"/>
+        </w:rPr>
+        <w:t>Implicit Semantic Data Augmentation, NeurIPS 2019</w:t>
+      </w:r>
+      <w:r>
+        <w:rPr>
+          <w:rFonts w:ascii="Calibri" w:hAnsi="Calibri" w:eastAsia="Calibri"/>
+          <w:color w:val="202124"/>
+          <w:sz w:val="21"/>
+        </w:rPr>
+        <w:t xml:space="preserve"> - Nguồn phương trình covariance feature-space và robust CE của ISDA. </w:t>
+      </w:r>
+      <w:hyperlink r:id="rId22">
+        <w:r>
+          <w:rPr>
+            <w:rFonts w:ascii="Calibri" w:hAnsi="Calibri" w:eastAsia="Calibri"/>
+            <w:color w:val="2E74B5"/>
+            <w:u w:val="single"/>
+          </w:rPr>
+          <w:t>Mở nguồn</w:t>
+        </w:r>
+      </w:hyperlink>
+    </w:p>
+    <w:p>
+      <w:pPr>
+        <w:keepLines/>
+        <w:widowControl/>
+        <w:numPr>
+          <w:ilvl w:val="0"/>
+          <w:numId w:val="15"/>
+        </w:numPr>
+        <w:spacing w:after="160" w:line="280" w:lineRule="auto"/>
+      </w:pPr>
+      <w:r>
+        <w:rPr>
+          <w:rFonts w:ascii="Calibri" w:hAnsi="Calibri" w:eastAsia="Calibri"/>
+          <w:b/>
+          <w:color w:val="202124"/>
+          <w:sz w:val="21"/>
+        </w:rPr>
+        <w:t>MetaSAug: Meta Semantic Augmentation for Long-Tailed Visual Recognition, CVPR 2021</w:t>
+      </w:r>
+      <w:r>
+        <w:rPr>
+          <w:rFonts w:ascii="Calibri" w:hAnsi="Calibri" w:eastAsia="Calibri"/>
+          <w:color w:val="202124"/>
+          <w:sz w:val="21"/>
+        </w:rPr>
+        <w:t xml:space="preserve"> - Nguồn balanced meta objective cho semantic augmentation. </w:t>
+      </w:r>
+      <w:hyperlink r:id="rId23">
+        <w:r>
+          <w:rPr>
+            <w:rFonts w:ascii="Calibri" w:hAnsi="Calibri" w:eastAsia="Calibri"/>
+            <w:color w:val="2E74B5"/>
+            <w:u w:val="single"/>
+          </w:rPr>
+          <w:t>Mở nguồn</w:t>
+        </w:r>
+      </w:hyperlink>
+    </w:p>
+    <w:p>
+      <w:pPr>
+        <w:keepLines/>
+        <w:widowControl/>
+        <w:numPr>
+          <w:ilvl w:val="0"/>
+          <w:numId w:val="15"/>
+        </w:numPr>
+        <w:spacing w:after="160" w:line="280" w:lineRule="auto"/>
+      </w:pPr>
+      <w:r>
+        <w:rPr>
+          <w:rFonts w:ascii="Calibri" w:hAnsi="Calibri" w:eastAsia="Calibri"/>
+          <w:b/>
+          <w:color w:val="202124"/>
+          <w:sz w:val="21"/>
+        </w:rPr>
+        <w:t>LearnableISDA, IEEE Transactions on Image Processing 2024</w:t>
+      </w:r>
+      <w:r>
+        <w:rPr>
+          <w:rFonts w:ascii="Calibri" w:hAnsi="Calibri" w:eastAsia="Calibri"/>
+          <w:color w:val="202124"/>
+          <w:sz w:val="21"/>
+        </w:rPr>
+        <w:t xml:space="preserve"> - Nguồn sample-wise learnable covariance/scale; repository chỉ dùng để pin provenance. </w:t>
+      </w:r>
+      <w:hyperlink r:id="rId24">
+        <w:r>
+          <w:rPr>
+            <w:rFonts w:ascii="Calibri" w:hAnsi="Calibri" w:eastAsia="Calibri"/>
+            <w:color w:val="2E74B5"/>
+            <w:u w:val="single"/>
+          </w:rPr>
+          <w:t>Mở nguồn</w:t>
+        </w:r>
+      </w:hyperlink>
+    </w:p>
+    <w:p>
+      <w:pPr>
+        <w:keepLines/>
+        <w:widowControl/>
+        <w:numPr>
+          <w:ilvl w:val="0"/>
+          <w:numId w:val="15"/>
+        </w:numPr>
+        <w:spacing w:after="160" w:line="280" w:lineRule="auto"/>
+      </w:pPr>
+      <w:r>
+        <w:rPr>
+          <w:rFonts w:ascii="Calibri" w:hAnsi="Calibri" w:eastAsia="Calibri"/>
+          <w:b/>
+          <w:color w:val="202124"/>
+          <w:sz w:val="21"/>
+        </w:rPr>
+        <w:t>Do We Train on Test Data? Purging CIFAR of Near-Duplicates</w:t>
+      </w:r>
+      <w:r>
+        <w:rPr>
+          <w:rFonts w:ascii="Calibri" w:hAnsi="Calibri" w:eastAsia="Calibri"/>
+          <w:color w:val="202124"/>
+          <w:sz w:val="21"/>
+        </w:rPr>
+        <w:t xml:space="preserve"> - Đối chiếu nguy cơ near-duplicate cross-split; TRKH dùng quy tắc whole-corpus invalidation nghiêm ngặt hơn. </w:t>
+      </w:r>
+      <w:hyperlink r:id="rId25">
         <w:r>
           <w:rPr>
             <w:rFonts w:ascii="Calibri" w:hAnsi="Calibri" w:eastAsia="Calibri"/>

</xml_diff>

<commit_message>
Close RN-LISDA audit and repair replay checks
</commit_message>
<xml_diff>
--- a/docs/TRKH_5CLASS_RESEARCH_PROCESS_STATUS.docx
+++ b/docs/TRKH_5CLASS_RESEARCH_PROCESS_STATUS.docx
@@ -75,7 +75,7 @@
           <w:color w:val="202124"/>
           <w:sz w:val="21"/>
         </w:rPr>
-        <w:t>2026-07-24 | Revision 7</w:t>
+        <w:t>2026-07-24 | Revision 8</w:t>
       </w:r>
     </w:p>
     <w:p>
@@ -97,7 +97,7 @@
           <w:color w:val="202124"/>
           <w:sz w:val="21"/>
         </w:rPr>
-        <w:t>Đang nghiên cứu - NSA A0 đã bị loại; đang khóa RN-LISDA train-only</w:t>
+        <w:t>Đang nghiên cứu - RN-LISDA A0 đã bị loại; đang khóa Bal-BCE train-only</w:t>
       </w:r>
     </w:p>
     <w:p>
@@ -340,7 +340,7 @@
                 <w:color w:val="5F6368"/>
                 <w:sz w:val="16"/>
               </w:rPr>
-              <w:t>NSA POISSON A0</w:t>
+              <w:t>RN-LISDA A0</w:t>
             </w:r>
           </w:p>
           <w:p>
@@ -367,7 +367,7 @@
                 <w:color w:val="202124"/>
                 <w:sz w:val="17"/>
               </w:rPr>
-              <w:t>AUROC 0,8214; TP 0,9754; FP reject 0,1396</w:t>
+              <w:t>Macro/class1 F1 0,9383/0,8146; mất 25 TP so với CE</w:t>
             </w:r>
           </w:p>
         </w:tc>
@@ -412,7 +412,7 @@
           <w:color w:val="202124"/>
           <w:sz w:val="21"/>
         </w:rPr>
-        <w:t>Giữ nguyên keeper hiện tại và file lệnh full-train tốt nhất. Full train random-init 30 epoch không thắng validation gate; JPEG-DL, SaSPA synthetic, LP-A3 hard-positive và NSA class-pair Poisson A0 đều đã bị loại. NSA dùng đủ 9.215 train rows với năm source-held fold, không mở validation/test; candidate không hơn clean/no-query/permuted controls, chỉ đạt AUROC 0,821398, giữ 0,975379 TP và loại 0,139640 restricted FP. Trainer, validation và full train không được mở từ kết quả này.</w:t>
+        <w:t>Giữ nguyên keeper hiện tại và file lệnh full-train tốt nhất. Full train random-init 30 epoch không thắng validation gate; JPEG-DL, SaSPA synthetic, LP-A3 hard-positive, NSA Poisson và RN-LISDA A0 đều đã bị loại. RN-LISDA dùng đủ 9.215 train rows với năm source-held fold, không mở validation/test; candidate trùng fixed/deranged/joint controls ở macro/class-1 F1 0,938291/0,814601, loại 22 restricted FP nhưng làm mất 25 class-1 TP so với CE. Trainer, validation và full train không được mở từ kết quả này.</w:t>
       </w:r>
     </w:p>
     <w:p>
@@ -2033,6 +2033,146 @@
           </w:p>
         </w:tc>
       </w:tr>
+      <w:tr>
+        <w:trPr>
+          <w:cantSplit/>
+        </w:trPr>
+        <w:tc>
+          <w:tcPr>
+            <w:tcW w:type="dxa" w:w="1500"/>
+            <w:tcMar>
+              <w:top w:w="80" w:type="dxa"/>
+              <w:start w:w="120" w:type="dxa"/>
+              <w:bottom w:w="80" w:type="dxa"/>
+              <w:end w:w="120" w:type="dxa"/>
+            </w:tcMar>
+            <w:vAlign w:val="center"/>
+          </w:tcPr>
+          <w:p>
+            <w:pPr>
+              <w:widowControl/>
+              <w:spacing w:after="0" w:line="247" w:lineRule="auto"/>
+              <w:jc w:val="left"/>
+            </w:pPr>
+            <w:r>
+              <w:rPr>
+                <w:rFonts w:ascii="Calibri" w:hAnsi="Calibri" w:eastAsia="Calibri"/>
+                <w:color w:val="202124"/>
+                <w:sz w:val="18"/>
+              </w:rPr>
+              <w:t>RN-LISDA A0</w:t>
+            </w:r>
+          </w:p>
+        </w:tc>
+        <w:tc>
+          <w:tcPr>
+            <w:tcW w:type="dxa" w:w="2250"/>
+            <w:tcMar>
+              <w:top w:w="80" w:type="dxa"/>
+              <w:start w:w="120" w:type="dxa"/>
+              <w:bottom w:w="80" w:type="dxa"/>
+              <w:end w:w="120" w:type="dxa"/>
+            </w:tcMar>
+            <w:vAlign w:val="center"/>
+          </w:tcPr>
+          <w:p>
+            <w:pPr>
+              <w:widowControl/>
+              <w:spacing w:after="0" w:line="247" w:lineRule="auto"/>
+              <w:jc w:val="left"/>
+            </w:pPr>
+            <w:r>
+              <w:rPr>
+                <w:rFonts w:ascii="Calibri" w:hAnsi="Calibri" w:eastAsia="Calibri"/>
+                <w:color w:val="202124"/>
+                <w:sz w:val="18"/>
+              </w:rPr>
+              <w:t>9.215 train; 5 source-held folds</w:t>
+            </w:r>
+          </w:p>
+        </w:tc>
+        <w:tc>
+          <w:tcPr>
+            <w:tcW w:type="dxa" w:w="1050"/>
+            <w:tcMar>
+              <w:top w:w="80" w:type="dxa"/>
+              <w:start w:w="120" w:type="dxa"/>
+              <w:bottom w:w="80" w:type="dxa"/>
+              <w:end w:w="120" w:type="dxa"/>
+            </w:tcMar>
+            <w:vAlign w:val="center"/>
+          </w:tcPr>
+          <w:p>
+            <w:pPr>
+              <w:widowControl/>
+              <w:spacing w:after="0" w:line="247" w:lineRule="auto"/>
+              <w:jc w:val="center"/>
+            </w:pPr>
+            <w:r>
+              <w:rPr>
+                <w:rFonts w:ascii="Calibri" w:hAnsi="Calibri" w:eastAsia="Calibri"/>
+                <w:color w:val="202124"/>
+                <w:sz w:val="18"/>
+              </w:rPr>
+              <w:t>0,938291</w:t>
+            </w:r>
+          </w:p>
+        </w:tc>
+        <w:tc>
+          <w:tcPr>
+            <w:tcW w:type="dxa" w:w="2450"/>
+            <w:tcMar>
+              <w:top w:w="80" w:type="dxa"/>
+              <w:start w:w="120" w:type="dxa"/>
+              <w:bottom w:w="80" w:type="dxa"/>
+              <w:end w:w="120" w:type="dxa"/>
+            </w:tcMar>
+            <w:vAlign w:val="center"/>
+          </w:tcPr>
+          <w:p>
+            <w:pPr>
+              <w:widowControl/>
+              <w:spacing w:after="0" w:line="247" w:lineRule="auto"/>
+              <w:jc w:val="left"/>
+            </w:pPr>
+            <w:r>
+              <w:rPr>
+                <w:rFonts w:ascii="Calibri" w:hAnsi="Calibri" w:eastAsia="Calibri"/>
+                <w:color w:val="202124"/>
+                <w:sz w:val="18"/>
+              </w:rPr>
+              <w:t>0,848000 / 0,783734 / 0,814601</w:t>
+            </w:r>
+          </w:p>
+        </w:tc>
+        <w:tc>
+          <w:tcPr>
+            <w:tcW w:type="dxa" w:w="2110"/>
+            <w:tcMar>
+              <w:top w:w="80" w:type="dxa"/>
+              <w:start w:w="120" w:type="dxa"/>
+              <w:bottom w:w="80" w:type="dxa"/>
+              <w:end w:w="120" w:type="dxa"/>
+            </w:tcMar>
+            <w:vAlign w:val="center"/>
+          </w:tcPr>
+          <w:p>
+            <w:pPr>
+              <w:widowControl/>
+              <w:spacing w:after="0" w:line="247" w:lineRule="auto"/>
+              <w:jc w:val="left"/>
+            </w:pPr>
+            <w:r>
+              <w:rPr>
+                <w:rFonts w:ascii="Calibri" w:hAnsi="Calibri" w:eastAsia="Calibri"/>
+                <w:color w:val="202124"/>
+                <w:sz w:val="18"/>
+              </w:rPr>
+              <w:t>Rejected; trùng fixed/deranged/joint, mất 25 TP</w:t>
+            </w:r>
+          </w:p>
+        </w:tc>
+      </w:tr>
     </w:tbl>
     <w:p>
       <w:pPr>
@@ -3524,6 +3664,92 @@
                 <w:sz w:val="18"/>
               </w:rPr>
               <w:t>Hình học hợp lệ không đủ; cơ chế phải hơn clean/no-query/permuted controls và định vị đúng tín hiệu.</w:t>
+            </w:r>
+          </w:p>
+        </w:tc>
+      </w:tr>
+      <w:tr>
+        <w:trPr>
+          <w:cantSplit/>
+        </w:trPr>
+        <w:tc>
+          <w:tcPr>
+            <w:tcW w:type="dxa" w:w="1900"/>
+            <w:tcMar>
+              <w:top w:w="80" w:type="dxa"/>
+              <w:start w:w="120" w:type="dxa"/>
+              <w:bottom w:w="80" w:type="dxa"/>
+              <w:end w:w="120" w:type="dxa"/>
+            </w:tcMar>
+            <w:vAlign w:val="center"/>
+          </w:tcPr>
+          <w:p>
+            <w:pPr>
+              <w:widowControl/>
+              <w:spacing w:after="0" w:line="247" w:lineRule="auto"/>
+              <w:jc w:val="left"/>
+            </w:pPr>
+            <w:r>
+              <w:rPr>
+                <w:rFonts w:ascii="Calibri" w:hAnsi="Calibri" w:eastAsia="Calibri"/>
+                <w:color w:val="202124"/>
+                <w:sz w:val="18"/>
+              </w:rPr>
+              <w:t>Learnable covariance bị collapse</w:t>
+            </w:r>
+          </w:p>
+        </w:tc>
+        <w:tc>
+          <w:tcPr>
+            <w:tcW w:type="dxa" w:w="4000"/>
+            <w:tcMar>
+              <w:top w:w="80" w:type="dxa"/>
+              <w:start w:w="120" w:type="dxa"/>
+              <w:bottom w:w="80" w:type="dxa"/>
+              <w:end w:w="120" w:type="dxa"/>
+            </w:tcMar>
+            <w:vAlign w:val="center"/>
+          </w:tcPr>
+          <w:p>
+            <w:pPr>
+              <w:widowControl/>
+              <w:spacing w:after="0" w:line="247" w:lineRule="auto"/>
+              <w:jc w:val="left"/>
+            </w:pPr>
+            <w:r>
+              <w:rPr>
+                <w:rFonts w:ascii="Calibri" w:hAnsi="Calibri" w:eastAsia="Calibri"/>
+                <w:color w:val="202124"/>
+                <w:sz w:val="18"/>
+              </w:rPr>
+              <w:t>RN-LISDA candidate trùng fixed, deranged và joint/no-meta; scale std 5,50e-8, input-swap change 1,68e-8.</w:t>
+            </w:r>
+          </w:p>
+        </w:tc>
+        <w:tc>
+          <w:tcPr>
+            <w:tcW w:type="dxa" w:w="3460"/>
+            <w:tcMar>
+              <w:top w:w="80" w:type="dxa"/>
+              <w:start w:w="120" w:type="dxa"/>
+              <w:bottom w:w="80" w:type="dxa"/>
+              <w:end w:w="120" w:type="dxa"/>
+            </w:tcMar>
+            <w:vAlign w:val="center"/>
+          </w:tcPr>
+          <w:p>
+            <w:pPr>
+              <w:widowControl/>
+              <w:spacing w:after="0" w:line="247" w:lineRule="auto"/>
+              <w:jc w:val="left"/>
+            </w:pPr>
+            <w:r>
+              <w:rPr>
+                <w:rFonts w:ascii="Calibri" w:hAnsi="Calibri" w:eastAsia="Calibri"/>
+                <w:color w:val="202124"/>
+                <w:sz w:val="18"/>
+              </w:rPr>
+              <w:t>Parameter có update không chứng minh signal theo mẫu; cần causal controls và TP budget.</w:t>
             </w:r>
           </w:p>
         </w:tc>
@@ -5120,7 +5346,93 @@
                 <w:color w:val="202124"/>
                 <w:sz w:val="18"/>
               </w:rPr>
-              <w:t>Ứng viên kế tiếp là restricted-negative RN-LISDA frozen-embedding A0, tám role và replay khóa trước; tự cài phương trình, không copy code thiếu license.</w:t>
+              <w:t>RN-LISDA A0 đã bị loại: scale collapse, không hơn fixed/deranged/joint controls và mất 25 class-1 TP.</w:t>
+            </w:r>
+          </w:p>
+        </w:tc>
+      </w:tr>
+      <w:tr>
+        <w:trPr>
+          <w:cantSplit/>
+        </w:trPr>
+        <w:tc>
+          <w:tcPr>
+            <w:tcW w:type="dxa" w:w="1900"/>
+            <w:tcMar>
+              <w:top w:w="80" w:type="dxa"/>
+              <w:start w:w="120" w:type="dxa"/>
+              <w:bottom w:w="80" w:type="dxa"/>
+              <w:end w:w="120" w:type="dxa"/>
+            </w:tcMar>
+            <w:vAlign w:val="center"/>
+          </w:tcPr>
+          <w:p>
+            <w:pPr>
+              <w:widowControl/>
+              <w:spacing w:after="0" w:line="247" w:lineRule="auto"/>
+              <w:jc w:val="left"/>
+            </w:pPr>
+            <w:r>
+              <w:rPr>
+                <w:rFonts w:ascii="Calibri" w:hAnsi="Calibri" w:eastAsia="Calibri"/>
+                <w:color w:val="202124"/>
+                <w:sz w:val="18"/>
+              </w:rPr>
+              <w:t>LiVT / Balanced BCE, CVPR 2023</w:t>
+            </w:r>
+          </w:p>
+        </w:tc>
+        <w:tc>
+          <w:tcPr>
+            <w:tcW w:type="dxa" w:w="3600"/>
+            <w:tcMar>
+              <w:top w:w="80" w:type="dxa"/>
+              <w:start w:w="120" w:type="dxa"/>
+              <w:bottom w:w="80" w:type="dxa"/>
+              <w:end w:w="120" w:type="dxa"/>
+            </w:tcMar>
+            <w:vAlign w:val="center"/>
+          </w:tcPr>
+          <w:p>
+            <w:pPr>
+              <w:widowControl/>
+              <w:spacing w:after="0" w:line="247" w:lineRule="auto"/>
+              <w:jc w:val="left"/>
+            </w:pPr>
+            <w:r>
+              <w:rPr>
+                <w:rFonts w:ascii="Calibri" w:hAnsi="Calibri" w:eastAsia="Calibri"/>
+                <w:color w:val="202124"/>
+                <w:sz w:val="18"/>
+              </w:rPr>
+              <w:t>ViT train-from-scratch trên long-tail; cộng log(pi)-log(1-pi) vào binary logits trước one-hot BCE.</w:t>
+            </w:r>
+          </w:p>
+        </w:tc>
+        <w:tc>
+          <w:tcPr>
+            <w:tcW w:type="dxa" w:w="3860"/>
+            <w:tcMar>
+              <w:top w:w="80" w:type="dxa"/>
+              <w:start w:w="120" w:type="dxa"/>
+              <w:bottom w:w="80" w:type="dxa"/>
+              <w:end w:w="120" w:type="dxa"/>
+            </w:tcMar>
+            <w:vAlign w:val="center"/>
+          </w:tcPr>
+          <w:p>
+            <w:pPr>
+              <w:widowControl/>
+              <w:spacing w:after="0" w:line="247" w:lineRule="auto"/>
+              <w:jc w:val="left"/>
+            </w:pPr>
+            <w:r>
+              <w:rPr>
+                <w:rFonts w:ascii="Calibri" w:hAnsi="Calibri" w:eastAsia="Calibri"/>
+                <w:color w:val="202124"/>
+                <w:sz w:val="18"/>
+              </w:rPr>
+              <w:t>Route kế tiếp chỉ là train-only OOF gate; phải hơn CE/plain BCE/Balanced Softmax/sign control mà vẫn giữ TP và precision.</w:t>
             </w:r>
           </w:p>
         </w:tc>
@@ -5345,7 +5657,7 @@
           <w:color w:val="202124"/>
           <w:sz w:val="22"/>
         </w:rPr>
-        <w:t>A0 bắt đầu với tỷ lệ synthetic bảo thủ 5-10%; tỷ lệ là hyperparameter validation-side chỉ sau khi train-only feasibility/fidelity pass, không sweep trên test.</w:t>
+        <w:t>A0 bắt đầu với tỷ lệ synthetic bảo thủ 5-10% được khóa trước hoặc chọn bằng train-only cross-fit. Sau khi corpus hoàn chỉnh đã đóng băng, validation chỉ được mở một lần ở auditor promotion riêng; cấm dùng validation/test để chọn hay sweep tỷ lệ.</w:t>
       </w:r>
     </w:p>
     <w:p>
@@ -6732,6 +7044,92 @@
           </w:p>
         </w:tc>
       </w:tr>
+      <w:tr>
+        <w:trPr>
+          <w:cantSplit/>
+        </w:trPr>
+        <w:tc>
+          <w:tcPr>
+            <w:tcW w:type="dxa" w:w="2550"/>
+            <w:tcMar>
+              <w:top w:w="80" w:type="dxa"/>
+              <w:start w:w="120" w:type="dxa"/>
+              <w:bottom w:w="80" w:type="dxa"/>
+              <w:end w:w="120" w:type="dxa"/>
+            </w:tcMar>
+            <w:vAlign w:val="center"/>
+          </w:tcPr>
+          <w:p>
+            <w:pPr>
+              <w:widowControl/>
+              <w:spacing w:after="0" w:line="247" w:lineRule="auto"/>
+              <w:jc w:val="left"/>
+            </w:pPr>
+            <w:r>
+              <w:rPr>
+                <w:rFonts w:ascii="Calibri" w:hAnsi="Calibri" w:eastAsia="Calibri"/>
+                <w:color w:val="202124"/>
+                <w:sz w:val="18"/>
+              </w:rPr>
+              <w:t>Replay read-set và scalar type</w:t>
+            </w:r>
+          </w:p>
+        </w:tc>
+        <w:tc>
+          <w:tcPr>
+            <w:tcW w:type="dxa" w:w="3810"/>
+            <w:tcMar>
+              <w:top w:w="80" w:type="dxa"/>
+              <w:start w:w="120" w:type="dxa"/>
+              <w:bottom w:w="80" w:type="dxa"/>
+              <w:end w:w="120" w:type="dxa"/>
+            </w:tcMar>
+            <w:vAlign w:val="center"/>
+          </w:tcPr>
+          <w:p>
+            <w:pPr>
+              <w:widowControl/>
+              <w:spacing w:after="0" w:line="247" w:lineRule="auto"/>
+              <w:jc w:val="left"/>
+            </w:pPr>
+            <w:r>
+              <w:rPr>
+                <w:rFonts w:ascii="Calibri" w:hAnsi="Calibri" w:eastAsia="Calibri"/>
+                <w:color w:val="202124"/>
+                <w:sz w:val="18"/>
+              </w:rPr>
+              <w:t>Formal/replay dựng cùng visual evidence nhưng replay ghi file tạm; bool và numpy.bool_ so theo typed logical value.</w:t>
+            </w:r>
+          </w:p>
+        </w:tc>
+        <w:tc>
+          <w:tcPr>
+            <w:tcW w:type="dxa" w:w="3000"/>
+            <w:tcMar>
+              <w:top w:w="80" w:type="dxa"/>
+              <w:start w:w="120" w:type="dxa"/>
+              <w:bottom w:w="80" w:type="dxa"/>
+              <w:end w:w="120" w:type="dxa"/>
+            </w:tcMar>
+            <w:vAlign w:val="center"/>
+          </w:tcPr>
+          <w:p>
+            <w:pPr>
+              <w:widowControl/>
+              <w:spacing w:after="0" w:line="247" w:lineRule="auto"/>
+              <w:jc w:val="left"/>
+            </w:pPr>
+            <w:r>
+              <w:rPr>
+                <w:rFonts w:ascii="Calibri" w:hAnsi="Calibri" w:eastAsia="Calibri"/>
+                <w:color w:val="202124"/>
+                <w:sz w:val="18"/>
+              </w:rPr>
+              <w:t>Ledger exact mà không ghi đè formal artifact; tránh false mismatch do object identity.</w:t>
+            </w:r>
+          </w:p>
+        </w:tc>
+      </w:tr>
     </w:tbl>
     <w:p>
       <w:pPr>
@@ -6762,7 +7160,7 @@
           <w:color w:val="202124"/>
           <w:sz w:val="22"/>
         </w:rPr>
-        <w:t>Giữ nguyên các closure JPEG-DL, SaSPA F1, LP-A3 và NSA A0 có giá trị tái lập; cleanup artifact tạm bằng manifest riêng.</w:t>
+        <w:t>Giữ nguyên các closure JPEG-DL, SaSPA F1, LP-A3, NSA và RN-LISDA A0 có giá trị tái lập; cleanup artifact tạm bằng manifest riêng.</w:t>
       </w:r>
     </w:p>
     <w:p>
@@ -6780,7 +7178,7 @@
           <w:color w:val="202124"/>
           <w:sz w:val="22"/>
         </w:rPr>
-        <w:t>Đóng exact SaSPA, LP-A3 và NSA neighborhoods đã khóa; không mở lại bằng sweep prompt/seed, radius/step/margin/lambda hoặc query/Poisson/readout.</w:t>
+        <w:t>Đóng exact SaSPA, LP-A3, NSA và RN-LISDA neighborhoods đã khóa; không mở lại bằng sweep prompt/seed, radius/step/margin/lambda, query/Poisson/readout hoặc CovNet/meta schedule.</w:t>
       </w:r>
     </w:p>
     <w:p>
@@ -6798,7 +7196,7 @@
           <w:color w:val="202124"/>
           <w:sz w:val="22"/>
         </w:rPr>
-        <w:t>Commit/push prospective RN-LISDA protocol và machine lock trước candidate metrics: tám matched roles, 65 source partitions, balanced meta schedules, file-access ledger, resource limit, visuals và conjunctive gates.</w:t>
+        <w:t>Commit/push prospective Bal-BCE protocol và machine lock trước candidate metrics: official LiVT equation, source-held folds, CE/plain-BCE/Balanced-Softmax/sign/seed controls, file-access ledger, resources và conjunctive gates.</w:t>
       </w:r>
     </w:p>
     <w:p>
@@ -6816,7 +7214,7 @@
           <w:color w:val="202124"/>
           <w:sz w:val="22"/>
         </w:rPr>
-        <w:t>Chạy RN-LISDA frozen-embedding A0 chỉ trên yolo_f/train; candidate phải giữ class-1 TP, loại restricted FP tốt hơn fixed-ISDA/CovNet/deranged/joint controls và replay exact trước trainer integration.</w:t>
+        <w:t>Chạy Bal-BCE frozen-embedding A0 chỉ trên yolo_f/train; candidate phải tăng precision, loại restricted FP, giữ class-1 TP/recall và macro/nonfocus safety trên đủ năm fold trước trainer integration.</w:t>
       </w:r>
     </w:p>
     <w:p>
@@ -7466,7 +7864,7 @@
           <w:color w:val="202124"/>
           <w:sz w:val="22"/>
         </w:rPr>
-        <w:t>Revision 1: tạo báo cáo Word tái lập; ghi nhận full train 30e, trạng thái JPEG-DL formal, nghiên cứu competition và chính sách synthetic train-only chống leak. Revision 2: khóa JPEG-DL A0 ở VisualFail với replay exact, ghi metric/XAI/SHAs cuối và chuyển kế hoạch sang synthetic feasibility source-disjoint. Revision 3: retention pass trên 822 thư mục/51 manifests, giữ formal 2,614 MiB; sửa odd/even header-footer và reset numbering theo từng block sau render QA. Revision 4: SaSPA F0 no-output pass formal/replay trên RTX 4060 8 GB; ghi telemetry, process isolation, hash artifact và chỉ mở quyền F1 10 ảnh train-only. Revision 5: đóng SaSPA F1 ở Rejected sau fidelity 0/10, blind 7/10, duplicate-safety pass và frozen-keeper XAI 6/10; giữ nguyên keeper/lệnh full-train tốt nhất; bỏ running header-footer để khóa lề 1 inch ổn định giữa Word và LibreOffice sau render QA. Revision 6: đóng LP-A3-inspired A0 sau audit train-only 9.215 hàng, replay exact, 19/23 automated gates và manual delta review; ghi causal-control fail 6/734, không integration hoặc command update. Revision 7: đóng NSA class-pair Poisson A0 ở reject sau formal/replay/manual review; phân biệt checker-order defect với scientific failure, sửa duplicate audit thành whole-corpus invalidation một chiều, chạy retention 847 thư mục không blocker, full suite 1.852/1.852, và chọn RN-LISDA train-only làm route kế tiếp.</w:t>
+        <w:t>Revision 1: tạo báo cáo Word tái lập; ghi nhận full train 30e, trạng thái JPEG-DL formal, nghiên cứu competition và chính sách synthetic train-only chống leak. Revision 2: khóa JPEG-DL A0 ở VisualFail với replay exact, ghi metric/XAI/SHAs cuối và chuyển kế hoạch sang synthetic feasibility source-disjoint. Revision 3: retention pass trên 822 thư mục/51 manifests, giữ formal 2,614 MiB; sửa odd/even header-footer và reset numbering theo từng block sau render QA. Revision 4: SaSPA F0 no-output pass formal/replay trên RTX 4060 8 GB; ghi telemetry, process isolation, hash artifact và chỉ mở quyền F1 10 ảnh train-only. Revision 5: đóng SaSPA F1 ở Rejected sau fidelity 0/10, blind 7/10, duplicate-safety pass và frozen-keeper XAI 6/10; giữ nguyên keeper/lệnh full-train tốt nhất; bỏ running header-footer để khóa lề 1 inch ổn định giữa Word và LibreOffice sau render QA. Revision 6: đóng LP-A3-inspired A0 sau audit train-only 9.215 hàng, replay exact, 19/23 automated gates và manual delta review; ghi causal-control fail 6/734, không integration hoặc command update. Revision 7: đóng NSA class-pair Poisson A0 ở reject sau formal/replay/manual review; phân biệt checker-order defect với scientific failure, sửa duplicate audit thành whole-corpus invalidation một chiều, chạy retention 847 thư mục không blocker, full suite 1.852/1.852, và chọn RN-LISDA train-only làm route kế tiếp. Revision 8: đóng RN-LISDA A0 sau performance 17/37, mechanism 22/25, replay exact và manual proxy review; sửa visual-ledger read-set cùng bool scalar checker, khóa synthetic ratio bằng train-only protocol, chọn Bal-BCE OOF gate làm route kế tiếp, full suite 1.884/1.884 và DOCX 12 trang đạt accessibility 0/0/0.</w:t>
       </w:r>
     </w:p>
     <w:p>
@@ -8103,6 +8501,82 @@
           <w:color w:val="202124"/>
           <w:sz w:val="21"/>
         </w:rPr>
+        <w:t>Learning Imbalanced Data With Vision Transformers, CVPR 2023</w:t>
+      </w:r>
+      <w:r>
+        <w:rPr>
+          <w:rFonts w:ascii="Calibri" w:hAnsi="Calibri" w:eastAsia="Calibri"/>
+          <w:color w:val="202124"/>
+          <w:sz w:val="21"/>
+        </w:rPr>
+        <w:t xml:space="preserve"> - Nguồn lý thuyết và thực nghiệm cho Balanced BCE trên ViT train-from-scratch. </w:t>
+      </w:r>
+      <w:hyperlink r:id="rId25">
+        <w:r>
+          <w:rPr>
+            <w:rFonts w:ascii="Calibri" w:hAnsi="Calibri" w:eastAsia="Calibri"/>
+            <w:color w:val="2E74B5"/>
+            <w:u w:val="single"/>
+          </w:rPr>
+          <w:t>Mở nguồn</w:t>
+        </w:r>
+      </w:hyperlink>
+    </w:p>
+    <w:p>
+      <w:pPr>
+        <w:keepLines/>
+        <w:widowControl/>
+        <w:numPr>
+          <w:ilvl w:val="0"/>
+          <w:numId w:val="15"/>
+        </w:numPr>
+        <w:spacing w:after="160" w:line="280" w:lineRule="auto"/>
+      </w:pPr>
+      <w:r>
+        <w:rPr>
+          <w:rFonts w:ascii="Calibri" w:hAnsi="Calibri" w:eastAsia="Calibri"/>
+          <w:b/>
+          <w:color w:val="202124"/>
+          <w:sz w:val="21"/>
+        </w:rPr>
+        <w:t>LiVT official repository</w:t>
+      </w:r>
+      <w:r>
+        <w:rPr>
+          <w:rFonts w:ascii="Calibri" w:hAnsi="Calibri" w:eastAsia="Calibri"/>
+          <w:color w:val="202124"/>
+          <w:sz w:val="21"/>
+        </w:rPr>
+        <w:t xml:space="preserve"> - Nguồn MIT cho công thức log(pi)-log(1-pi) và one-hot BCE; phải pin revision trước A0. </w:t>
+      </w:r>
+      <w:hyperlink r:id="rId26">
+        <w:r>
+          <w:rPr>
+            <w:rFonts w:ascii="Calibri" w:hAnsi="Calibri" w:eastAsia="Calibri"/>
+            <w:color w:val="2E74B5"/>
+            <w:u w:val="single"/>
+          </w:rPr>
+          <w:t>Mở nguồn</w:t>
+        </w:r>
+      </w:hyperlink>
+    </w:p>
+    <w:p>
+      <w:pPr>
+        <w:keepLines/>
+        <w:widowControl/>
+        <w:numPr>
+          <w:ilvl w:val="0"/>
+          <w:numId w:val="15"/>
+        </w:numPr>
+        <w:spacing w:after="160" w:line="280" w:lineRule="auto"/>
+      </w:pPr>
+      <w:r>
+        <w:rPr>
+          <w:rFonts w:ascii="Calibri" w:hAnsi="Calibri" w:eastAsia="Calibri"/>
+          <w:b/>
+          <w:color w:val="202124"/>
+          <w:sz w:val="21"/>
+        </w:rPr>
         <w:t>Do We Train on Test Data? Purging CIFAR of Near-Duplicates</w:t>
       </w:r>
       <w:r>
@@ -8113,7 +8587,7 @@
         </w:rPr>
         <w:t xml:space="preserve"> - Đối chiếu nguy cơ near-duplicate cross-split; TRKH dùng quy tắc whole-corpus invalidation nghiêm ngặt hơn. </w:t>
       </w:r>
-      <w:hyperlink r:id="rId25">
+      <w:hyperlink r:id="rId27">
         <w:r>
           <w:rPr>
             <w:rFonts w:ascii="Calibri" w:hAnsi="Calibri" w:eastAsia="Calibri"/>

</xml_diff>

<commit_message>
Lock train-only Balanced BCE A0
</commit_message>
<xml_diff>
--- a/docs/TRKH_5CLASS_RESEARCH_PROCESS_STATUS.docx
+++ b/docs/TRKH_5CLASS_RESEARCH_PROCESS_STATUS.docx
@@ -75,7 +75,7 @@
           <w:color w:val="202124"/>
           <w:sz w:val="21"/>
         </w:rPr>
-        <w:t>2026-07-24 | Revision 8</w:t>
+        <w:t>2026-07-24 | Revision 9</w:t>
       </w:r>
     </w:p>
     <w:p>
@@ -97,7 +97,7 @@
           <w:color w:val="202124"/>
           <w:sz w:val="21"/>
         </w:rPr>
-        <w:t>Đang nghiên cứu - RN-LISDA A0 đã bị loại; đang khóa Bal-BCE train-only</w:t>
+        <w:t>Đang nghiên cứu - Bal-BCE train-only A0 đã khóa prospectively; chưa có candidate metric</w:t>
       </w:r>
     </w:p>
     <w:p>
@@ -340,7 +340,7 @@
                 <w:color w:val="5F6368"/>
                 <w:sz w:val="16"/>
               </w:rPr>
-              <w:t>RN-LISDA A0</w:t>
+              <w:t>BAL-BCE A0</w:t>
             </w:r>
           </w:p>
           <w:p>
@@ -354,7 +354,7 @@
                 <w:color w:val="1F4D78"/>
                 <w:sz w:val="28"/>
               </w:rPr>
-              <w:t>Rejected</w:t>
+              <w:t>Locked</w:t>
             </w:r>
           </w:p>
           <w:p>
@@ -367,7 +367,7 @@
                 <w:color w:val="202124"/>
                 <w:sz w:val="17"/>
               </w:rPr>
-              <w:t>Macro/class1 F1 0,9383/0,8146; mất 25 TP so với CE</w:t>
+              <w:t>Protocol/lock 27c32d2a/1e28c686; chưa chạy candidate</w:t>
             </w:r>
           </w:p>
         </w:tc>
@@ -412,7 +412,7 @@
           <w:color w:val="202124"/>
           <w:sz w:val="21"/>
         </w:rPr>
-        <w:t>Giữ nguyên keeper hiện tại và file lệnh full-train tốt nhất. Full train random-init 30 epoch không thắng validation gate; JPEG-DL, SaSPA synthetic, LP-A3 hard-positive, NSA Poisson và RN-LISDA A0 đều đã bị loại. RN-LISDA dùng đủ 9.215 train rows với năm source-held fold, không mở validation/test; candidate trùng fixed/deranged/joint controls ở macro/class-1 F1 0,938291/0,814601, loại 22 restricted FP nhưng làm mất 25 class-1 TP so với CE. Trainer, validation và full train không được mở từ kết quả này.</w:t>
+        <w:t>Giữ nguyên keeper hiện tại và file lệnh full-train tốt nhất. Full train random-init 30 epoch không thắng validation gate; JPEG-DL, SaSPA synthetic, LP-A3 hard-positive, NSA Poisson và RN-LISDA A0 đều đã bị loại. Bal-BCE frozen-embedding A0 đã được khóa trước metric ở protocol/lock SHA 27c32d2a/1e28c686 với sáu vai trò, năm source-held fold, prior chỉ từ fitting-train và cổng precision-TP đồng thời. Chưa có candidate metric; trainer, validation, test và full train vẫn đóng.</w:t>
       </w:r>
     </w:p>
     <w:p>
@@ -2169,6 +2169,146 @@
                 <w:sz w:val="18"/>
               </w:rPr>
               <w:t>Rejected; trùng fixed/deranged/joint, mất 25 TP</w:t>
+            </w:r>
+          </w:p>
+        </w:tc>
+      </w:tr>
+      <w:tr>
+        <w:trPr>
+          <w:cantSplit/>
+        </w:trPr>
+        <w:tc>
+          <w:tcPr>
+            <w:tcW w:type="dxa" w:w="1500"/>
+            <w:tcMar>
+              <w:top w:w="80" w:type="dxa"/>
+              <w:start w:w="120" w:type="dxa"/>
+              <w:bottom w:w="80" w:type="dxa"/>
+              <w:end w:w="120" w:type="dxa"/>
+            </w:tcMar>
+            <w:vAlign w:val="center"/>
+          </w:tcPr>
+          <w:p>
+            <w:pPr>
+              <w:widowControl/>
+              <w:spacing w:after="0" w:line="247" w:lineRule="auto"/>
+              <w:jc w:val="left"/>
+            </w:pPr>
+            <w:r>
+              <w:rPr>
+                <w:rFonts w:ascii="Calibri" w:hAnsi="Calibri" w:eastAsia="Calibri"/>
+                <w:color w:val="202124"/>
+                <w:sz w:val="18"/>
+              </w:rPr>
+              <w:t>Bal-BCE A0</w:t>
+            </w:r>
+          </w:p>
+        </w:tc>
+        <w:tc>
+          <w:tcPr>
+            <w:tcW w:type="dxa" w:w="2250"/>
+            <w:tcMar>
+              <w:top w:w="80" w:type="dxa"/>
+              <w:start w:w="120" w:type="dxa"/>
+              <w:bottom w:w="80" w:type="dxa"/>
+              <w:end w:w="120" w:type="dxa"/>
+            </w:tcMar>
+            <w:vAlign w:val="center"/>
+          </w:tcPr>
+          <w:p>
+            <w:pPr>
+              <w:widowControl/>
+              <w:spacing w:after="0" w:line="247" w:lineRule="auto"/>
+              <w:jc w:val="left"/>
+            </w:pPr>
+            <w:r>
+              <w:rPr>
+                <w:rFonts w:ascii="Calibri" w:hAnsi="Calibri" w:eastAsia="Calibri"/>
+                <w:color w:val="202124"/>
+                <w:sz w:val="18"/>
+              </w:rPr>
+              <w:t>Prospective train-only lock; chưa chạy</w:t>
+            </w:r>
+          </w:p>
+        </w:tc>
+        <w:tc>
+          <w:tcPr>
+            <w:tcW w:type="dxa" w:w="1050"/>
+            <w:tcMar>
+              <w:top w:w="80" w:type="dxa"/>
+              <w:start w:w="120" w:type="dxa"/>
+              <w:bottom w:w="80" w:type="dxa"/>
+              <w:end w:w="120" w:type="dxa"/>
+            </w:tcMar>
+            <w:vAlign w:val="center"/>
+          </w:tcPr>
+          <w:p>
+            <w:pPr>
+              <w:widowControl/>
+              <w:spacing w:after="0" w:line="247" w:lineRule="auto"/>
+              <w:jc w:val="center"/>
+            </w:pPr>
+            <w:r>
+              <w:rPr>
+                <w:rFonts w:ascii="Calibri" w:hAnsi="Calibri" w:eastAsia="Calibri"/>
+                <w:color w:val="202124"/>
+                <w:sz w:val="18"/>
+              </w:rPr>
+              <w:t>N/A</w:t>
+            </w:r>
+          </w:p>
+        </w:tc>
+        <w:tc>
+          <w:tcPr>
+            <w:tcW w:type="dxa" w:w="2450"/>
+            <w:tcMar>
+              <w:top w:w="80" w:type="dxa"/>
+              <w:start w:w="120" w:type="dxa"/>
+              <w:bottom w:w="80" w:type="dxa"/>
+              <w:end w:w="120" w:type="dxa"/>
+            </w:tcMar>
+            <w:vAlign w:val="center"/>
+          </w:tcPr>
+          <w:p>
+            <w:pPr>
+              <w:widowControl/>
+              <w:spacing w:after="0" w:line="247" w:lineRule="auto"/>
+              <w:jc w:val="left"/>
+            </w:pPr>
+            <w:r>
+              <w:rPr>
+                <w:rFonts w:ascii="Calibri" w:hAnsi="Calibri" w:eastAsia="Calibri"/>
+                <w:color w:val="202124"/>
+                <w:sz w:val="18"/>
+              </w:rPr>
+              <w:t>CE/plain BCE/Bal-BCE/seed/BS/sign</w:t>
+            </w:r>
+          </w:p>
+        </w:tc>
+        <w:tc>
+          <w:tcPr>
+            <w:tcW w:type="dxa" w:w="2110"/>
+            <w:tcMar>
+              <w:top w:w="80" w:type="dxa"/>
+              <w:start w:w="120" w:type="dxa"/>
+              <w:bottom w:w="80" w:type="dxa"/>
+              <w:end w:w="120" w:type="dxa"/>
+            </w:tcMar>
+            <w:vAlign w:val="center"/>
+          </w:tcPr>
+          <w:p>
+            <w:pPr>
+              <w:widowControl/>
+              <w:spacing w:after="0" w:line="247" w:lineRule="auto"/>
+              <w:jc w:val="left"/>
+            </w:pPr>
+            <w:r>
+              <w:rPr>
+                <w:rFonts w:ascii="Calibri" w:hAnsi="Calibri" w:eastAsia="Calibri"/>
+                <w:color w:val="202124"/>
+                <w:sz w:val="18"/>
+              </w:rPr>
+              <w:t>Lock 1e28c686; 0 candidate metric</w:t>
             </w:r>
           </w:p>
         </w:tc>
@@ -7196,7 +7336,7 @@
           <w:color w:val="202124"/>
           <w:sz w:val="22"/>
         </w:rPr>
-        <w:t>Commit/push prospective Bal-BCE protocol và machine lock trước candidate metrics: official LiVT equation, source-held folds, CE/plain-BCE/Balanced-Softmax/sign/seed controls, file-access ledger, resources và conjunctive gates.</w:t>
+        <w:t>Giữ bất biến Bal-BCE protocol/lock SHA 27c32d2a/1e28c686 đã khóa và push trước candidate metrics: official LiVT equation, source-held folds, CE/plain-BCE/Balanced-Softmax/sign/seed controls, file-access ledger, resources và conjunctive gates.</w:t>
       </w:r>
     </w:p>
     <w:p>
@@ -7816,6 +7956,124 @@
                 <w:color w:val="202124"/>
                 <w:sz w:val="18"/>
               </w:rPr>
+              <w:t>docs/TRKH_5CLASS_BALANCED_BCE_FROZEN_EMBEDDING_A0_PROTOCOL_20260724.md</w:t>
+            </w:r>
+          </w:p>
+        </w:tc>
+        <w:tc>
+          <w:tcPr>
+            <w:tcW w:type="dxa" w:w="5310"/>
+            <w:tcMar>
+              <w:top w:w="80" w:type="dxa"/>
+              <w:start w:w="120" w:type="dxa"/>
+              <w:bottom w:w="80" w:type="dxa"/>
+              <w:end w:w="120" w:type="dxa"/>
+            </w:tcMar>
+            <w:vAlign w:val="center"/>
+          </w:tcPr>
+          <w:p>
+            <w:pPr>
+              <w:widowControl/>
+              <w:spacing w:after="0" w:line="247" w:lineRule="auto"/>
+              <w:jc w:val="left"/>
+            </w:pPr>
+            <w:r>
+              <w:rPr>
+                <w:rFonts w:ascii="Calibri" w:hAnsi="Calibri" w:eastAsia="Calibri"/>
+                <w:color w:val="202124"/>
+                <w:sz w:val="18"/>
+              </w:rPr>
+              <w:t>Giao thức prospective Bal-BCE trước mọi candidate metric.</w:t>
+            </w:r>
+          </w:p>
+        </w:tc>
+      </w:tr>
+      <w:tr>
+        <w:trPr>
+          <w:cantSplit/>
+        </w:trPr>
+        <w:tc>
+          <w:tcPr>
+            <w:tcW w:type="dxa" w:w="4050"/>
+            <w:tcMar>
+              <w:top w:w="80" w:type="dxa"/>
+              <w:start w:w="120" w:type="dxa"/>
+              <w:bottom w:w="80" w:type="dxa"/>
+              <w:end w:w="120" w:type="dxa"/>
+            </w:tcMar>
+            <w:vAlign w:val="center"/>
+          </w:tcPr>
+          <w:p>
+            <w:pPr>
+              <w:widowControl/>
+              <w:spacing w:after="0" w:line="247" w:lineRule="auto"/>
+              <w:jc w:val="left"/>
+            </w:pPr>
+            <w:r>
+              <w:rPr>
+                <w:rFonts w:ascii="Calibri" w:hAnsi="Calibri" w:eastAsia="Calibri"/>
+                <w:color w:val="202124"/>
+                <w:sz w:val="18"/>
+              </w:rPr>
+              <w:t>scripts/build_trkh_balanced_bce_frozen_embedding_a0_lock.py</w:t>
+            </w:r>
+          </w:p>
+        </w:tc>
+        <w:tc>
+          <w:tcPr>
+            <w:tcW w:type="dxa" w:w="5310"/>
+            <w:tcMar>
+              <w:top w:w="80" w:type="dxa"/>
+              <w:start w:w="120" w:type="dxa"/>
+              <w:bottom w:w="80" w:type="dxa"/>
+              <w:end w:w="120" w:type="dxa"/>
+            </w:tcMar>
+            <w:vAlign w:val="center"/>
+          </w:tcPr>
+          <w:p>
+            <w:pPr>
+              <w:widowControl/>
+              <w:spacing w:after="0" w:line="247" w:lineRule="auto"/>
+              <w:jc w:val="left"/>
+            </w:pPr>
+            <w:r>
+              <w:rPr>
+                <w:rFonts w:ascii="Calibri" w:hAnsi="Calibri" w:eastAsia="Calibri"/>
+                <w:color w:val="202124"/>
+                <w:sz w:val="18"/>
+              </w:rPr>
+              <w:t>Tái sinh fold prior, bias, init, order hashes và machine lock.</w:t>
+            </w:r>
+          </w:p>
+        </w:tc>
+      </w:tr>
+      <w:tr>
+        <w:trPr>
+          <w:cantSplit/>
+        </w:trPr>
+        <w:tc>
+          <w:tcPr>
+            <w:tcW w:type="dxa" w:w="4050"/>
+            <w:tcMar>
+              <w:top w:w="80" w:type="dxa"/>
+              <w:start w:w="120" w:type="dxa"/>
+              <w:bottom w:w="80" w:type="dxa"/>
+              <w:end w:w="120" w:type="dxa"/>
+            </w:tcMar>
+            <w:vAlign w:val="center"/>
+          </w:tcPr>
+          <w:p>
+            <w:pPr>
+              <w:widowControl/>
+              <w:spacing w:after="0" w:line="247" w:lineRule="auto"/>
+              <w:jc w:val="left"/>
+            </w:pPr>
+            <w:r>
+              <w:rPr>
+                <w:rFonts w:ascii="Calibri" w:hAnsi="Calibri" w:eastAsia="Calibri"/>
+                <w:color w:val="202124"/>
+                <w:sz w:val="18"/>
+              </w:rPr>
               <w:t>C:/Users/ADMIN/.codex/skills/trkh-5class/SKILL.md</w:t>
             </w:r>
           </w:p>
@@ -7864,7 +8122,7 @@
           <w:color w:val="202124"/>
           <w:sz w:val="22"/>
         </w:rPr>
-        <w:t>Revision 1: tạo báo cáo Word tái lập; ghi nhận full train 30e, trạng thái JPEG-DL formal, nghiên cứu competition và chính sách synthetic train-only chống leak. Revision 2: khóa JPEG-DL A0 ở VisualFail với replay exact, ghi metric/XAI/SHAs cuối và chuyển kế hoạch sang synthetic feasibility source-disjoint. Revision 3: retention pass trên 822 thư mục/51 manifests, giữ formal 2,614 MiB; sửa odd/even header-footer và reset numbering theo từng block sau render QA. Revision 4: SaSPA F0 no-output pass formal/replay trên RTX 4060 8 GB; ghi telemetry, process isolation, hash artifact và chỉ mở quyền F1 10 ảnh train-only. Revision 5: đóng SaSPA F1 ở Rejected sau fidelity 0/10, blind 7/10, duplicate-safety pass và frozen-keeper XAI 6/10; giữ nguyên keeper/lệnh full-train tốt nhất; bỏ running header-footer để khóa lề 1 inch ổn định giữa Word và LibreOffice sau render QA. Revision 6: đóng LP-A3-inspired A0 sau audit train-only 9.215 hàng, replay exact, 19/23 automated gates và manual delta review; ghi causal-control fail 6/734, không integration hoặc command update. Revision 7: đóng NSA class-pair Poisson A0 ở reject sau formal/replay/manual review; phân biệt checker-order defect với scientific failure, sửa duplicate audit thành whole-corpus invalidation một chiều, chạy retention 847 thư mục không blocker, full suite 1.852/1.852, và chọn RN-LISDA train-only làm route kế tiếp. Revision 8: đóng RN-LISDA A0 sau performance 17/37, mechanism 22/25, replay exact và manual proxy review; sửa visual-ledger read-set cùng bool scalar checker, khóa synthetic ratio bằng train-only protocol, chọn Bal-BCE OOF gate làm route kế tiếp, full suite 1.884/1.884 và DOCX 12 trang đạt accessibility 0/0/0.</w:t>
+        <w:t>Revision 1: tạo báo cáo Word tái lập; ghi nhận full train 30e, trạng thái JPEG-DL formal, nghiên cứu competition và chính sách synthetic train-only chống leak. Revision 2: khóa JPEG-DL A0 ở VisualFail với replay exact, ghi metric/XAI/SHAs cuối và chuyển kế hoạch sang synthetic feasibility source-disjoint. Revision 3: retention pass trên 822 thư mục/51 manifests, giữ formal 2,614 MiB; sửa odd/even header-footer và reset numbering theo từng block sau render QA. Revision 4: SaSPA F0 no-output pass formal/replay trên RTX 4060 8 GB; ghi telemetry, process isolation, hash artifact và chỉ mở quyền F1 10 ảnh train-only. Revision 5: đóng SaSPA F1 ở Rejected sau fidelity 0/10, blind 7/10, duplicate-safety pass và frozen-keeper XAI 6/10; giữ nguyên keeper/lệnh full-train tốt nhất; bỏ running header-footer để khóa lề 1 inch ổn định giữa Word và LibreOffice sau render QA. Revision 6: đóng LP-A3-inspired A0 sau audit train-only 9.215 hàng, replay exact, 19/23 automated gates và manual delta review; ghi causal-control fail 6/734, không integration hoặc command update. Revision 7: đóng NSA class-pair Poisson A0 ở reject sau formal/replay/manual review; phân biệt checker-order defect với scientific failure, sửa duplicate audit thành whole-corpus invalidation một chiều, chạy retention 847 thư mục không blocker, full suite 1.852/1.852, và chọn RN-LISDA train-only làm route kế tiếp. Revision 8: đóng RN-LISDA A0 sau performance 17/37, mechanism 22/25, replay exact và manual proxy review; sửa visual-ledger read-set cùng bool scalar checker, khóa synthetic ratio bằng train-only protocol, chọn Bal-BCE OOF gate làm route kế tiếp, full suite 1.884/1.884 và DOCX 12 trang đạt accessibility 0/0/0. Revision 9: pin LiVT MIT commit 68546ef và paper/source hashes; khóa prospective Bal-BCE A0 với sáu vai trò, fit-fold priors, init/order hashes, ledger và cổng precision-TP tại protocol/lock SHA 27c32d2a/1e28c686 trước mọi candidate metric; full suite 1.888/1.888.</w:t>
       </w:r>
     </w:p>
     <w:p>

</xml_diff>

<commit_message>
Close balanced BCE train-only audit
</commit_message>
<xml_diff>
--- a/docs/TRKH_5CLASS_RESEARCH_PROCESS_STATUS.docx
+++ b/docs/TRKH_5CLASS_RESEARCH_PROCESS_STATUS.docx
@@ -75,7 +75,7 @@
           <w:color w:val="202124"/>
           <w:sz w:val="21"/>
         </w:rPr>
-        <w:t>2026-07-24 | Revision 9</w:t>
+        <w:t>2026-07-24 | Revision 10</w:t>
       </w:r>
     </w:p>
     <w:p>
@@ -97,7 +97,7 @@
           <w:color w:val="202124"/>
           <w:sz w:val="21"/>
         </w:rPr>
-        <w:t>Đang nghiên cứu - Bal-BCE train-only A0 đã khóa prospectively; chưa có candidate metric</w:t>
+        <w:t>Đang nghiên cứu - Bal-BCE train-only A0 đã bị loại; đang sàng lọc hướng representation mới</w:t>
       </w:r>
     </w:p>
     <w:p>
@@ -354,7 +354,7 @@
                 <w:color w:val="1F4D78"/>
                 <w:sz w:val="28"/>
               </w:rPr>
-              <w:t>Locked</w:t>
+              <w:t>Rejected</w:t>
             </w:r>
           </w:p>
           <w:p>
@@ -367,7 +367,7 @@
                 <w:color w:val="202124"/>
                 <w:sz w:val="17"/>
               </w:rPr>
-              <w:t>Protocol/lock 27c32d2a/1e28c686; chưa chạy candidate</w:t>
+              <w:t>P/R/F1 lớp 1 = 0,7593/0,9039/0,8253; tạo 57 restricted FP</w:t>
             </w:r>
           </w:p>
         </w:tc>
@@ -412,7 +412,7 @@
           <w:color w:val="202124"/>
           <w:sz w:val="21"/>
         </w:rPr>
-        <w:t>Giữ nguyên keeper hiện tại và file lệnh full-train tốt nhất. Full train random-init 30 epoch không thắng validation gate; JPEG-DL, SaSPA synthetic, LP-A3 hard-positive, NSA Poisson và RN-LISDA A0 đều đã bị loại. Bal-BCE frozen-embedding A0 đã được khóa trước metric ở protocol/lock SHA 27c32d2a/1e28c686 với sáu vai trò, năm source-held fold, prior chỉ từ fitting-train và cổng precision-TP đồng thời. Chưa có candidate metric; trainer, validation, test và full train vẫn đóng.</w:t>
+        <w:t>Giữ nguyên keeper hiện tại và file lệnh full-train tốt nhất. Full train random-init 30 epoch không thắng validation gate; JPEG-DL, SaSPA synthetic, LP-A3 hard-positive, NSA Poisson, RN-LISDA và Bal-BCE A0 đều đã bị loại. Bal-BCE pass toàn bộ cấu trúc và replay exact nhưng chỉ pass 19/34 performance gate: cứu 38 TP lớp 1 đồng thời tạo 57 restricted FP và giảm precision từ 0,821494 xuống 0,759317. Trainer, validation, test và full train vẫn đóng; hướng kế tiếp phải bổ sung tín hiệu cục bộ theo mẫu thay vì dịch prior toàn cục.</w:t>
       </w:r>
     </w:p>
     <w:p>
@@ -2227,7 +2227,7 @@
                 <w:color w:val="202124"/>
                 <w:sz w:val="18"/>
               </w:rPr>
-              <w:t>Prospective train-only lock; chưa chạy</w:t>
+              <w:t>9.215 train; 5 source-held folds</w:t>
             </w:r>
           </w:p>
         </w:tc>
@@ -2254,7 +2254,7 @@
                 <w:color w:val="202124"/>
                 <w:sz w:val="18"/>
               </w:rPr>
-              <w:t>N/A</w:t>
+              <w:t>0,940560</w:t>
             </w:r>
           </w:p>
         </w:tc>
@@ -2281,7 +2281,7 @@
                 <w:color w:val="202124"/>
                 <w:sz w:val="18"/>
               </w:rPr>
-              <w:t>CE/plain BCE/Bal-BCE/seed/BS/sign</w:t>
+              <w:t>0,759317 / 0,903882 / 0,825316</w:t>
             </w:r>
           </w:p>
         </w:tc>
@@ -2308,7 +2308,7 @@
                 <w:color w:val="202124"/>
                 <w:sz w:val="18"/>
               </w:rPr>
-              <w:t>Lock 1e28c686; 0 candidate metric</w:t>
+              <w:t>Rejected; cứu 38 TP nhưng tạo 57 restricted FP</w:t>
             </w:r>
           </w:p>
         </w:tc>
@@ -3921,6 +3921,92 @@
                 <w:color w:val="202124"/>
                 <w:sz w:val="18"/>
               </w:rPr>
+              <w:t>Dịch prior toàn cục</w:t>
+            </w:r>
+          </w:p>
+        </w:tc>
+        <w:tc>
+          <w:tcPr>
+            <w:tcW w:type="dxa" w:w="4000"/>
+            <w:tcMar>
+              <w:top w:w="80" w:type="dxa"/>
+              <w:start w:w="120" w:type="dxa"/>
+              <w:bottom w:w="80" w:type="dxa"/>
+              <w:end w:w="120" w:type="dxa"/>
+            </w:tcMar>
+            <w:vAlign w:val="center"/>
+          </w:tcPr>
+          <w:p>
+            <w:pPr>
+              <w:widowControl/>
+              <w:spacing w:after="0" w:line="247" w:lineRule="auto"/>
+              <w:jc w:val="left"/>
+            </w:pPr>
+            <w:r>
+              <w:rPr>
+                <w:rFonts w:ascii="Calibri" w:hAnsi="Calibri" w:eastAsia="Calibri"/>
+                <w:color w:val="202124"/>
+                <w:sz w:val="18"/>
+              </w:rPr>
+              <w:t>Bal-BCE cứu 38 TP nhưng tạo 57 restricted FP; prior đảo loại 33 FP nhưng phá 53 TP.</w:t>
+            </w:r>
+          </w:p>
+        </w:tc>
+        <w:tc>
+          <w:tcPr>
+            <w:tcW w:type="dxa" w:w="3460"/>
+            <w:tcMar>
+              <w:top w:w="80" w:type="dxa"/>
+              <w:start w:w="120" w:type="dxa"/>
+              <w:bottom w:w="80" w:type="dxa"/>
+              <w:end w:w="120" w:type="dxa"/>
+            </w:tcMar>
+            <w:vAlign w:val="center"/>
+          </w:tcPr>
+          <w:p>
+            <w:pPr>
+              <w:widowControl/>
+              <w:spacing w:after="0" w:line="247" w:lineRule="auto"/>
+              <w:jc w:val="left"/>
+            </w:pPr>
+            <w:r>
+              <w:rPr>
+                <w:rFonts w:ascii="Calibri" w:hAnsi="Calibri" w:eastAsia="Calibri"/>
+                <w:color w:val="202124"/>
+                <w:sz w:val="18"/>
+              </w:rPr>
+              <w:t>Cân bằng lớp đổi operating point nhưng không tạo tín hiệu cục bộ để tách lớp 1 khỏi 0/2/4.</w:t>
+            </w:r>
+          </w:p>
+        </w:tc>
+      </w:tr>
+      <w:tr>
+        <w:trPr>
+          <w:cantSplit/>
+        </w:trPr>
+        <w:tc>
+          <w:tcPr>
+            <w:tcW w:type="dxa" w:w="1900"/>
+            <w:tcMar>
+              <w:top w:w="80" w:type="dxa"/>
+              <w:start w:w="120" w:type="dxa"/>
+              <w:bottom w:w="80" w:type="dxa"/>
+              <w:end w:w="120" w:type="dxa"/>
+            </w:tcMar>
+            <w:vAlign w:val="center"/>
+          </w:tcPr>
+          <w:p>
+            <w:pPr>
+              <w:widowControl/>
+              <w:spacing w:after="0" w:line="247" w:lineRule="auto"/>
+              <w:jc w:val="left"/>
+            </w:pPr>
+            <w:r>
+              <w:rPr>
+                <w:rFonts w:ascii="Calibri" w:hAnsi="Calibri" w:eastAsia="Calibri"/>
+                <w:color w:val="202124"/>
+                <w:sz w:val="18"/>
+              </w:rPr>
               <w:t>Worktree bẩn</w:t>
             </w:r>
           </w:p>
@@ -4137,6 +4223,42 @@
           <w:sz w:val="22"/>
         </w:rPr>
         <w:t>NSA class-pair Poisson: đóng exact geometry/query/adapter/readout neighborhood; không sweep support, Poisson mode, query width, epoch, readout hoặc metric gate sau khi candidate không hơn controls.</w:t>
+      </w:r>
+    </w:p>
+    <w:p>
+      <w:pPr>
+        <w:widowControl/>
+        <w:numPr>
+          <w:ilvl w:val="0"/>
+          <w:numId w:val="10"/>
+        </w:numPr>
+        <w:spacing w:after="160" w:line="280" w:lineRule="auto"/>
+      </w:pPr>
+      <w:r>
+        <w:rPr>
+          <w:rFonts w:ascii="Calibri" w:hAnsi="Calibri" w:eastAsia="Calibri"/>
+          <w:color w:val="202124"/>
+          <w:sz w:val="22"/>
+        </w:rPr>
+        <w:t>RN-LISDA: đóng exact covariance/CovNet/meta schedule vì candidate trùng fixed, deranged, joint/no-meta và mất 25 TP lớp 1.</w:t>
+      </w:r>
+    </w:p>
+    <w:p>
+      <w:pPr>
+        <w:widowControl/>
+        <w:numPr>
+          <w:ilvl w:val="0"/>
+          <w:numId w:val="10"/>
+        </w:numPr>
+        <w:spacing w:after="160" w:line="280" w:lineRule="auto"/>
+      </w:pPr>
+      <w:r>
+        <w:rPr>
+          <w:rFonts w:ascii="Calibri" w:hAnsi="Calibri" w:eastAsia="Calibri"/>
+          <w:color w:val="202124"/>
+          <w:sz w:val="22"/>
+        </w:rPr>
+        <w:t>Bal-BCE: đóng exact prior/sign/seed/fold/epoch/optimizer neighborhood; không nội suy prior multiplier hoặc nhiệt độ Balanced Softmax sau khi thấy tradeoff FP-TP.</w:t>
       </w:r>
     </w:p>
     <w:p>
@@ -5572,7 +5694,7 @@
                 <w:color w:val="202124"/>
                 <w:sz w:val="18"/>
               </w:rPr>
-              <w:t>Route kế tiếp chỉ là train-only OOF gate; phải hơn CE/plain BCE/Balanced Softmax/sign control mà vẫn giữ TP và precision.</w:t>
+              <w:t>A0 đã bị loại: recall tăng nhưng precision giảm, tạo 57 restricted FP; global prior không thay thế representation cục bộ.</w:t>
             </w:r>
           </w:p>
         </w:tc>
@@ -6464,7 +6586,7 @@
                 <w:color w:val="202124"/>
                 <w:sz w:val="18"/>
               </w:rPr>
-              <w:t>Hash/tóm tắt trước khi xóa chính xác artifact obsolete; hậu NSA pass 847 thư mục, 36/36 nguồn compact đã vắng.</w:t>
+              <w:t>Hash/tóm tắt trước khi xóa chính xác artifact obsolete; hậu Bal-BCE quét 850 thư mục và 51 manifest, 220/220 nguồn compact đã vắng.</w:t>
             </w:r>
           </w:p>
         </w:tc>
@@ -6491,7 +6613,7 @@
                 <w:color w:val="202124"/>
                 <w:sz w:val="18"/>
               </w:rPr>
-              <w:t>Giải phóng dung lượng mà không mất bằng chứng; 0 blocker và 88,918 GiB còn trống.</w:t>
+              <w:t>Không xóa gì trong audit; 0 blocker và 88,871 GiB còn trống.</w:t>
             </w:r>
           </w:p>
         </w:tc>
@@ -7270,6 +7392,92 @@
           </w:p>
         </w:tc>
       </w:tr>
+      <w:tr>
+        <w:trPr>
+          <w:cantSplit/>
+        </w:trPr>
+        <w:tc>
+          <w:tcPr>
+            <w:tcW w:type="dxa" w:w="2550"/>
+            <w:tcMar>
+              <w:top w:w="80" w:type="dxa"/>
+              <w:start w:w="120" w:type="dxa"/>
+              <w:bottom w:w="80" w:type="dxa"/>
+              <w:end w:w="120" w:type="dxa"/>
+            </w:tcMar>
+            <w:vAlign w:val="center"/>
+          </w:tcPr>
+          <w:p>
+            <w:pPr>
+              <w:widowControl/>
+              <w:spacing w:after="0" w:line="247" w:lineRule="auto"/>
+              <w:jc w:val="left"/>
+            </w:pPr>
+            <w:r>
+              <w:rPr>
+                <w:rFonts w:ascii="Calibri" w:hAnsi="Calibri" w:eastAsia="Calibri"/>
+                <w:color w:val="202124"/>
+                <w:sz w:val="18"/>
+              </w:rPr>
+              <w:t>Đối chứng hai chiều prior</w:t>
+            </w:r>
+          </w:p>
+        </w:tc>
+        <w:tc>
+          <w:tcPr>
+            <w:tcW w:type="dxa" w:w="3810"/>
+            <w:tcMar>
+              <w:top w:w="80" w:type="dxa"/>
+              <w:start w:w="120" w:type="dxa"/>
+              <w:bottom w:w="80" w:type="dxa"/>
+              <w:end w:w="120" w:type="dxa"/>
+            </w:tcMar>
+            <w:vAlign w:val="center"/>
+          </w:tcPr>
+          <w:p>
+            <w:pPr>
+              <w:widowControl/>
+              <w:spacing w:after="0" w:line="247" w:lineRule="auto"/>
+              <w:jc w:val="left"/>
+            </w:pPr>
+            <w:r>
+              <w:rPr>
+                <w:rFonts w:ascii="Calibri" w:hAnsi="Calibri" w:eastAsia="Calibri"/>
+                <w:color w:val="202124"/>
+                <w:sz w:val="18"/>
+              </w:rPr>
+              <w:t>So exact Bal-BCE với CE, plain BCE, Balanced Softmax, seed repeat và reversed-prior trên cùng fold/init/order.</w:t>
+            </w:r>
+          </w:p>
+        </w:tc>
+        <w:tc>
+          <w:tcPr>
+            <w:tcW w:type="dxa" w:w="3000"/>
+            <w:tcMar>
+              <w:top w:w="80" w:type="dxa"/>
+              <w:start w:w="120" w:type="dxa"/>
+              <w:bottom w:w="80" w:type="dxa"/>
+              <w:end w:w="120" w:type="dxa"/>
+            </w:tcMar>
+            <w:vAlign w:val="center"/>
+          </w:tcPr>
+          <w:p>
+            <w:pPr>
+              <w:widowControl/>
+              <w:spacing w:after="0" w:line="247" w:lineRule="auto"/>
+              <w:jc w:val="left"/>
+            </w:pPr>
+            <w:r>
+              <w:rPr>
+                <w:rFonts w:ascii="Calibri" w:hAnsi="Calibri" w:eastAsia="Calibri"/>
+                <w:color w:val="202124"/>
+                <w:sz w:val="18"/>
+              </w:rPr>
+              <w:t>Phân biệt tăng recall do mở rộng lớp toàn cục với cải thiện ranh giới chọn lọc; chặn sweep hệ số sau kết quả.</w:t>
+            </w:r>
+          </w:p>
+        </w:tc>
+      </w:tr>
     </w:tbl>
     <w:p>
       <w:pPr>
@@ -7300,7 +7508,7 @@
           <w:color w:val="202124"/>
           <w:sz w:val="22"/>
         </w:rPr>
-        <w:t>Giữ nguyên các closure JPEG-DL, SaSPA F1, LP-A3, NSA và RN-LISDA A0 có giá trị tái lập; cleanup artifact tạm bằng manifest riêng.</w:t>
+        <w:t>Giữ nguyên các closure JPEG-DL, SaSPA F1, LP-A3, NSA, RN-LISDA và Bal-BCE A0 có giá trị tái lập; cleanup artifact tạm bằng manifest riêng.</w:t>
       </w:r>
     </w:p>
     <w:p>
@@ -7318,7 +7526,7 @@
           <w:color w:val="202124"/>
           <w:sz w:val="22"/>
         </w:rPr>
-        <w:t>Đóng exact SaSPA, LP-A3, NSA và RN-LISDA neighborhoods đã khóa; không mở lại bằng sweep prompt/seed, radius/step/margin/lambda, query/Poisson/readout hoặc CovNet/meta schedule.</w:t>
+        <w:t>Đóng exact SaSPA, LP-A3, NSA, RN-LISDA và Bal-BCE neighborhoods đã khóa; không mở lại bằng sweep prompt/seed, radius/step/margin/lambda, query/Poisson/readout, CovNet/meta schedule hoặc prior multiplier.</w:t>
       </w:r>
     </w:p>
     <w:p>
@@ -7336,7 +7544,7 @@
           <w:color w:val="202124"/>
           <w:sz w:val="22"/>
         </w:rPr>
-        <w:t>Giữ bất biến Bal-BCE protocol/lock SHA 27c32d2a/1e28c686 đã khóa và push trước candidate metrics: official LiVT equation, source-held folds, CE/plain-BCE/Balanced-Softmax/sign/seed controls, file-access ledger, resources và conjunctive gates.</w:t>
+        <w:t>Giữ bất biến Bal-BCE protocol/lock SHA 27c32d2a/1e28c686 và formal/replay/final SHAs b501fe60/8766c26e/93fc089b; không integration vì candidate tạo 57 restricted FP.</w:t>
       </w:r>
     </w:p>
     <w:p>
@@ -7354,7 +7562,7 @@
           <w:color w:val="202124"/>
           <w:sz w:val="22"/>
         </w:rPr>
-        <w:t>Chạy Bal-BCE frozen-embedding A0 chỉ trên yolo_f/train; candidate phải tăng precision, loại restricted FP, giữ class-1 TP/recall và macro/nonfocus safety trên đủ năm fold trước trainer integration.</w:t>
+        <w:t>Sàng lọc rồi khóa prospectively một A0 representation-distinct dùng tín hiệu cục bộ theo mẫu; gate train-only phải cùng lúc giữ TP lớp 1 và loại restricted FP, với matched causal controls.</w:t>
       </w:r>
     </w:p>
     <w:p>
@@ -8015,6 +8223,65 @@
                 <w:color w:val="202124"/>
                 <w:sz w:val="18"/>
               </w:rPr>
+              <w:t>docs/TRKH_5CLASS_BALANCED_BCE_FROZEN_EMBEDDING_A0_CLOSURE_20260724.md</w:t>
+            </w:r>
+          </w:p>
+        </w:tc>
+        <w:tc>
+          <w:tcPr>
+            <w:tcW w:type="dxa" w:w="5310"/>
+            <w:tcMar>
+              <w:top w:w="80" w:type="dxa"/>
+              <w:start w:w="120" w:type="dxa"/>
+              <w:bottom w:w="80" w:type="dxa"/>
+              <w:end w:w="120" w:type="dxa"/>
+            </w:tcMar>
+            <w:vAlign w:val="center"/>
+          </w:tcPr>
+          <w:p>
+            <w:pPr>
+              <w:widowControl/>
+              <w:spacing w:after="0" w:line="247" w:lineRule="auto"/>
+              <w:jc w:val="left"/>
+            </w:pPr>
+            <w:r>
+              <w:rPr>
+                <w:rFonts w:ascii="Calibri" w:hAnsi="Calibri" w:eastAsia="Calibri"/>
+                <w:color w:val="202124"/>
+                <w:sz w:val="18"/>
+              </w:rPr>
+              <w:t>Kết luận formal/replay/visual, no-repeat boundary và hash bằng chứng Bal-BCE.</w:t>
+            </w:r>
+          </w:p>
+        </w:tc>
+      </w:tr>
+      <w:tr>
+        <w:trPr>
+          <w:cantSplit/>
+        </w:trPr>
+        <w:tc>
+          <w:tcPr>
+            <w:tcW w:type="dxa" w:w="4050"/>
+            <w:tcMar>
+              <w:top w:w="80" w:type="dxa"/>
+              <w:start w:w="120" w:type="dxa"/>
+              <w:bottom w:w="80" w:type="dxa"/>
+              <w:end w:w="120" w:type="dxa"/>
+            </w:tcMar>
+            <w:vAlign w:val="center"/>
+          </w:tcPr>
+          <w:p>
+            <w:pPr>
+              <w:widowControl/>
+              <w:spacing w:after="0" w:line="247" w:lineRule="auto"/>
+              <w:jc w:val="left"/>
+            </w:pPr>
+            <w:r>
+              <w:rPr>
+                <w:rFonts w:ascii="Calibri" w:hAnsi="Calibri" w:eastAsia="Calibri"/>
+                <w:color w:val="202124"/>
+                <w:sz w:val="18"/>
+              </w:rPr>
               <w:t>scripts/build_trkh_balanced_bce_frozen_embedding_a0_lock.py</w:t>
             </w:r>
           </w:p>
@@ -8122,7 +8389,7 @@
           <w:color w:val="202124"/>
           <w:sz w:val="22"/>
         </w:rPr>
-        <w:t>Revision 1: tạo báo cáo Word tái lập; ghi nhận full train 30e, trạng thái JPEG-DL formal, nghiên cứu competition và chính sách synthetic train-only chống leak. Revision 2: khóa JPEG-DL A0 ở VisualFail với replay exact, ghi metric/XAI/SHAs cuối và chuyển kế hoạch sang synthetic feasibility source-disjoint. Revision 3: retention pass trên 822 thư mục/51 manifests, giữ formal 2,614 MiB; sửa odd/even header-footer và reset numbering theo từng block sau render QA. Revision 4: SaSPA F0 no-output pass formal/replay trên RTX 4060 8 GB; ghi telemetry, process isolation, hash artifact và chỉ mở quyền F1 10 ảnh train-only. Revision 5: đóng SaSPA F1 ở Rejected sau fidelity 0/10, blind 7/10, duplicate-safety pass và frozen-keeper XAI 6/10; giữ nguyên keeper/lệnh full-train tốt nhất; bỏ running header-footer để khóa lề 1 inch ổn định giữa Word và LibreOffice sau render QA. Revision 6: đóng LP-A3-inspired A0 sau audit train-only 9.215 hàng, replay exact, 19/23 automated gates và manual delta review; ghi causal-control fail 6/734, không integration hoặc command update. Revision 7: đóng NSA class-pair Poisson A0 ở reject sau formal/replay/manual review; phân biệt checker-order defect với scientific failure, sửa duplicate audit thành whole-corpus invalidation một chiều, chạy retention 847 thư mục không blocker, full suite 1.852/1.852, và chọn RN-LISDA train-only làm route kế tiếp. Revision 8: đóng RN-LISDA A0 sau performance 17/37, mechanism 22/25, replay exact và manual proxy review; sửa visual-ledger read-set cùng bool scalar checker, khóa synthetic ratio bằng train-only protocol, chọn Bal-BCE OOF gate làm route kế tiếp, full suite 1.884/1.884 và DOCX 12 trang đạt accessibility 0/0/0. Revision 9: pin LiVT MIT commit 68546ef và paper/source hashes; khóa prospective Bal-BCE A0 với sáu vai trò, fit-fold priors, init/order hashes, ledger và cổng precision-TP tại protocol/lock SHA 27c32d2a/1e28c686 trước mọi candidate metric; full suite 1.888/1.888.</w:t>
+        <w:t>Revision 1-3: tạo báo cáo tái lập, ghi full train 30e/JPEG-DL/chính sách synthetic chống leak, đóng JPEG-DL bằng replay-XAI và hoàn tất retention/layout QA. Revision 4-5: SaSPA F0 pass resource/replay; F1 bị loại ở fidelity 0/10, blind 7/10 và XAI 6/10, không đổi keeper. Revision 6: LP-A3 A0 bị loại sau causal-control fail; không integration. Revision 7: NSA Poisson bị loại sau formal/replay/manual review; sửa canonical hash và whole-corpus duplicate rule. Revision 8: RN-LISDA bị loại sau performance 17/37, mechanism 22/25 và replay exact; sửa visual-ledger/bool checker. Revision 9: pin nguồn LiVT và khóa Bal-BCE prospective tại protocol/lock SHA 27c32d2a/1e28c686 trước metric. Revision 10: Bal-BCE bị loại sau performance 19/34, replay exact và review 20 anchor; cứu 38 TP nhưng tạo 57 restricted FP, prior đảo mất 53 TP. Full suite 1.899/1.899, retention 850 thư mục/220 nguồn vắng và DOCX 12 trang accessibility 0/0/0; keeper/lệnh tốt nhất không đổi.</w:t>
       </w:r>
     </w:p>
     <w:p>

</xml_diff>

<commit_message>
Lock CAP integral-region context A0 protocol
</commit_message>
<xml_diff>
--- a/docs/TRKH_5CLASS_RESEARCH_PROCESS_STATUS.docx
+++ b/docs/TRKH_5CLASS_RESEARCH_PROCESS_STATUS.docx
@@ -75,7 +75,7 @@
           <w:color w:val="202124"/>
           <w:sz w:val="21"/>
         </w:rPr>
-        <w:t>2026-07-24 | Revision 10</w:t>
+        <w:t>2026-07-24 | Revision 11</w:t>
       </w:r>
     </w:p>
     <w:p>
@@ -97,7 +97,7 @@
           <w:color w:val="202124"/>
           <w:sz w:val="21"/>
         </w:rPr>
-        <w:t>Đang nghiên cứu - Bal-BCE train-only A0 đã bị loại; đang sàng lọc hướng representation mới</w:t>
+        <w:t>Đang nghiên cứu - CAP integral-region context A0 đã được khóa prospectively trước candidate code</w:t>
       </w:r>
     </w:p>
     <w:p>
@@ -412,7 +412,7 @@
           <w:color w:val="202124"/>
           <w:sz w:val="21"/>
         </w:rPr>
-        <w:t>Giữ nguyên keeper hiện tại và file lệnh full-train tốt nhất. Full train random-init 30 epoch không thắng validation gate; JPEG-DL, SaSPA synthetic, LP-A3 hard-positive, NSA Poisson, RN-LISDA và Bal-BCE A0 đều đã bị loại. Bal-BCE pass toàn bộ cấu trúc và replay exact nhưng chỉ pass 19/34 performance gate: cứu 38 TP lớp 1 đồng thời tạo 57 restricted FP và giảm precision từ 0,821494 xuống 0,759317. Trainer, validation, test và full train vẫn đóng; hướng kế tiếp phải bổ sung tín hiệu cục bộ theo mẫu thay vì dịch prior toàn cục.</w:t>
+        <w:t>Giữ nguyên keeper hiện tại và file lệnh full-train tốt nhất. Full train random-init 30 epoch không thắng validation gate; JPEG-DL, SaSPA synthetic, LP-A3 hard-positive, NSA Poisson, RN-LISDA và Bal-BCE A0 đều đã bị loại. Hướng CAP integral-region context đã được khóa prospectively trên frozen train-only block-2 cohort trước candidate code hoặc metric. Trainer, validation, test và full train vẫn đóng; CAP chỉ được tiến tiếp nếu đồng thời giữ TP lớp 1, loại restricted FP và chứng minh lợi thế biến mất dưới causal derangement.</w:t>
       </w:r>
     </w:p>
     <w:p>
@@ -6586,7 +6586,7 @@
                 <w:color w:val="202124"/>
                 <w:sz w:val="18"/>
               </w:rPr>
-              <w:t>Hash/tóm tắt trước khi xóa chính xác artifact obsolete; hậu Bal-BCE quét 850 thư mục và 51 manifest, 220/220 nguồn compact đã vắng.</w:t>
+              <w:t>Hash/tóm tắt trước khi xóa chính xác artifact obsolete; hậu CAP lock quét 851 thư mục và 51 manifest, 220/220 nguồn compact đã vắng.</w:t>
             </w:r>
           </w:p>
         </w:tc>
@@ -6613,7 +6613,7 @@
                 <w:color w:val="202124"/>
                 <w:sz w:val="18"/>
               </w:rPr>
-              <w:t>Không xóa gì trong audit; 0 blocker và 88,871 GiB còn trống.</w:t>
+              <w:t>Không xóa gì trong audit; 0 blocker, 88,846 GiB còn trống và summary SHA 436c06ac...bfd72e.</w:t>
             </w:r>
           </w:p>
         </w:tc>
@@ -7478,6 +7478,92 @@
           </w:p>
         </w:tc>
       </w:tr>
+      <w:tr>
+        <w:trPr>
+          <w:cantSplit/>
+        </w:trPr>
+        <w:tc>
+          <w:tcPr>
+            <w:tcW w:type="dxa" w:w="2550"/>
+            <w:tcMar>
+              <w:top w:w="80" w:type="dxa"/>
+              <w:start w:w="120" w:type="dxa"/>
+              <w:bottom w:w="80" w:type="dxa"/>
+              <w:end w:w="120" w:type="dxa"/>
+            </w:tcMar>
+            <w:vAlign w:val="center"/>
+          </w:tcPr>
+          <w:p>
+            <w:pPr>
+              <w:widowControl/>
+              <w:spacing w:after="0" w:line="247" w:lineRule="auto"/>
+              <w:jc w:val="left"/>
+            </w:pPr>
+            <w:r>
+              <w:rPr>
+                <w:rFonts w:ascii="Calibri" w:hAnsi="Calibri" w:eastAsia="Calibri"/>
+                <w:color w:val="202124"/>
+                <w:sz w:val="18"/>
+              </w:rPr>
+              <w:t>Khóa representation trước code</w:t>
+            </w:r>
+          </w:p>
+        </w:tc>
+        <w:tc>
+          <w:tcPr>
+            <w:tcW w:type="dxa" w:w="3810"/>
+            <w:tcMar>
+              <w:top w:w="80" w:type="dxa"/>
+              <w:start w:w="120" w:type="dxa"/>
+              <w:bottom w:w="80" w:type="dxa"/>
+              <w:end w:w="120" w:type="dxa"/>
+            </w:tcMar>
+            <w:vAlign w:val="center"/>
+          </w:tcPr>
+          <w:p>
+            <w:pPr>
+              <w:widowControl/>
+              <w:spacing w:after="0" w:line="247" w:lineRule="auto"/>
+              <w:jc w:val="left"/>
+            </w:pPr>
+            <w:r>
+              <w:rPr>
+                <w:rFonts w:ascii="Calibri" w:hAnsi="Calibri" w:eastAsia="Calibri"/>
+                <w:color w:val="202124"/>
+                <w:sz w:val="18"/>
+              </w:rPr>
+              <w:t>Pin paper/repository/license, phương trình CAP, 27 region, fold, role, seed, threshold, XAI và gate trước khi viết candidate.</w:t>
+            </w:r>
+          </w:p>
+        </w:tc>
+        <w:tc>
+          <w:tcPr>
+            <w:tcW w:type="dxa" w:w="3000"/>
+            <w:tcMar>
+              <w:top w:w="80" w:type="dxa"/>
+              <w:start w:w="120" w:type="dxa"/>
+              <w:bottom w:w="80" w:type="dxa"/>
+              <w:end w:w="120" w:type="dxa"/>
+            </w:tcMar>
+            <w:vAlign w:val="center"/>
+          </w:tcPr>
+          <w:p>
+            <w:pPr>
+              <w:widowControl/>
+              <w:spacing w:after="0" w:line="247" w:lineRule="auto"/>
+              <w:jc w:val="left"/>
+            </w:pPr>
+            <w:r>
+              <w:rPr>
+                <w:rFonts w:ascii="Calibri" w:hAnsi="Calibri" w:eastAsia="Calibri"/>
+                <w:color w:val="202124"/>
+                <w:sz w:val="18"/>
+              </w:rPr>
+              <w:t>Tách quyết định khoa học khỏi metric; test đã bắt parent/hash sai trước khi lock được công bố.</w:t>
+            </w:r>
+          </w:p>
+        </w:tc>
+      </w:tr>
     </w:tbl>
     <w:p>
       <w:pPr>
@@ -7562,7 +7648,25 @@
           <w:color w:val="202124"/>
           <w:sz w:val="22"/>
         </w:rPr>
-        <w:t>Sàng lọc rồi khóa prospectively một A0 representation-distinct dùng tín hiệu cục bộ theo mẫu; gate train-only phải cùng lúc giữ TP lớp 1 và loại restricted FP, với matched causal controls.</w:t>
+        <w:t>Giữ bất biến CAP protocol/lock SHA c6d307bf/4aaba9ef; valid support loại padding, spatial Sattolo không fixed point và cross-sample control partition-preserving; commit/push trước candidate code/metric.</w:t>
+      </w:r>
+    </w:p>
+    <w:p>
+      <w:pPr>
+        <w:widowControl/>
+        <w:numPr>
+          <w:ilvl w:val="0"/>
+          <w:numId w:val="14"/>
+        </w:numPr>
+        <w:spacing w:after="160" w:line="280" w:lineRule="auto"/>
+      </w:pPr>
+      <w:r>
+        <w:rPr>
+          <w:rFonts w:ascii="Calibri" w:hAnsi="Calibri" w:eastAsia="Calibri"/>
+          <w:color w:val="202124"/>
+          <w:sz w:val="22"/>
+        </w:rPr>
+        <w:t>Sau mốc push, triển khai độc lập CAP pixel context, 27 integral regions, region attention, ordered LSTM và residual-less NetVLAD cùng các causal controls, train-only ledger, replay và XAI cố định.</w:t>
       </w:r>
     </w:p>
     <w:p>
@@ -8341,6 +8445,124 @@
                 <w:color w:val="202124"/>
                 <w:sz w:val="18"/>
               </w:rPr>
+              <w:t>docs/TRKH_5CLASS_CAP_INTEGRAL_REGION_CONTEXT_A0_PROTOCOL_20260724.md</w:t>
+            </w:r>
+          </w:p>
+        </w:tc>
+        <w:tc>
+          <w:tcPr>
+            <w:tcW w:type="dxa" w:w="5310"/>
+            <w:tcMar>
+              <w:top w:w="80" w:type="dxa"/>
+              <w:start w:w="120" w:type="dxa"/>
+              <w:bottom w:w="80" w:type="dxa"/>
+              <w:end w:w="120" w:type="dxa"/>
+            </w:tcMar>
+            <w:vAlign w:val="center"/>
+          </w:tcPr>
+          <w:p>
+            <w:pPr>
+              <w:widowControl/>
+              <w:spacing w:after="0" w:line="247" w:lineRule="auto"/>
+              <w:jc w:val="left"/>
+            </w:pPr>
+            <w:r>
+              <w:rPr>
+                <w:rFonts w:ascii="Calibri" w:hAnsi="Calibri" w:eastAsia="Calibri"/>
+                <w:color w:val="202124"/>
+                <w:sz w:val="18"/>
+              </w:rPr>
+              <w:t>Giao thức prospective CAP, equation boundary, causal controls và downstream authorization.</w:t>
+            </w:r>
+          </w:p>
+        </w:tc>
+      </w:tr>
+      <w:tr>
+        <w:trPr>
+          <w:cantSplit/>
+        </w:trPr>
+        <w:tc>
+          <w:tcPr>
+            <w:tcW w:type="dxa" w:w="4050"/>
+            <w:tcMar>
+              <w:top w:w="80" w:type="dxa"/>
+              <w:start w:w="120" w:type="dxa"/>
+              <w:bottom w:w="80" w:type="dxa"/>
+              <w:end w:w="120" w:type="dxa"/>
+            </w:tcMar>
+            <w:vAlign w:val="center"/>
+          </w:tcPr>
+          <w:p>
+            <w:pPr>
+              <w:widowControl/>
+              <w:spacing w:after="0" w:line="247" w:lineRule="auto"/>
+              <w:jc w:val="left"/>
+            </w:pPr>
+            <w:r>
+              <w:rPr>
+                <w:rFonts w:ascii="Calibri" w:hAnsi="Calibri" w:eastAsia="Calibri"/>
+                <w:color w:val="202124"/>
+                <w:sz w:val="18"/>
+              </w:rPr>
+              <w:t>scripts/build_trkh_cap_integral_region_context_a0_lock.py</w:t>
+            </w:r>
+          </w:p>
+        </w:tc>
+        <w:tc>
+          <w:tcPr>
+            <w:tcW w:type="dxa" w:w="5310"/>
+            <w:tcMar>
+              <w:top w:w="80" w:type="dxa"/>
+              <w:start w:w="120" w:type="dxa"/>
+              <w:bottom w:w="80" w:type="dxa"/>
+              <w:end w:w="120" w:type="dxa"/>
+            </w:tcMar>
+            <w:vAlign w:val="center"/>
+          </w:tcPr>
+          <w:p>
+            <w:pPr>
+              <w:widowControl/>
+              <w:spacing w:after="0" w:line="247" w:lineRule="auto"/>
+              <w:jc w:val="left"/>
+            </w:pPr>
+            <w:r>
+              <w:rPr>
+                <w:rFonts w:ascii="Calibri" w:hAnsi="Calibri" w:eastAsia="Calibri"/>
+                <w:color w:val="202124"/>
+                <w:sz w:val="18"/>
+              </w:rPr>
+              <w:t>Tái sinh cohort, fold, role, seed, epoch-order, derangement, visual-anchor và machine lock CAP.</w:t>
+            </w:r>
+          </w:p>
+        </w:tc>
+      </w:tr>
+      <w:tr>
+        <w:trPr>
+          <w:cantSplit/>
+        </w:trPr>
+        <w:tc>
+          <w:tcPr>
+            <w:tcW w:type="dxa" w:w="4050"/>
+            <w:tcMar>
+              <w:top w:w="80" w:type="dxa"/>
+              <w:start w:w="120" w:type="dxa"/>
+              <w:bottom w:w="80" w:type="dxa"/>
+              <w:end w:w="120" w:type="dxa"/>
+            </w:tcMar>
+            <w:vAlign w:val="center"/>
+          </w:tcPr>
+          <w:p>
+            <w:pPr>
+              <w:widowControl/>
+              <w:spacing w:after="0" w:line="247" w:lineRule="auto"/>
+              <w:jc w:val="left"/>
+            </w:pPr>
+            <w:r>
+              <w:rPr>
+                <w:rFonts w:ascii="Calibri" w:hAnsi="Calibri" w:eastAsia="Calibri"/>
+                <w:color w:val="202124"/>
+                <w:sz w:val="18"/>
+              </w:rPr>
               <w:t>C:/Users/ADMIN/.codex/skills/trkh-5class/SKILL.md</w:t>
             </w:r>
           </w:p>
@@ -8389,7 +8611,7 @@
           <w:color w:val="202124"/>
           <w:sz w:val="22"/>
         </w:rPr>
-        <w:t>Revision 1-3: tạo báo cáo tái lập, ghi full train 30e/JPEG-DL/chính sách synthetic chống leak, đóng JPEG-DL bằng replay-XAI và hoàn tất retention/layout QA. Revision 4-5: SaSPA F0 pass resource/replay; F1 bị loại ở fidelity 0/10, blind 7/10 và XAI 6/10, không đổi keeper. Revision 6: LP-A3 A0 bị loại sau causal-control fail; không integration. Revision 7: NSA Poisson bị loại sau formal/replay/manual review; sửa canonical hash và whole-corpus duplicate rule. Revision 8: RN-LISDA bị loại sau performance 17/37, mechanism 22/25 và replay exact; sửa visual-ledger/bool checker. Revision 9: pin nguồn LiVT và khóa Bal-BCE prospective tại protocol/lock SHA 27c32d2a/1e28c686 trước metric. Revision 10: Bal-BCE bị loại sau performance 19/34, replay exact và review 20 anchor; cứu 38 TP nhưng tạo 57 restricted FP, prior đảo mất 53 TP. Full suite 1.899/1.899, retention 850 thư mục/220 nguồn vắng và DOCX 12 trang accessibility 0/0/0; keeper/lệnh tốt nhất không đổi.</w:t>
+        <w:t>Revision 1-3: tạo báo cáo tái lập, ghi full train 30e/JPEG-DL/chính sách synthetic chống leak, đóng JPEG-DL bằng replay-XAI và hoàn tất retention/layout QA. Revision 4-5: SaSPA F0/F1; F1 bị loại ở fidelity và XAI. Revision 6-8: LP-A3, NSA và RN-LISDA bị loại bằng causal controls/replay. Revision 9-10: khóa rồi loại Bal-BCE; cứu 38 TP nhưng tạo 57 restricted FP. Revision 11: pin paper/repository MIT của CAP và khóa prospectively frozen train-only A0 tại protocol/lock SHA c6d307bf/4aaba9ef; 27 integral regions, bảy role, năm fold, 20 visual anchors và mọi gate cố định trước candidate code/metric. Pre-commit review loại padding shortcut, khóa Sattolo, sửa cross-sample mapping và chốt phương trình paper thay vì phụ gia script. Full pytest 1.904/1.904; retention 851 thư mục/51 manifest/220 nguồn vắng; 13 trang, accessibility 0/0/0. Keeper/lệnh tốt nhất không đổi.</w:t>
       </w:r>
     </w:p>
     <w:p>
@@ -9102,6 +9324,82 @@
           <w:color w:val="202124"/>
           <w:sz w:val="21"/>
         </w:rPr>
+        <w:t>Context-aware Attentional Pooling, AAAI 2021</w:t>
+      </w:r>
+      <w:r>
+        <w:rPr>
+          <w:rFonts w:ascii="Calibri" w:hAnsi="Calibri" w:eastAsia="Calibri"/>
+          <w:color w:val="202124"/>
+          <w:sz w:val="21"/>
+        </w:rPr>
+        <w:t xml:space="preserve"> - Nguồn phương trình pixel context, 27 integral regions, region attention, LSTM và residual-less NetVLAD cho CAP A0. </w:t>
+      </w:r>
+      <w:hyperlink r:id="rId27">
+        <w:r>
+          <w:rPr>
+            <w:rFonts w:ascii="Calibri" w:hAnsi="Calibri" w:eastAsia="Calibri"/>
+            <w:color w:val="2E74B5"/>
+            <w:u w:val="single"/>
+          </w:rPr>
+          <w:t>Mở nguồn</w:t>
+        </w:r>
+      </w:hyperlink>
+    </w:p>
+    <w:p>
+      <w:pPr>
+        <w:keepLines/>
+        <w:widowControl/>
+        <w:numPr>
+          <w:ilvl w:val="0"/>
+          <w:numId w:val="15"/>
+        </w:numPr>
+        <w:spacing w:after="160" w:line="280" w:lineRule="auto"/>
+      </w:pPr>
+      <w:r>
+        <w:rPr>
+          <w:rFonts w:ascii="Calibri" w:hAnsi="Calibri" w:eastAsia="Calibri"/>
+          <w:b/>
+          <w:color w:val="202124"/>
+          <w:sz w:val="21"/>
+        </w:rPr>
+        <w:t>CAP official repository</w:t>
+      </w:r>
+      <w:r>
+        <w:rPr>
+          <w:rFonts w:ascii="Calibri" w:hAnsi="Calibri" w:eastAsia="Calibri"/>
+          <w:color w:val="202124"/>
+          <w:sz w:val="21"/>
+        </w:rPr>
+        <w:t xml:space="preserve"> - Nguồn MIT được pin tại commit cae53050af583c2b3fa38081c0abc227199e7dc1; TRKH dùng implementation PyTorch độc lập. </w:t>
+      </w:r>
+      <w:hyperlink r:id="rId28">
+        <w:r>
+          <w:rPr>
+            <w:rFonts w:ascii="Calibri" w:hAnsi="Calibri" w:eastAsia="Calibri"/>
+            <w:color w:val="2E74B5"/>
+            <w:u w:val="single"/>
+          </w:rPr>
+          <w:t>Mở nguồn</w:t>
+        </w:r>
+      </w:hyperlink>
+    </w:p>
+    <w:p>
+      <w:pPr>
+        <w:keepLines/>
+        <w:widowControl/>
+        <w:numPr>
+          <w:ilvl w:val="0"/>
+          <w:numId w:val="15"/>
+        </w:numPr>
+        <w:spacing w:after="160" w:line="280" w:lineRule="auto"/>
+      </w:pPr>
+      <w:r>
+        <w:rPr>
+          <w:rFonts w:ascii="Calibri" w:hAnsi="Calibri" w:eastAsia="Calibri"/>
+          <w:b/>
+          <w:color w:val="202124"/>
+          <w:sz w:val="21"/>
+        </w:rPr>
         <w:t>Do We Train on Test Data? Purging CIFAR of Near-Duplicates</w:t>
       </w:r>
       <w:r>
@@ -9112,7 +9410,7 @@
         </w:rPr>
         <w:t xml:space="preserve"> - Đối chiếu nguy cơ near-duplicate cross-split; TRKH dùng quy tắc whole-corpus invalidation nghiêm ngặt hơn. </w:t>
       </w:r>
-      <w:hyperlink r:id="rId27">
+      <w:hyperlink r:id="rId29">
         <w:r>
           <w:rPr>
             <w:rFonts w:ascii="Calibri" w:hAnsi="Calibri" w:eastAsia="Calibri"/>

</xml_diff>

<commit_message>
Implement CAP A0 auditor and replay boundary
</commit_message>
<xml_diff>
--- a/docs/TRKH_5CLASS_RESEARCH_PROCESS_STATUS.docx
+++ b/docs/TRKH_5CLASS_RESEARCH_PROCESS_STATUS.docx
@@ -75,7 +75,7 @@
           <w:color w:val="202124"/>
           <w:sz w:val="21"/>
         </w:rPr>
-        <w:t>2026-07-24 | Revision 11</w:t>
+        <w:t>2026-07-24 | Revision 12</w:t>
       </w:r>
     </w:p>
     <w:p>
@@ -97,7 +97,7 @@
           <w:color w:val="202124"/>
           <w:sz w:val="21"/>
         </w:rPr>
-        <w:t>Đang nghiên cứu - CAP integral-region context A0 đã được khóa prospectively trước candidate code</w:t>
+        <w:t>Đang nghiên cứu - CAP A0 engine/auditor đã được khóa trước formal metric</w:t>
       </w:r>
     </w:p>
     <w:p>
@@ -7564,6 +7564,92 @@
           </w:p>
         </w:tc>
       </w:tr>
+      <w:tr>
+        <w:trPr>
+          <w:cantSplit/>
+        </w:trPr>
+        <w:tc>
+          <w:tcPr>
+            <w:tcW w:type="dxa" w:w="2550"/>
+            <w:tcMar>
+              <w:top w:w="80" w:type="dxa"/>
+              <w:start w:w="120" w:type="dxa"/>
+              <w:bottom w:w="80" w:type="dxa"/>
+              <w:end w:w="120" w:type="dxa"/>
+            </w:tcMar>
+            <w:vAlign w:val="center"/>
+          </w:tcPr>
+          <w:p>
+            <w:pPr>
+              <w:widowControl/>
+              <w:spacing w:after="0" w:line="247" w:lineRule="auto"/>
+              <w:jc w:val="left"/>
+            </w:pPr>
+            <w:r>
+              <w:rPr>
+                <w:rFonts w:ascii="Calibri" w:hAnsi="Calibri" w:eastAsia="Calibri"/>
+                <w:color w:val="202124"/>
+                <w:sz w:val="18"/>
+              </w:rPr>
+              <w:t>Implementation boundary trước metric</w:t>
+            </w:r>
+          </w:p>
+        </w:tc>
+        <w:tc>
+          <w:tcPr>
+            <w:tcW w:type="dxa" w:w="3810"/>
+            <w:tcMar>
+              <w:top w:w="80" w:type="dxa"/>
+              <w:start w:w="120" w:type="dxa"/>
+              <w:bottom w:w="80" w:type="dxa"/>
+              <w:end w:w="120" w:type="dxa"/>
+            </w:tcMar>
+            <w:vAlign w:val="center"/>
+          </w:tcPr>
+          <w:p>
+            <w:pPr>
+              <w:widowControl/>
+              <w:spacing w:after="0" w:line="247" w:lineRule="auto"/>
+              <w:jc w:val="left"/>
+            </w:pPr>
+            <w:r>
+              <w:rPr>
+                <w:rFonts w:ascii="Calibri" w:hAnsi="Calibri" w:eastAsia="Calibri"/>
+                <w:color w:val="202124"/>
+                <w:sz w:val="18"/>
+              </w:rPr>
+              <w:t>Tách commit protocol, engine và auditor; NumPy oracle, synthetic 30e, FP32/BF16 resource, ledger, fresh-process replay và XAI đều được kiểm tra trước formal.</w:t>
+            </w:r>
+          </w:p>
+        </w:tc>
+        <w:tc>
+          <w:tcPr>
+            <w:tcW w:type="dxa" w:w="3000"/>
+            <w:tcMar>
+              <w:top w:w="80" w:type="dxa"/>
+              <w:start w:w="120" w:type="dxa"/>
+              <w:bottom w:w="80" w:type="dxa"/>
+              <w:end w:w="120" w:type="dxa"/>
+            </w:tcMar>
+            <w:vAlign w:val="center"/>
+          </w:tcPr>
+          <w:p>
+            <w:pPr>
+              <w:widowControl/>
+              <w:spacing w:after="0" w:line="247" w:lineRule="auto"/>
+              <w:jc w:val="left"/>
+            </w:pPr>
+            <w:r>
+              <w:rPr>
+                <w:rFonts w:ascii="Calibri" w:hAnsi="Calibri" w:eastAsia="Calibri"/>
+                <w:color w:val="202124"/>
+                <w:sz w:val="18"/>
+              </w:rPr>
+              <w:t>Ngăn sửa phương trình hoặc audit sau khi thấy candidate metric; worst-role batch 32 chỉ dùng 0,934 GiB CUDA.</w:t>
+            </w:r>
+          </w:p>
+        </w:tc>
+      </w:tr>
     </w:tbl>
     <w:p>
       <w:pPr>
@@ -7648,7 +7734,7 @@
           <w:color w:val="202124"/>
           <w:sz w:val="22"/>
         </w:rPr>
-        <w:t>Giữ bất biến CAP protocol/lock SHA c6d307bf/4aaba9ef; valid support loại padding, spatial Sattolo không fixed point và cross-sample control partition-preserving; commit/push trước candidate code/metric.</w:t>
+        <w:t>Giữ bất biến CAP protocol/lock SHA c6d307bf/4aaba9ef tại commit 05a9ced và engine độc lập tại ea90703; valid support loại padding, spatial Sattolo không fixed point và cross-sample control partition-preserving.</w:t>
       </w:r>
     </w:p>
     <w:p>
@@ -7666,7 +7752,7 @@
           <w:color w:val="202124"/>
           <w:sz w:val="22"/>
         </w:rPr>
-        <w:t>Sau mốc push, triển khai độc lập CAP pixel context, 27 integral regions, region attention, ordered LSTM và residual-less NetVLAD cùng các causal controls, train-only ledger, replay và XAI cố định.</w:t>
+        <w:t>Commit/push auditor, ledger, resource preflight, fresh-process replay và XAI cố định trước metric; sau đó chạy duy nhất CAP formal A0 từ commit sạch đã push.</w:t>
       </w:r>
     </w:p>
     <w:p>
@@ -8504,6 +8590,65 @@
                 <w:color w:val="202124"/>
                 <w:sz w:val="18"/>
               </w:rPr>
+              <w:t>docs/TRKH_5CLASS_CAP_INTEGRAL_REGION_CONTEXT_A0_IMPLEMENTATION_20260724.md</w:t>
+            </w:r>
+          </w:p>
+        </w:tc>
+        <w:tc>
+          <w:tcPr>
+            <w:tcW w:type="dxa" w:w="5310"/>
+            <w:tcMar>
+              <w:top w:w="80" w:type="dxa"/>
+              <w:start w:w="120" w:type="dxa"/>
+              <w:bottom w:w="80" w:type="dxa"/>
+              <w:end w:w="120" w:type="dxa"/>
+            </w:tcMar>
+            <w:vAlign w:val="center"/>
+          </w:tcPr>
+          <w:p>
+            <w:pPr>
+              <w:widowControl/>
+              <w:spacing w:after="0" w:line="247" w:lineRule="auto"/>
+              <w:jc w:val="left"/>
+            </w:pPr>
+            <w:r>
+              <w:rPr>
+                <w:rFonts w:ascii="Calibri" w:hAnsi="Calibri" w:eastAsia="Calibri"/>
+                <w:color w:val="202124"/>
+                <w:sz w:val="18"/>
+              </w:rPr>
+              <w:t>Định nghĩa engine, threshold, full-row action, XAI, resource và fresh-process replay trước formal metric.</w:t>
+            </w:r>
+          </w:p>
+        </w:tc>
+      </w:tr>
+      <w:tr>
+        <w:trPr>
+          <w:cantSplit/>
+        </w:trPr>
+        <w:tc>
+          <w:tcPr>
+            <w:tcW w:type="dxa" w:w="4050"/>
+            <w:tcMar>
+              <w:top w:w="80" w:type="dxa"/>
+              <w:start w:w="120" w:type="dxa"/>
+              <w:bottom w:w="80" w:type="dxa"/>
+              <w:end w:w="120" w:type="dxa"/>
+            </w:tcMar>
+            <w:vAlign w:val="center"/>
+          </w:tcPr>
+          <w:p>
+            <w:pPr>
+              <w:widowControl/>
+              <w:spacing w:after="0" w:line="247" w:lineRule="auto"/>
+              <w:jc w:val="left"/>
+            </w:pPr>
+            <w:r>
+              <w:rPr>
+                <w:rFonts w:ascii="Calibri" w:hAnsi="Calibri" w:eastAsia="Calibri"/>
+                <w:color w:val="202124"/>
+                <w:sz w:val="18"/>
+              </w:rPr>
               <w:t>scripts/build_trkh_cap_integral_region_context_a0_lock.py</w:t>
             </w:r>
           </w:p>
@@ -8532,6 +8677,183 @@
                 <w:sz w:val="18"/>
               </w:rPr>
               <w:t>Tái sinh cohort, fold, role, seed, epoch-order, derangement, visual-anchor và machine lock CAP.</w:t>
+            </w:r>
+          </w:p>
+        </w:tc>
+      </w:tr>
+      <w:tr>
+        <w:trPr>
+          <w:cantSplit/>
+        </w:trPr>
+        <w:tc>
+          <w:tcPr>
+            <w:tcW w:type="dxa" w:w="4050"/>
+            <w:tcMar>
+              <w:top w:w="80" w:type="dxa"/>
+              <w:start w:w="120" w:type="dxa"/>
+              <w:bottom w:w="80" w:type="dxa"/>
+              <w:end w:w="120" w:type="dxa"/>
+            </w:tcMar>
+            <w:vAlign w:val="center"/>
+          </w:tcPr>
+          <w:p>
+            <w:pPr>
+              <w:widowControl/>
+              <w:spacing w:after="0" w:line="247" w:lineRule="auto"/>
+              <w:jc w:val="left"/>
+            </w:pPr>
+            <w:r>
+              <w:rPr>
+                <w:rFonts w:ascii="Calibri" w:hAnsi="Calibri" w:eastAsia="Calibri"/>
+                <w:color w:val="202124"/>
+                <w:sz w:val="18"/>
+              </w:rPr>
+              <w:t>trkh/tools/cap_integral_region_context_a0_engine.py</w:t>
+            </w:r>
+          </w:p>
+        </w:tc>
+        <w:tc>
+          <w:tcPr>
+            <w:tcW w:type="dxa" w:w="5310"/>
+            <w:tcMar>
+              <w:top w:w="80" w:type="dxa"/>
+              <w:start w:w="120" w:type="dxa"/>
+              <w:bottom w:w="80" w:type="dxa"/>
+              <w:end w:w="120" w:type="dxa"/>
+            </w:tcMar>
+            <w:vAlign w:val="center"/>
+          </w:tcPr>
+          <w:p>
+            <w:pPr>
+              <w:widowControl/>
+              <w:spacing w:after="0" w:line="247" w:lineRule="auto"/>
+              <w:jc w:val="left"/>
+            </w:pPr>
+            <w:r>
+              <w:rPr>
+                <w:rFonts w:ascii="Calibri" w:hAnsi="Calibri" w:eastAsia="Calibri"/>
+                <w:color w:val="202124"/>
+                <w:sz w:val="18"/>
+              </w:rPr>
+              <w:t>Engine PyTorch độc lập cho paper-equation CAP và sáu role trainable.</w:t>
+            </w:r>
+          </w:p>
+        </w:tc>
+      </w:tr>
+      <w:tr>
+        <w:trPr>
+          <w:cantSplit/>
+        </w:trPr>
+        <w:tc>
+          <w:tcPr>
+            <w:tcW w:type="dxa" w:w="4050"/>
+            <w:tcMar>
+              <w:top w:w="80" w:type="dxa"/>
+              <w:start w:w="120" w:type="dxa"/>
+              <w:bottom w:w="80" w:type="dxa"/>
+              <w:end w:w="120" w:type="dxa"/>
+            </w:tcMar>
+            <w:vAlign w:val="center"/>
+          </w:tcPr>
+          <w:p>
+            <w:pPr>
+              <w:widowControl/>
+              <w:spacing w:after="0" w:line="247" w:lineRule="auto"/>
+              <w:jc w:val="left"/>
+            </w:pPr>
+            <w:r>
+              <w:rPr>
+                <w:rFonts w:ascii="Calibri" w:hAnsi="Calibri" w:eastAsia="Calibri"/>
+                <w:color w:val="202124"/>
+                <w:sz w:val="18"/>
+              </w:rPr>
+              <w:t>trkh/tools/audit_cap_integral_region_context_a0.py</w:t>
+            </w:r>
+          </w:p>
+        </w:tc>
+        <w:tc>
+          <w:tcPr>
+            <w:tcW w:type="dxa" w:w="5310"/>
+            <w:tcMar>
+              <w:top w:w="80" w:type="dxa"/>
+              <w:start w:w="120" w:type="dxa"/>
+              <w:bottom w:w="80" w:type="dxa"/>
+              <w:end w:w="120" w:type="dxa"/>
+            </w:tcMar>
+            <w:vAlign w:val="center"/>
+          </w:tcPr>
+          <w:p>
+            <w:pPr>
+              <w:widowControl/>
+              <w:spacing w:after="0" w:line="247" w:lineRule="auto"/>
+              <w:jc w:val="left"/>
+            </w:pPr>
+            <w:r>
+              <w:rPr>
+                <w:rFonts w:ascii="Calibri" w:hAnsi="Calibri" w:eastAsia="Calibri"/>
+                <w:color w:val="202124"/>
+                <w:sz w:val="18"/>
+              </w:rPr>
+              <w:t>Formal auditor, dynamic ledger, metric gates, resource, XAI, manifest và replay.</w:t>
+            </w:r>
+          </w:p>
+        </w:tc>
+      </w:tr>
+      <w:tr>
+        <w:trPr>
+          <w:cantSplit/>
+        </w:trPr>
+        <w:tc>
+          <w:tcPr>
+            <w:tcW w:type="dxa" w:w="4050"/>
+            <w:tcMar>
+              <w:top w:w="80" w:type="dxa"/>
+              <w:start w:w="120" w:type="dxa"/>
+              <w:bottom w:w="80" w:type="dxa"/>
+              <w:end w:w="120" w:type="dxa"/>
+            </w:tcMar>
+            <w:vAlign w:val="center"/>
+          </w:tcPr>
+          <w:p>
+            <w:pPr>
+              <w:widowControl/>
+              <w:spacing w:after="0" w:line="247" w:lineRule="auto"/>
+              <w:jc w:val="left"/>
+            </w:pPr>
+            <w:r>
+              <w:rPr>
+                <w:rFonts w:ascii="Calibri" w:hAnsi="Calibri" w:eastAsia="Calibri"/>
+                <w:color w:val="202124"/>
+                <w:sz w:val="18"/>
+              </w:rPr>
+              <w:t>scripts/run_trkh_cap_integral_region_context_a0.ps1</w:t>
+            </w:r>
+          </w:p>
+        </w:tc>
+        <w:tc>
+          <w:tcPr>
+            <w:tcW w:type="dxa" w:w="5310"/>
+            <w:tcMar>
+              <w:top w:w="80" w:type="dxa"/>
+              <w:start w:w="120" w:type="dxa"/>
+              <w:bottom w:w="80" w:type="dxa"/>
+              <w:end w:w="120" w:type="dxa"/>
+            </w:tcMar>
+            <w:vAlign w:val="center"/>
+          </w:tcPr>
+          <w:p>
+            <w:pPr>
+              <w:widowControl/>
+              <w:spacing w:after="0" w:line="247" w:lineRule="auto"/>
+              <w:jc w:val="left"/>
+            </w:pPr>
+            <w:r>
+              <w:rPr>
+                <w:rFonts w:ascii="Calibri" w:hAnsi="Calibri" w:eastAsia="Calibri"/>
+                <w:color w:val="202124"/>
+                <w:sz w:val="18"/>
+              </w:rPr>
+              <w:t>Launcher VS Code PowerShell cho preflight, formal, fresh-process replay và manual finalize.</w:t>
             </w:r>
           </w:p>
         </w:tc>
@@ -8611,7 +8933,7 @@
           <w:color w:val="202124"/>
           <w:sz w:val="22"/>
         </w:rPr>
-        <w:t>Revision 1-3: tạo báo cáo tái lập, ghi full train 30e/JPEG-DL/chính sách synthetic chống leak, đóng JPEG-DL bằng replay-XAI và hoàn tất retention/layout QA. Revision 4-5: SaSPA F0/F1; F1 bị loại ở fidelity và XAI. Revision 6-8: LP-A3, NSA và RN-LISDA bị loại bằng causal controls/replay. Revision 9-10: khóa rồi loại Bal-BCE; cứu 38 TP nhưng tạo 57 restricted FP. Revision 11: pin paper/repository MIT của CAP và khóa prospectively frozen train-only A0 tại protocol/lock SHA c6d307bf/4aaba9ef; 27 integral regions, bảy role, năm fold, 20 visual anchors và mọi gate cố định trước candidate code/metric. Pre-commit review loại padding shortcut, khóa Sattolo, sửa cross-sample mapping và chốt phương trình paper thay vì phụ gia script. Full pytest 1.904/1.904; retention 851 thư mục/51 manifest/220 nguồn vắng; 13 trang, accessibility 0/0/0. Keeper/lệnh tốt nhất không đổi.</w:t>
+        <w:t>Revision 1-3: tạo báo cáo tái lập, ghi full train 30e/JPEG-DL/chính sách synthetic chống leak, đóng JPEG-DL bằng replay-XAI và hoàn tất retention/layout QA. Revision 4-5: SaSPA F0/F1; F1 bị loại ở fidelity và XAI. Revision 6-8: LP-A3, NSA và RN-LISDA bị loại bằng causal controls/replay. Revision 9-10: khóa rồi loại Bal-BCE; cứu 38 TP nhưng tạo 57 restricted FP. Revision 11: pin paper/repository MIT của CAP và khóa prospectively frozen train-only A0 tại protocol/lock SHA c6d307bf/4aaba9ef. Revision 12: engine paper-equation, sáu role trainable, dynamic ledger, exact-file-set formal/replay manifest, full-row action, fresh-process replay và XAI được cố định trước formal; NumPy error tối đa 2,55e-15, focused 25/25, full pytest 1924/1924, synthetic FP32/BF16 peak CUDA 0,934/0,890 GiB. Keeper/lệnh tốt nhất không đổi.</w:t>
       </w:r>
     </w:p>
     <w:p>

</xml_diff>

<commit_message>
Fix CAP eval-mode LSTM XAI attribution
</commit_message>
<xml_diff>
--- a/docs/TRKH_5CLASS_RESEARCH_PROCESS_STATUS.docx
+++ b/docs/TRKH_5CLASS_RESEARCH_PROCESS_STATUS.docx
@@ -75,7 +75,7 @@
           <w:color w:val="202124"/>
           <w:sz w:val="21"/>
         </w:rPr>
-        <w:t>2026-07-24 | Revision 12</w:t>
+        <w:t>2026-07-24 | Revision 13</w:t>
       </w:r>
     </w:p>
     <w:p>
@@ -97,7 +97,7 @@
           <w:color w:val="202124"/>
           <w:sz w:val="21"/>
         </w:rPr>
-        <w:t>Đang nghiên cứu - CAP A0 engine/auditor đã được khóa trước formal metric</w:t>
+        <w:t>Đang nghiên cứu - CAP A0 chờ rerun sau erratum XAI cuDNN</w:t>
       </w:r>
     </w:p>
     <w:p>
@@ -340,7 +340,7 @@
                 <w:color w:val="5F6368"/>
                 <w:sz w:val="16"/>
               </w:rPr>
-              <w:t>BAL-BCE A0</w:t>
+              <w:t>CAP A0 FORMAL</w:t>
             </w:r>
           </w:p>
           <w:p>
@@ -354,7 +354,7 @@
                 <w:color w:val="1F4D78"/>
                 <w:sz w:val="28"/>
               </w:rPr>
-              <w:t>Rejected</w:t>
+              <w:t>XAI erratum</w:t>
             </w:r>
           </w:p>
           <w:p>
@@ -367,7 +367,7 @@
                 <w:color w:val="202124"/>
                 <w:sz w:val="17"/>
               </w:rPr>
-              <w:t>P/R/F1 lớp 1 = 0,7593/0,9039/0,8253; tạo 57 restricted FP</w:t>
+              <w:t>30/30 fold-role xong; 0 artifact/metric; rerun cùng lock</w:t>
             </w:r>
           </w:p>
         </w:tc>
@@ -412,7 +412,7 @@
           <w:color w:val="202124"/>
           <w:sz w:val="21"/>
         </w:rPr>
-        <w:t>Giữ nguyên keeper hiện tại và file lệnh full-train tốt nhất. Full train random-init 30 epoch không thắng validation gate; JPEG-DL, SaSPA synthetic, LP-A3 hard-positive, NSA Poisson, RN-LISDA và Bal-BCE A0 đều đã bị loại. Hướng CAP integral-region context đã được khóa prospectively trên frozen train-only block-2 cohort trước candidate code hoặc metric. Trainer, validation, test và full train vẫn đóng; CAP chỉ được tiến tiếp nếu đồng thời giữ TP lớp 1, loại restricted FP và chứng minh lợi thế biến mất dưới causal derangement.</w:t>
+        <w:t>Giữ nguyên keeper và file lệnh full-train tốt nhất. CAP formal đầu tiên hoàn tất 30/30 fold-role nhưng lỗi cuDNN LSTM eval-backward trong XAI trước khi ghi file; thư mục output có 0 artifact nên chưa có metric hoặc quyết định candidate. Chỉ sửa harness audit bằng native RNN trong XAI, giữ nguyên protocol/lock/training/scoring rồi rerun đúng một lần từ commit sạch. Mọi classifier đề xuất vẫn scratch-only và phải qua cả gate chất lượng lẫn inference; pretrained baseline chỉ được dùng đối chiếu, không được nạp tham số vào candidate.</w:t>
       </w:r>
     </w:p>
     <w:p>
@@ -2620,6 +2620,60 @@
           <w:sz w:val="22"/>
         </w:rPr>
         <w:t>Bộ retention/cleanup giữ checkpoint, metric, hash và manifest trước khi xóa run không còn giá trị; khoảng 23,7 GB artifact lịch sử đã được thu hồi có chứng cứ.</w:t>
+      </w:r>
+    </w:p>
+    <w:p>
+      <w:pPr>
+        <w:widowControl/>
+        <w:numPr>
+          <w:ilvl w:val="0"/>
+          <w:numId w:val="10"/>
+        </w:numPr>
+        <w:spacing w:after="160" w:line="280" w:lineRule="auto"/>
+      </w:pPr>
+      <w:r>
+        <w:rPr>
+          <w:rFonts w:ascii="Calibri" w:hAnsi="Calibri" w:eastAsia="Calibri"/>
+          <w:color w:val="202124"/>
+          <w:sz w:val="22"/>
+        </w:rPr>
+        <w:t>Scratch-only là ràng buộc cưỡng chế: chỉ mượn kiến trúc/phương trình; cấm nạp tham số pretrained/external vào classifier, teacher, router hoặc gói inference. Resume chỉ hợp lệ từ checkpoint TRKH scratch có provenance.</w:t>
+      </w:r>
+    </w:p>
+    <w:p>
+      <w:pPr>
+        <w:widowControl/>
+        <w:numPr>
+          <w:ilvl w:val="0"/>
+          <w:numId w:val="10"/>
+        </w:numPr>
+        <w:spacing w:after="160" w:line="280" w:lineRule="auto"/>
+      </w:pPr>
+      <w:r>
+        <w:rPr>
+          <w:rFonts w:ascii="Calibri" w:hAnsi="Calibri" w:eastAsia="Calibri"/>
+          <w:color w:val="202124"/>
+          <w:sz w:val="22"/>
+        </w:rPr>
+        <w:t>Ngoài CNN/Transformer đã đánh giá selective state-space Mamba, graph ViG, dynamic-routing capsule, recurrent/LSTM, NMF, covariance, quaternion, topology, morphology và frequency operators; chưa họ nào đủ gate production.</w:t>
+      </w:r>
+    </w:p>
+    <w:p>
+      <w:pPr>
+        <w:widowControl/>
+        <w:numPr>
+          <w:ilvl w:val="0"/>
+          <w:numId w:val="10"/>
+        </w:numPr>
+        <w:spacing w:after="160" w:line="280" w:lineRule="auto"/>
+      </w:pPr>
+      <w:r>
+        <w:rPr>
+          <w:rFonts w:ascii="Calibri" w:hAnsi="Calibri" w:eastAsia="Calibri"/>
+          <w:color w:val="202124"/>
+          <w:sz w:val="22"/>
+        </w:rPr>
+        <w:t>Mọi candidate kiến trúc phải so cùng keeper về parameter, batch-1 mean/p95, batch throughput, peak VRAM, ONNX parity và TensorRT feasibility; accuracy không được bù một deployment gate thất bại.</w:t>
       </w:r>
     </w:p>
     <w:p>
@@ -7650,6 +7704,178 @@
           </w:p>
         </w:tc>
       </w:tr>
+      <w:tr>
+        <w:trPr>
+          <w:cantSplit/>
+        </w:trPr>
+        <w:tc>
+          <w:tcPr>
+            <w:tcW w:type="dxa" w:w="2550"/>
+            <w:tcMar>
+              <w:top w:w="80" w:type="dxa"/>
+              <w:start w:w="120" w:type="dxa"/>
+              <w:bottom w:w="80" w:type="dxa"/>
+              <w:end w:w="120" w:type="dxa"/>
+            </w:tcMar>
+            <w:vAlign w:val="center"/>
+          </w:tcPr>
+          <w:p>
+            <w:pPr>
+              <w:widowControl/>
+              <w:spacing w:after="0" w:line="247" w:lineRule="auto"/>
+              <w:jc w:val="left"/>
+            </w:pPr>
+            <w:r>
+              <w:rPr>
+                <w:rFonts w:ascii="Calibri" w:hAnsi="Calibri" w:eastAsia="Calibri"/>
+                <w:color w:val="202124"/>
+                <w:sz w:val="18"/>
+              </w:rPr>
+              <w:t>Eval-LSTM XAI backend</w:t>
+            </w:r>
+          </w:p>
+        </w:tc>
+        <w:tc>
+          <w:tcPr>
+            <w:tcW w:type="dxa" w:w="3810"/>
+            <w:tcMar>
+              <w:top w:w="80" w:type="dxa"/>
+              <w:start w:w="120" w:type="dxa"/>
+              <w:bottom w:w="80" w:type="dxa"/>
+              <w:end w:w="120" w:type="dxa"/>
+            </w:tcMar>
+            <w:vAlign w:val="center"/>
+          </w:tcPr>
+          <w:p>
+            <w:pPr>
+              <w:widowControl/>
+              <w:spacing w:after="0" w:line="247" w:lineRule="auto"/>
+              <w:jc w:val="left"/>
+            </w:pPr>
+            <w:r>
+              <w:rPr>
+                <w:rFonts w:ascii="Calibri" w:hAnsi="Calibri" w:eastAsia="Calibri"/>
+                <w:color w:val="202124"/>
+                <w:sz w:val="18"/>
+              </w:rPr>
+              <w:t>Chạy exact attribution path trong preflight; giữ eval mode và dùng native RNN khi cuDNN không hỗ trợ backward.</w:t>
+            </w:r>
+          </w:p>
+        </w:tc>
+        <w:tc>
+          <w:tcPr>
+            <w:tcW w:type="dxa" w:w="3000"/>
+            <w:tcMar>
+              <w:top w:w="80" w:type="dxa"/>
+              <w:start w:w="120" w:type="dxa"/>
+              <w:bottom w:w="80" w:type="dxa"/>
+              <w:end w:w="120" w:type="dxa"/>
+            </w:tcMar>
+            <w:vAlign w:val="center"/>
+          </w:tcPr>
+          <w:p>
+            <w:pPr>
+              <w:widowControl/>
+              <w:spacing w:after="0" w:line="247" w:lineRule="auto"/>
+              <w:jc w:val="left"/>
+            </w:pPr>
+            <w:r>
+              <w:rPr>
+                <w:rFonts w:ascii="Calibri" w:hAnsi="Calibri" w:eastAsia="Calibri"/>
+                <w:color w:val="202124"/>
+                <w:sz w:val="18"/>
+              </w:rPr>
+              <w:t>Ngăn lặp lại việc hoàn tất 30/30 job rồi mất toàn bộ formal artifact ở bước XAI cuối.</w:t>
+            </w:r>
+          </w:p>
+        </w:tc>
+      </w:tr>
+      <w:tr>
+        <w:trPr>
+          <w:cantSplit/>
+        </w:trPr>
+        <w:tc>
+          <w:tcPr>
+            <w:tcW w:type="dxa" w:w="2550"/>
+            <w:tcMar>
+              <w:top w:w="80" w:type="dxa"/>
+              <w:start w:w="120" w:type="dxa"/>
+              <w:bottom w:w="80" w:type="dxa"/>
+              <w:end w:w="120" w:type="dxa"/>
+            </w:tcMar>
+            <w:vAlign w:val="center"/>
+          </w:tcPr>
+          <w:p>
+            <w:pPr>
+              <w:widowControl/>
+              <w:spacing w:after="0" w:line="247" w:lineRule="auto"/>
+              <w:jc w:val="left"/>
+            </w:pPr>
+            <w:r>
+              <w:rPr>
+                <w:rFonts w:ascii="Calibri" w:hAnsi="Calibri" w:eastAsia="Calibri"/>
+                <w:color w:val="202124"/>
+                <w:sz w:val="18"/>
+              </w:rPr>
+              <w:t>Resource-value và inference gate</w:t>
+            </w:r>
+          </w:p>
+        </w:tc>
+        <w:tc>
+          <w:tcPr>
+            <w:tcW w:type="dxa" w:w="3810"/>
+            <w:tcMar>
+              <w:top w:w="80" w:type="dxa"/>
+              <w:start w:w="120" w:type="dxa"/>
+              <w:bottom w:w="80" w:type="dxa"/>
+              <w:end w:w="120" w:type="dxa"/>
+            </w:tcMar>
+            <w:vAlign w:val="center"/>
+          </w:tcPr>
+          <w:p>
+            <w:pPr>
+              <w:widowControl/>
+              <w:spacing w:after="0" w:line="247" w:lineRule="auto"/>
+              <w:jc w:val="left"/>
+            </w:pPr>
+            <w:r>
+              <w:rPr>
+                <w:rFonts w:ascii="Calibri" w:hAnsi="Calibri" w:eastAsia="Calibri"/>
+                <w:color w:val="202124"/>
+                <w:sz w:val="18"/>
+              </w:rPr>
+              <w:t>Khóa mechanism/evidence gap, time-VRAM-disk ceiling, stop/cleanup rule và latency-throughput-VRAM-ONNX/TensorRT budget trước run dài.</w:t>
+            </w:r>
+          </w:p>
+        </w:tc>
+        <w:tc>
+          <w:tcPr>
+            <w:tcW w:type="dxa" w:w="3000"/>
+            <w:tcMar>
+              <w:top w:w="80" w:type="dxa"/>
+              <w:start w:w="120" w:type="dxa"/>
+              <w:bottom w:w="80" w:type="dxa"/>
+              <w:end w:w="120" w:type="dxa"/>
+            </w:tcMar>
+            <w:vAlign w:val="center"/>
+          </w:tcPr>
+          <w:p>
+            <w:pPr>
+              <w:widowControl/>
+              <w:spacing w:after="0" w:line="247" w:lineRule="auto"/>
+              <w:jc w:val="left"/>
+            </w:pPr>
+            <w:r>
+              <w:rPr>
+                <w:rFonts w:ascii="Calibri" w:hAnsi="Calibri" w:eastAsia="Calibri"/>
+                <w:color w:val="202124"/>
+                <w:sz w:val="18"/>
+              </w:rPr>
+              <w:t>Dừng thử nghiệm trùng họ, phân biệt negative evidence có tái sử dụng với chi phí vô ích.</w:t>
+            </w:r>
+          </w:p>
+        </w:tc>
+      </w:tr>
     </w:tbl>
     <w:p>
       <w:pPr>
@@ -7752,7 +7978,7 @@
           <w:color w:val="202124"/>
           <w:sz w:val="22"/>
         </w:rPr>
-        <w:t>Commit/push auditor, ledger, resource preflight, fresh-process replay và XAI cố định trước metric; sau đó chạy duy nhất CAP formal A0 từ commit sạch đã push.</w:t>
+        <w:t>Bảo toàn log failure CAP stdout/stderr SHA 630b5cec/48930829; full pytest đã đạt 1925/1925, DOCX QA đạt 14/14 trang và accessibility 0/0/0; commit/push erratum native-RNN XAI rồi rerun đúng một formal cùng protocol/lock.</w:t>
       </w:r>
     </w:p>
     <w:p>
@@ -7771,6 +7997,42 @@
           <w:sz w:val="22"/>
         </w:rPr>
         <w:t>Giữ ưu tiên precision lớp 1 nhưng đặt recall-loss budget rõ ràng; không chấp nhận giảm false positive bằng cách phá quá nhiều true positive.</w:t>
+      </w:r>
+    </w:p>
+    <w:p>
+      <w:pPr>
+        <w:widowControl/>
+        <w:numPr>
+          <w:ilvl w:val="0"/>
+          <w:numId w:val="14"/>
+        </w:numPr>
+        <w:spacing w:after="160" w:line="280" w:lineRule="auto"/>
+      </w:pPr>
+      <w:r>
+        <w:rPr>
+          <w:rFonts w:ascii="Calibri" w:hAnsi="Calibri" w:eastAsia="Calibri"/>
+          <w:color w:val="202124"/>
+          <w:sz w:val="22"/>
+        </w:rPr>
+        <w:t>Không chạy kiến trúc mới trước khi có resource-value record và matched keeper inference contract; gắn nhãn kết quả promotable, mechanism-only, negative-but-reusable hoặc waste/invalid.</w:t>
+      </w:r>
+    </w:p>
+    <w:p>
+      <w:pPr>
+        <w:widowControl/>
+        <w:numPr>
+          <w:ilvl w:val="0"/>
+          <w:numId w:val="14"/>
+        </w:numPr>
+        <w:spacing w:after="160" w:line="280" w:lineRule="auto"/>
+      </w:pPr>
+      <w:r>
+        <w:rPr>
+          <w:rFonts w:ascii="Calibri" w:hAnsi="Calibri" w:eastAsia="Calibri"/>
+          <w:color w:val="202124"/>
+          <w:sz w:val="22"/>
+        </w:rPr>
+        <w:t>Kiểm toán dependency của các root lớn, ưu tiên OOF 2,488 GiB/96.774 file; chỉ compact sau manifest và retention proof, không xóa theo tên hoặc tuổi.</w:t>
       </w:r>
     </w:p>
     <w:p>
@@ -8917,6 +9179,124 @@
           </w:p>
         </w:tc>
       </w:tr>
+      <w:tr>
+        <w:trPr>
+          <w:cantSplit/>
+        </w:trPr>
+        <w:tc>
+          <w:tcPr>
+            <w:tcW w:type="dxa" w:w="4050"/>
+            <w:tcMar>
+              <w:top w:w="80" w:type="dxa"/>
+              <w:start w:w="120" w:type="dxa"/>
+              <w:bottom w:w="80" w:type="dxa"/>
+              <w:end w:w="120" w:type="dxa"/>
+            </w:tcMar>
+            <w:vAlign w:val="center"/>
+          </w:tcPr>
+          <w:p>
+            <w:pPr>
+              <w:widowControl/>
+              <w:spacing w:after="0" w:line="247" w:lineRule="auto"/>
+              <w:jc w:val="left"/>
+            </w:pPr>
+            <w:r>
+              <w:rPr>
+                <w:rFonts w:ascii="Calibri" w:hAnsi="Calibri" w:eastAsia="Calibri"/>
+                <w:color w:val="202124"/>
+                <w:sz w:val="18"/>
+              </w:rPr>
+              <w:t>docs/TRKH_5CLASS_CAP_INTEGRAL_REGION_CONTEXT_A0_XAI_ERRATUM_20260724.md</w:t>
+            </w:r>
+          </w:p>
+        </w:tc>
+        <w:tc>
+          <w:tcPr>
+            <w:tcW w:type="dxa" w:w="5310"/>
+            <w:tcMar>
+              <w:top w:w="80" w:type="dxa"/>
+              <w:start w:w="120" w:type="dxa"/>
+              <w:bottom w:w="80" w:type="dxa"/>
+              <w:end w:w="120" w:type="dxa"/>
+            </w:tcMar>
+            <w:vAlign w:val="center"/>
+          </w:tcPr>
+          <w:p>
+            <w:pPr>
+              <w:widowControl/>
+              <w:spacing w:after="0" w:line="247" w:lineRule="auto"/>
+              <w:jc w:val="left"/>
+            </w:pPr>
+            <w:r>
+              <w:rPr>
+                <w:rFonts w:ascii="Calibri" w:hAnsi="Calibri" w:eastAsia="Calibri"/>
+                <w:color w:val="202124"/>
+                <w:sz w:val="18"/>
+              </w:rPr>
+              <w:t>Zero-artifact failure evidence, native-RNN XAI correction và same-lock rerun rule.</w:t>
+            </w:r>
+          </w:p>
+        </w:tc>
+      </w:tr>
+      <w:tr>
+        <w:trPr>
+          <w:cantSplit/>
+        </w:trPr>
+        <w:tc>
+          <w:tcPr>
+            <w:tcW w:type="dxa" w:w="4050"/>
+            <w:tcMar>
+              <w:top w:w="80" w:type="dxa"/>
+              <w:start w:w="120" w:type="dxa"/>
+              <w:bottom w:w="80" w:type="dxa"/>
+              <w:end w:w="120" w:type="dxa"/>
+            </w:tcMar>
+            <w:vAlign w:val="center"/>
+          </w:tcPr>
+          <w:p>
+            <w:pPr>
+              <w:widowControl/>
+              <w:spacing w:after="0" w:line="247" w:lineRule="auto"/>
+              <w:jc w:val="left"/>
+            </w:pPr>
+            <w:r>
+              <w:rPr>
+                <w:rFonts w:ascii="Calibri" w:hAnsi="Calibri" w:eastAsia="Calibri"/>
+                <w:color w:val="202124"/>
+                <w:sz w:val="18"/>
+              </w:rPr>
+              <w:t>docs/TRKH_5CLASS_SCRATCH_INFERENCE_RESOURCE_VALUE_AUDIT_20260724.md</w:t>
+            </w:r>
+          </w:p>
+        </w:tc>
+        <w:tc>
+          <w:tcPr>
+            <w:tcW w:type="dxa" w:w="5310"/>
+            <w:tcMar>
+              <w:top w:w="80" w:type="dxa"/>
+              <w:start w:w="120" w:type="dxa"/>
+              <w:bottom w:w="80" w:type="dxa"/>
+              <w:end w:w="120" w:type="dxa"/>
+            </w:tcMar>
+            <w:vAlign w:val="center"/>
+          </w:tcPr>
+          <w:p>
+            <w:pPr>
+              <w:widowControl/>
+              <w:spacing w:after="0" w:line="247" w:lineRule="auto"/>
+              <w:jc w:val="left"/>
+            </w:pPr>
+            <w:r>
+              <w:rPr>
+                <w:rFonts w:ascii="Calibri" w:hAnsi="Calibri" w:eastAsia="Calibri"/>
+                <w:color w:val="202124"/>
+                <w:sz w:val="18"/>
+              </w:rPr>
+              <w:t>Scratch provenance, non-CNN/Transformer review, storage inventory và mandatory resource/inference gate.</w:t>
+            </w:r>
+          </w:p>
+        </w:tc>
+      </w:tr>
     </w:tbl>
     <w:p>
       <w:pPr>
@@ -8933,7 +9313,7 @@
           <w:color w:val="202124"/>
           <w:sz w:val="22"/>
         </w:rPr>
-        <w:t>Revision 1-3: tạo báo cáo tái lập, ghi full train 30e/JPEG-DL/chính sách synthetic chống leak, đóng JPEG-DL bằng replay-XAI và hoàn tất retention/layout QA. Revision 4-5: SaSPA F0/F1; F1 bị loại ở fidelity và XAI. Revision 6-8: LP-A3, NSA và RN-LISDA bị loại bằng causal controls/replay. Revision 9-10: khóa rồi loại Bal-BCE; cứu 38 TP nhưng tạo 57 restricted FP. Revision 11: pin paper/repository MIT của CAP và khóa prospectively frozen train-only A0 tại protocol/lock SHA c6d307bf/4aaba9ef. Revision 12: engine paper-equation, sáu role trainable, dynamic ledger, exact-file-set formal/replay manifest, full-row action, fresh-process replay và XAI được cố định trước formal; NumPy error tối đa 2,55e-15, focused 25/25, full pytest 1924/1924, synthetic FP32/BF16 peak CUDA 0,934/0,890 GiB. Keeper/lệnh tốt nhất không đổi.</w:t>
+        <w:t>Revision 1-3: tạo báo cáo tái lập, ghi full train 30e/JPEG-DL/chính sách synthetic chống leak, đóng JPEG-DL bằng replay-XAI và hoàn tất retention/layout QA. Revision 4-5: SaSPA F0/F1; F1 bị loại ở fidelity và XAI. Revision 6-8: LP-A3, NSA và RN-LISDA bị loại bằng causal controls/replay. Revision 9-10: khóa rồi loại Bal-BCE; cứu 38 TP nhưng tạo 57 restricted FP. Revision 11: pin paper/repository MIT của CAP và khóa prospectively frozen train-only A0 tại protocol/lock SHA c6d307bf/4aaba9ef. Revision 12: engine paper-equation, sáu role trainable, dynamic ledger, exact-file-set formal/replay manifest, full-row action, fresh-process replay và XAI được cố định trước formal; NumPy error tối đa 2,55e-15, focused 25/25, full pytest 1924/1924, synthetic FP32/BF16 peak CUDA 0,934/0,890 GiB. Keeper/lệnh tốt nhất không đổi. Revision 13: ghi nhận CAP formal hoàn tất 30/30 fold-role nhưng lỗi eval-LSTM XAI trước khi tạo artifact; sửa audit-only bằng native RNN, thêm regression, scratch/inference/resource-value gate và bảo toàn same-lock rerun. Focused 26/26, full pytest 1925/1925 trong 93,86 giây, DOCX QA 14/14 trang và accessibility 0/0/0. Không có CAP metric; keeper/lệnh tốt nhất vẫn không đổi.</w:t>
       </w:r>
     </w:p>
     <w:p>

</xml_diff>

<commit_message>
Close CAP integral-region context A0
</commit_message>
<xml_diff>
--- a/docs/TRKH_5CLASS_RESEARCH_PROCESS_STATUS.docx
+++ b/docs/TRKH_5CLASS_RESEARCH_PROCESS_STATUS.docx
@@ -75,7 +75,7 @@
           <w:color w:val="202124"/>
           <w:sz w:val="21"/>
         </w:rPr>
-        <w:t>2026-07-24 | Revision 13</w:t>
+        <w:t>2026-07-24 | Revision 14</w:t>
       </w:r>
     </w:p>
     <w:p>
@@ -97,7 +97,7 @@
           <w:color w:val="202124"/>
           <w:sz w:val="21"/>
         </w:rPr>
-        <w:t>Đang nghiên cứu - CAP A0 chờ rerun sau erratum XAI cuDNN</w:t>
+        <w:t>Đang nghiên cứu - CAP A0 đã reject sau formal/replay/XAI</w:t>
       </w:r>
     </w:p>
     <w:p>
@@ -354,7 +354,7 @@
                 <w:color w:val="1F4D78"/>
                 <w:sz w:val="28"/>
               </w:rPr>
-              <w:t>XAI erratum</w:t>
+              <w:t>Rejected</w:t>
             </w:r>
           </w:p>
           <w:p>
@@ -367,7 +367,7 @@
                 <w:color w:val="202124"/>
                 <w:sz w:val="17"/>
               </w:rPr>
-              <w:t>30/30 fold-role xong; 0 artifact/metric; rerun cùng lock</w:t>
+              <w:t>AUROC 0,560111; 5 FP sửa, 14 TP hỏng; replay exact</w:t>
             </w:r>
           </w:p>
         </w:tc>
@@ -412,7 +412,7 @@
           <w:color w:val="202124"/>
           <w:sz w:val="21"/>
         </w:rPr>
-        <w:t>Giữ nguyên keeper và file lệnh full-train tốt nhất. CAP formal đầu tiên hoàn tất 30/30 fold-role nhưng lỗi cuDNN LSTM eval-backward trong XAI trước khi ghi file; thư mục output có 0 artifact nên chưa có metric hoặc quyết định candidate. Chỉ sửa harness audit bằng native RNN trong XAI, giữ nguyên protocol/lock/training/scoring rồi rerun đúng một lần từ commit sạch. Mọi classifier đề xuất vẫn scratch-only và phải qua cả gate chất lượng lẫn inference; pretrained baseline chỉ được dùng đối chiếu, không được nạp tham số vào candidate.</w:t>
+        <w:t>Giữ nguyên keeper và file lệnh full-train tốt nhất. CAP rerun cùng lock đã hoàn tất formal, fresh-process replay và review đủ 20 hàng XAI nhưng bị loại: AUROC 0,560111, chỉ sửa 5 restricted FP và phá 14 TP lớp 1; macro/class-1 F1 giảm còn 0,937491/0,805643. Replay exact nhưng causal controls và manual XAI đều không hỗ trợ cơ chế. Không integration, validation/test, probe/full train hoặc command update. Mọi classifier đề xuất vẫn scratch-only; pretrained baseline chỉ được dùng đối chiếu.</w:t>
       </w:r>
     </w:p>
     <w:p>
@@ -2313,6 +2313,146 @@
           </w:p>
         </w:tc>
       </w:tr>
+      <w:tr>
+        <w:trPr>
+          <w:cantSplit/>
+        </w:trPr>
+        <w:tc>
+          <w:tcPr>
+            <w:tcW w:type="dxa" w:w="1500"/>
+            <w:tcMar>
+              <w:top w:w="80" w:type="dxa"/>
+              <w:start w:w="120" w:type="dxa"/>
+              <w:bottom w:w="80" w:type="dxa"/>
+              <w:end w:w="120" w:type="dxa"/>
+            </w:tcMar>
+            <w:vAlign w:val="center"/>
+          </w:tcPr>
+          <w:p>
+            <w:pPr>
+              <w:widowControl/>
+              <w:spacing w:after="0" w:line="247" w:lineRule="auto"/>
+              <w:jc w:val="left"/>
+            </w:pPr>
+            <w:r>
+              <w:rPr>
+                <w:rFonts w:ascii="Calibri" w:hAnsi="Calibri" w:eastAsia="Calibri"/>
+                <w:color w:val="202124"/>
+                <w:sz w:val="18"/>
+              </w:rPr>
+              <w:t>CAP A0</w:t>
+            </w:r>
+          </w:p>
+        </w:tc>
+        <w:tc>
+          <w:tcPr>
+            <w:tcW w:type="dxa" w:w="2250"/>
+            <w:tcMar>
+              <w:top w:w="80" w:type="dxa"/>
+              <w:start w:w="120" w:type="dxa"/>
+              <w:bottom w:w="80" w:type="dxa"/>
+              <w:end w:w="120" w:type="dxa"/>
+            </w:tcMar>
+            <w:vAlign w:val="center"/>
+          </w:tcPr>
+          <w:p>
+            <w:pPr>
+              <w:widowControl/>
+              <w:spacing w:after="0" w:line="247" w:lineRule="auto"/>
+              <w:jc w:val="left"/>
+            </w:pPr>
+            <w:r>
+              <w:rPr>
+                <w:rFonts w:ascii="Calibri" w:hAnsi="Calibri" w:eastAsia="Calibri"/>
+                <w:color w:val="202124"/>
+                <w:sz w:val="18"/>
+              </w:rPr>
+              <w:t>9.215 train; cohort 763; 5 source-held folds</w:t>
+            </w:r>
+          </w:p>
+        </w:tc>
+        <w:tc>
+          <w:tcPr>
+            <w:tcW w:type="dxa" w:w="1050"/>
+            <w:tcMar>
+              <w:top w:w="80" w:type="dxa"/>
+              <w:start w:w="120" w:type="dxa"/>
+              <w:bottom w:w="80" w:type="dxa"/>
+              <w:end w:w="120" w:type="dxa"/>
+            </w:tcMar>
+            <w:vAlign w:val="center"/>
+          </w:tcPr>
+          <w:p>
+            <w:pPr>
+              <w:widowControl/>
+              <w:spacing w:after="0" w:line="247" w:lineRule="auto"/>
+              <w:jc w:val="center"/>
+            </w:pPr>
+            <w:r>
+              <w:rPr>
+                <w:rFonts w:ascii="Calibri" w:hAnsi="Calibri" w:eastAsia="Calibri"/>
+                <w:color w:val="202124"/>
+                <w:sz w:val="18"/>
+              </w:rPr>
+              <w:t>0,937491</w:t>
+            </w:r>
+          </w:p>
+        </w:tc>
+        <w:tc>
+          <w:tcPr>
+            <w:tcW w:type="dxa" w:w="2450"/>
+            <w:tcMar>
+              <w:top w:w="80" w:type="dxa"/>
+              <w:start w:w="120" w:type="dxa"/>
+              <w:bottom w:w="80" w:type="dxa"/>
+              <w:end w:w="120" w:type="dxa"/>
+            </w:tcMar>
+            <w:vAlign w:val="center"/>
+          </w:tcPr>
+          <w:p>
+            <w:pPr>
+              <w:widowControl/>
+              <w:spacing w:after="0" w:line="247" w:lineRule="auto"/>
+              <w:jc w:val="left"/>
+            </w:pPr>
+            <w:r>
+              <w:rPr>
+                <w:rFonts w:ascii="Calibri" w:hAnsi="Calibri" w:eastAsia="Calibri"/>
+                <w:color w:val="202124"/>
+                <w:sz w:val="18"/>
+              </w:rPr>
+              <w:t>0,699320 / 0,950092 / 0,805643</w:t>
+            </w:r>
+          </w:p>
+        </w:tc>
+        <w:tc>
+          <w:tcPr>
+            <w:tcW w:type="dxa" w:w="2110"/>
+            <w:tcMar>
+              <w:top w:w="80" w:type="dxa"/>
+              <w:start w:w="120" w:type="dxa"/>
+              <w:bottom w:w="80" w:type="dxa"/>
+              <w:end w:w="120" w:type="dxa"/>
+            </w:tcMar>
+            <w:vAlign w:val="center"/>
+          </w:tcPr>
+          <w:p>
+            <w:pPr>
+              <w:widowControl/>
+              <w:spacing w:after="0" w:line="247" w:lineRule="auto"/>
+              <w:jc w:val="left"/>
+            </w:pPr>
+            <w:r>
+              <w:rPr>
+                <w:rFonts w:ascii="Calibri" w:hAnsi="Calibri" w:eastAsia="Calibri"/>
+                <w:color w:val="202124"/>
+                <w:sz w:val="18"/>
+              </w:rPr>
+              <w:t>Rejected; AUROC 0,5601, net -9, XAI fail</w:t>
+            </w:r>
+          </w:p>
+        </w:tc>
+      </w:tr>
     </w:tbl>
     <w:p>
       <w:pPr>
@@ -4061,6 +4201,92 @@
                 <w:color w:val="202124"/>
                 <w:sz w:val="18"/>
               </w:rPr>
+              <w:t>Context tích phân phi chọn lọc</w:t>
+            </w:r>
+          </w:p>
+        </w:tc>
+        <w:tc>
+          <w:tcPr>
+            <w:tcW w:type="dxa" w:w="4000"/>
+            <w:tcMar>
+              <w:top w:w="80" w:type="dxa"/>
+              <w:start w:w="120" w:type="dxa"/>
+              <w:bottom w:w="80" w:type="dxa"/>
+              <w:end w:w="120" w:type="dxa"/>
+            </w:tcMar>
+            <w:vAlign w:val="center"/>
+          </w:tcPr>
+          <w:p>
+            <w:pPr>
+              <w:widowControl/>
+              <w:spacing w:after="0" w:line="247" w:lineRule="auto"/>
+              <w:jc w:val="left"/>
+            </w:pPr>
+            <w:r>
+              <w:rPr>
+                <w:rFonts w:ascii="Calibri" w:hAnsi="Calibri" w:eastAsia="Calibri"/>
+                <w:color w:val="202124"/>
+                <w:sz w:val="18"/>
+              </w:rPr>
+              <w:t>CAP AUROC 0,560111 gần spatial control 0,560452, thấp hơn self-only 0,598809; sửa 5 FP nhưng phá 14 TP.</w:t>
+            </w:r>
+          </w:p>
+        </w:tc>
+        <w:tc>
+          <w:tcPr>
+            <w:tcW w:type="dxa" w:w="3460"/>
+            <w:tcMar>
+              <w:top w:w="80" w:type="dxa"/>
+              <w:start w:w="120" w:type="dxa"/>
+              <w:bottom w:w="80" w:type="dxa"/>
+              <w:end w:w="120" w:type="dxa"/>
+            </w:tcMar>
+            <w:vAlign w:val="center"/>
+          </w:tcPr>
+          <w:p>
+            <w:pPr>
+              <w:widowControl/>
+              <w:spacing w:after="0" w:line="247" w:lineRule="auto"/>
+              <w:jc w:val="left"/>
+            </w:pPr>
+            <w:r>
+              <w:rPr>
+                <w:rFonts w:ascii="Calibri" w:hAnsi="Calibri" w:eastAsia="Calibri"/>
+                <w:color w:val="202124"/>
+                <w:sz w:val="18"/>
+              </w:rPr>
+              <w:t>Context/region map không thay thế tín hiệu bề mặt lớp-điều-kiện; đóng neighborhood CAP exact.</w:t>
+            </w:r>
+          </w:p>
+        </w:tc>
+      </w:tr>
+      <w:tr>
+        <w:trPr>
+          <w:cantSplit/>
+        </w:trPr>
+        <w:tc>
+          <w:tcPr>
+            <w:tcW w:type="dxa" w:w="1900"/>
+            <w:tcMar>
+              <w:top w:w="80" w:type="dxa"/>
+              <w:start w:w="120" w:type="dxa"/>
+              <w:bottom w:w="80" w:type="dxa"/>
+              <w:end w:w="120" w:type="dxa"/>
+            </w:tcMar>
+            <w:vAlign w:val="center"/>
+          </w:tcPr>
+          <w:p>
+            <w:pPr>
+              <w:widowControl/>
+              <w:spacing w:after="0" w:line="247" w:lineRule="auto"/>
+              <w:jc w:val="left"/>
+            </w:pPr>
+            <w:r>
+              <w:rPr>
+                <w:rFonts w:ascii="Calibri" w:hAnsi="Calibri" w:eastAsia="Calibri"/>
+                <w:color w:val="202124"/>
+                <w:sz w:val="18"/>
+              </w:rPr>
               <w:t>Worktree bẩn</w:t>
             </w:r>
           </w:p>
@@ -4313,6 +4539,24 @@
           <w:sz w:val="22"/>
         </w:rPr>
         <w:t>Bal-BCE: đóng exact prior/sign/seed/fold/epoch/optimizer neighborhood; không nội suy prior multiplier hoặc nhiệt độ Balanced Softmax sau khi thấy tradeoff FP-TP.</w:t>
+      </w:r>
+    </w:p>
+    <w:p>
+      <w:pPr>
+        <w:widowControl/>
+        <w:numPr>
+          <w:ilvl w:val="0"/>
+          <w:numId w:val="10"/>
+        </w:numPr>
+        <w:spacing w:after="160" w:line="280" w:lineRule="auto"/>
+      </w:pPr>
+      <w:r>
+        <w:rPr>
+          <w:rFonts w:ascii="Calibri" w:hAnsi="Calibri" w:eastAsia="Calibri"/>
+          <w:color w:val="202124"/>
+          <w:sz w:val="22"/>
+        </w:rPr>
+        <w:t>CAP integral-region context: đóng exact region/order/layer/width/LSTM/NetVLAD/optimizer/epoch/seed/fold/threshold neighborhood; candidate không hơn derangements, seed không ổn định và manual XAI fail.</w:t>
       </w:r>
     </w:p>
     <w:p>
@@ -5753,6 +5997,264 @@
           </w:p>
         </w:tc>
       </w:tr>
+      <w:tr>
+        <w:trPr>
+          <w:cantSplit/>
+        </w:trPr>
+        <w:tc>
+          <w:tcPr>
+            <w:tcW w:type="dxa" w:w="1900"/>
+            <w:tcMar>
+              <w:top w:w="80" w:type="dxa"/>
+              <w:start w:w="120" w:type="dxa"/>
+              <w:bottom w:w="80" w:type="dxa"/>
+              <w:end w:w="120" w:type="dxa"/>
+            </w:tcMar>
+            <w:vAlign w:val="center"/>
+          </w:tcPr>
+          <w:p>
+            <w:pPr>
+              <w:widowControl/>
+              <w:spacing w:after="0" w:line="247" w:lineRule="auto"/>
+              <w:jc w:val="left"/>
+            </w:pPr>
+            <w:r>
+              <w:rPr>
+                <w:rFonts w:ascii="Calibri" w:hAnsi="Calibri" w:eastAsia="Calibri"/>
+                <w:color w:val="202124"/>
+                <w:sz w:val="18"/>
+              </w:rPr>
+              <w:t>CAP, AAAI 2021</w:t>
+            </w:r>
+          </w:p>
+        </w:tc>
+        <w:tc>
+          <w:tcPr>
+            <w:tcW w:type="dxa" w:w="3600"/>
+            <w:tcMar>
+              <w:top w:w="80" w:type="dxa"/>
+              <w:start w:w="120" w:type="dxa"/>
+              <w:bottom w:w="80" w:type="dxa"/>
+              <w:end w:w="120" w:type="dxa"/>
+            </w:tcMar>
+            <w:vAlign w:val="center"/>
+          </w:tcPr>
+          <w:p>
+            <w:pPr>
+              <w:widowControl/>
+              <w:spacing w:after="0" w:line="247" w:lineRule="auto"/>
+              <w:jc w:val="left"/>
+            </w:pPr>
+            <w:r>
+              <w:rPr>
+                <w:rFonts w:ascii="Calibri" w:hAnsi="Calibri" w:eastAsia="Calibri"/>
+                <w:color w:val="202124"/>
+                <w:sz w:val="18"/>
+              </w:rPr>
+              <w:t>Pixel context, 27 integral regions, region attention, LSTM và residual-less NetVLAD; paper dùng pretrained và 150 epoch.</w:t>
+            </w:r>
+          </w:p>
+        </w:tc>
+        <w:tc>
+          <w:tcPr>
+            <w:tcW w:type="dxa" w:w="3860"/>
+            <w:tcMar>
+              <w:top w:w="80" w:type="dxa"/>
+              <w:start w:w="120" w:type="dxa"/>
+              <w:bottom w:w="80" w:type="dxa"/>
+              <w:end w:w="120" w:type="dxa"/>
+            </w:tcMar>
+            <w:vAlign w:val="center"/>
+          </w:tcPr>
+          <w:p>
+            <w:pPr>
+              <w:widowControl/>
+              <w:spacing w:after="0" w:line="247" w:lineRule="auto"/>
+              <w:jc w:val="left"/>
+            </w:pPr>
+            <w:r>
+              <w:rPr>
+                <w:rFonts w:ascii="Calibri" w:hAnsi="Calibri" w:eastAsia="Calibri"/>
+                <w:color w:val="202124"/>
+                <w:sz w:val="18"/>
+              </w:rPr>
+              <w:t>A0 scratch đã bị loại; không chuyển số 4,1 ms hoặc accuracy của ResNet-50/Titan V sang TRKH.</w:t>
+            </w:r>
+          </w:p>
+        </w:tc>
+      </w:tr>
+      <w:tr>
+        <w:trPr>
+          <w:cantSplit/>
+        </w:trPr>
+        <w:tc>
+          <w:tcPr>
+            <w:tcW w:type="dxa" w:w="1900"/>
+            <w:tcMar>
+              <w:top w:w="80" w:type="dxa"/>
+              <w:start w:w="120" w:type="dxa"/>
+              <w:bottom w:w="80" w:type="dxa"/>
+              <w:end w:w="120" w:type="dxa"/>
+            </w:tcMar>
+            <w:vAlign w:val="center"/>
+          </w:tcPr>
+          <w:p>
+            <w:pPr>
+              <w:widowControl/>
+              <w:spacing w:after="0" w:line="247" w:lineRule="auto"/>
+              <w:jc w:val="left"/>
+            </w:pPr>
+            <w:r>
+              <w:rPr>
+                <w:rFonts w:ascii="Calibri" w:hAnsi="Calibri" w:eastAsia="Calibri"/>
+                <w:color w:val="202124"/>
+                <w:sz w:val="18"/>
+              </w:rPr>
+              <w:t>I2-HOFI, IJCV 2024</w:t>
+            </w:r>
+          </w:p>
+        </w:tc>
+        <w:tc>
+          <w:tcPr>
+            <w:tcW w:type="dxa" w:w="3600"/>
+            <w:tcMar>
+              <w:top w:w="80" w:type="dxa"/>
+              <w:start w:w="120" w:type="dxa"/>
+              <w:bottom w:w="80" w:type="dxa"/>
+              <w:end w:w="120" w:type="dxa"/>
+            </w:tcMar>
+            <w:vAlign w:val="center"/>
+          </w:tcPr>
+          <w:p>
+            <w:pPr>
+              <w:widowControl/>
+              <w:spacing w:after="0" w:line="247" w:lineRule="auto"/>
+              <w:jc w:val="left"/>
+            </w:pPr>
+            <w:r>
+              <w:rPr>
+                <w:rFonts w:ascii="Calibri" w:hAnsi="Calibri" w:eastAsia="Calibri"/>
+                <w:color w:val="202124"/>
+                <w:sz w:val="18"/>
+              </w:rPr>
+              <w:t>CNN-GNN với inter/intra-region high-order interaction; repo đề nghị GPU tối thiểu 16 GB và chưa phát hành inference script.</w:t>
+            </w:r>
+          </w:p>
+        </w:tc>
+        <w:tc>
+          <w:tcPr>
+            <w:tcW w:type="dxa" w:w="3860"/>
+            <w:tcMar>
+              <w:top w:w="80" w:type="dxa"/>
+              <w:start w:w="120" w:type="dxa"/>
+              <w:bottom w:w="80" w:type="dxa"/>
+              <w:end w:w="120" w:type="dxa"/>
+            </w:tcMar>
+            <w:vAlign w:val="center"/>
+          </w:tcPr>
+          <w:p>
+            <w:pPr>
+              <w:widowControl/>
+              <w:spacing w:after="0" w:line="247" w:lineRule="auto"/>
+              <w:jc w:val="left"/>
+            </w:pPr>
+            <w:r>
+              <w:rPr>
+                <w:rFonts w:ascii="Calibri" w:hAnsi="Calibri" w:eastAsia="Calibri"/>
+                <w:color w:val="202124"/>
+                <w:sz w:val="18"/>
+              </w:rPr>
+              <w:t>No-run: trùng graph/context đã đóng và không phù hợp RTX 4060 8 GB.</w:t>
+            </w:r>
+          </w:p>
+        </w:tc>
+      </w:tr>
+      <w:tr>
+        <w:trPr>
+          <w:cantSplit/>
+        </w:trPr>
+        <w:tc>
+          <w:tcPr>
+            <w:tcW w:type="dxa" w:w="1900"/>
+            <w:tcMar>
+              <w:top w:w="80" w:type="dxa"/>
+              <w:start w:w="120" w:type="dxa"/>
+              <w:bottom w:w="80" w:type="dxa"/>
+              <w:end w:w="120" w:type="dxa"/>
+            </w:tcMar>
+            <w:vAlign w:val="center"/>
+          </w:tcPr>
+          <w:p>
+            <w:pPr>
+              <w:widowControl/>
+              <w:spacing w:after="0" w:line="247" w:lineRule="auto"/>
+              <w:jc w:val="left"/>
+            </w:pPr>
+            <w:r>
+              <w:rPr>
+                <w:rFonts w:ascii="Calibri" w:hAnsi="Calibri" w:eastAsia="Calibri"/>
+                <w:color w:val="202124"/>
+                <w:sz w:val="18"/>
+              </w:rPr>
+              <w:t>FMR / AD-Net, 2024</w:t>
+            </w:r>
+          </w:p>
+        </w:tc>
+        <w:tc>
+          <w:tcPr>
+            <w:tcW w:type="dxa" w:w="3600"/>
+            <w:tcMar>
+              <w:top w:w="80" w:type="dxa"/>
+              <w:start w:w="120" w:type="dxa"/>
+              <w:bottom w:w="80" w:type="dxa"/>
+              <w:end w:w="120" w:type="dxa"/>
+            </w:tcMar>
+            <w:vAlign w:val="center"/>
+          </w:tcPr>
+          <w:p>
+            <w:pPr>
+              <w:widowControl/>
+              <w:spacing w:after="0" w:line="247" w:lineRule="auto"/>
+              <w:jc w:val="left"/>
+            </w:pPr>
+            <w:r>
+              <w:rPr>
+                <w:rFonts w:ascii="Calibri" w:hAnsi="Calibri" w:eastAsia="Calibri"/>
+                <w:color w:val="202124"/>
+                <w:sz w:val="18"/>
+              </w:rPr>
+              <w:t>Regularize magnitude của pretrained feature; augmented self-distillation cho low-data fine-tuning.</w:t>
+            </w:r>
+          </w:p>
+        </w:tc>
+        <w:tc>
+          <w:tcPr>
+            <w:tcW w:type="dxa" w:w="3860"/>
+            <w:tcMar>
+              <w:top w:w="80" w:type="dxa"/>
+              <w:start w:w="120" w:type="dxa"/>
+              <w:bottom w:w="80" w:type="dxa"/>
+              <w:end w:w="120" w:type="dxa"/>
+            </w:tcMar>
+            <w:vAlign w:val="center"/>
+          </w:tcPr>
+          <w:p>
+            <w:pPr>
+              <w:widowControl/>
+              <w:spacing w:after="0" w:line="247" w:lineRule="auto"/>
+              <w:jc w:val="left"/>
+            </w:pPr>
+            <w:r>
+              <w:rPr>
+                <w:rFonts w:ascii="Calibri" w:hAnsi="Calibri" w:eastAsia="Calibri"/>
+                <w:color w:val="202124"/>
+                <w:sz w:val="18"/>
+              </w:rPr>
+              <w:t>No-run: FMR không đúng scratch failure, AD-Net trùng multi-view/distillation đã đóng.</w:t>
+            </w:r>
+          </w:p>
+        </w:tc>
+      </w:tr>
     </w:tbl>
     <w:p>
       <w:pPr>
@@ -6640,7 +7142,7 @@
                 <w:color w:val="202124"/>
                 <w:sz w:val="18"/>
               </w:rPr>
-              <w:t>Hash/tóm tắt trước khi xóa chính xác artifact obsolete; hậu CAP lock quét 851 thư mục và 51 manifest, 220/220 nguồn compact đã vắng.</w:t>
+              <w:t>Hash/tóm tắt trước khi xóa chính xác artifact obsolete; phân biệt logical traversal với physical NTFS hardlink.</w:t>
             </w:r>
           </w:p>
         </w:tc>
@@ -6667,7 +7169,7 @@
                 <w:color w:val="202124"/>
                 <w:sz w:val="18"/>
               </w:rPr>
-              <w:t>Không xóa gì trong audit; 0 blocker, 88,846 GiB còn trống và summary SHA 436c06ac...bfd72e.</w:t>
+              <w:t>OOF 2,488 GiB có 96.768 hardlink/0 copy, là dependency được bảo vệ chứ không phải 2,488 GiB reclaimable.</w:t>
             </w:r>
           </w:p>
         </w:tc>
@@ -7876,6 +8378,264 @@
           </w:p>
         </w:tc>
       </w:tr>
+      <w:tr>
+        <w:trPr>
+          <w:cantSplit/>
+        </w:trPr>
+        <w:tc>
+          <w:tcPr>
+            <w:tcW w:type="dxa" w:w="2550"/>
+            <w:tcMar>
+              <w:top w:w="80" w:type="dxa"/>
+              <w:start w:w="120" w:type="dxa"/>
+              <w:bottom w:w="80" w:type="dxa"/>
+              <w:end w:w="120" w:type="dxa"/>
+            </w:tcMar>
+            <w:vAlign w:val="center"/>
+          </w:tcPr>
+          <w:p>
+            <w:pPr>
+              <w:widowControl/>
+              <w:spacing w:after="0" w:line="247" w:lineRule="auto"/>
+              <w:jc w:val="left"/>
+            </w:pPr>
+            <w:r>
+              <w:rPr>
+                <w:rFonts w:ascii="Calibri" w:hAnsi="Calibri" w:eastAsia="Calibri"/>
+                <w:color w:val="202124"/>
+                <w:sz w:val="18"/>
+              </w:rPr>
+              <w:t>CAP exact replay và one-shot finalization</w:t>
+            </w:r>
+          </w:p>
+        </w:tc>
+        <w:tc>
+          <w:tcPr>
+            <w:tcW w:type="dxa" w:w="3810"/>
+            <w:tcMar>
+              <w:top w:w="80" w:type="dxa"/>
+              <w:start w:w="120" w:type="dxa"/>
+              <w:bottom w:w="80" w:type="dxa"/>
+              <w:end w:w="120" w:type="dxa"/>
+            </w:tcMar>
+            <w:vAlign w:val="center"/>
+          </w:tcPr>
+          <w:p>
+            <w:pPr>
+              <w:widowControl/>
+              <w:spacing w:after="0" w:line="247" w:lineRule="auto"/>
+              <w:jc w:val="left"/>
+            </w:pPr>
+            <w:r>
+              <w:rPr>
+                <w:rFonts w:ascii="Calibri" w:hAnsi="Calibri" w:eastAsia="Calibri"/>
+                <w:color w:val="202124"/>
+                <w:sz w:val="18"/>
+              </w:rPr>
+              <w:t>Formal/replay mất 6150,613/5185,448 giây; mọi numeric error 0,0, ledger exact, 20/20 XAI được review.</w:t>
+            </w:r>
+          </w:p>
+        </w:tc>
+        <w:tc>
+          <w:tcPr>
+            <w:tcW w:type="dxa" w:w="3000"/>
+            <w:tcMar>
+              <w:top w:w="80" w:type="dxa"/>
+              <w:start w:w="120" w:type="dxa"/>
+              <w:bottom w:w="80" w:type="dxa"/>
+              <w:end w:w="120" w:type="dxa"/>
+            </w:tcMar>
+            <w:vAlign w:val="center"/>
+          </w:tcPr>
+          <w:p>
+            <w:pPr>
+              <w:widowControl/>
+              <w:spacing w:after="0" w:line="247" w:lineRule="auto"/>
+              <w:jc w:val="left"/>
+            </w:pPr>
+            <w:r>
+              <w:rPr>
+                <w:rFonts w:ascii="Calibri" w:hAnsi="Calibri" w:eastAsia="Calibri"/>
+                <w:color w:val="202124"/>
+                <w:sz w:val="18"/>
+              </w:rPr>
+              <w:t>Tách reproducibility khỏi utility: replay pass không cứu performance/causal/manual-XAI fail.</w:t>
+            </w:r>
+          </w:p>
+        </w:tc>
+      </w:tr>
+      <w:tr>
+        <w:trPr>
+          <w:cantSplit/>
+        </w:trPr>
+        <w:tc>
+          <w:tcPr>
+            <w:tcW w:type="dxa" w:w="2550"/>
+            <w:tcMar>
+              <w:top w:w="80" w:type="dxa"/>
+              <w:start w:w="120" w:type="dxa"/>
+              <w:bottom w:w="80" w:type="dxa"/>
+              <w:end w:w="120" w:type="dxa"/>
+            </w:tcMar>
+            <w:vAlign w:val="center"/>
+          </w:tcPr>
+          <w:p>
+            <w:pPr>
+              <w:widowControl/>
+              <w:spacing w:after="0" w:line="247" w:lineRule="auto"/>
+              <w:jc w:val="left"/>
+            </w:pPr>
+            <w:r>
+              <w:rPr>
+                <w:rFonts w:ascii="Calibri" w:hAnsi="Calibri" w:eastAsia="Calibri"/>
+                <w:color w:val="202124"/>
+                <w:sz w:val="18"/>
+              </w:rPr>
+              <w:t>Memory không đồng nghĩa inference</w:t>
+            </w:r>
+          </w:p>
+        </w:tc>
+        <w:tc>
+          <w:tcPr>
+            <w:tcW w:type="dxa" w:w="3810"/>
+            <w:tcMar>
+              <w:top w:w="80" w:type="dxa"/>
+              <w:start w:w="120" w:type="dxa"/>
+              <w:bottom w:w="80" w:type="dxa"/>
+              <w:end w:w="120" w:type="dxa"/>
+            </w:tcMar>
+            <w:vAlign w:val="center"/>
+          </w:tcPr>
+          <w:p>
+            <w:pPr>
+              <w:widowControl/>
+              <w:spacing w:after="0" w:line="247" w:lineRule="auto"/>
+              <w:jc w:val="left"/>
+            </w:pPr>
+            <w:r>
+              <w:rPr>
+                <w:rFonts w:ascii="Calibri" w:hAnsi="Calibri" w:eastAsia="Calibri"/>
+                <w:color w:val="202124"/>
+                <w:sz w:val="18"/>
+              </w:rPr>
+              <w:t>CAP chỉ khóa 1.090.979 parameter và peak CUDA/RSS 0,281/1,869 GiB.</w:t>
+            </w:r>
+          </w:p>
+        </w:tc>
+        <w:tc>
+          <w:tcPr>
+            <w:tcW w:type="dxa" w:w="3000"/>
+            <w:tcMar>
+              <w:top w:w="80" w:type="dxa"/>
+              <w:start w:w="120" w:type="dxa"/>
+              <w:bottom w:w="80" w:type="dxa"/>
+              <w:end w:w="120" w:type="dxa"/>
+            </w:tcMar>
+            <w:vAlign w:val="center"/>
+          </w:tcPr>
+          <w:p>
+            <w:pPr>
+              <w:widowControl/>
+              <w:spacing w:after="0" w:line="247" w:lineRule="auto"/>
+              <w:jc w:val="left"/>
+            </w:pPr>
+            <w:r>
+              <w:rPr>
+                <w:rFonts w:ascii="Calibri" w:hAnsi="Calibri" w:eastAsia="Calibri"/>
+                <w:color w:val="202124"/>
+                <w:sz w:val="18"/>
+              </w:rPr>
+              <w:t>Không tuyên bố inference pass khi chưa có mean/p95, throughput, end-to-end VRAM, ONNX và TensorRT.</w:t>
+            </w:r>
+          </w:p>
+        </w:tc>
+      </w:tr>
+      <w:tr>
+        <w:trPr>
+          <w:cantSplit/>
+        </w:trPr>
+        <w:tc>
+          <w:tcPr>
+            <w:tcW w:type="dxa" w:w="2550"/>
+            <w:tcMar>
+              <w:top w:w="80" w:type="dxa"/>
+              <w:start w:w="120" w:type="dxa"/>
+              <w:bottom w:w="80" w:type="dxa"/>
+              <w:end w:w="120" w:type="dxa"/>
+            </w:tcMar>
+            <w:vAlign w:val="center"/>
+          </w:tcPr>
+          <w:p>
+            <w:pPr>
+              <w:widowControl/>
+              <w:spacing w:after="0" w:line="247" w:lineRule="auto"/>
+              <w:jc w:val="left"/>
+            </w:pPr>
+            <w:r>
+              <w:rPr>
+                <w:rFonts w:ascii="Calibri" w:hAnsi="Calibri" w:eastAsia="Calibri"/>
+                <w:color w:val="202124"/>
+                <w:sz w:val="18"/>
+              </w:rPr>
+              <w:t>CAP closure verification</w:t>
+            </w:r>
+          </w:p>
+        </w:tc>
+        <w:tc>
+          <w:tcPr>
+            <w:tcW w:type="dxa" w:w="3810"/>
+            <w:tcMar>
+              <w:top w:w="80" w:type="dxa"/>
+              <w:start w:w="120" w:type="dxa"/>
+              <w:bottom w:w="80" w:type="dxa"/>
+              <w:end w:w="120" w:type="dxa"/>
+            </w:tcMar>
+            <w:vAlign w:val="center"/>
+          </w:tcPr>
+          <w:p>
+            <w:pPr>
+              <w:widowControl/>
+              <w:spacing w:after="0" w:line="247" w:lineRule="auto"/>
+              <w:jc w:val="left"/>
+            </w:pPr>
+            <w:r>
+              <w:rPr>
+                <w:rFonts w:ascii="Calibri" w:hAnsi="Calibri" w:eastAsia="Calibri"/>
+                <w:color w:val="202124"/>
+                <w:sz w:val="18"/>
+              </w:rPr>
+              <w:t>Focused/full test 28/28 và 1925/1925; Word QA 14/14, accessibility 0/0/0; retention 860 directory/51 manifest/220 original vắng.</w:t>
+            </w:r>
+          </w:p>
+        </w:tc>
+        <w:tc>
+          <w:tcPr>
+            <w:tcW w:type="dxa" w:w="3000"/>
+            <w:tcMar>
+              <w:top w:w="80" w:type="dxa"/>
+              <w:start w:w="120" w:type="dxa"/>
+              <w:bottom w:w="80" w:type="dxa"/>
+              <w:end w:w="120" w:type="dxa"/>
+            </w:tcMar>
+            <w:vAlign w:val="center"/>
+          </w:tcPr>
+          <w:p>
+            <w:pPr>
+              <w:widowControl/>
+              <w:spacing w:after="0" w:line="247" w:lineRule="auto"/>
+              <w:jc w:val="left"/>
+            </w:pPr>
+            <w:r>
+              <w:rPr>
+                <w:rFonts w:ascii="Calibri" w:hAnsi="Calibri" w:eastAsia="Calibri"/>
+                <w:color w:val="202124"/>
+                <w:sz w:val="18"/>
+              </w:rPr>
+              <w:t>Bảo toàn toàn bộ CAP evidence, không xóa artifact và khóa kết luận bằng retention SHA 99d1835a...04a636.</w:t>
+            </w:r>
+          </w:p>
+        </w:tc>
+      </w:tr>
     </w:tbl>
     <w:p>
       <w:pPr>
@@ -7906,7 +8666,7 @@
           <w:color w:val="202124"/>
           <w:sz w:val="22"/>
         </w:rPr>
-        <w:t>Giữ nguyên các closure JPEG-DL, SaSPA F1, LP-A3, NSA, RN-LISDA và Bal-BCE A0 có giá trị tái lập; cleanup artifact tạm bằng manifest riêng.</w:t>
+        <w:t>Giữ nguyên các closure JPEG-DL, SaSPA F1, LP-A3, NSA, RN-LISDA, Bal-BCE và CAP A0 có giá trị tái lập; cleanup artifact tạm bằng manifest riêng.</w:t>
       </w:r>
     </w:p>
     <w:p>
@@ -7924,7 +8684,7 @@
           <w:color w:val="202124"/>
           <w:sz w:val="22"/>
         </w:rPr>
-        <w:t>Đóng exact SaSPA, LP-A3, NSA, RN-LISDA và Bal-BCE neighborhoods đã khóa; không mở lại bằng sweep prompt/seed, radius/step/margin/lambda, query/Poisson/readout, CovNet/meta schedule hoặc prior multiplier.</w:t>
+        <w:t>Đóng exact SaSPA, LP-A3, NSA, RN-LISDA, Bal-BCE và CAP neighborhoods; không mở lại bằng sweep lân cận sau kết quả.</w:t>
       </w:r>
     </w:p>
     <w:p>
@@ -7978,7 +8738,7 @@
           <w:color w:val="202124"/>
           <w:sz w:val="22"/>
         </w:rPr>
-        <w:t>Bảo toàn log failure CAP stdout/stderr SHA 630b5cec/48930829; full pytest đã đạt 1925/1925, DOCX QA đạt 14/14 trang và accessibility 0/0/0; commit/push erratum native-RNN XAI rồi rerun đúng một formal cùng protocol/lock.</w:t>
+        <w:t>Bảo toàn CAP summary/replay/manual/final SHAs 824549d2/e9f21c59/197ca492/00263f23; exact replay pass nhưng performance, causal control và manual XAI fail.</w:t>
       </w:r>
     </w:p>
     <w:p>
@@ -8014,7 +8774,7 @@
           <w:color w:val="202124"/>
           <w:sz w:val="22"/>
         </w:rPr>
-        <w:t>Không chạy kiến trúc mới trước khi có resource-value record và matched keeper inference contract; gắn nhãn kết quả promotable, mechanism-only, negative-but-reusable hoặc waste/invalid.</w:t>
+        <w:t>Không chạy kiến trúc mới trước khi có resource-value record và matched keeper inference contract; CAP là negative-but-reusable, không phải candidate production.</w:t>
       </w:r>
     </w:p>
     <w:p>
@@ -8032,7 +8792,7 @@
           <w:color w:val="202124"/>
           <w:sz w:val="22"/>
         </w:rPr>
-        <w:t>Kiểm toán dependency của các root lớn, ưu tiên OOF 2,488 GiB/96.774 file; chỉ compact sau manifest và retention proof, không xóa theo tên hoặc tuổi.</w:t>
+        <w:t>Bảo vệ OOF fold root: 2,488 GiB là logical size của 96.768 hardlink/0 copy và các path còn dependency; chỉ xét migration sau dependency proof.</w:t>
       </w:r>
     </w:p>
     <w:p>
@@ -8068,7 +8828,25 @@
           <w:color w:val="202124"/>
           <w:sz w:val="22"/>
         </w:rPr>
-        <w:t>Chỉ cập nhật lệnh full-train tốt nhất và history khi một candidate thắng validation, replay và XAI gate.</w:t>
+        <w:t>Chỉ cập nhật lệnh full-train tốt nhất và history khi một candidate thắng validation, replay, XAI và deployment gate.</w:t>
+      </w:r>
+    </w:p>
+    <w:p>
+      <w:pPr>
+        <w:widowControl/>
+        <w:numPr>
+          <w:ilvl w:val="0"/>
+          <w:numId w:val="14"/>
+        </w:numPr>
+        <w:spacing w:after="160" w:line="280" w:lineRule="auto"/>
+      </w:pPr>
+      <w:r>
+        <w:rPr>
+          <w:rFonts w:ascii="Calibri" w:hAnsi="Calibri" w:eastAsia="Calibri"/>
+          <w:color w:val="202124"/>
+          <w:sz w:val="22"/>
+        </w:rPr>
+        <w:t>Chọn successor chỉ khi equation-distinct, có sample-conditional surface evidence và khóa trước TP/FP, latency/p95/throughput/VRAM, ONNX/TensorRT.</w:t>
       </w:r>
     </w:p>
     <w:p>
@@ -8911,6 +9689,65 @@
                 <w:color w:val="202124"/>
                 <w:sz w:val="18"/>
               </w:rPr>
+              <w:t>docs/TRKH_5CLASS_CAP_INTEGRAL_REGION_CONTEXT_A0_CLOSURE_20260724.md</w:t>
+            </w:r>
+          </w:p>
+        </w:tc>
+        <w:tc>
+          <w:tcPr>
+            <w:tcW w:type="dxa" w:w="5310"/>
+            <w:tcMar>
+              <w:top w:w="80" w:type="dxa"/>
+              <w:start w:w="120" w:type="dxa"/>
+              <w:bottom w:w="80" w:type="dxa"/>
+              <w:end w:w="120" w:type="dxa"/>
+            </w:tcMar>
+            <w:vAlign w:val="center"/>
+          </w:tcPr>
+          <w:p>
+            <w:pPr>
+              <w:widowControl/>
+              <w:spacing w:after="0" w:line="247" w:lineRule="auto"/>
+              <w:jc w:val="left"/>
+            </w:pPr>
+            <w:r>
+              <w:rPr>
+                <w:rFonts w:ascii="Calibri" w:hAnsi="Calibri" w:eastAsia="Calibri"/>
+                <w:color w:val="202124"/>
+                <w:sz w:val="18"/>
+              </w:rPr>
+              <w:t>Kết quả formal/replay/manual review, inference caveat, no-repeat boundary và hash CAP cuối.</w:t>
+            </w:r>
+          </w:p>
+        </w:tc>
+      </w:tr>
+      <w:tr>
+        <w:trPr>
+          <w:cantSplit/>
+        </w:trPr>
+        <w:tc>
+          <w:tcPr>
+            <w:tcW w:type="dxa" w:w="4050"/>
+            <w:tcMar>
+              <w:top w:w="80" w:type="dxa"/>
+              <w:start w:w="120" w:type="dxa"/>
+              <w:bottom w:w="80" w:type="dxa"/>
+              <w:end w:w="120" w:type="dxa"/>
+            </w:tcMar>
+            <w:vAlign w:val="center"/>
+          </w:tcPr>
+          <w:p>
+            <w:pPr>
+              <w:widowControl/>
+              <w:spacing w:after="0" w:line="247" w:lineRule="auto"/>
+              <w:jc w:val="left"/>
+            </w:pPr>
+            <w:r>
+              <w:rPr>
+                <w:rFonts w:ascii="Calibri" w:hAnsi="Calibri" w:eastAsia="Calibri"/>
+                <w:color w:val="202124"/>
+                <w:sz w:val="18"/>
+              </w:rPr>
               <w:t>scripts/build_trkh_cap_integral_region_context_a0_lock.py</w:t>
             </w:r>
           </w:p>
@@ -9313,7 +10150,7 @@
           <w:color w:val="202124"/>
           <w:sz w:val="22"/>
         </w:rPr>
-        <w:t>Revision 1-3: tạo báo cáo tái lập, ghi full train 30e/JPEG-DL/chính sách synthetic chống leak, đóng JPEG-DL bằng replay-XAI và hoàn tất retention/layout QA. Revision 4-5: SaSPA F0/F1; F1 bị loại ở fidelity và XAI. Revision 6-8: LP-A3, NSA và RN-LISDA bị loại bằng causal controls/replay. Revision 9-10: khóa rồi loại Bal-BCE; cứu 38 TP nhưng tạo 57 restricted FP. Revision 11: pin paper/repository MIT của CAP và khóa prospectively frozen train-only A0 tại protocol/lock SHA c6d307bf/4aaba9ef. Revision 12: engine paper-equation, sáu role trainable, dynamic ledger, exact-file-set formal/replay manifest, full-row action, fresh-process replay và XAI được cố định trước formal; NumPy error tối đa 2,55e-15, focused 25/25, full pytest 1924/1924, synthetic FP32/BF16 peak CUDA 0,934/0,890 GiB. Keeper/lệnh tốt nhất không đổi. Revision 13: ghi nhận CAP formal hoàn tất 30/30 fold-role nhưng lỗi eval-LSTM XAI trước khi tạo artifact; sửa audit-only bằng native RNN, thêm regression, scratch/inference/resource-value gate và bảo toàn same-lock rerun. Focused 26/26, full pytest 1925/1925 trong 93,86 giây, DOCX QA 14/14 trang và accessibility 0/0/0. Không có CAP metric; keeper/lệnh tốt nhất vẫn không đổi.</w:t>
+        <w:t>Revision 1-3: tạo báo cáo tái lập, full train 30e/JPEG-DL và synthetic policy. Revision 4-5: SaSPA F0/F1 bị loại ở fidelity/XAI. Revision 6-8: LP-A3, NSA và RN-LISDA bị loại bằng causal controls/replay. Revision 9-10: Bal-BCE bị loại vì tạo 57 restricted FP. Revision 11-12: khóa CAP prospectively rồi cố định engine/auditor/replay/XAI trước metric. Revision 13: sửa audit-only lỗi eval-LSTM XAI sau zero-artifact formal. Revision 14: same-lock CAP formal/replay/manual review hoàn tất; candidate AUROC 0,560111, net -9, macro/class-1 F1 0,937491/0,805643, replay numeric error 0,0 nhưng manual XAI fail. CAP đóng negative-but-reusable; sửa OOF hardlink và memory-vs-inference claims. Closure QA pass focused/full 28/28 và 1925/1925, Word 14/14, accessibility 0/0/0, retention 860 directory/51 manifest/220 original vắng tại SHA 99d1835a...04a636. Keeper/lệnh tốt nhất vẫn không đổi.</w:t>
       </w:r>
     </w:p>
     <w:p>
@@ -9333,14 +10170,14 @@
           <w:ilvl w:val="0"/>
           <w:numId w:val="15"/>
         </w:numPr>
-        <w:spacing w:after="160" w:line="280" w:lineRule="auto"/>
+        <w:spacing w:after="80" w:line="259" w:lineRule="auto" w:before="160"/>
       </w:pPr>
       <w:r>
         <w:rPr>
           <w:rFonts w:ascii="Calibri" w:hAnsi="Calibri" w:eastAsia="Calibri"/>
           <w:b/>
           <w:color w:val="202124"/>
-          <w:sz w:val="21"/>
+          <w:sz w:val="20"/>
         </w:rPr>
         <w:t>JPEG Inspired Deep Learning, ICLR 2025</w:t>
       </w:r>
@@ -9348,7 +10185,7 @@
         <w:rPr>
           <w:rFonts w:ascii="Calibri" w:hAnsi="Calibri" w:eastAsia="Calibri"/>
           <w:color w:val="202124"/>
-          <w:sz w:val="21"/>
+          <w:sz w:val="20"/>
         </w:rPr>
         <w:t xml:space="preserve"> - Paper chính cho candidate input quantization. </w:t>
       </w:r>
@@ -9358,6 +10195,8 @@
             <w:rFonts w:ascii="Calibri" w:hAnsi="Calibri" w:eastAsia="Calibri"/>
             <w:color w:val="2E74B5"/>
             <w:u w:val="single"/>
+            <w:sz w:val="20"/>
+            <w:szCs w:val="20"/>
           </w:rPr>
           <w:t>Mở nguồn</w:t>
         </w:r>
@@ -9371,14 +10210,14 @@
           <w:ilvl w:val="0"/>
           <w:numId w:val="15"/>
         </w:numPr>
-        <w:spacing w:after="160" w:line="280" w:lineRule="auto"/>
+        <w:spacing w:after="80" w:line="259" w:lineRule="auto"/>
       </w:pPr>
       <w:r>
         <w:rPr>
           <w:rFonts w:ascii="Calibri" w:hAnsi="Calibri" w:eastAsia="Calibri"/>
           <w:b/>
           <w:color w:val="202124"/>
-          <w:sz w:val="21"/>
+          <w:sz w:val="20"/>
         </w:rPr>
         <w:t>JPEG-Inspired-DL official repository</w:t>
       </w:r>
@@ -9386,7 +10225,7 @@
         <w:rPr>
           <w:rFonts w:ascii="Calibri" w:hAnsi="Calibri" w:eastAsia="Calibri"/>
           <w:color w:val="202124"/>
-          <w:sz w:val="21"/>
+          <w:sz w:val="20"/>
         </w:rPr>
         <w:t xml:space="preserve"> - Repository tham chiếu, pin commit 894fdb651326b7c68f13967886fea2ee04831b3a. </w:t>
       </w:r>
@@ -9396,6 +10235,8 @@
             <w:rFonts w:ascii="Calibri" w:hAnsi="Calibri" w:eastAsia="Calibri"/>
             <w:color w:val="2E74B5"/>
             <w:u w:val="single"/>
+            <w:sz w:val="20"/>
+            <w:szCs w:val="20"/>
           </w:rPr>
           <w:t>Mở nguồn</w:t>
         </w:r>
@@ -9409,14 +10250,14 @@
           <w:ilvl w:val="0"/>
           <w:numId w:val="15"/>
         </w:numPr>
-        <w:spacing w:after="160" w:line="280" w:lineRule="auto"/>
+        <w:spacing w:after="80" w:line="259" w:lineRule="auto"/>
       </w:pPr>
       <w:r>
         <w:rPr>
           <w:rFonts w:ascii="Calibri" w:hAnsi="Calibri" w:eastAsia="Calibri"/>
           <w:b/>
           <w:color w:val="202124"/>
-          <w:sz w:val="21"/>
+          <w:sz w:val="20"/>
         </w:rPr>
         <w:t>Plant Pathology 2020 - first-place solution discussion</w:t>
       </w:r>
@@ -9424,7 +10265,7 @@
         <w:rPr>
           <w:rFonts w:ascii="Calibri" w:hAnsi="Calibri" w:eastAsia="Calibri"/>
           <w:color w:val="202124"/>
-          <w:sz w:val="21"/>
+          <w:sz w:val="20"/>
         </w:rPr>
         <w:t xml:space="preserve"> - OOF repair, 5-fold, non-square input và augmentation. </w:t>
       </w:r>
@@ -9434,6 +10275,8 @@
             <w:rFonts w:ascii="Calibri" w:hAnsi="Calibri" w:eastAsia="Calibri"/>
             <w:color w:val="2E74B5"/>
             <w:u w:val="single"/>
+            <w:sz w:val="20"/>
+            <w:szCs w:val="20"/>
           </w:rPr>
           <w:t>Mở nguồn</w:t>
         </w:r>
@@ -9447,14 +10290,14 @@
           <w:ilvl w:val="0"/>
           <w:numId w:val="15"/>
         </w:numPr>
-        <w:spacing w:after="160" w:line="280" w:lineRule="auto"/>
+        <w:spacing w:after="80" w:line="259" w:lineRule="auto"/>
       </w:pPr>
       <w:r>
         <w:rPr>
           <w:rFonts w:ascii="Calibri" w:hAnsi="Calibri" w:eastAsia="Calibri"/>
           <w:b/>
           <w:color w:val="202124"/>
-          <w:sz w:val="21"/>
+          <w:sz w:val="20"/>
         </w:rPr>
         <w:t>Plant Pathology 2021 - first-place solution discussion</w:t>
       </w:r>
@@ -9462,7 +10305,7 @@
         <w:rPr>
           <w:rFonts w:ascii="Calibri" w:hAnsi="Calibri" w:eastAsia="Calibri"/>
           <w:color w:val="202124"/>
-          <w:sz w:val="21"/>
+          <w:sz w:val="20"/>
         </w:rPr>
         <w:t xml:space="preserve"> - Fold ensemble, soft-label rule, multi-label mixing, balancing và TTA. </w:t>
       </w:r>
@@ -9472,6 +10315,8 @@
             <w:rFonts w:ascii="Calibri" w:hAnsi="Calibri" w:eastAsia="Calibri"/>
             <w:color w:val="2E74B5"/>
             <w:u w:val="single"/>
+            <w:sz w:val="20"/>
+            <w:szCs w:val="20"/>
           </w:rPr>
           <w:t>Mở nguồn</w:t>
         </w:r>
@@ -9485,14 +10330,14 @@
           <w:ilvl w:val="0"/>
           <w:numId w:val="15"/>
         </w:numPr>
-        <w:spacing w:after="160" w:line="280" w:lineRule="auto"/>
+        <w:spacing w:after="80" w:line="259" w:lineRule="auto"/>
       </w:pPr>
       <w:r>
         <w:rPr>
           <w:rFonts w:ascii="Calibri" w:hAnsi="Calibri" w:eastAsia="Calibri"/>
           <w:b/>
           <w:color w:val="202124"/>
-          <w:sz w:val="21"/>
+          <w:sz w:val="20"/>
         </w:rPr>
         <w:t>Cassava Leaf Disease Classification - second-place solution</w:t>
       </w:r>
@@ -9500,7 +10345,7 @@
         <w:rPr>
           <w:rFonts w:ascii="Calibri" w:hAnsi="Calibri" w:eastAsia="Calibri"/>
           <w:color w:val="202124"/>
-          <w:sz w:val="21"/>
+          <w:sz w:val="20"/>
         </w:rPr>
         <w:t xml:space="preserve"> - Ví dụ domain-pretrained CropNet và protocol khác scratch. </w:t>
       </w:r>
@@ -9510,6 +10355,8 @@
             <w:rFonts w:ascii="Calibri" w:hAnsi="Calibri" w:eastAsia="Calibri"/>
             <w:color w:val="2E74B5"/>
             <w:u w:val="single"/>
+            <w:sz w:val="20"/>
+            <w:szCs w:val="20"/>
           </w:rPr>
           <w:t>Mở nguồn</w:t>
         </w:r>
@@ -9523,14 +10370,14 @@
           <w:ilvl w:val="0"/>
           <w:numId w:val="15"/>
         </w:numPr>
-        <w:spacing w:after="160" w:line="280" w:lineRule="auto"/>
+        <w:spacing w:after="80" w:line="259" w:lineRule="auto"/>
       </w:pPr>
       <w:r>
         <w:rPr>
           <w:rFonts w:ascii="Calibri" w:hAnsi="Calibri" w:eastAsia="Calibri"/>
           <w:b/>
           <w:color w:val="202124"/>
-          <w:sz w:val="21"/>
+          <w:sz w:val="20"/>
         </w:rPr>
         <w:t>iCassava 2019 Fine-Grained Visual Categorization Challenge</w:t>
       </w:r>
@@ -9538,7 +10385,7 @@
         <w:rPr>
           <w:rFonts w:ascii="Calibri" w:hAnsi="Calibri" w:eastAsia="Calibri"/>
           <w:color w:val="202124"/>
-          <w:sz w:val="21"/>
+          <w:sz w:val="20"/>
         </w:rPr>
         <w:t xml:space="preserve"> - Đặc điểm ảnh nông nghiệp hiện trường và unlabeled-data setting. </w:t>
       </w:r>
@@ -9548,6 +10395,8 @@
             <w:rFonts w:ascii="Calibri" w:hAnsi="Calibri" w:eastAsia="Calibri"/>
             <w:color w:val="2E74B5"/>
             <w:u w:val="single"/>
+            <w:sz w:val="20"/>
+            <w:szCs w:val="20"/>
           </w:rPr>
           <w:t>Mở nguồn</w:t>
         </w:r>
@@ -9561,14 +10410,14 @@
           <w:ilvl w:val="0"/>
           <w:numId w:val="15"/>
         </w:numPr>
-        <w:spacing w:after="160" w:line="280" w:lineRule="auto"/>
+        <w:spacing w:after="80" w:line="259" w:lineRule="auto"/>
       </w:pPr>
       <w:r>
         <w:rPr>
           <w:rFonts w:ascii="Calibri" w:hAnsi="Calibri" w:eastAsia="Calibri"/>
           <w:b/>
           <w:color w:val="202124"/>
-          <w:sz w:val="21"/>
+          <w:sz w:val="20"/>
         </w:rPr>
         <w:t>SaSPA: Structure and Subject Preserving Augmentation, NeurIPS 2024</w:t>
       </w:r>
@@ -9576,7 +10425,7 @@
         <w:rPr>
           <w:rFonts w:ascii="Calibri" w:hAnsi="Calibri" w:eastAsia="Calibri"/>
           <w:color w:val="202124"/>
-          <w:sz w:val="21"/>
+          <w:sz w:val="20"/>
         </w:rPr>
         <w:t xml:space="preserve"> - Ứng viên synthetic fine-grained chính. </w:t>
       </w:r>
@@ -9586,6 +10435,8 @@
             <w:rFonts w:ascii="Calibri" w:hAnsi="Calibri" w:eastAsia="Calibri"/>
             <w:color w:val="2E74B5"/>
             <w:u w:val="single"/>
+            <w:sz w:val="20"/>
+            <w:szCs w:val="20"/>
           </w:rPr>
           <w:t>Mở nguồn</w:t>
         </w:r>
@@ -9599,14 +10450,14 @@
           <w:ilvl w:val="0"/>
           <w:numId w:val="15"/>
         </w:numPr>
-        <w:spacing w:after="160" w:line="280" w:lineRule="auto"/>
+        <w:spacing w:after="80" w:line="259" w:lineRule="auto"/>
       </w:pPr>
       <w:r>
         <w:rPr>
           <w:rFonts w:ascii="Calibri" w:hAnsi="Calibri" w:eastAsia="Calibri"/>
           <w:b/>
           <w:color w:val="202124"/>
-          <w:sz w:val="21"/>
+          <w:sz w:val="20"/>
         </w:rPr>
         <w:t>SaSPA-Aug official repository</w:t>
       </w:r>
@@ -9614,7 +10465,7 @@
         <w:rPr>
           <w:rFonts w:ascii="Calibri" w:hAnsi="Calibri" w:eastAsia="Calibri"/>
           <w:color w:val="202124"/>
-          <w:sz w:val="21"/>
+          <w:sz w:val="20"/>
         </w:rPr>
         <w:t xml:space="preserve"> - Implementation tham khảo cho feasibility/provenance. </w:t>
       </w:r>
@@ -9624,6 +10475,8 @@
             <w:rFonts w:ascii="Calibri" w:hAnsi="Calibri" w:eastAsia="Calibri"/>
             <w:color w:val="2E74B5"/>
             <w:u w:val="single"/>
+            <w:sz w:val="20"/>
+            <w:szCs w:val="20"/>
           </w:rPr>
           <w:t>Mở nguồn</w:t>
         </w:r>
@@ -9637,14 +10490,14 @@
           <w:ilvl w:val="0"/>
           <w:numId w:val="15"/>
         </w:numPr>
-        <w:spacing w:after="160" w:line="280" w:lineRule="auto"/>
+        <w:spacing w:after="80" w:line="259" w:lineRule="auto"/>
       </w:pPr>
       <w:r>
         <w:rPr>
           <w:rFonts w:ascii="Calibri" w:hAnsi="Calibri" w:eastAsia="Calibri"/>
           <w:b/>
           <w:color w:val="202124"/>
-          <w:sz w:val="21"/>
+          <w:sz w:val="20"/>
         </w:rPr>
         <w:t>DiffuseMix, CVPR 2024</w:t>
       </w:r>
@@ -9652,7 +10505,7 @@
         <w:rPr>
           <w:rFonts w:ascii="Calibri" w:hAnsi="Calibri" w:eastAsia="Calibri"/>
           <w:color w:val="202124"/>
-          <w:sz w:val="21"/>
+          <w:sz w:val="20"/>
         </w:rPr>
         <w:t xml:space="preserve"> - Diffusion augmentation hướng label-preserving. </w:t>
       </w:r>
@@ -9662,6 +10515,8 @@
             <w:rFonts w:ascii="Calibri" w:hAnsi="Calibri" w:eastAsia="Calibri"/>
             <w:color w:val="2E74B5"/>
             <w:u w:val="single"/>
+            <w:sz w:val="20"/>
+            <w:szCs w:val="20"/>
           </w:rPr>
           <w:t>Mở nguồn</w:t>
         </w:r>
@@ -9675,14 +10530,14 @@
           <w:ilvl w:val="0"/>
           <w:numId w:val="15"/>
         </w:numPr>
-        <w:spacing w:after="160" w:line="280" w:lineRule="auto"/>
+        <w:spacing w:after="80" w:line="259" w:lineRule="auto"/>
       </w:pPr>
       <w:r>
         <w:rPr>
           <w:rFonts w:ascii="Calibri" w:hAnsi="Calibri" w:eastAsia="Calibri"/>
           <w:b/>
           <w:color w:val="202124"/>
-          <w:sz w:val="21"/>
+          <w:sz w:val="20"/>
         </w:rPr>
         <w:t>Beyond Objects: Contextual Synthetic Data Generation, CVPR 2026</w:t>
       </w:r>
@@ -9690,7 +10545,7 @@
         <w:rPr>
           <w:rFonts w:ascii="Calibri" w:hAnsi="Calibri" w:eastAsia="Calibri"/>
           <w:color w:val="202124"/>
-          <w:sz w:val="21"/>
+          <w:sz w:val="20"/>
         </w:rPr>
         <w:t xml:space="preserve"> - Class-agnostic context/pose conditioning cho fine-grained synthetic data. </w:t>
       </w:r>
@@ -9700,6 +10555,8 @@
             <w:rFonts w:ascii="Calibri" w:hAnsi="Calibri" w:eastAsia="Calibri"/>
             <w:color w:val="2E74B5"/>
             <w:u w:val="single"/>
+            <w:sz w:val="20"/>
+            <w:szCs w:val="20"/>
           </w:rPr>
           <w:t>Mở nguồn</w:t>
         </w:r>
@@ -9713,14 +10570,14 @@
           <w:ilvl w:val="0"/>
           <w:numId w:val="15"/>
         </w:numPr>
-        <w:spacing w:after="160" w:line="280" w:lineRule="auto"/>
+        <w:spacing w:after="80" w:line="259" w:lineRule="auto"/>
       </w:pPr>
       <w:r>
         <w:rPr>
           <w:rFonts w:ascii="Calibri" w:hAnsi="Calibri" w:eastAsia="Calibri"/>
           <w:b/>
           <w:color w:val="202124"/>
-          <w:sz w:val="21"/>
+          <w:sz w:val="20"/>
         </w:rPr>
         <w:t>Adversarial Auto-Augment with Label Preservation, NeurIPS 2022</w:t>
       </w:r>
@@ -9728,7 +10585,7 @@
         <w:rPr>
           <w:rFonts w:ascii="Calibri" w:hAnsi="Calibri" w:eastAsia="Calibri"/>
           <w:color w:val="202124"/>
-          <w:sz w:val="21"/>
+          <w:sz w:val="20"/>
         </w:rPr>
         <w:t xml:space="preserve"> - Nguồn phương trình hard-positive và label-preserving constraint cho LP-A3 A0. </w:t>
       </w:r>
@@ -9738,6 +10595,8 @@
             <w:rFonts w:ascii="Calibri" w:hAnsi="Calibri" w:eastAsia="Calibri"/>
             <w:color w:val="2E74B5"/>
             <w:u w:val="single"/>
+            <w:sz w:val="20"/>
+            <w:szCs w:val="20"/>
           </w:rPr>
           <w:t>Mở nguồn</w:t>
         </w:r>
@@ -9751,14 +10610,14 @@
           <w:ilvl w:val="0"/>
           <w:numId w:val="15"/>
         </w:numPr>
-        <w:spacing w:after="160" w:line="280" w:lineRule="auto"/>
+        <w:spacing w:after="80" w:line="259" w:lineRule="auto"/>
       </w:pPr>
       <w:r>
         <w:rPr>
           <w:rFonts w:ascii="Calibri" w:hAnsi="Calibri" w:eastAsia="Calibri"/>
           <w:b/>
           <w:color w:val="202124"/>
-          <w:sz w:val="21"/>
+          <w:sz w:val="20"/>
         </w:rPr>
         <w:t>LP-A3 official reference repository</w:t>
       </w:r>
@@ -9766,7 +10625,7 @@
         <w:rPr>
           <w:rFonts w:ascii="Calibri" w:hAnsi="Calibri" w:eastAsia="Calibri"/>
           <w:color w:val="202124"/>
-          <w:sz w:val="21"/>
+          <w:sz w:val="20"/>
         </w:rPr>
         <w:t xml:space="preserve"> - Pin commit 7059ca393b5cdfa04cf3304bb86c4c79712adfa3; không thấy license nên không copy/import code. </w:t>
       </w:r>
@@ -9776,6 +10635,8 @@
             <w:rFonts w:ascii="Calibri" w:hAnsi="Calibri" w:eastAsia="Calibri"/>
             <w:color w:val="2E74B5"/>
             <w:u w:val="single"/>
+            <w:sz w:val="20"/>
+            <w:szCs w:val="20"/>
           </w:rPr>
           <w:t>Mở nguồn</w:t>
         </w:r>
@@ -9789,14 +10650,14 @@
           <w:ilvl w:val="0"/>
           <w:numId w:val="15"/>
         </w:numPr>
-        <w:spacing w:after="160" w:line="280" w:lineRule="auto"/>
+        <w:spacing w:after="80" w:line="259" w:lineRule="auto"/>
       </w:pPr>
       <w:r>
         <w:rPr>
           <w:rFonts w:ascii="Calibri" w:hAnsi="Calibri" w:eastAsia="Calibri"/>
           <w:b/>
           <w:color w:val="202124"/>
-          <w:sz w:val="21"/>
+          <w:sz w:val="20"/>
         </w:rPr>
         <w:t>Natural Synthetic Anomalies for Self-Supervised Anomaly Detection and Localization, ECCV 2022</w:t>
       </w:r>
@@ -9804,7 +10665,7 @@
         <w:rPr>
           <w:rFonts w:ascii="Calibri" w:hAnsi="Calibri" w:eastAsia="Calibri"/>
           <w:color w:val="202124"/>
-          <w:sz w:val="21"/>
+          <w:sz w:val="20"/>
         </w:rPr>
         <w:t xml:space="preserve"> - Nguồn Poisson synthetic geometry; TRKH adaptation độc lập đã bị loại ở A0. </w:t>
       </w:r>
@@ -9814,6 +10675,8 @@
             <w:rFonts w:ascii="Calibri" w:hAnsi="Calibri" w:eastAsia="Calibri"/>
             <w:color w:val="2E74B5"/>
             <w:u w:val="single"/>
+            <w:sz w:val="20"/>
+            <w:szCs w:val="20"/>
           </w:rPr>
           <w:t>Mở nguồn</w:t>
         </w:r>
@@ -9827,14 +10690,14 @@
           <w:ilvl w:val="0"/>
           <w:numId w:val="15"/>
         </w:numPr>
-        <w:spacing w:after="160" w:line="280" w:lineRule="auto"/>
+        <w:spacing w:after="80" w:line="259" w:lineRule="auto"/>
       </w:pPr>
       <w:r>
         <w:rPr>
           <w:rFonts w:ascii="Calibri" w:hAnsi="Calibri" w:eastAsia="Calibri"/>
           <w:b/>
           <w:color w:val="202124"/>
-          <w:sz w:val="21"/>
+          <w:sz w:val="20"/>
         </w:rPr>
         <w:t>Implicit Semantic Data Augmentation, NeurIPS 2019</w:t>
       </w:r>
@@ -9842,7 +10705,7 @@
         <w:rPr>
           <w:rFonts w:ascii="Calibri" w:hAnsi="Calibri" w:eastAsia="Calibri"/>
           <w:color w:val="202124"/>
-          <w:sz w:val="21"/>
+          <w:sz w:val="20"/>
         </w:rPr>
         <w:t xml:space="preserve"> - Nguồn phương trình covariance feature-space và robust CE của ISDA. </w:t>
       </w:r>
@@ -9852,6 +10715,8 @@
             <w:rFonts w:ascii="Calibri" w:hAnsi="Calibri" w:eastAsia="Calibri"/>
             <w:color w:val="2E74B5"/>
             <w:u w:val="single"/>
+            <w:sz w:val="20"/>
+            <w:szCs w:val="20"/>
           </w:rPr>
           <w:t>Mở nguồn</w:t>
         </w:r>
@@ -9865,14 +10730,14 @@
           <w:ilvl w:val="0"/>
           <w:numId w:val="15"/>
         </w:numPr>
-        <w:spacing w:after="160" w:line="280" w:lineRule="auto"/>
+        <w:spacing w:after="80" w:line="259" w:lineRule="auto"/>
       </w:pPr>
       <w:r>
         <w:rPr>
           <w:rFonts w:ascii="Calibri" w:hAnsi="Calibri" w:eastAsia="Calibri"/>
           <w:b/>
           <w:color w:val="202124"/>
-          <w:sz w:val="21"/>
+          <w:sz w:val="20"/>
         </w:rPr>
         <w:t>MetaSAug: Meta Semantic Augmentation for Long-Tailed Visual Recognition, CVPR 2021</w:t>
       </w:r>
@@ -9880,7 +10745,7 @@
         <w:rPr>
           <w:rFonts w:ascii="Calibri" w:hAnsi="Calibri" w:eastAsia="Calibri"/>
           <w:color w:val="202124"/>
-          <w:sz w:val="21"/>
+          <w:sz w:val="20"/>
         </w:rPr>
         <w:t xml:space="preserve"> - Nguồn balanced meta objective cho semantic augmentation. </w:t>
       </w:r>
@@ -9890,6 +10755,8 @@
             <w:rFonts w:ascii="Calibri" w:hAnsi="Calibri" w:eastAsia="Calibri"/>
             <w:color w:val="2E74B5"/>
             <w:u w:val="single"/>
+            <w:sz w:val="20"/>
+            <w:szCs w:val="20"/>
           </w:rPr>
           <w:t>Mở nguồn</w:t>
         </w:r>
@@ -9903,14 +10770,14 @@
           <w:ilvl w:val="0"/>
           <w:numId w:val="15"/>
         </w:numPr>
-        <w:spacing w:after="160" w:line="280" w:lineRule="auto"/>
+        <w:spacing w:after="80" w:line="259" w:lineRule="auto"/>
       </w:pPr>
       <w:r>
         <w:rPr>
           <w:rFonts w:ascii="Calibri" w:hAnsi="Calibri" w:eastAsia="Calibri"/>
           <w:b/>
           <w:color w:val="202124"/>
-          <w:sz w:val="21"/>
+          <w:sz w:val="20"/>
         </w:rPr>
         <w:t>LearnableISDA, IEEE Transactions on Image Processing 2024</w:t>
       </w:r>
@@ -9918,7 +10785,7 @@
         <w:rPr>
           <w:rFonts w:ascii="Calibri" w:hAnsi="Calibri" w:eastAsia="Calibri"/>
           <w:color w:val="202124"/>
-          <w:sz w:val="21"/>
+          <w:sz w:val="20"/>
         </w:rPr>
         <w:t xml:space="preserve"> - Nguồn sample-wise learnable covariance/scale; repository chỉ dùng để pin provenance. </w:t>
       </w:r>
@@ -9928,6 +10795,8 @@
             <w:rFonts w:ascii="Calibri" w:hAnsi="Calibri" w:eastAsia="Calibri"/>
             <w:color w:val="2E74B5"/>
             <w:u w:val="single"/>
+            <w:sz w:val="20"/>
+            <w:szCs w:val="20"/>
           </w:rPr>
           <w:t>Mở nguồn</w:t>
         </w:r>
@@ -9941,14 +10810,14 @@
           <w:ilvl w:val="0"/>
           <w:numId w:val="15"/>
         </w:numPr>
-        <w:spacing w:after="160" w:line="280" w:lineRule="auto"/>
+        <w:spacing w:after="80" w:line="259" w:lineRule="auto"/>
       </w:pPr>
       <w:r>
         <w:rPr>
           <w:rFonts w:ascii="Calibri" w:hAnsi="Calibri" w:eastAsia="Calibri"/>
           <w:b/>
           <w:color w:val="202124"/>
-          <w:sz w:val="21"/>
+          <w:sz w:val="20"/>
         </w:rPr>
         <w:t>Learning Imbalanced Data With Vision Transformers, CVPR 2023</w:t>
       </w:r>
@@ -9956,7 +10825,7 @@
         <w:rPr>
           <w:rFonts w:ascii="Calibri" w:hAnsi="Calibri" w:eastAsia="Calibri"/>
           <w:color w:val="202124"/>
-          <w:sz w:val="21"/>
+          <w:sz w:val="20"/>
         </w:rPr>
         <w:t xml:space="preserve"> - Nguồn lý thuyết và thực nghiệm cho Balanced BCE trên ViT train-from-scratch. </w:t>
       </w:r>
@@ -9966,6 +10835,8 @@
             <w:rFonts w:ascii="Calibri" w:hAnsi="Calibri" w:eastAsia="Calibri"/>
             <w:color w:val="2E74B5"/>
             <w:u w:val="single"/>
+            <w:sz w:val="20"/>
+            <w:szCs w:val="20"/>
           </w:rPr>
           <w:t>Mở nguồn</w:t>
         </w:r>
@@ -9979,14 +10850,14 @@
           <w:ilvl w:val="0"/>
           <w:numId w:val="15"/>
         </w:numPr>
-        <w:spacing w:after="160" w:line="280" w:lineRule="auto"/>
+        <w:spacing w:after="80" w:line="259" w:lineRule="auto"/>
       </w:pPr>
       <w:r>
         <w:rPr>
           <w:rFonts w:ascii="Calibri" w:hAnsi="Calibri" w:eastAsia="Calibri"/>
           <w:b/>
           <w:color w:val="202124"/>
-          <w:sz w:val="21"/>
+          <w:sz w:val="20"/>
         </w:rPr>
         <w:t>LiVT official repository</w:t>
       </w:r>
@@ -9994,7 +10865,7 @@
         <w:rPr>
           <w:rFonts w:ascii="Calibri" w:hAnsi="Calibri" w:eastAsia="Calibri"/>
           <w:color w:val="202124"/>
-          <w:sz w:val="21"/>
+          <w:sz w:val="20"/>
         </w:rPr>
         <w:t xml:space="preserve"> - Nguồn MIT cho công thức log(pi)-log(1-pi) và one-hot BCE; phải pin revision trước A0. </w:t>
       </w:r>
@@ -10004,6 +10875,8 @@
             <w:rFonts w:ascii="Calibri" w:hAnsi="Calibri" w:eastAsia="Calibri"/>
             <w:color w:val="2E74B5"/>
             <w:u w:val="single"/>
+            <w:sz w:val="20"/>
+            <w:szCs w:val="20"/>
           </w:rPr>
           <w:t>Mở nguồn</w:t>
         </w:r>
@@ -10017,14 +10890,14 @@
           <w:ilvl w:val="0"/>
           <w:numId w:val="15"/>
         </w:numPr>
-        <w:spacing w:after="160" w:line="280" w:lineRule="auto"/>
+        <w:spacing w:after="80" w:line="259" w:lineRule="auto"/>
       </w:pPr>
       <w:r>
         <w:rPr>
           <w:rFonts w:ascii="Calibri" w:hAnsi="Calibri" w:eastAsia="Calibri"/>
           <w:b/>
           <w:color w:val="202124"/>
-          <w:sz w:val="21"/>
+          <w:sz w:val="20"/>
         </w:rPr>
         <w:t>Context-aware Attentional Pooling, AAAI 2021</w:t>
       </w:r>
@@ -10032,7 +10905,7 @@
         <w:rPr>
           <w:rFonts w:ascii="Calibri" w:hAnsi="Calibri" w:eastAsia="Calibri"/>
           <w:color w:val="202124"/>
-          <w:sz w:val="21"/>
+          <w:sz w:val="20"/>
         </w:rPr>
         <w:t xml:space="preserve"> - Nguồn phương trình pixel context, 27 integral regions, region attention, LSTM và residual-less NetVLAD cho CAP A0. </w:t>
       </w:r>
@@ -10042,6 +10915,8 @@
             <w:rFonts w:ascii="Calibri" w:hAnsi="Calibri" w:eastAsia="Calibri"/>
             <w:color w:val="2E74B5"/>
             <w:u w:val="single"/>
+            <w:sz w:val="20"/>
+            <w:szCs w:val="20"/>
           </w:rPr>
           <w:t>Mở nguồn</w:t>
         </w:r>
@@ -10055,14 +10930,14 @@
           <w:ilvl w:val="0"/>
           <w:numId w:val="15"/>
         </w:numPr>
-        <w:spacing w:after="160" w:line="280" w:lineRule="auto"/>
+        <w:spacing w:after="80" w:line="259" w:lineRule="auto"/>
       </w:pPr>
       <w:r>
         <w:rPr>
           <w:rFonts w:ascii="Calibri" w:hAnsi="Calibri" w:eastAsia="Calibri"/>
           <w:b/>
           <w:color w:val="202124"/>
-          <w:sz w:val="21"/>
+          <w:sz w:val="20"/>
         </w:rPr>
         <w:t>CAP official repository</w:t>
       </w:r>
@@ -10070,7 +10945,7 @@
         <w:rPr>
           <w:rFonts w:ascii="Calibri" w:hAnsi="Calibri" w:eastAsia="Calibri"/>
           <w:color w:val="202124"/>
-          <w:sz w:val="21"/>
+          <w:sz w:val="20"/>
         </w:rPr>
         <w:t xml:space="preserve"> - Nguồn MIT được pin tại commit cae53050af583c2b3fa38081c0abc227199e7dc1; TRKH dùng implementation PyTorch độc lập. </w:t>
       </w:r>
@@ -10080,6 +10955,8 @@
             <w:rFonts w:ascii="Calibri" w:hAnsi="Calibri" w:eastAsia="Calibri"/>
             <w:color w:val="2E74B5"/>
             <w:u w:val="single"/>
+            <w:sz w:val="20"/>
+            <w:szCs w:val="20"/>
           </w:rPr>
           <w:t>Mở nguồn</w:t>
         </w:r>
@@ -10093,14 +10970,134 @@
           <w:ilvl w:val="0"/>
           <w:numId w:val="15"/>
         </w:numPr>
-        <w:spacing w:after="160" w:line="280" w:lineRule="auto"/>
+        <w:spacing w:after="80" w:line="259" w:lineRule="auto"/>
       </w:pPr>
       <w:r>
         <w:rPr>
           <w:rFonts w:ascii="Calibri" w:hAnsi="Calibri" w:eastAsia="Calibri"/>
           <w:b/>
           <w:color w:val="202124"/>
-          <w:sz w:val="21"/>
+          <w:sz w:val="20"/>
+        </w:rPr>
+        <w:t>I2-HOFI, International Journal of Computer Vision 2024</w:t>
+      </w:r>
+      <w:r>
+        <w:rPr>
+          <w:rFonts w:ascii="Calibri" w:hAnsi="Calibri" w:eastAsia="Calibri"/>
+          <w:color w:val="202124"/>
+          <w:sz w:val="20"/>
+        </w:rPr>
+        <w:t xml:space="preserve"> - CNN-GNN high-order region interaction; screened no-run vì overlap và resource/inference gap. </w:t>
+      </w:r>
+      <w:hyperlink r:id="rId29">
+        <w:r>
+          <w:rPr>
+            <w:rFonts w:ascii="Calibri" w:hAnsi="Calibri" w:eastAsia="Calibri"/>
+            <w:color w:val="2E74B5"/>
+            <w:u w:val="single"/>
+            <w:sz w:val="20"/>
+            <w:szCs w:val="20"/>
+          </w:rPr>
+          <w:t>Mở nguồn</w:t>
+        </w:r>
+      </w:hyperlink>
+    </w:p>
+    <w:p>
+      <w:pPr>
+        <w:keepLines/>
+        <w:widowControl/>
+        <w:numPr>
+          <w:ilvl w:val="0"/>
+          <w:numId w:val="15"/>
+        </w:numPr>
+        <w:spacing w:after="80" w:line="259" w:lineRule="auto"/>
+      </w:pPr>
+      <w:r>
+        <w:rPr>
+          <w:rFonts w:ascii="Calibri" w:hAnsi="Calibri" w:eastAsia="Calibri"/>
+          <w:b/>
+          <w:color w:val="202124"/>
+          <w:sz w:val="20"/>
+        </w:rPr>
+        <w:t>Feature Magnitude Regularization, 2024</w:t>
+      </w:r>
+      <w:r>
+        <w:rPr>
+          <w:rFonts w:ascii="Calibri" w:hAnsi="Calibri" w:eastAsia="Calibri"/>
+          <w:color w:val="202124"/>
+          <w:sz w:val="20"/>
+        </w:rPr>
+        <w:t xml:space="preserve"> - Low-data pretrained-feature regularization; motivating bias không khớp scratch TRKH. </w:t>
+      </w:r>
+      <w:hyperlink r:id="rId30">
+        <w:r>
+          <w:rPr>
+            <w:rFonts w:ascii="Calibri" w:hAnsi="Calibri" w:eastAsia="Calibri"/>
+            <w:color w:val="2E74B5"/>
+            <w:u w:val="single"/>
+            <w:sz w:val="20"/>
+            <w:szCs w:val="20"/>
+          </w:rPr>
+          <w:t>Mở nguồn</w:t>
+        </w:r>
+      </w:hyperlink>
+    </w:p>
+    <w:p>
+      <w:pPr>
+        <w:keepLines/>
+        <w:widowControl/>
+        <w:numPr>
+          <w:ilvl w:val="0"/>
+          <w:numId w:val="15"/>
+        </w:numPr>
+        <w:spacing w:after="80" w:line="259" w:lineRule="auto"/>
+      </w:pPr>
+      <w:r>
+        <w:rPr>
+          <w:rFonts w:ascii="Calibri" w:hAnsi="Calibri" w:eastAsia="Calibri"/>
+          <w:b/>
+          <w:color w:val="202124"/>
+          <w:sz w:val="20"/>
+        </w:rPr>
+        <w:t>AD-Net: Extract More from Less, BMVC 2024</w:t>
+      </w:r>
+      <w:r>
+        <w:rPr>
+          <w:rFonts w:ascii="Calibri" w:hAnsi="Calibri" w:eastAsia="Calibri"/>
+          <w:color w:val="202124"/>
+          <w:sz w:val="20"/>
+        </w:rPr>
+        <w:t xml:space="preserve"> - Augmentation và self-distillation cho low-data; screened no-run vì overlap. </w:t>
+      </w:r>
+      <w:hyperlink r:id="rId31">
+        <w:r>
+          <w:rPr>
+            <w:rFonts w:ascii="Calibri" w:hAnsi="Calibri" w:eastAsia="Calibri"/>
+            <w:color w:val="2E74B5"/>
+            <w:u w:val="single"/>
+            <w:sz w:val="20"/>
+            <w:szCs w:val="20"/>
+          </w:rPr>
+          <w:t>Mở nguồn</w:t>
+        </w:r>
+      </w:hyperlink>
+    </w:p>
+    <w:p>
+      <w:pPr>
+        <w:keepLines/>
+        <w:widowControl/>
+        <w:numPr>
+          <w:ilvl w:val="0"/>
+          <w:numId w:val="15"/>
+        </w:numPr>
+        <w:spacing w:after="80" w:line="259" w:lineRule="auto"/>
+      </w:pPr>
+      <w:r>
+        <w:rPr>
+          <w:rFonts w:ascii="Calibri" w:hAnsi="Calibri" w:eastAsia="Calibri"/>
+          <w:b/>
+          <w:color w:val="202124"/>
+          <w:sz w:val="20"/>
         </w:rPr>
         <w:t>Do We Train on Test Data? Purging CIFAR of Near-Duplicates</w:t>
       </w:r>
@@ -10108,16 +11105,18 @@
         <w:rPr>
           <w:rFonts w:ascii="Calibri" w:hAnsi="Calibri" w:eastAsia="Calibri"/>
           <w:color w:val="202124"/>
-          <w:sz w:val="21"/>
+          <w:sz w:val="20"/>
         </w:rPr>
         <w:t xml:space="preserve"> - Đối chiếu nguy cơ near-duplicate cross-split; TRKH dùng quy tắc whole-corpus invalidation nghiêm ngặt hơn. </w:t>
       </w:r>
-      <w:hyperlink r:id="rId29">
+      <w:hyperlink r:id="rId32">
         <w:r>
           <w:rPr>
             <w:rFonts w:ascii="Calibri" w:hAnsi="Calibri" w:eastAsia="Calibri"/>
             <w:color w:val="2E74B5"/>
             <w:u w:val="single"/>
+            <w:sz w:val="20"/>
+            <w:szCs w:val="20"/>
           </w:rPr>
           <w:t>Mở nguồn</w:t>
         </w:r>

</xml_diff>

<commit_message>
Screen post-CAP successors and fix report rendering
</commit_message>
<xml_diff>
--- a/docs/TRKH_5CLASS_RESEARCH_PROCESS_STATUS.docx
+++ b/docs/TRKH_5CLASS_RESEARCH_PROCESS_STATUS.docx
@@ -75,7 +75,7 @@
           <w:color w:val="202124"/>
           <w:sz w:val="21"/>
         </w:rPr>
-        <w:t>2026-07-24 | Revision 14</w:t>
+        <w:t>2026-07-25 | Revision 15</w:t>
       </w:r>
     </w:p>
     <w:p>
@@ -97,7 +97,7 @@
           <w:color w:val="202124"/>
           <w:sz w:val="21"/>
         </w:rPr>
-        <w:t>Đang nghiên cứu - CAP A0 đã reject sau formal/replay/XAI</w:t>
+        <w:t>Đang nghiên cứu - post-CAP no-run screen đã hoàn tất</w:t>
       </w:r>
     </w:p>
     <w:p>
@@ -340,7 +340,7 @@
                 <w:color w:val="5F6368"/>
                 <w:sz w:val="16"/>
               </w:rPr>
-              <w:t>CAP A0 FORMAL</w:t>
+              <w:t>POST-CAP SCREEN</w:t>
             </w:r>
           </w:p>
           <w:p>
@@ -354,7 +354,7 @@
                 <w:color w:val="1F4D78"/>
                 <w:sz w:val="28"/>
               </w:rPr>
-              <w:t>Rejected</w:t>
+              <w:t>6 no-run</w:t>
             </w:r>
           </w:p>
           <w:p>
@@ -367,7 +367,7 @@
                 <w:color w:val="202124"/>
                 <w:sz w:val="17"/>
               </w:rPr>
-              <w:t>AUROC 0,560111; 5 FP sửa, 14 TP hỏng; replay exact</w:t>
+              <w:t>Không ứng viên nào qua đủ mechanism, surface và deployment gate</w:t>
             </w:r>
           </w:p>
         </w:tc>
@@ -412,7 +412,7 @@
           <w:color w:val="202124"/>
           <w:sz w:val="21"/>
         </w:rPr>
-        <w:t>Giữ nguyên keeper và file lệnh full-train tốt nhất. CAP rerun cùng lock đã hoàn tất formal, fresh-process replay và review đủ 20 hàng XAI nhưng bị loại: AUROC 0,560111, chỉ sửa 5 restricted FP và phá 14 TP lớp 1; macro/class-1 F1 giảm còn 0,937491/0,805643. Replay exact nhưng causal controls và manual XAI đều không hỗ trợ cơ chế. Không integration, validation/test, probe/full train hoặc command update. Mọi classifier đề xuất vẫn scratch-only; pretrained baseline chỉ được dùng đối chiếu.</w:t>
+        <w:t>Giữ nguyên keeper và file lệnh full-train tốt nhất. CAP rerun cùng lock đã hoàn tất formal, fresh-process replay và review đủ 20 hàng XAI nhưng bị loại: AUROC 0,560111, chỉ sửa 5 restricted FP và phá 14 TP lớp 1; macro/class-1 F1 giảm còn 0,937491/0,805643. Sau CAP, sáu họ Self-ONN, learnable morphology, PointNet/Deep Sets, DeepEMD/optimal transport, normalizing flow và hierarchical material recognition đều bị screen no-run vì trùng cơ chế, thiếu tín hiệu bề mặt lớp-điều-kiện hoặc không phù hợp deployment. Không integration, validation/test, probe/full train hoặc command update. Mọi classifier đề xuất vẫn scratch-only; pretrained baseline chỉ được dùng đối chiếu.</w:t>
       </w:r>
     </w:p>
     <w:p>
@@ -439,6 +439,19 @@
           <w:sz w:val="22"/>
         </w:rPr>
         <w:t>Mô hình hiện tại đã vượt AIDT trên phép đối chiếu final-test đã ánh xạ ở macro-F1, nhưng chưa vượt các teacher pretrained mạnh và chưa giải quyết ranh giới lớp 1. Các giao thức pretrained, scratch, validation và test không được trộn thành một bảng xếp hạng duy nhất nếu chưa chuẩn hóa điều kiện.</w:t>
+      </w:r>
+    </w:p>
+    <w:p>
+      <w:pPr>
+        <w:widowControl/>
+      </w:pPr>
+      <w:r>
+        <w:rPr>
+          <w:rFonts w:ascii="Calibri" w:hAnsi="Calibri" w:eastAsia="Calibri"/>
+          <w:color w:val="202124"/>
+          <w:sz w:val="22"/>
+        </w:rPr>
+        <w:t>No-run screen ngày 25-07 là một cổng tiết kiệm tài nguyên, không phải metric mới. Successor kế tiếp phải tạo evidence map hoặc score cục bộ riêng cho 1-vs-0, 1-vs-2 và 1-vs-4 trên phần bề mặt hợp lệ trong bbox; phải thắng keeper margin và causal derangement ở cả giữ TP lớp 1 lẫn loại restricted FP trên source-held train folds; đồng thời có đường standard-op để đo latency mean/p95, throughput, VRAM, ONNX và TensorRT.</w:t>
       </w:r>
     </w:p>
     <w:p>
@@ -8851,6 +8864,24 @@
     </w:p>
     <w:p>
       <w:pPr>
+        <w:widowControl/>
+        <w:numPr>
+          <w:ilvl w:val="0"/>
+          <w:numId w:val="14"/>
+        </w:numPr>
+        <w:spacing w:after="160" w:line="280" w:lineRule="auto"/>
+      </w:pPr>
+      <w:r>
+        <w:rPr>
+          <w:rFonts w:ascii="Calibri" w:hAnsi="Calibri" w:eastAsia="Calibri"/>
+          <w:color w:val="202124"/>
+          <w:sz w:val="22"/>
+        </w:rPr>
+        <w:t>Không mở lại sáu họ post-CAP bằng cách chỉ đổi width, order, pooling, solver hoặc head; tài liệu no-run ngày 25-07 là cổng resource-value bắt buộc.</w:t>
+      </w:r>
+    </w:p>
+    <w:p>
+      <w:pPr>
         <w:pStyle w:val="Heading1"/>
         <w:keepNext/>
       </w:pPr>
@@ -10134,6 +10165,65 @@
           </w:p>
         </w:tc>
       </w:tr>
+      <w:tr>
+        <w:trPr>
+          <w:cantSplit/>
+        </w:trPr>
+        <w:tc>
+          <w:tcPr>
+            <w:tcW w:type="dxa" w:w="4050"/>
+            <w:tcMar>
+              <w:top w:w="80" w:type="dxa"/>
+              <w:start w:w="120" w:type="dxa"/>
+              <w:bottom w:w="80" w:type="dxa"/>
+              <w:end w:w="120" w:type="dxa"/>
+            </w:tcMar>
+            <w:vAlign w:val="center"/>
+          </w:tcPr>
+          <w:p>
+            <w:pPr>
+              <w:widowControl/>
+              <w:spacing w:after="0" w:line="247" w:lineRule="auto"/>
+              <w:jc w:val="left"/>
+            </w:pPr>
+            <w:r>
+              <w:rPr>
+                <w:rFonts w:ascii="Calibri" w:hAnsi="Calibri" w:eastAsia="Calibri"/>
+                <w:color w:val="202124"/>
+                <w:sz w:val="18"/>
+              </w:rPr>
+              <w:t>docs/TRKH_5CLASS_POST_CAP_SUCCESSOR_NO_RUN_SCREEN_20260725.md</w:t>
+            </w:r>
+          </w:p>
+        </w:tc>
+        <w:tc>
+          <w:tcPr>
+            <w:tcW w:type="dxa" w:w="5310"/>
+            <w:tcMar>
+              <w:top w:w="80" w:type="dxa"/>
+              <w:start w:w="120" w:type="dxa"/>
+              <w:bottom w:w="80" w:type="dxa"/>
+              <w:end w:w="120" w:type="dxa"/>
+            </w:tcMar>
+            <w:vAlign w:val="center"/>
+          </w:tcPr>
+          <w:p>
+            <w:pPr>
+              <w:widowControl/>
+              <w:spacing w:after="0" w:line="247" w:lineRule="auto"/>
+              <w:jc w:val="left"/>
+            </w:pPr>
+            <w:r>
+              <w:rPr>
+                <w:rFonts w:ascii="Calibri" w:hAnsi="Calibri" w:eastAsia="Calibri"/>
+                <w:color w:val="202124"/>
+                <w:sz w:val="18"/>
+              </w:rPr>
+              <w:t>Primary-source screen cho sáu họ successor, local-overlap map, deployment caveat và điều kiện mở lại.</w:t>
+            </w:r>
+          </w:p>
+        </w:tc>
+      </w:tr>
     </w:tbl>
     <w:p>
       <w:pPr>
@@ -10150,7 +10240,7 @@
           <w:color w:val="202124"/>
           <w:sz w:val="22"/>
         </w:rPr>
-        <w:t>Revision 1-3: tạo báo cáo tái lập, full train 30e/JPEG-DL và synthetic policy. Revision 4-5: SaSPA F0/F1 bị loại ở fidelity/XAI. Revision 6-8: LP-A3, NSA và RN-LISDA bị loại bằng causal controls/replay. Revision 9-10: Bal-BCE bị loại vì tạo 57 restricted FP. Revision 11-12: khóa CAP prospectively rồi cố định engine/auditor/replay/XAI trước metric. Revision 13: sửa audit-only lỗi eval-LSTM XAI sau zero-artifact formal. Revision 14: same-lock CAP formal/replay/manual review hoàn tất; candidate AUROC 0,560111, net -9, macro/class-1 F1 0,937491/0,805643, replay numeric error 0,0 nhưng manual XAI fail. CAP đóng negative-but-reusable; sửa OOF hardlink và memory-vs-inference claims. Closure QA pass focused/full 28/28 và 1925/1925, Word 14/14, accessibility 0/0/0, retention 860 directory/51 manifest/220 original vắng tại SHA 99d1835a...04a636. Keeper/lệnh tốt nhất vẫn không đổi.</w:t>
+        <w:t>Revision 1-3 dựng báo cáo tái lập, full-train/JPEG-DL và synthetic policy. Revision 4-10 đóng SaSPA, LP-A3, NSA, RN-LISDA và Bal-BCE bằng fidelity, causal control, replay và TP/FP gates. Revision 11-14 khóa CAP trước metric, sửa audit-only eval-LSTM, rồi hoàn tất same-lock formal/replay/manual review; CAP đóng negative-but-reusable và retention pass tại SHA 99d1835a...04a636. Revision 15 screen no-run sáu họ successor; không code/GPU/validation/test, keeper và lệnh tốt nhất không đổi. A/B known-good cô lập regression OOXML hyperlink gây Word/LibreOffice repagination vô hạn; hai test cấu trúc và full suite đạt 1927/1927, toàn bộ trang render được, accessibility 0/0/0.</w:t>
       </w:r>
     </w:p>
     <w:p>
@@ -10170,14 +10260,14 @@
           <w:ilvl w:val="0"/>
           <w:numId w:val="15"/>
         </w:numPr>
-        <w:spacing w:after="80" w:line="259" w:lineRule="auto" w:before="160"/>
+        <w:spacing w:after="160" w:line="280" w:lineRule="auto"/>
       </w:pPr>
       <w:r>
         <w:rPr>
           <w:rFonts w:ascii="Calibri" w:hAnsi="Calibri" w:eastAsia="Calibri"/>
           <w:b/>
           <w:color w:val="202124"/>
-          <w:sz w:val="20"/>
+          <w:sz w:val="21"/>
         </w:rPr>
         <w:t>JPEG Inspired Deep Learning, ICLR 2025</w:t>
       </w:r>
@@ -10185,7 +10275,7 @@
         <w:rPr>
           <w:rFonts w:ascii="Calibri" w:hAnsi="Calibri" w:eastAsia="Calibri"/>
           <w:color w:val="202124"/>
-          <w:sz w:val="20"/>
+          <w:sz w:val="21"/>
         </w:rPr>
         <w:t xml:space="preserve"> - Paper chính cho candidate input quantization. </w:t>
       </w:r>
@@ -10195,8 +10285,6 @@
             <w:rFonts w:ascii="Calibri" w:hAnsi="Calibri" w:eastAsia="Calibri"/>
             <w:color w:val="2E74B5"/>
             <w:u w:val="single"/>
-            <w:sz w:val="20"/>
-            <w:szCs w:val="20"/>
           </w:rPr>
           <w:t>Mở nguồn</w:t>
         </w:r>
@@ -10210,14 +10298,14 @@
           <w:ilvl w:val="0"/>
           <w:numId w:val="15"/>
         </w:numPr>
-        <w:spacing w:after="80" w:line="259" w:lineRule="auto"/>
+        <w:spacing w:after="160" w:line="280" w:lineRule="auto"/>
       </w:pPr>
       <w:r>
         <w:rPr>
           <w:rFonts w:ascii="Calibri" w:hAnsi="Calibri" w:eastAsia="Calibri"/>
           <w:b/>
           <w:color w:val="202124"/>
-          <w:sz w:val="20"/>
+          <w:sz w:val="21"/>
         </w:rPr>
         <w:t>JPEG-Inspired-DL official repository</w:t>
       </w:r>
@@ -10225,7 +10313,7 @@
         <w:rPr>
           <w:rFonts w:ascii="Calibri" w:hAnsi="Calibri" w:eastAsia="Calibri"/>
           <w:color w:val="202124"/>
-          <w:sz w:val="20"/>
+          <w:sz w:val="21"/>
         </w:rPr>
         <w:t xml:space="preserve"> - Repository tham chiếu, pin commit 894fdb651326b7c68f13967886fea2ee04831b3a. </w:t>
       </w:r>
@@ -10235,8 +10323,6 @@
             <w:rFonts w:ascii="Calibri" w:hAnsi="Calibri" w:eastAsia="Calibri"/>
             <w:color w:val="2E74B5"/>
             <w:u w:val="single"/>
-            <w:sz w:val="20"/>
-            <w:szCs w:val="20"/>
           </w:rPr>
           <w:t>Mở nguồn</w:t>
         </w:r>
@@ -10250,14 +10336,14 @@
           <w:ilvl w:val="0"/>
           <w:numId w:val="15"/>
         </w:numPr>
-        <w:spacing w:after="80" w:line="259" w:lineRule="auto"/>
+        <w:spacing w:after="160" w:line="280" w:lineRule="auto"/>
       </w:pPr>
       <w:r>
         <w:rPr>
           <w:rFonts w:ascii="Calibri" w:hAnsi="Calibri" w:eastAsia="Calibri"/>
           <w:b/>
           <w:color w:val="202124"/>
-          <w:sz w:val="20"/>
+          <w:sz w:val="21"/>
         </w:rPr>
         <w:t>Plant Pathology 2020 - first-place solution discussion</w:t>
       </w:r>
@@ -10265,7 +10351,7 @@
         <w:rPr>
           <w:rFonts w:ascii="Calibri" w:hAnsi="Calibri" w:eastAsia="Calibri"/>
           <w:color w:val="202124"/>
-          <w:sz w:val="20"/>
+          <w:sz w:val="21"/>
         </w:rPr>
         <w:t xml:space="preserve"> - OOF repair, 5-fold, non-square input và augmentation. </w:t>
       </w:r>
@@ -10275,8 +10361,6 @@
             <w:rFonts w:ascii="Calibri" w:hAnsi="Calibri" w:eastAsia="Calibri"/>
             <w:color w:val="2E74B5"/>
             <w:u w:val="single"/>
-            <w:sz w:val="20"/>
-            <w:szCs w:val="20"/>
           </w:rPr>
           <w:t>Mở nguồn</w:t>
         </w:r>
@@ -10290,14 +10374,14 @@
           <w:ilvl w:val="0"/>
           <w:numId w:val="15"/>
         </w:numPr>
-        <w:spacing w:after="80" w:line="259" w:lineRule="auto"/>
+        <w:spacing w:after="160" w:line="280" w:lineRule="auto"/>
       </w:pPr>
       <w:r>
         <w:rPr>
           <w:rFonts w:ascii="Calibri" w:hAnsi="Calibri" w:eastAsia="Calibri"/>
           <w:b/>
           <w:color w:val="202124"/>
-          <w:sz w:val="20"/>
+          <w:sz w:val="21"/>
         </w:rPr>
         <w:t>Plant Pathology 2021 - first-place solution discussion</w:t>
       </w:r>
@@ -10305,7 +10389,7 @@
         <w:rPr>
           <w:rFonts w:ascii="Calibri" w:hAnsi="Calibri" w:eastAsia="Calibri"/>
           <w:color w:val="202124"/>
-          <w:sz w:val="20"/>
+          <w:sz w:val="21"/>
         </w:rPr>
         <w:t xml:space="preserve"> - Fold ensemble, soft-label rule, multi-label mixing, balancing và TTA. </w:t>
       </w:r>
@@ -10315,8 +10399,6 @@
             <w:rFonts w:ascii="Calibri" w:hAnsi="Calibri" w:eastAsia="Calibri"/>
             <w:color w:val="2E74B5"/>
             <w:u w:val="single"/>
-            <w:sz w:val="20"/>
-            <w:szCs w:val="20"/>
           </w:rPr>
           <w:t>Mở nguồn</w:t>
         </w:r>
@@ -10330,14 +10412,14 @@
           <w:ilvl w:val="0"/>
           <w:numId w:val="15"/>
         </w:numPr>
-        <w:spacing w:after="80" w:line="259" w:lineRule="auto"/>
+        <w:spacing w:after="160" w:line="280" w:lineRule="auto"/>
       </w:pPr>
       <w:r>
         <w:rPr>
           <w:rFonts w:ascii="Calibri" w:hAnsi="Calibri" w:eastAsia="Calibri"/>
           <w:b/>
           <w:color w:val="202124"/>
-          <w:sz w:val="20"/>
+          <w:sz w:val="21"/>
         </w:rPr>
         <w:t>Cassava Leaf Disease Classification - second-place solution</w:t>
       </w:r>
@@ -10345,7 +10427,7 @@
         <w:rPr>
           <w:rFonts w:ascii="Calibri" w:hAnsi="Calibri" w:eastAsia="Calibri"/>
           <w:color w:val="202124"/>
-          <w:sz w:val="20"/>
+          <w:sz w:val="21"/>
         </w:rPr>
         <w:t xml:space="preserve"> - Ví dụ domain-pretrained CropNet và protocol khác scratch. </w:t>
       </w:r>
@@ -10355,8 +10437,6 @@
             <w:rFonts w:ascii="Calibri" w:hAnsi="Calibri" w:eastAsia="Calibri"/>
             <w:color w:val="2E74B5"/>
             <w:u w:val="single"/>
-            <w:sz w:val="20"/>
-            <w:szCs w:val="20"/>
           </w:rPr>
           <w:t>Mở nguồn</w:t>
         </w:r>
@@ -10370,14 +10450,14 @@
           <w:ilvl w:val="0"/>
           <w:numId w:val="15"/>
         </w:numPr>
-        <w:spacing w:after="80" w:line="259" w:lineRule="auto"/>
+        <w:spacing w:after="160" w:line="280" w:lineRule="auto"/>
       </w:pPr>
       <w:r>
         <w:rPr>
           <w:rFonts w:ascii="Calibri" w:hAnsi="Calibri" w:eastAsia="Calibri"/>
           <w:b/>
           <w:color w:val="202124"/>
-          <w:sz w:val="20"/>
+          <w:sz w:val="21"/>
         </w:rPr>
         <w:t>iCassava 2019 Fine-Grained Visual Categorization Challenge</w:t>
       </w:r>
@@ -10385,7 +10465,7 @@
         <w:rPr>
           <w:rFonts w:ascii="Calibri" w:hAnsi="Calibri" w:eastAsia="Calibri"/>
           <w:color w:val="202124"/>
-          <w:sz w:val="20"/>
+          <w:sz w:val="21"/>
         </w:rPr>
         <w:t xml:space="preserve"> - Đặc điểm ảnh nông nghiệp hiện trường và unlabeled-data setting. </w:t>
       </w:r>
@@ -10395,8 +10475,6 @@
             <w:rFonts w:ascii="Calibri" w:hAnsi="Calibri" w:eastAsia="Calibri"/>
             <w:color w:val="2E74B5"/>
             <w:u w:val="single"/>
-            <w:sz w:val="20"/>
-            <w:szCs w:val="20"/>
           </w:rPr>
           <w:t>Mở nguồn</w:t>
         </w:r>
@@ -10410,14 +10488,14 @@
           <w:ilvl w:val="0"/>
           <w:numId w:val="15"/>
         </w:numPr>
-        <w:spacing w:after="80" w:line="259" w:lineRule="auto"/>
+        <w:spacing w:after="160" w:line="280" w:lineRule="auto"/>
       </w:pPr>
       <w:r>
         <w:rPr>
           <w:rFonts w:ascii="Calibri" w:hAnsi="Calibri" w:eastAsia="Calibri"/>
           <w:b/>
           <w:color w:val="202124"/>
-          <w:sz w:val="20"/>
+          <w:sz w:val="21"/>
         </w:rPr>
         <w:t>SaSPA: Structure and Subject Preserving Augmentation, NeurIPS 2024</w:t>
       </w:r>
@@ -10425,7 +10503,7 @@
         <w:rPr>
           <w:rFonts w:ascii="Calibri" w:hAnsi="Calibri" w:eastAsia="Calibri"/>
           <w:color w:val="202124"/>
-          <w:sz w:val="20"/>
+          <w:sz w:val="21"/>
         </w:rPr>
         <w:t xml:space="preserve"> - Ứng viên synthetic fine-grained chính. </w:t>
       </w:r>
@@ -10435,8 +10513,6 @@
             <w:rFonts w:ascii="Calibri" w:hAnsi="Calibri" w:eastAsia="Calibri"/>
             <w:color w:val="2E74B5"/>
             <w:u w:val="single"/>
-            <w:sz w:val="20"/>
-            <w:szCs w:val="20"/>
           </w:rPr>
           <w:t>Mở nguồn</w:t>
         </w:r>
@@ -10450,14 +10526,14 @@
           <w:ilvl w:val="0"/>
           <w:numId w:val="15"/>
         </w:numPr>
-        <w:spacing w:after="80" w:line="259" w:lineRule="auto"/>
+        <w:spacing w:after="160" w:line="280" w:lineRule="auto"/>
       </w:pPr>
       <w:r>
         <w:rPr>
           <w:rFonts w:ascii="Calibri" w:hAnsi="Calibri" w:eastAsia="Calibri"/>
           <w:b/>
           <w:color w:val="202124"/>
-          <w:sz w:val="20"/>
+          <w:sz w:val="21"/>
         </w:rPr>
         <w:t>SaSPA-Aug official repository</w:t>
       </w:r>
@@ -10465,7 +10541,7 @@
         <w:rPr>
           <w:rFonts w:ascii="Calibri" w:hAnsi="Calibri" w:eastAsia="Calibri"/>
           <w:color w:val="202124"/>
-          <w:sz w:val="20"/>
+          <w:sz w:val="21"/>
         </w:rPr>
         <w:t xml:space="preserve"> - Implementation tham khảo cho feasibility/provenance. </w:t>
       </w:r>
@@ -10475,8 +10551,6 @@
             <w:rFonts w:ascii="Calibri" w:hAnsi="Calibri" w:eastAsia="Calibri"/>
             <w:color w:val="2E74B5"/>
             <w:u w:val="single"/>
-            <w:sz w:val="20"/>
-            <w:szCs w:val="20"/>
           </w:rPr>
           <w:t>Mở nguồn</w:t>
         </w:r>
@@ -10490,14 +10564,14 @@
           <w:ilvl w:val="0"/>
           <w:numId w:val="15"/>
         </w:numPr>
-        <w:spacing w:after="80" w:line="259" w:lineRule="auto"/>
+        <w:spacing w:after="160" w:line="280" w:lineRule="auto"/>
       </w:pPr>
       <w:r>
         <w:rPr>
           <w:rFonts w:ascii="Calibri" w:hAnsi="Calibri" w:eastAsia="Calibri"/>
           <w:b/>
           <w:color w:val="202124"/>
-          <w:sz w:val="20"/>
+          <w:sz w:val="21"/>
         </w:rPr>
         <w:t>DiffuseMix, CVPR 2024</w:t>
       </w:r>
@@ -10505,7 +10579,7 @@
         <w:rPr>
           <w:rFonts w:ascii="Calibri" w:hAnsi="Calibri" w:eastAsia="Calibri"/>
           <w:color w:val="202124"/>
-          <w:sz w:val="20"/>
+          <w:sz w:val="21"/>
         </w:rPr>
         <w:t xml:space="preserve"> - Diffusion augmentation hướng label-preserving. </w:t>
       </w:r>
@@ -10515,8 +10589,6 @@
             <w:rFonts w:ascii="Calibri" w:hAnsi="Calibri" w:eastAsia="Calibri"/>
             <w:color w:val="2E74B5"/>
             <w:u w:val="single"/>
-            <w:sz w:val="20"/>
-            <w:szCs w:val="20"/>
           </w:rPr>
           <w:t>Mở nguồn</w:t>
         </w:r>
@@ -10530,14 +10602,14 @@
           <w:ilvl w:val="0"/>
           <w:numId w:val="15"/>
         </w:numPr>
-        <w:spacing w:after="80" w:line="259" w:lineRule="auto"/>
+        <w:spacing w:after="160" w:line="280" w:lineRule="auto"/>
       </w:pPr>
       <w:r>
         <w:rPr>
           <w:rFonts w:ascii="Calibri" w:hAnsi="Calibri" w:eastAsia="Calibri"/>
           <w:b/>
           <w:color w:val="202124"/>
-          <w:sz w:val="20"/>
+          <w:sz w:val="21"/>
         </w:rPr>
         <w:t>Beyond Objects: Contextual Synthetic Data Generation, CVPR 2026</w:t>
       </w:r>
@@ -10545,7 +10617,7 @@
         <w:rPr>
           <w:rFonts w:ascii="Calibri" w:hAnsi="Calibri" w:eastAsia="Calibri"/>
           <w:color w:val="202124"/>
-          <w:sz w:val="20"/>
+          <w:sz w:val="21"/>
         </w:rPr>
         <w:t xml:space="preserve"> - Class-agnostic context/pose conditioning cho fine-grained synthetic data. </w:t>
       </w:r>
@@ -10555,8 +10627,6 @@
             <w:rFonts w:ascii="Calibri" w:hAnsi="Calibri" w:eastAsia="Calibri"/>
             <w:color w:val="2E74B5"/>
             <w:u w:val="single"/>
-            <w:sz w:val="20"/>
-            <w:szCs w:val="20"/>
           </w:rPr>
           <w:t>Mở nguồn</w:t>
         </w:r>
@@ -10570,14 +10640,14 @@
           <w:ilvl w:val="0"/>
           <w:numId w:val="15"/>
         </w:numPr>
-        <w:spacing w:after="80" w:line="259" w:lineRule="auto"/>
+        <w:spacing w:after="160" w:line="280" w:lineRule="auto"/>
       </w:pPr>
       <w:r>
         <w:rPr>
           <w:rFonts w:ascii="Calibri" w:hAnsi="Calibri" w:eastAsia="Calibri"/>
           <w:b/>
           <w:color w:val="202124"/>
-          <w:sz w:val="20"/>
+          <w:sz w:val="21"/>
         </w:rPr>
         <w:t>Adversarial Auto-Augment with Label Preservation, NeurIPS 2022</w:t>
       </w:r>
@@ -10585,7 +10655,7 @@
         <w:rPr>
           <w:rFonts w:ascii="Calibri" w:hAnsi="Calibri" w:eastAsia="Calibri"/>
           <w:color w:val="202124"/>
-          <w:sz w:val="20"/>
+          <w:sz w:val="21"/>
         </w:rPr>
         <w:t xml:space="preserve"> - Nguồn phương trình hard-positive và label-preserving constraint cho LP-A3 A0. </w:t>
       </w:r>
@@ -10595,8 +10665,6 @@
             <w:rFonts w:ascii="Calibri" w:hAnsi="Calibri" w:eastAsia="Calibri"/>
             <w:color w:val="2E74B5"/>
             <w:u w:val="single"/>
-            <w:sz w:val="20"/>
-            <w:szCs w:val="20"/>
           </w:rPr>
           <w:t>Mở nguồn</w:t>
         </w:r>
@@ -10610,14 +10678,14 @@
           <w:ilvl w:val="0"/>
           <w:numId w:val="15"/>
         </w:numPr>
-        <w:spacing w:after="80" w:line="259" w:lineRule="auto"/>
+        <w:spacing w:after="160" w:line="280" w:lineRule="auto"/>
       </w:pPr>
       <w:r>
         <w:rPr>
           <w:rFonts w:ascii="Calibri" w:hAnsi="Calibri" w:eastAsia="Calibri"/>
           <w:b/>
           <w:color w:val="202124"/>
-          <w:sz w:val="20"/>
+          <w:sz w:val="21"/>
         </w:rPr>
         <w:t>LP-A3 official reference repository</w:t>
       </w:r>
@@ -10625,7 +10693,7 @@
         <w:rPr>
           <w:rFonts w:ascii="Calibri" w:hAnsi="Calibri" w:eastAsia="Calibri"/>
           <w:color w:val="202124"/>
-          <w:sz w:val="20"/>
+          <w:sz w:val="21"/>
         </w:rPr>
         <w:t xml:space="preserve"> - Pin commit 7059ca393b5cdfa04cf3304bb86c4c79712adfa3; không thấy license nên không copy/import code. </w:t>
       </w:r>
@@ -10635,8 +10703,6 @@
             <w:rFonts w:ascii="Calibri" w:hAnsi="Calibri" w:eastAsia="Calibri"/>
             <w:color w:val="2E74B5"/>
             <w:u w:val="single"/>
-            <w:sz w:val="20"/>
-            <w:szCs w:val="20"/>
           </w:rPr>
           <w:t>Mở nguồn</w:t>
         </w:r>
@@ -10650,14 +10716,14 @@
           <w:ilvl w:val="0"/>
           <w:numId w:val="15"/>
         </w:numPr>
-        <w:spacing w:after="80" w:line="259" w:lineRule="auto"/>
+        <w:spacing w:after="160" w:line="280" w:lineRule="auto"/>
       </w:pPr>
       <w:r>
         <w:rPr>
           <w:rFonts w:ascii="Calibri" w:hAnsi="Calibri" w:eastAsia="Calibri"/>
           <w:b/>
           <w:color w:val="202124"/>
-          <w:sz w:val="20"/>
+          <w:sz w:val="21"/>
         </w:rPr>
         <w:t>Natural Synthetic Anomalies for Self-Supervised Anomaly Detection and Localization, ECCV 2022</w:t>
       </w:r>
@@ -10665,7 +10731,7 @@
         <w:rPr>
           <w:rFonts w:ascii="Calibri" w:hAnsi="Calibri" w:eastAsia="Calibri"/>
           <w:color w:val="202124"/>
-          <w:sz w:val="20"/>
+          <w:sz w:val="21"/>
         </w:rPr>
         <w:t xml:space="preserve"> - Nguồn Poisson synthetic geometry; TRKH adaptation độc lập đã bị loại ở A0. </w:t>
       </w:r>
@@ -10675,8 +10741,6 @@
             <w:rFonts w:ascii="Calibri" w:hAnsi="Calibri" w:eastAsia="Calibri"/>
             <w:color w:val="2E74B5"/>
             <w:u w:val="single"/>
-            <w:sz w:val="20"/>
-            <w:szCs w:val="20"/>
           </w:rPr>
           <w:t>Mở nguồn</w:t>
         </w:r>
@@ -10690,14 +10754,14 @@
           <w:ilvl w:val="0"/>
           <w:numId w:val="15"/>
         </w:numPr>
-        <w:spacing w:after="80" w:line="259" w:lineRule="auto"/>
+        <w:spacing w:after="160" w:line="280" w:lineRule="auto"/>
       </w:pPr>
       <w:r>
         <w:rPr>
           <w:rFonts w:ascii="Calibri" w:hAnsi="Calibri" w:eastAsia="Calibri"/>
           <w:b/>
           <w:color w:val="202124"/>
-          <w:sz w:val="20"/>
+          <w:sz w:val="21"/>
         </w:rPr>
         <w:t>Implicit Semantic Data Augmentation, NeurIPS 2019</w:t>
       </w:r>
@@ -10705,7 +10769,7 @@
         <w:rPr>
           <w:rFonts w:ascii="Calibri" w:hAnsi="Calibri" w:eastAsia="Calibri"/>
           <w:color w:val="202124"/>
-          <w:sz w:val="20"/>
+          <w:sz w:val="21"/>
         </w:rPr>
         <w:t xml:space="preserve"> - Nguồn phương trình covariance feature-space và robust CE của ISDA. </w:t>
       </w:r>
@@ -10715,8 +10779,6 @@
             <w:rFonts w:ascii="Calibri" w:hAnsi="Calibri" w:eastAsia="Calibri"/>
             <w:color w:val="2E74B5"/>
             <w:u w:val="single"/>
-            <w:sz w:val="20"/>
-            <w:szCs w:val="20"/>
           </w:rPr>
           <w:t>Mở nguồn</w:t>
         </w:r>
@@ -10730,14 +10792,14 @@
           <w:ilvl w:val="0"/>
           <w:numId w:val="15"/>
         </w:numPr>
-        <w:spacing w:after="80" w:line="259" w:lineRule="auto"/>
+        <w:spacing w:after="160" w:line="280" w:lineRule="auto"/>
       </w:pPr>
       <w:r>
         <w:rPr>
           <w:rFonts w:ascii="Calibri" w:hAnsi="Calibri" w:eastAsia="Calibri"/>
           <w:b/>
           <w:color w:val="202124"/>
-          <w:sz w:val="20"/>
+          <w:sz w:val="21"/>
         </w:rPr>
         <w:t>MetaSAug: Meta Semantic Augmentation for Long-Tailed Visual Recognition, CVPR 2021</w:t>
       </w:r>
@@ -10745,7 +10807,7 @@
         <w:rPr>
           <w:rFonts w:ascii="Calibri" w:hAnsi="Calibri" w:eastAsia="Calibri"/>
           <w:color w:val="202124"/>
-          <w:sz w:val="20"/>
+          <w:sz w:val="21"/>
         </w:rPr>
         <w:t xml:space="preserve"> - Nguồn balanced meta objective cho semantic augmentation. </w:t>
       </w:r>
@@ -10755,8 +10817,6 @@
             <w:rFonts w:ascii="Calibri" w:hAnsi="Calibri" w:eastAsia="Calibri"/>
             <w:color w:val="2E74B5"/>
             <w:u w:val="single"/>
-            <w:sz w:val="20"/>
-            <w:szCs w:val="20"/>
           </w:rPr>
           <w:t>Mở nguồn</w:t>
         </w:r>
@@ -10770,14 +10830,14 @@
           <w:ilvl w:val="0"/>
           <w:numId w:val="15"/>
         </w:numPr>
-        <w:spacing w:after="80" w:line="259" w:lineRule="auto"/>
+        <w:spacing w:after="160" w:line="280" w:lineRule="auto"/>
       </w:pPr>
       <w:r>
         <w:rPr>
           <w:rFonts w:ascii="Calibri" w:hAnsi="Calibri" w:eastAsia="Calibri"/>
           <w:b/>
           <w:color w:val="202124"/>
-          <w:sz w:val="20"/>
+          <w:sz w:val="21"/>
         </w:rPr>
         <w:t>LearnableISDA, IEEE Transactions on Image Processing 2024</w:t>
       </w:r>
@@ -10785,7 +10845,7 @@
         <w:rPr>
           <w:rFonts w:ascii="Calibri" w:hAnsi="Calibri" w:eastAsia="Calibri"/>
           <w:color w:val="202124"/>
-          <w:sz w:val="20"/>
+          <w:sz w:val="21"/>
         </w:rPr>
         <w:t xml:space="preserve"> - Nguồn sample-wise learnable covariance/scale; repository chỉ dùng để pin provenance. </w:t>
       </w:r>
@@ -10795,8 +10855,6 @@
             <w:rFonts w:ascii="Calibri" w:hAnsi="Calibri" w:eastAsia="Calibri"/>
             <w:color w:val="2E74B5"/>
             <w:u w:val="single"/>
-            <w:sz w:val="20"/>
-            <w:szCs w:val="20"/>
           </w:rPr>
           <w:t>Mở nguồn</w:t>
         </w:r>
@@ -10810,14 +10868,14 @@
           <w:ilvl w:val="0"/>
           <w:numId w:val="15"/>
         </w:numPr>
-        <w:spacing w:after="80" w:line="259" w:lineRule="auto"/>
+        <w:spacing w:after="160" w:line="280" w:lineRule="auto"/>
       </w:pPr>
       <w:r>
         <w:rPr>
           <w:rFonts w:ascii="Calibri" w:hAnsi="Calibri" w:eastAsia="Calibri"/>
           <w:b/>
           <w:color w:val="202124"/>
-          <w:sz w:val="20"/>
+          <w:sz w:val="21"/>
         </w:rPr>
         <w:t>Learning Imbalanced Data With Vision Transformers, CVPR 2023</w:t>
       </w:r>
@@ -10825,7 +10883,7 @@
         <w:rPr>
           <w:rFonts w:ascii="Calibri" w:hAnsi="Calibri" w:eastAsia="Calibri"/>
           <w:color w:val="202124"/>
-          <w:sz w:val="20"/>
+          <w:sz w:val="21"/>
         </w:rPr>
         <w:t xml:space="preserve"> - Nguồn lý thuyết và thực nghiệm cho Balanced BCE trên ViT train-from-scratch. </w:t>
       </w:r>
@@ -10835,8 +10893,6 @@
             <w:rFonts w:ascii="Calibri" w:hAnsi="Calibri" w:eastAsia="Calibri"/>
             <w:color w:val="2E74B5"/>
             <w:u w:val="single"/>
-            <w:sz w:val="20"/>
-            <w:szCs w:val="20"/>
           </w:rPr>
           <w:t>Mở nguồn</w:t>
         </w:r>
@@ -10850,14 +10906,14 @@
           <w:ilvl w:val="0"/>
           <w:numId w:val="15"/>
         </w:numPr>
-        <w:spacing w:after="80" w:line="259" w:lineRule="auto"/>
+        <w:spacing w:after="160" w:line="280" w:lineRule="auto"/>
       </w:pPr>
       <w:r>
         <w:rPr>
           <w:rFonts w:ascii="Calibri" w:hAnsi="Calibri" w:eastAsia="Calibri"/>
           <w:b/>
           <w:color w:val="202124"/>
-          <w:sz w:val="20"/>
+          <w:sz w:val="21"/>
         </w:rPr>
         <w:t>LiVT official repository</w:t>
       </w:r>
@@ -10865,7 +10921,7 @@
         <w:rPr>
           <w:rFonts w:ascii="Calibri" w:hAnsi="Calibri" w:eastAsia="Calibri"/>
           <w:color w:val="202124"/>
-          <w:sz w:val="20"/>
+          <w:sz w:val="21"/>
         </w:rPr>
         <w:t xml:space="preserve"> - Nguồn MIT cho công thức log(pi)-log(1-pi) và one-hot BCE; phải pin revision trước A0. </w:t>
       </w:r>
@@ -10875,8 +10931,6 @@
             <w:rFonts w:ascii="Calibri" w:hAnsi="Calibri" w:eastAsia="Calibri"/>
             <w:color w:val="2E74B5"/>
             <w:u w:val="single"/>
-            <w:sz w:val="20"/>
-            <w:szCs w:val="20"/>
           </w:rPr>
           <w:t>Mở nguồn</w:t>
         </w:r>
@@ -10890,14 +10944,14 @@
           <w:ilvl w:val="0"/>
           <w:numId w:val="15"/>
         </w:numPr>
-        <w:spacing w:after="80" w:line="259" w:lineRule="auto"/>
+        <w:spacing w:after="160" w:line="280" w:lineRule="auto"/>
       </w:pPr>
       <w:r>
         <w:rPr>
           <w:rFonts w:ascii="Calibri" w:hAnsi="Calibri" w:eastAsia="Calibri"/>
           <w:b/>
           <w:color w:val="202124"/>
-          <w:sz w:val="20"/>
+          <w:sz w:val="21"/>
         </w:rPr>
         <w:t>Context-aware Attentional Pooling, AAAI 2021</w:t>
       </w:r>
@@ -10905,7 +10959,7 @@
         <w:rPr>
           <w:rFonts w:ascii="Calibri" w:hAnsi="Calibri" w:eastAsia="Calibri"/>
           <w:color w:val="202124"/>
-          <w:sz w:val="20"/>
+          <w:sz w:val="21"/>
         </w:rPr>
         <w:t xml:space="preserve"> - Nguồn phương trình pixel context, 27 integral regions, region attention, LSTM và residual-less NetVLAD cho CAP A0. </w:t>
       </w:r>
@@ -10915,8 +10969,6 @@
             <w:rFonts w:ascii="Calibri" w:hAnsi="Calibri" w:eastAsia="Calibri"/>
             <w:color w:val="2E74B5"/>
             <w:u w:val="single"/>
-            <w:sz w:val="20"/>
-            <w:szCs w:val="20"/>
           </w:rPr>
           <w:t>Mở nguồn</w:t>
         </w:r>
@@ -10930,14 +10982,14 @@
           <w:ilvl w:val="0"/>
           <w:numId w:val="15"/>
         </w:numPr>
-        <w:spacing w:after="80" w:line="259" w:lineRule="auto"/>
+        <w:spacing w:after="160" w:line="280" w:lineRule="auto"/>
       </w:pPr>
       <w:r>
         <w:rPr>
           <w:rFonts w:ascii="Calibri" w:hAnsi="Calibri" w:eastAsia="Calibri"/>
           <w:b/>
           <w:color w:val="202124"/>
-          <w:sz w:val="20"/>
+          <w:sz w:val="21"/>
         </w:rPr>
         <w:t>CAP official repository</w:t>
       </w:r>
@@ -10945,7 +10997,7 @@
         <w:rPr>
           <w:rFonts w:ascii="Calibri" w:hAnsi="Calibri" w:eastAsia="Calibri"/>
           <w:color w:val="202124"/>
-          <w:sz w:val="20"/>
+          <w:sz w:val="21"/>
         </w:rPr>
         <w:t xml:space="preserve"> - Nguồn MIT được pin tại commit cae53050af583c2b3fa38081c0abc227199e7dc1; TRKH dùng implementation PyTorch độc lập. </w:t>
       </w:r>
@@ -10955,8 +11007,6 @@
             <w:rFonts w:ascii="Calibri" w:hAnsi="Calibri" w:eastAsia="Calibri"/>
             <w:color w:val="2E74B5"/>
             <w:u w:val="single"/>
-            <w:sz w:val="20"/>
-            <w:szCs w:val="20"/>
           </w:rPr>
           <w:t>Mở nguồn</w:t>
         </w:r>
@@ -10970,14 +11020,14 @@
           <w:ilvl w:val="0"/>
           <w:numId w:val="15"/>
         </w:numPr>
-        <w:spacing w:after="80" w:line="259" w:lineRule="auto"/>
+        <w:spacing w:after="160" w:line="280" w:lineRule="auto"/>
       </w:pPr>
       <w:r>
         <w:rPr>
           <w:rFonts w:ascii="Calibri" w:hAnsi="Calibri" w:eastAsia="Calibri"/>
           <w:b/>
           <w:color w:val="202124"/>
-          <w:sz w:val="20"/>
+          <w:sz w:val="21"/>
         </w:rPr>
         <w:t>I2-HOFI, International Journal of Computer Vision 2024</w:t>
       </w:r>
@@ -10985,7 +11035,7 @@
         <w:rPr>
           <w:rFonts w:ascii="Calibri" w:hAnsi="Calibri" w:eastAsia="Calibri"/>
           <w:color w:val="202124"/>
-          <w:sz w:val="20"/>
+          <w:sz w:val="21"/>
         </w:rPr>
         <w:t xml:space="preserve"> - CNN-GNN high-order region interaction; screened no-run vì overlap và resource/inference gap. </w:t>
       </w:r>
@@ -10995,8 +11045,6 @@
             <w:rFonts w:ascii="Calibri" w:hAnsi="Calibri" w:eastAsia="Calibri"/>
             <w:color w:val="2E74B5"/>
             <w:u w:val="single"/>
-            <w:sz w:val="20"/>
-            <w:szCs w:val="20"/>
           </w:rPr>
           <w:t>Mở nguồn</w:t>
         </w:r>
@@ -11010,14 +11058,14 @@
           <w:ilvl w:val="0"/>
           <w:numId w:val="15"/>
         </w:numPr>
-        <w:spacing w:after="80" w:line="259" w:lineRule="auto"/>
+        <w:spacing w:after="160" w:line="280" w:lineRule="auto"/>
       </w:pPr>
       <w:r>
         <w:rPr>
           <w:rFonts w:ascii="Calibri" w:hAnsi="Calibri" w:eastAsia="Calibri"/>
           <w:b/>
           <w:color w:val="202124"/>
-          <w:sz w:val="20"/>
+          <w:sz w:val="21"/>
         </w:rPr>
         <w:t>Feature Magnitude Regularization, 2024</w:t>
       </w:r>
@@ -11025,7 +11073,7 @@
         <w:rPr>
           <w:rFonts w:ascii="Calibri" w:hAnsi="Calibri" w:eastAsia="Calibri"/>
           <w:color w:val="202124"/>
-          <w:sz w:val="20"/>
+          <w:sz w:val="21"/>
         </w:rPr>
         <w:t xml:space="preserve"> - Low-data pretrained-feature regularization; motivating bias không khớp scratch TRKH. </w:t>
       </w:r>
@@ -11035,8 +11083,6 @@
             <w:rFonts w:ascii="Calibri" w:hAnsi="Calibri" w:eastAsia="Calibri"/>
             <w:color w:val="2E74B5"/>
             <w:u w:val="single"/>
-            <w:sz w:val="20"/>
-            <w:szCs w:val="20"/>
           </w:rPr>
           <w:t>Mở nguồn</w:t>
         </w:r>
@@ -11050,14 +11096,14 @@
           <w:ilvl w:val="0"/>
           <w:numId w:val="15"/>
         </w:numPr>
-        <w:spacing w:after="80" w:line="259" w:lineRule="auto"/>
+        <w:spacing w:after="160" w:line="280" w:lineRule="auto"/>
       </w:pPr>
       <w:r>
         <w:rPr>
           <w:rFonts w:ascii="Calibri" w:hAnsi="Calibri" w:eastAsia="Calibri"/>
           <w:b/>
           <w:color w:val="202124"/>
-          <w:sz w:val="20"/>
+          <w:sz w:val="21"/>
         </w:rPr>
         <w:t>AD-Net: Extract More from Less, BMVC 2024</w:t>
       </w:r>
@@ -11065,7 +11111,7 @@
         <w:rPr>
           <w:rFonts w:ascii="Calibri" w:hAnsi="Calibri" w:eastAsia="Calibri"/>
           <w:color w:val="202124"/>
-          <w:sz w:val="20"/>
+          <w:sz w:val="21"/>
         </w:rPr>
         <w:t xml:space="preserve"> - Augmentation và self-distillation cho low-data; screened no-run vì overlap. </w:t>
       </w:r>
@@ -11075,8 +11121,6 @@
             <w:rFonts w:ascii="Calibri" w:hAnsi="Calibri" w:eastAsia="Calibri"/>
             <w:color w:val="2E74B5"/>
             <w:u w:val="single"/>
-            <w:sz w:val="20"/>
-            <w:szCs w:val="20"/>
           </w:rPr>
           <w:t>Mở nguồn</w:t>
         </w:r>
@@ -11090,14 +11134,242 @@
           <w:ilvl w:val="0"/>
           <w:numId w:val="15"/>
         </w:numPr>
-        <w:spacing w:after="80" w:line="259" w:lineRule="auto"/>
+        <w:spacing w:after="160" w:line="280" w:lineRule="auto"/>
       </w:pPr>
       <w:r>
         <w:rPr>
           <w:rFonts w:ascii="Calibri" w:hAnsi="Calibri" w:eastAsia="Calibri"/>
           <w:b/>
           <w:color w:val="202124"/>
-          <w:sz w:val="20"/>
+          <w:sz w:val="21"/>
+        </w:rPr>
+        <w:t>Self-Organized Operational Neural Networks for Severe Image Restoration</w:t>
+      </w:r>
+      <w:r>
+        <w:rPr>
+          <w:rFonts w:ascii="Calibri" w:hAnsi="Calibri" w:eastAsia="Calibri"/>
+          <w:color w:val="202124"/>
+          <w:sz w:val="21"/>
+        </w:rPr>
+        <w:t xml:space="preserve"> - Taylor-polynomial operational neurons; screen no-run vì evidence chính là restoration và overlap higher-order stem. </w:t>
+      </w:r>
+      <w:hyperlink r:id="rId32">
+        <w:r>
+          <w:rPr>
+            <w:rFonts w:ascii="Calibri" w:hAnsi="Calibri" w:eastAsia="Calibri"/>
+            <w:color w:val="2E74B5"/>
+            <w:u w:val="single"/>
+          </w:rPr>
+          <w:t>Mở nguồn</w:t>
+        </w:r>
+      </w:hyperlink>
+    </w:p>
+    <w:p>
+      <w:pPr>
+        <w:keepLines/>
+        <w:widowControl/>
+        <w:numPr>
+          <w:ilvl w:val="0"/>
+          <w:numId w:val="15"/>
+        </w:numPr>
+        <w:spacing w:after="160" w:line="280" w:lineRule="auto"/>
+      </w:pPr>
+      <w:r>
+        <w:rPr>
+          <w:rFonts w:ascii="Calibri" w:hAnsi="Calibri" w:eastAsia="Calibri"/>
+          <w:b/>
+          <w:color w:val="202124"/>
+          <w:sz w:val="21"/>
+        </w:rPr>
+        <w:t>Morphological Network: How Far Can We Go with Morphological Neurons?, BMVC 2022</w:t>
+      </w:r>
+      <w:r>
+        <w:rPr>
+          <w:rFonts w:ascii="Calibri" w:hAnsi="Calibri" w:eastAsia="Calibri"/>
+          <w:color w:val="202124"/>
+          <w:sz w:val="21"/>
+        </w:rPr>
+        <w:t xml:space="preserve"> - Learnable dilation/erosion; theory và experiment chính bị giới hạn ở whole-input 1D, chưa chứng minh surface selectivity cho TRKH. </w:t>
+      </w:r>
+      <w:hyperlink r:id="rId33">
+        <w:r>
+          <w:rPr>
+            <w:rFonts w:ascii="Calibri" w:hAnsi="Calibri" w:eastAsia="Calibri"/>
+            <w:color w:val="2E74B5"/>
+            <w:u w:val="single"/>
+          </w:rPr>
+          <w:t>Mở nguồn</w:t>
+        </w:r>
+      </w:hyperlink>
+    </w:p>
+    <w:p>
+      <w:pPr>
+        <w:keepLines/>
+        <w:widowControl/>
+        <w:numPr>
+          <w:ilvl w:val="0"/>
+          <w:numId w:val="15"/>
+        </w:numPr>
+        <w:spacing w:after="160" w:line="280" w:lineRule="auto"/>
+      </w:pPr>
+      <w:r>
+        <w:rPr>
+          <w:rFonts w:ascii="Calibri" w:hAnsi="Calibri" w:eastAsia="Calibri"/>
+          <w:b/>
+          <w:color w:val="202124"/>
+          <w:sz w:val="21"/>
+        </w:rPr>
+        <w:t>PointNet, CVPR 2017</w:t>
+      </w:r>
+      <w:r>
+        <w:rPr>
+          <w:rFonts w:ascii="Calibri" w:hAnsi="Calibri" w:eastAsia="Calibri"/>
+          <w:color w:val="202124"/>
+          <w:sz w:val="21"/>
+        </w:rPr>
+        <w:t xml:space="preserve"> - Permutation-invariant 3D point-set model; không khớp regular 2D fruit surface và overlap patch-set aggregation. </w:t>
+      </w:r>
+      <w:hyperlink r:id="rId34">
+        <w:r>
+          <w:rPr>
+            <w:rFonts w:ascii="Calibri" w:hAnsi="Calibri" w:eastAsia="Calibri"/>
+            <w:color w:val="2E74B5"/>
+            <w:u w:val="single"/>
+          </w:rPr>
+          <w:t>Mở nguồn</w:t>
+        </w:r>
+      </w:hyperlink>
+    </w:p>
+    <w:p>
+      <w:pPr>
+        <w:keepLines/>
+        <w:widowControl/>
+        <w:numPr>
+          <w:ilvl w:val="0"/>
+          <w:numId w:val="15"/>
+        </w:numPr>
+        <w:spacing w:after="160" w:line="280" w:lineRule="auto"/>
+      </w:pPr>
+      <w:r>
+        <w:rPr>
+          <w:rFonts w:ascii="Calibri" w:hAnsi="Calibri" w:eastAsia="Calibri"/>
+          <w:b/>
+          <w:color w:val="202124"/>
+          <w:sz w:val="21"/>
+        </w:rPr>
+        <w:t>DeepEMD, CVPR 2020</w:t>
+      </w:r>
+      <w:r>
+        <w:rPr>
+          <w:rFonts w:ascii="Calibri" w:hAnsi="Calibri" w:eastAsia="Calibri"/>
+          <w:color w:val="202124"/>
+          <w:sz w:val="21"/>
+        </w:rPr>
+        <w:t xml:space="preserve"> - Few-shot optimal patch matching; local DeepEMD/DN4/Sinkhorn neighborhood đã screen với patch-prototype closure. </w:t>
+      </w:r>
+      <w:hyperlink r:id="rId35">
+        <w:r>
+          <w:rPr>
+            <w:rFonts w:ascii="Calibri" w:hAnsi="Calibri" w:eastAsia="Calibri"/>
+            <w:color w:val="2E74B5"/>
+            <w:u w:val="single"/>
+          </w:rPr>
+          <w:t>Mở nguồn</w:t>
+        </w:r>
+      </w:hyperlink>
+    </w:p>
+    <w:p>
+      <w:pPr>
+        <w:keepLines/>
+        <w:widowControl/>
+        <w:numPr>
+          <w:ilvl w:val="0"/>
+          <w:numId w:val="15"/>
+        </w:numPr>
+        <w:spacing w:after="160" w:line="280" w:lineRule="auto"/>
+      </w:pPr>
+      <w:r>
+        <w:rPr>
+          <w:rFonts w:ascii="Calibri" w:hAnsi="Calibri" w:eastAsia="Calibri"/>
+          <w:b/>
+          <w:color w:val="202124"/>
+          <w:sz w:val="21"/>
+        </w:rPr>
+        <w:t>Why Normalizing Flows Fail to Detect Out-of-Distribution Data, NeurIPS 2020</w:t>
+      </w:r>
+      <w:r>
+        <w:rPr>
+          <w:rFonts w:ascii="Calibri" w:hAnsi="Calibri" w:eastAsia="Calibri"/>
+          <w:color w:val="202124"/>
+          <w:sz w:val="21"/>
+        </w:rPr>
+        <w:t xml:space="preserve"> - Flow likelihood có thể học local pixel correlation thay vì semantics; không mở lại density route đã fail. </w:t>
+      </w:r>
+      <w:hyperlink r:id="rId36">
+        <w:r>
+          <w:rPr>
+            <w:rFonts w:ascii="Calibri" w:hAnsi="Calibri" w:eastAsia="Calibri"/>
+            <w:color w:val="2E74B5"/>
+            <w:u w:val="single"/>
+          </w:rPr>
+          <w:t>Mở nguồn</w:t>
+        </w:r>
+      </w:hyperlink>
+    </w:p>
+    <w:p>
+      <w:pPr>
+        <w:keepLines/>
+        <w:widowControl/>
+        <w:numPr>
+          <w:ilvl w:val="0"/>
+          <w:numId w:val="15"/>
+        </w:numPr>
+        <w:spacing w:after="160" w:line="280" w:lineRule="auto"/>
+      </w:pPr>
+      <w:r>
+        <w:rPr>
+          <w:rFonts w:ascii="Calibri" w:hAnsi="Calibri" w:eastAsia="Calibri"/>
+          <w:b/>
+          <w:color w:val="202124"/>
+          <w:sz w:val="21"/>
+        </w:rPr>
+        <w:t>Hierarchical Material Recognition from Local Appearance, ICCV 2025</w:t>
+      </w:r>
+      <w:r>
+        <w:rPr>
+          <w:rFonts w:ascii="Calibri" w:hAnsi="Calibri" w:eastAsia="Calibri"/>
+          <w:color w:val="202124"/>
+          <w:sz w:val="21"/>
+        </w:rPr>
+        <w:t xml:space="preserve"> - Dựa trên taxonomy graph, depth và context không tồn tại tương đương trong TRKH; graph/context neighborhood đã đóng. </w:t>
+      </w:r>
+      <w:hyperlink r:id="rId37">
+        <w:r>
+          <w:rPr>
+            <w:rFonts w:ascii="Calibri" w:hAnsi="Calibri" w:eastAsia="Calibri"/>
+            <w:color w:val="2E74B5"/>
+            <w:u w:val="single"/>
+          </w:rPr>
+          <w:t>Mở nguồn</w:t>
+        </w:r>
+      </w:hyperlink>
+    </w:p>
+    <w:p>
+      <w:pPr>
+        <w:keepLines/>
+        <w:widowControl/>
+        <w:numPr>
+          <w:ilvl w:val="0"/>
+          <w:numId w:val="15"/>
+        </w:numPr>
+        <w:spacing w:after="160" w:line="280" w:lineRule="auto"/>
+      </w:pPr>
+      <w:r>
+        <w:rPr>
+          <w:rFonts w:ascii="Calibri" w:hAnsi="Calibri" w:eastAsia="Calibri"/>
+          <w:b/>
+          <w:color w:val="202124"/>
+          <w:sz w:val="21"/>
         </w:rPr>
         <w:t>Do We Train on Test Data? Purging CIFAR of Near-Duplicates</w:t>
       </w:r>
@@ -11105,18 +11377,16 @@
         <w:rPr>
           <w:rFonts w:ascii="Calibri" w:hAnsi="Calibri" w:eastAsia="Calibri"/>
           <w:color w:val="202124"/>
-          <w:sz w:val="20"/>
+          <w:sz w:val="21"/>
         </w:rPr>
         <w:t xml:space="preserve"> - Đối chiếu nguy cơ near-duplicate cross-split; TRKH dùng quy tắc whole-corpus invalidation nghiêm ngặt hơn. </w:t>
       </w:r>
-      <w:hyperlink r:id="rId32">
+      <w:hyperlink r:id="rId38">
         <w:r>
           <w:rPr>
             <w:rFonts w:ascii="Calibri" w:hAnsi="Calibri" w:eastAsia="Calibri"/>
             <w:color w:val="2E74B5"/>
             <w:u w:val="single"/>
-            <w:sz w:val="20"/>
-            <w:szCs w:val="20"/>
           </w:rPr>
           <w:t>Mở nguồn</w:t>
         </w:r>

</xml_diff>

<commit_message>
Lock CCR train-only surface information gate
</commit_message>
<xml_diff>
--- a/docs/TRKH_5CLASS_RESEARCH_PROCESS_STATUS.docx
+++ b/docs/TRKH_5CLASS_RESEARCH_PROCESS_STATUS.docx
@@ -75,7 +75,7 @@
           <w:color w:val="202124"/>
           <w:sz w:val="21"/>
         </w:rPr>
-        <w:t>2026-07-25 | Revision 15</w:t>
+        <w:t>2026-07-25 | Revision 16</w:t>
       </w:r>
     </w:p>
     <w:p>
@@ -97,7 +97,7 @@
           <w:color w:val="202124"/>
           <w:sz w:val="21"/>
         </w:rPr>
-        <w:t>Đang nghiên cứu - post-CAP no-run screen đã hoàn tất</w:t>
+        <w:t>Đang nghiên cứu - đã khóa prospective CCR train-only</w:t>
       </w:r>
     </w:p>
     <w:p>
@@ -340,7 +340,7 @@
                 <w:color w:val="5F6368"/>
                 <w:sz w:val="16"/>
               </w:rPr>
-              <w:t>POST-CAP SCREEN</w:t>
+              <w:t>CCR PROSPECTIVE LOCK</w:t>
             </w:r>
           </w:p>
           <w:p>
@@ -354,7 +354,7 @@
                 <w:color w:val="1F4D78"/>
                 <w:sz w:val="28"/>
               </w:rPr>
-              <w:t>6 no-run</w:t>
+              <w:t>763 train-only rows</w:t>
             </w:r>
           </w:p>
           <w:p>
@@ -367,7 +367,7 @@
                 <w:color w:val="202124"/>
                 <w:sz w:val="17"/>
               </w:rPr>
-              <w:t>Không ứng viên nào qua đủ mechanism, surface và deployment gate</w:t>
+              <w:t>Chưa có candidate metric; model, validation/test và lệnh tốt nhất không đổi</w:t>
             </w:r>
           </w:p>
         </w:tc>
@@ -452,6 +452,19 @@
           <w:sz w:val="22"/>
         </w:rPr>
         <w:t>No-run screen ngày 25-07 là một cổng tiết kiệm tài nguyên, không phải metric mới. Successor kế tiếp phải tạo evidence map hoặc score cục bộ riêng cho 1-vs-0, 1-vs-2 và 1-vs-4 trên phần bề mặt hợp lệ trong bbox; phải thắng keeper margin và causal derangement ở cả giữ TP lớp 1 lẫn loại restricted FP trên source-held train folds; đồng thời có đường standard-op để đo latency mean/p95, throughput, VRAM, ONNX và TensorRT.</w:t>
+      </w:r>
+    </w:p>
+    <w:p>
+      <w:pPr>
+        <w:widowControl/>
+      </w:pPr>
+      <w:r>
+        <w:rPr>
+          <w:rFonts w:ascii="Calibri" w:hAnsi="Calibri" w:eastAsia="Calibri"/>
+          <w:color w:val="202124"/>
+          <w:sz w:val="22"/>
+        </w:rPr>
+        <w:t>Revision 16 đã khóa Cross Colour Ratio (CCR) như một information gate train-only có thể bác bỏ, không phải model promotion. Cohort gồm 763 hàng/735 ảnh unique trong năm source-held folds; candidate phải thắng keeper margin, plain colour-ratio cùng kích thước, trained spatial dephase, same-weight dephase và seed repeat trên gate đồng thời về TP/FP/pairwise/replay. Giả định vật lý của CCR có thể bị phá bởi tone curve JPEG, auto-WB, clipping, bề mặt ướt hoặc phản xạ gương, vì vậy chưa có metric hay quyền integration/full train.</w:t>
       </w:r>
     </w:p>
     <w:p>
@@ -8649,6 +8662,92 @@
           </w:p>
         </w:tc>
       </w:tr>
+      <w:tr>
+        <w:trPr>
+          <w:cantSplit/>
+        </w:trPr>
+        <w:tc>
+          <w:tcPr>
+            <w:tcW w:type="dxa" w:w="2550"/>
+            <w:tcMar>
+              <w:top w:w="80" w:type="dxa"/>
+              <w:start w:w="120" w:type="dxa"/>
+              <w:bottom w:w="80" w:type="dxa"/>
+              <w:end w:w="120" w:type="dxa"/>
+            </w:tcMar>
+            <w:vAlign w:val="center"/>
+          </w:tcPr>
+          <w:p>
+            <w:pPr>
+              <w:widowControl/>
+              <w:spacing w:after="0" w:line="247" w:lineRule="auto"/>
+              <w:jc w:val="left"/>
+            </w:pPr>
+            <w:r>
+              <w:rPr>
+                <w:rFonts w:ascii="Calibri" w:hAnsi="Calibri" w:eastAsia="Calibri"/>
+                <w:color w:val="202124"/>
+                <w:sz w:val="18"/>
+              </w:rPr>
+              <w:t>CCR prospective information gate</w:t>
+            </w:r>
+          </w:p>
+        </w:tc>
+        <w:tc>
+          <w:tcPr>
+            <w:tcW w:type="dxa" w:w="3810"/>
+            <w:tcMar>
+              <w:top w:w="80" w:type="dxa"/>
+              <w:start w:w="120" w:type="dxa"/>
+              <w:bottom w:w="80" w:type="dxa"/>
+              <w:end w:w="120" w:type="dxa"/>
+            </w:tcMar>
+            <w:vAlign w:val="center"/>
+          </w:tcPr>
+          <w:p>
+            <w:pPr>
+              <w:widowControl/>
+              <w:spacing w:after="0" w:line="247" w:lineRule="auto"/>
+              <w:jc w:val="left"/>
+            </w:pPr>
+            <w:r>
+              <w:rPr>
+                <w:rFonts w:ascii="Calibri" w:hAnsi="Calibri" w:eastAsia="Calibri"/>
+                <w:color w:val="202124"/>
+                <w:sz w:val="18"/>
+              </w:rPr>
+              <w:t>Khóa 763 train-only rows/735 ảnh, năm source-held folds, plain colour-ratio và hai spatial-dephase controls trước candidate code.</w:t>
+            </w:r>
+          </w:p>
+        </w:tc>
+        <w:tc>
+          <w:tcPr>
+            <w:tcW w:type="dxa" w:w="3000"/>
+            <w:tcMar>
+              <w:top w:w="80" w:type="dxa"/>
+              <w:start w:w="120" w:type="dxa"/>
+              <w:bottom w:w="80" w:type="dxa"/>
+              <w:end w:w="120" w:type="dxa"/>
+            </w:tcMar>
+            <w:vAlign w:val="center"/>
+          </w:tcPr>
+          <w:p>
+            <w:pPr>
+              <w:widowControl/>
+              <w:spacing w:after="0" w:line="247" w:lineRule="auto"/>
+              <w:jc w:val="left"/>
+            </w:pPr>
+            <w:r>
+              <w:rPr>
+                <w:rFonts w:ascii="Calibri" w:hAnsi="Calibri" w:eastAsia="Calibri"/>
+                <w:color w:val="202124"/>
+                <w:sz w:val="18"/>
+              </w:rPr>
+              <w:t>Giới hạn A0 20 phút, dưới 2 GiB VRAM, không validation/test; chỉ mở XAI/inference khi toàn bộ clean conjunction pass.</w:t>
+            </w:r>
+          </w:p>
+        </w:tc>
+      </w:tr>
     </w:tbl>
     <w:p>
       <w:pPr>
@@ -8878,6 +8977,42 @@
           <w:sz w:val="22"/>
         </w:rPr>
         <w:t>Không mở lại sáu họ post-CAP bằng cách chỉ đổi width, order, pooling, solver hoặc head; tài liệu no-run ngày 25-07 là cổng resource-value bắt buộc.</w:t>
+      </w:r>
+    </w:p>
+    <w:p>
+      <w:pPr>
+        <w:widowControl/>
+        <w:numPr>
+          <w:ilvl w:val="0"/>
+          <w:numId w:val="14"/>
+        </w:numPr>
+        <w:spacing w:after="160" w:line="280" w:lineRule="auto"/>
+      </w:pPr>
+      <w:r>
+        <w:rPr>
+          <w:rFonts w:ascii="Calibri" w:hAnsi="Calibri" w:eastAsia="Calibri"/>
+          <w:color w:val="202124"/>
+          <w:sz w:val="22"/>
+        </w:rPr>
+        <w:t>Commit/push CCR protocol và machine lock trước candidate code; giữ bất biến SHA 1e408502...f347/6c2a604d...c835 và trạng thái chưa có metric.</w:t>
+      </w:r>
+    </w:p>
+    <w:p>
+      <w:pPr>
+        <w:widowControl/>
+        <w:numPr>
+          <w:ilvl w:val="0"/>
+          <w:numId w:val="14"/>
+        </w:numPr>
+        <w:spacing w:after="160" w:line="280" w:lineRule="auto"/>
+      </w:pPr>
+      <w:r>
+        <w:rPr>
+          <w:rFonts w:ascii="Calibri" w:hAnsi="Calibri" w:eastAsia="Calibri"/>
+          <w:color w:val="202124"/>
+          <w:sz w:val="22"/>
+        </w:rPr>
+        <w:t>Chỉ triển khai một independent CCR A0 sau prospective commit; dừng fail-closed trước robustness/XAI/inference nếu không thắng mọi clean information, causal và TP/FP gate.</w:t>
       </w:r>
     </w:p>
     <w:p>
@@ -10224,6 +10359,183 @@
           </w:p>
         </w:tc>
       </w:tr>
+      <w:tr>
+        <w:trPr>
+          <w:cantSplit/>
+        </w:trPr>
+        <w:tc>
+          <w:tcPr>
+            <w:tcW w:type="dxa" w:w="4050"/>
+            <w:tcMar>
+              <w:top w:w="80" w:type="dxa"/>
+              <w:start w:w="120" w:type="dxa"/>
+              <w:bottom w:w="80" w:type="dxa"/>
+              <w:end w:w="120" w:type="dxa"/>
+            </w:tcMar>
+            <w:vAlign w:val="center"/>
+          </w:tcPr>
+          <w:p>
+            <w:pPr>
+              <w:widowControl/>
+              <w:spacing w:after="0" w:line="247" w:lineRule="auto"/>
+              <w:jc w:val="left"/>
+            </w:pPr>
+            <w:r>
+              <w:rPr>
+                <w:rFonts w:ascii="Calibri" w:hAnsi="Calibri" w:eastAsia="Calibri"/>
+                <w:color w:val="202124"/>
+                <w:sz w:val="18"/>
+              </w:rPr>
+              <w:t>docs/TRKH_5CLASS_CROSS_COLOUR_RATIO_SURFACE_A0_PROTOCOL_20260725.md</w:t>
+            </w:r>
+          </w:p>
+        </w:tc>
+        <w:tc>
+          <w:tcPr>
+            <w:tcW w:type="dxa" w:w="5310"/>
+            <w:tcMar>
+              <w:top w:w="80" w:type="dxa"/>
+              <w:start w:w="120" w:type="dxa"/>
+              <w:bottom w:w="80" w:type="dxa"/>
+              <w:end w:w="120" w:type="dxa"/>
+            </w:tcMar>
+            <w:vAlign w:val="center"/>
+          </w:tcPr>
+          <w:p>
+            <w:pPr>
+              <w:widowControl/>
+              <w:spacing w:after="0" w:line="247" w:lineRule="auto"/>
+              <w:jc w:val="left"/>
+            </w:pPr>
+            <w:r>
+              <w:rPr>
+                <w:rFonts w:ascii="Calibri" w:hAnsi="Calibri" w:eastAsia="Calibri"/>
+                <w:color w:val="202124"/>
+                <w:sz w:val="18"/>
+              </w:rPr>
+              <w:t>Prospective CCR equations, camera-assumption caveats, cohort/folds, controls, gates, XAI và resource/inference authorization.</w:t>
+            </w:r>
+          </w:p>
+        </w:tc>
+      </w:tr>
+      <w:tr>
+        <w:trPr>
+          <w:cantSplit/>
+        </w:trPr>
+        <w:tc>
+          <w:tcPr>
+            <w:tcW w:type="dxa" w:w="4050"/>
+            <w:tcMar>
+              <w:top w:w="80" w:type="dxa"/>
+              <w:start w:w="120" w:type="dxa"/>
+              <w:bottom w:w="80" w:type="dxa"/>
+              <w:end w:w="120" w:type="dxa"/>
+            </w:tcMar>
+            <w:vAlign w:val="center"/>
+          </w:tcPr>
+          <w:p>
+            <w:pPr>
+              <w:widowControl/>
+              <w:spacing w:after="0" w:line="247" w:lineRule="auto"/>
+              <w:jc w:val="left"/>
+            </w:pPr>
+            <w:r>
+              <w:rPr>
+                <w:rFonts w:ascii="Calibri" w:hAnsi="Calibri" w:eastAsia="Calibri"/>
+                <w:color w:val="202124"/>
+                <w:sz w:val="18"/>
+              </w:rPr>
+              <w:t>docs/TRKH_5CLASS_CROSS_COLOUR_RATIO_SURFACE_A0_LOCK_20260725.json</w:t>
+            </w:r>
+          </w:p>
+        </w:tc>
+        <w:tc>
+          <w:tcPr>
+            <w:tcW w:type="dxa" w:w="5310"/>
+            <w:tcMar>
+              <w:top w:w="80" w:type="dxa"/>
+              <w:start w:w="120" w:type="dxa"/>
+              <w:bottom w:w="80" w:type="dxa"/>
+              <w:end w:w="120" w:type="dxa"/>
+            </w:tcMar>
+            <w:vAlign w:val="center"/>
+          </w:tcPr>
+          <w:p>
+            <w:pPr>
+              <w:widowControl/>
+              <w:spacing w:after="0" w:line="247" w:lineRule="auto"/>
+              <w:jc w:val="left"/>
+            </w:pPr>
+            <w:r>
+              <w:rPr>
+                <w:rFonts w:ascii="Calibri" w:hAnsi="Calibri" w:eastAsia="Calibri"/>
+                <w:color w:val="202124"/>
+                <w:sz w:val="18"/>
+              </w:rPr>
+              <w:t>Machine lock cho 763-row train-only cohort, source-held folds, dephase offsets, hashes và protected artifacts.</w:t>
+            </w:r>
+          </w:p>
+        </w:tc>
+      </w:tr>
+      <w:tr>
+        <w:trPr>
+          <w:cantSplit/>
+        </w:trPr>
+        <w:tc>
+          <w:tcPr>
+            <w:tcW w:type="dxa" w:w="4050"/>
+            <w:tcMar>
+              <w:top w:w="80" w:type="dxa"/>
+              <w:start w:w="120" w:type="dxa"/>
+              <w:bottom w:w="80" w:type="dxa"/>
+              <w:end w:w="120" w:type="dxa"/>
+            </w:tcMar>
+            <w:vAlign w:val="center"/>
+          </w:tcPr>
+          <w:p>
+            <w:pPr>
+              <w:widowControl/>
+              <w:spacing w:after="0" w:line="247" w:lineRule="auto"/>
+              <w:jc w:val="left"/>
+            </w:pPr>
+            <w:r>
+              <w:rPr>
+                <w:rFonts w:ascii="Calibri" w:hAnsi="Calibri" w:eastAsia="Calibri"/>
+                <w:color w:val="202124"/>
+                <w:sz w:val="18"/>
+              </w:rPr>
+              <w:t>scripts/build_trkh_cross_colour_ratio_surface_a0_lock.py</w:t>
+            </w:r>
+          </w:p>
+        </w:tc>
+        <w:tc>
+          <w:tcPr>
+            <w:tcW w:type="dxa" w:w="5310"/>
+            <w:tcMar>
+              <w:top w:w="80" w:type="dxa"/>
+              <w:start w:w="120" w:type="dxa"/>
+              <w:bottom w:w="80" w:type="dxa"/>
+              <w:end w:w="120" w:type="dxa"/>
+            </w:tcMar>
+            <w:vAlign w:val="center"/>
+          </w:tcPr>
+          <w:p>
+            <w:pPr>
+              <w:widowControl/>
+              <w:spacing w:after="0" w:line="247" w:lineRule="auto"/>
+              <w:jc w:val="left"/>
+            </w:pPr>
+            <w:r>
+              <w:rPr>
+                <w:rFonts w:ascii="Calibri" w:hAnsi="Calibri" w:eastAsia="Calibri"/>
+                <w:color w:val="202124"/>
+                <w:sz w:val="18"/>
+              </w:rPr>
+              <w:t>Tái sinh và check-only CCR prospective lock trước mọi candidate implementation hoặc metric.</w:t>
+            </w:r>
+          </w:p>
+        </w:tc>
+      </w:tr>
     </w:tbl>
     <w:p>
       <w:pPr>
@@ -10240,7 +10552,7 @@
           <w:color w:val="202124"/>
           <w:sz w:val="22"/>
         </w:rPr>
-        <w:t>Revision 1-3 dựng báo cáo tái lập, full-train/JPEG-DL và synthetic policy. Revision 4-10 đóng SaSPA, LP-A3, NSA, RN-LISDA và Bal-BCE bằng fidelity, causal control, replay và TP/FP gates. Revision 11-14 khóa CAP trước metric, sửa audit-only eval-LSTM, rồi hoàn tất same-lock formal/replay/manual review; CAP đóng negative-but-reusable và retention pass tại SHA 99d1835a...04a636. Revision 15 screen no-run sáu họ successor; không code/GPU/validation/test, keeper và lệnh tốt nhất không đổi. A/B known-good cô lập regression OOXML hyperlink gây Word/LibreOffice repagination vô hạn; hai test cấu trúc và full suite đạt 1927/1927, toàn bộ trang render được, accessibility 0/0/0.</w:t>
+        <w:t>Revision 1-3 dựng báo cáo tái lập, full-train/JPEG-DL và synthetic policy. Revision 4-10 đóng SaSPA, LP-A3, NSA, RN-LISDA và Bal-BCE bằng fidelity, causal control, replay và TP/FP gates. Revision 11-14 khóa CAP trước metric, sửa audit-only eval-LSTM, rồi hoàn tất same-lock formal/replay/manual review; CAP đóng negative-but-reusable và retention pass tại SHA 99d1835a...04a636. Revision 15 screen no-run sáu họ successor và cô lập regression OOXML hyperlink; full suite đạt 1927/1927, visual/accessibility QA đạt 15/15 và 0/0/0. Revision 16 khóa CCR train-only trước candidate code tại protocol/lock SHA 1e408502...f347/6c2a604d...c835; pre-commit review sửa mô tả RNG, thêm write guard và full-payload check-only, focused/full test đạt 9/9 và 1934/1934, visual/accessibility QA đạt 16/16 và 0/0/0; chưa có metric, GPU run, validation/test, production edit hoặc command update.</w:t>
       </w:r>
     </w:p>
     <w:p>
@@ -11371,6 +11683,120 @@
           <w:color w:val="202124"/>
           <w:sz w:val="21"/>
         </w:rPr>
+        <w:t>Color-Based Object Recognition, Pattern Recognition 1999</w:t>
+      </w:r>
+      <w:r>
+        <w:rPr>
+          <w:rFonts w:ascii="Calibri" w:hAnsi="Calibri" w:eastAsia="Calibri"/>
+          <w:color w:val="202124"/>
+          <w:sz w:val="21"/>
+        </w:rPr>
+        <w:t xml:space="preserve"> - Nguồn phương trình cross colour ratio, Gaussian derivative sigma=1 và các giả định invariance dùng cho CCR A0. </w:t>
+      </w:r>
+      <w:hyperlink r:id="rId38">
+        <w:r>
+          <w:rPr>
+            <w:rFonts w:ascii="Calibri" w:hAnsi="Calibri" w:eastAsia="Calibri"/>
+            <w:color w:val="2E74B5"/>
+            <w:u w:val="single"/>
+          </w:rPr>
+          <w:t>Mở nguồn</w:t>
+        </w:r>
+      </w:hyperlink>
+    </w:p>
+    <w:p>
+      <w:pPr>
+        <w:keepLines/>
+        <w:widowControl/>
+        <w:numPr>
+          <w:ilvl w:val="0"/>
+          <w:numId w:val="15"/>
+        </w:numPr>
+        <w:spacing w:after="160" w:line="280" w:lineRule="auto"/>
+      </w:pPr>
+      <w:r>
+        <w:rPr>
+          <w:rFonts w:ascii="Calibri" w:hAnsi="Calibri" w:eastAsia="Calibri"/>
+          <w:b/>
+          <w:color w:val="202124"/>
+          <w:sz w:val="21"/>
+        </w:rPr>
+        <w:t>Invariant Descriptors for Intrinsic Image Decomposition, JOSA A 2021</w:t>
+      </w:r>
+      <w:r>
+        <w:rPr>
+          <w:rFonts w:ascii="Calibri" w:hAnsi="Calibri" w:eastAsia="Calibri"/>
+          <w:color w:val="202124"/>
+          <w:sz w:val="21"/>
+        </w:rPr>
+        <w:t xml:space="preserve"> - Đối chiếu log cross-colour ratios, reflectance edge evidence và giới hạn từ image-formation assumptions. </w:t>
+      </w:r>
+      <w:hyperlink r:id="rId39">
+        <w:r>
+          <w:rPr>
+            <w:rFonts w:ascii="Calibri" w:hAnsi="Calibri" w:eastAsia="Calibri"/>
+            <w:color w:val="2E74B5"/>
+            <w:u w:val="single"/>
+          </w:rPr>
+          <w:t>Mở nguồn</w:t>
+        </w:r>
+      </w:hyperlink>
+    </w:p>
+    <w:p>
+      <w:pPr>
+        <w:keepLines/>
+        <w:widowControl/>
+        <w:numPr>
+          <w:ilvl w:val="0"/>
+          <w:numId w:val="15"/>
+        </w:numPr>
+        <w:spacing w:after="160" w:line="280" w:lineRule="auto"/>
+      </w:pPr>
+      <w:r>
+        <w:rPr>
+          <w:rFonts w:ascii="Calibri" w:hAnsi="Calibri" w:eastAsia="Calibri"/>
+          <w:b/>
+          <w:color w:val="202124"/>
+          <w:sz w:val="21"/>
+        </w:rPr>
+        <w:t>IDTransformer, ICCV Workshop 2023</w:t>
+      </w:r>
+      <w:r>
+        <w:rPr>
+          <w:rFonts w:ascii="Calibri" w:hAnsi="Calibri" w:eastAsia="Calibri"/>
+          <w:color w:val="202124"/>
+          <w:sz w:val="21"/>
+        </w:rPr>
+        <w:t xml:space="preserve"> - Bối cảnh học intrinsic decomposition; project page chưa cung cấp code nên TRKH không copy/import implementation. </w:t>
+      </w:r>
+      <w:hyperlink r:id="rId40">
+        <w:r>
+          <w:rPr>
+            <w:rFonts w:ascii="Calibri" w:hAnsi="Calibri" w:eastAsia="Calibri"/>
+            <w:color w:val="2E74B5"/>
+            <w:u w:val="single"/>
+          </w:rPr>
+          <w:t>Mở nguồn</w:t>
+        </w:r>
+      </w:hyperlink>
+    </w:p>
+    <w:p>
+      <w:pPr>
+        <w:keepLines/>
+        <w:widowControl/>
+        <w:numPr>
+          <w:ilvl w:val="0"/>
+          <w:numId w:val="15"/>
+        </w:numPr>
+        <w:spacing w:after="160" w:line="280" w:lineRule="auto"/>
+      </w:pPr>
+      <w:r>
+        <w:rPr>
+          <w:rFonts w:ascii="Calibri" w:hAnsi="Calibri" w:eastAsia="Calibri"/>
+          <w:b/>
+          <w:color w:val="202124"/>
+          <w:sz w:val="21"/>
+        </w:rPr>
         <w:t>Do We Train on Test Data? Purging CIFAR of Near-Duplicates</w:t>
       </w:r>
       <w:r>
@@ -11381,7 +11807,7 @@
         </w:rPr>
         <w:t xml:space="preserve"> - Đối chiếu nguy cơ near-duplicate cross-split; TRKH dùng quy tắc whole-corpus invalidation nghiêm ngặt hơn. </w:t>
       </w:r>
-      <w:hyperlink r:id="rId38">
+      <w:hyperlink r:id="rId41">
         <w:r>
           <w:rPr>
             <w:rFonts w:ascii="Calibri" w:hAnsi="Calibri" w:eastAsia="Calibri"/>

</xml_diff>

<commit_message>
Lock CCR same-tensor preimplementation erratum
</commit_message>
<xml_diff>
--- a/docs/TRKH_5CLASS_RESEARCH_PROCESS_STATUS.docx
+++ b/docs/TRKH_5CLASS_RESEARCH_PROCESS_STATUS.docx
@@ -75,7 +75,7 @@
           <w:color w:val="202124"/>
           <w:sz w:val="21"/>
         </w:rPr>
-        <w:t>2026-07-25 | Revision 16</w:t>
+        <w:t>2026-07-25 | Revision 17</w:t>
       </w:r>
     </w:p>
     <w:p>
@@ -97,7 +97,7 @@
           <w:color w:val="202124"/>
           <w:sz w:val="21"/>
         </w:rPr>
-        <w:t>Đang nghiên cứu - đã khóa prospective CCR train-only</w:t>
+        <w:t>Đang nghiên cứu - đã khóa CCR same-tensor erratum</w:t>
       </w:r>
     </w:p>
     <w:p>
@@ -340,7 +340,7 @@
                 <w:color w:val="5F6368"/>
                 <w:sz w:val="16"/>
               </w:rPr>
-              <w:t>CCR PROSPECTIVE LOCK</w:t>
+              <w:t>CCR SAME-TENSOR ERRATUM</w:t>
             </w:r>
           </w:p>
           <w:p>
@@ -354,7 +354,7 @@
                 <w:color w:val="1F4D78"/>
                 <w:sz w:val="28"/>
               </w:rPr>
-              <w:t>763 train-only rows</w:t>
+              <w:t>Pre-code, no metric</w:t>
             </w:r>
           </w:p>
           <w:p>
@@ -367,7 +367,7 @@
                 <w:color w:val="202124"/>
                 <w:sz w:val="17"/>
               </w:rPr>
-              <w:t>Chưa có candidate metric; model, validation/test và lệnh tốt nhất không đổi</w:t>
+              <w:t>Giữ frozen desaturate_blur; cấm thêm CCR-specific preprocessing</w:t>
             </w:r>
           </w:p>
         </w:tc>
@@ -465,6 +465,19 @@
           <w:sz w:val="22"/>
         </w:rPr>
         <w:t>Revision 16 đã khóa Cross Colour Ratio (CCR) như một information gate train-only có thể bác bỏ, không phải model promotion. Cohort gồm 763 hàng/735 ảnh unique trong năm source-held folds; candidate phải thắng keeper margin, plain colour-ratio cùng kích thước, trained spatial dephase, same-weight dephase và seed repeat trên gate đồng thời về TP/FP/pairwise/replay. Giả định vật lý của CCR có thể bị phá bởi tone curve JPEG, auto-WB, clipping, bề mặt ướt hoặc phản xạ gương, vì vậy chưa có metric hay quyền integration/full train.</w:t>
+      </w:r>
+    </w:p>
+    <w:p>
+      <w:pPr>
+        <w:widowControl/>
+      </w:pPr>
+      <w:r>
+        <w:rPr>
+          <w:rFonts w:ascii="Calibri" w:hAnsi="Calibri" w:eastAsia="Calibri"/>
+          <w:color w:val="202124"/>
+          <w:sz w:val="22"/>
+        </w:rPr>
+        <w:t>Revision 17 khóa erratum trước implementation: cùng tensor nghĩa là giữ nguyên frozen keeper eval transform, bao gồm desaturate_blur margin/blur 0,08/7,0 đã có sẵn; CCR không được thêm hoặc đổi suppression. Auditor phải dùng trực tiếp CIDT path và geometry đã khóa thay vì index toàn bộ nhãn train, rồi chứng minh crop-box/valid-mask parity trước descriptor. Erratum SHA f9a901b1...d03b; focused/full test 13/13 và 1938/1938, Word QA 16/16, accessibility 0/0/0; chưa có image pass, fit hay metric.</w:t>
       </w:r>
     </w:p>
     <w:p>
@@ -8748,6 +8761,92 @@
           </w:p>
         </w:tc>
       </w:tr>
+      <w:tr>
+        <w:trPr>
+          <w:cantSplit/>
+        </w:trPr>
+        <w:tc>
+          <w:tcPr>
+            <w:tcW w:type="dxa" w:w="2550"/>
+            <w:tcMar>
+              <w:top w:w="80" w:type="dxa"/>
+              <w:start w:w="120" w:type="dxa"/>
+              <w:bottom w:w="80" w:type="dxa"/>
+              <w:end w:w="120" w:type="dxa"/>
+            </w:tcMar>
+            <w:vAlign w:val="center"/>
+          </w:tcPr>
+          <w:p>
+            <w:pPr>
+              <w:widowControl/>
+              <w:spacing w:after="0" w:line="247" w:lineRule="auto"/>
+              <w:jc w:val="left"/>
+            </w:pPr>
+            <w:r>
+              <w:rPr>
+                <w:rFonts w:ascii="Calibri" w:hAnsi="Calibri" w:eastAsia="Calibri"/>
+                <w:color w:val="202124"/>
+                <w:sz w:val="18"/>
+              </w:rPr>
+              <w:t>CCR same-tensor pre-code erratum</w:t>
+            </w:r>
+          </w:p>
+        </w:tc>
+        <w:tc>
+          <w:tcPr>
+            <w:tcW w:type="dxa" w:w="3810"/>
+            <w:tcMar>
+              <w:top w:w="80" w:type="dxa"/>
+              <w:start w:w="120" w:type="dxa"/>
+              <w:bottom w:w="80" w:type="dxa"/>
+              <w:end w:w="120" w:type="dxa"/>
+            </w:tcMar>
+            <w:vAlign w:val="center"/>
+          </w:tcPr>
+          <w:p>
+            <w:pPr>
+              <w:widowControl/>
+              <w:spacing w:after="0" w:line="247" w:lineRule="auto"/>
+              <w:jc w:val="left"/>
+            </w:pPr>
+            <w:r>
+              <w:rPr>
+                <w:rFonts w:ascii="Calibri" w:hAnsi="Calibri" w:eastAsia="Calibri"/>
+                <w:color w:val="202124"/>
+                <w:sz w:val="18"/>
+              </w:rPr>
+              <w:t>Giữ frozen eval desaturate_blur 0,08/7,0; direct loader dùng CIDT path + locked geometry, không index toàn bộ label train.</w:t>
+            </w:r>
+          </w:p>
+        </w:tc>
+        <w:tc>
+          <w:tcPr>
+            <w:tcW w:type="dxa" w:w="3000"/>
+            <w:tcMar>
+              <w:top w:w="80" w:type="dxa"/>
+              <w:start w:w="120" w:type="dxa"/>
+              <w:bottom w:w="80" w:type="dxa"/>
+              <w:end w:w="120" w:type="dxa"/>
+            </w:tcMar>
+            <w:vAlign w:val="center"/>
+          </w:tcPr>
+          <w:p>
+            <w:pPr>
+              <w:widowControl/>
+              <w:spacing w:after="0" w:line="247" w:lineRule="auto"/>
+              <w:jc w:val="left"/>
+            </w:pPr>
+            <w:r>
+              <w:rPr>
+                <w:rFonts w:ascii="Calibri" w:hAnsi="Calibri" w:eastAsia="Calibri"/>
+                <w:color w:val="202124"/>
+                <w:sz w:val="18"/>
+              </w:rPr>
+              <w:t>Loại ambiguity trước candidate code và buộc crop-box/valid-mask parity fail-closed.</w:t>
+            </w:r>
+          </w:p>
+        </w:tc>
+      </w:tr>
     </w:tbl>
     <w:p>
       <w:pPr>
@@ -9013,6 +9112,24 @@
           <w:sz w:val="22"/>
         </w:rPr>
         <w:t>Chỉ triển khai một independent CCR A0 sau prospective commit; dừng fail-closed trước robustness/XAI/inference nếu không thắng mọi clean information, causal và TP/FP gate.</w:t>
+      </w:r>
+    </w:p>
+    <w:p>
+      <w:pPr>
+        <w:widowControl/>
+        <w:numPr>
+          <w:ilvl w:val="0"/>
+          <w:numId w:val="14"/>
+        </w:numPr>
+        <w:spacing w:after="160" w:line="280" w:lineRule="auto"/>
+      </w:pPr>
+      <w:r>
+        <w:rPr>
+          <w:rFonts w:ascii="Calibri" w:hAnsi="Calibri" w:eastAsia="Calibri"/>
+          <w:color w:val="202124"/>
+          <w:sz w:val="22"/>
+        </w:rPr>
+        <w:t>Commit/push same-tensor erratum SHA f9a901b1...d03b trước engine code; không rewrite protocol/lock gốc và không dùng full dataset constructor trong CCR auditor.</w:t>
       </w:r>
     </w:p>
     <w:p>
@@ -10536,6 +10653,65 @@
           </w:p>
         </w:tc>
       </w:tr>
+      <w:tr>
+        <w:trPr>
+          <w:cantSplit/>
+        </w:trPr>
+        <w:tc>
+          <w:tcPr>
+            <w:tcW w:type="dxa" w:w="4050"/>
+            <w:tcMar>
+              <w:top w:w="80" w:type="dxa"/>
+              <w:start w:w="120" w:type="dxa"/>
+              <w:bottom w:w="80" w:type="dxa"/>
+              <w:end w:w="120" w:type="dxa"/>
+            </w:tcMar>
+            <w:vAlign w:val="center"/>
+          </w:tcPr>
+          <w:p>
+            <w:pPr>
+              <w:widowControl/>
+              <w:spacing w:after="0" w:line="247" w:lineRule="auto"/>
+              <w:jc w:val="left"/>
+            </w:pPr>
+            <w:r>
+              <w:rPr>
+                <w:rFonts w:ascii="Calibri" w:hAnsi="Calibri" w:eastAsia="Calibri"/>
+                <w:color w:val="202124"/>
+                <w:sz w:val="18"/>
+              </w:rPr>
+              <w:t>docs/TRKH_5CLASS_CROSS_COLOUR_RATIO_SURFACE_A0_PREIMPLEMENTATION_ERRATUM_20260725.md</w:t>
+            </w:r>
+          </w:p>
+        </w:tc>
+        <w:tc>
+          <w:tcPr>
+            <w:tcW w:type="dxa" w:w="5310"/>
+            <w:tcMar>
+              <w:top w:w="80" w:type="dxa"/>
+              <w:start w:w="120" w:type="dxa"/>
+              <w:bottom w:w="80" w:type="dxa"/>
+              <w:end w:w="120" w:type="dxa"/>
+            </w:tcMar>
+            <w:vAlign w:val="center"/>
+          </w:tcPr>
+          <w:p>
+            <w:pPr>
+              <w:widowControl/>
+              <w:spacing w:after="0" w:line="247" w:lineRule="auto"/>
+              <w:jc w:val="left"/>
+            </w:pPr>
+            <w:r>
+              <w:rPr>
+                <w:rFonts w:ascii="Calibri" w:hAnsi="Calibri" w:eastAsia="Calibri"/>
+                <w:color w:val="202124"/>
+                <w:sz w:val="18"/>
+              </w:rPr>
+              <w:t>Sửa ambiguity same-tensor trước code; pin frozen eval preprocessing và direct-loader crop/valid-mask parity.</w:t>
+            </w:r>
+          </w:p>
+        </w:tc>
+      </w:tr>
     </w:tbl>
     <w:p>
       <w:pPr>
@@ -10552,7 +10728,7 @@
           <w:color w:val="202124"/>
           <w:sz w:val="22"/>
         </w:rPr>
-        <w:t>Revision 1-3 dựng báo cáo tái lập, full-train/JPEG-DL và synthetic policy. Revision 4-10 đóng SaSPA, LP-A3, NSA, RN-LISDA và Bal-BCE bằng fidelity, causal control, replay và TP/FP gates. Revision 11-14 khóa CAP trước metric, sửa audit-only eval-LSTM, rồi hoàn tất same-lock formal/replay/manual review; CAP đóng negative-but-reusable và retention pass tại SHA 99d1835a...04a636. Revision 15 screen no-run sáu họ successor và cô lập regression OOXML hyperlink; full suite đạt 1927/1927, visual/accessibility QA đạt 15/15 và 0/0/0. Revision 16 khóa CCR train-only trước candidate code tại protocol/lock SHA 1e408502...f347/6c2a604d...c835; pre-commit review sửa mô tả RNG, thêm write guard và full-payload check-only, focused/full test đạt 9/9 và 1934/1934, visual/accessibility QA đạt 16/16 và 0/0/0; chưa có metric, GPU run, validation/test, production edit hoặc command update.</w:t>
+        <w:t>Revision 1-3 dựng báo cáo tái lập, full-train/JPEG-DL và synthetic policy. Revision 4-10 đóng SaSPA, LP-A3, NSA, RN-LISDA và Bal-BCE bằng fidelity, causal control, replay và TP/FP gates. Revision 11-14 khóa CAP trước metric, sửa audit-only eval-LSTM, rồi hoàn tất same-lock formal/replay/manual review; CAP đóng negative-but-reusable và retention pass tại SHA 99d1835a...04a636. Revision 15 screen no-run sáu họ successor và cô lập regression OOXML hyperlink. Revision 16 khóa CCR train-only tại protocol/lock SHA 1e408502...f347/6c2a604d...c835, thêm write guard/full-payload check-only; focused/full test 9/9 và 1934/1934, visual/accessibility 16/16 và 0/0/0. Revision 17 khóa same-tensor/direct-loader erratum SHA f9a901b1...d03b trước implementation; focused/full test 13/13 và 1938/1938, visual/accessibility 16/16 và 0/0/0; chưa có image pass, fit, metric, validation/test, production edit hoặc command update.</w:t>
       </w:r>
     </w:p>
     <w:p>
@@ -10572,7 +10748,7 @@
           <w:ilvl w:val="0"/>
           <w:numId w:val="15"/>
         </w:numPr>
-        <w:spacing w:after="160" w:line="280" w:lineRule="auto"/>
+        <w:spacing w:after="20" w:line="252" w:lineRule="auto"/>
       </w:pPr>
       <w:r>
         <w:rPr>
@@ -10610,7 +10786,7 @@
           <w:ilvl w:val="0"/>
           <w:numId w:val="15"/>
         </w:numPr>
-        <w:spacing w:after="160" w:line="280" w:lineRule="auto"/>
+        <w:spacing w:after="20" w:line="252" w:lineRule="auto"/>
       </w:pPr>
       <w:r>
         <w:rPr>
@@ -10648,7 +10824,7 @@
           <w:ilvl w:val="0"/>
           <w:numId w:val="15"/>
         </w:numPr>
-        <w:spacing w:after="160" w:line="280" w:lineRule="auto"/>
+        <w:spacing w:after="20" w:line="252" w:lineRule="auto"/>
       </w:pPr>
       <w:r>
         <w:rPr>
@@ -10686,7 +10862,7 @@
           <w:ilvl w:val="0"/>
           <w:numId w:val="15"/>
         </w:numPr>
-        <w:spacing w:after="160" w:line="280" w:lineRule="auto"/>
+        <w:spacing w:after="20" w:line="252" w:lineRule="auto"/>
       </w:pPr>
       <w:r>
         <w:rPr>
@@ -10724,7 +10900,7 @@
           <w:ilvl w:val="0"/>
           <w:numId w:val="15"/>
         </w:numPr>
-        <w:spacing w:after="160" w:line="280" w:lineRule="auto"/>
+        <w:spacing w:after="20" w:line="252" w:lineRule="auto"/>
       </w:pPr>
       <w:r>
         <w:rPr>
@@ -10762,7 +10938,7 @@
           <w:ilvl w:val="0"/>
           <w:numId w:val="15"/>
         </w:numPr>
-        <w:spacing w:after="160" w:line="280" w:lineRule="auto"/>
+        <w:spacing w:after="20" w:line="252" w:lineRule="auto"/>
       </w:pPr>
       <w:r>
         <w:rPr>
@@ -10800,7 +10976,7 @@
           <w:ilvl w:val="0"/>
           <w:numId w:val="15"/>
         </w:numPr>
-        <w:spacing w:after="160" w:line="280" w:lineRule="auto"/>
+        <w:spacing w:after="20" w:line="252" w:lineRule="auto"/>
       </w:pPr>
       <w:r>
         <w:rPr>
@@ -10838,7 +11014,7 @@
           <w:ilvl w:val="0"/>
           <w:numId w:val="15"/>
         </w:numPr>
-        <w:spacing w:after="160" w:line="280" w:lineRule="auto"/>
+        <w:spacing w:after="20" w:line="252" w:lineRule="auto"/>
       </w:pPr>
       <w:r>
         <w:rPr>
@@ -10876,7 +11052,7 @@
           <w:ilvl w:val="0"/>
           <w:numId w:val="15"/>
         </w:numPr>
-        <w:spacing w:after="160" w:line="280" w:lineRule="auto"/>
+        <w:spacing w:after="20" w:line="252" w:lineRule="auto"/>
       </w:pPr>
       <w:r>
         <w:rPr>
@@ -10914,7 +11090,7 @@
           <w:ilvl w:val="0"/>
           <w:numId w:val="15"/>
         </w:numPr>
-        <w:spacing w:after="160" w:line="280" w:lineRule="auto"/>
+        <w:spacing w:after="20" w:line="252" w:lineRule="auto"/>
       </w:pPr>
       <w:r>
         <w:rPr>
@@ -10952,7 +11128,7 @@
           <w:ilvl w:val="0"/>
           <w:numId w:val="15"/>
         </w:numPr>
-        <w:spacing w:after="160" w:line="280" w:lineRule="auto"/>
+        <w:spacing w:after="20" w:line="252" w:lineRule="auto"/>
       </w:pPr>
       <w:r>
         <w:rPr>
@@ -10990,7 +11166,7 @@
           <w:ilvl w:val="0"/>
           <w:numId w:val="15"/>
         </w:numPr>
-        <w:spacing w:after="160" w:line="280" w:lineRule="auto"/>
+        <w:spacing w:after="20" w:line="252" w:lineRule="auto"/>
       </w:pPr>
       <w:r>
         <w:rPr>
@@ -11028,7 +11204,7 @@
           <w:ilvl w:val="0"/>
           <w:numId w:val="15"/>
         </w:numPr>
-        <w:spacing w:after="160" w:line="280" w:lineRule="auto"/>
+        <w:spacing w:after="20" w:line="252" w:lineRule="auto"/>
       </w:pPr>
       <w:r>
         <w:rPr>
@@ -11066,7 +11242,7 @@
           <w:ilvl w:val="0"/>
           <w:numId w:val="15"/>
         </w:numPr>
-        <w:spacing w:after="160" w:line="280" w:lineRule="auto"/>
+        <w:spacing w:after="20" w:line="252" w:lineRule="auto"/>
       </w:pPr>
       <w:r>
         <w:rPr>
@@ -11104,7 +11280,7 @@
           <w:ilvl w:val="0"/>
           <w:numId w:val="15"/>
         </w:numPr>
-        <w:spacing w:after="160" w:line="280" w:lineRule="auto"/>
+        <w:spacing w:after="20" w:line="252" w:lineRule="auto"/>
       </w:pPr>
       <w:r>
         <w:rPr>
@@ -11142,7 +11318,7 @@
           <w:ilvl w:val="0"/>
           <w:numId w:val="15"/>
         </w:numPr>
-        <w:spacing w:after="160" w:line="280" w:lineRule="auto"/>
+        <w:spacing w:after="20" w:line="252" w:lineRule="auto"/>
       </w:pPr>
       <w:r>
         <w:rPr>
@@ -11180,7 +11356,7 @@
           <w:ilvl w:val="0"/>
           <w:numId w:val="15"/>
         </w:numPr>
-        <w:spacing w:after="160" w:line="280" w:lineRule="auto"/>
+        <w:spacing w:after="20" w:line="252" w:lineRule="auto"/>
       </w:pPr>
       <w:r>
         <w:rPr>
@@ -11218,7 +11394,7 @@
           <w:ilvl w:val="0"/>
           <w:numId w:val="15"/>
         </w:numPr>
-        <w:spacing w:after="160" w:line="280" w:lineRule="auto"/>
+        <w:spacing w:after="20" w:line="252" w:lineRule="auto"/>
       </w:pPr>
       <w:r>
         <w:rPr>
@@ -11256,7 +11432,7 @@
           <w:ilvl w:val="0"/>
           <w:numId w:val="15"/>
         </w:numPr>
-        <w:spacing w:after="160" w:line="280" w:lineRule="auto"/>
+        <w:spacing w:after="20" w:line="252" w:lineRule="auto"/>
       </w:pPr>
       <w:r>
         <w:rPr>
@@ -11294,7 +11470,7 @@
           <w:ilvl w:val="0"/>
           <w:numId w:val="15"/>
         </w:numPr>
-        <w:spacing w:after="160" w:line="280" w:lineRule="auto"/>
+        <w:spacing w:after="20" w:line="252" w:lineRule="auto"/>
       </w:pPr>
       <w:r>
         <w:rPr>
@@ -11332,7 +11508,7 @@
           <w:ilvl w:val="0"/>
           <w:numId w:val="15"/>
         </w:numPr>
-        <w:spacing w:after="160" w:line="280" w:lineRule="auto"/>
+        <w:spacing w:after="20" w:line="252" w:lineRule="auto"/>
       </w:pPr>
       <w:r>
         <w:rPr>
@@ -11370,7 +11546,7 @@
           <w:ilvl w:val="0"/>
           <w:numId w:val="15"/>
         </w:numPr>
-        <w:spacing w:after="160" w:line="280" w:lineRule="auto"/>
+        <w:spacing w:after="20" w:line="252" w:lineRule="auto"/>
       </w:pPr>
       <w:r>
         <w:rPr>
@@ -11408,7 +11584,7 @@
           <w:ilvl w:val="0"/>
           <w:numId w:val="15"/>
         </w:numPr>
-        <w:spacing w:after="160" w:line="280" w:lineRule="auto"/>
+        <w:spacing w:after="20" w:line="252" w:lineRule="auto"/>
       </w:pPr>
       <w:r>
         <w:rPr>
@@ -11446,7 +11622,7 @@
           <w:ilvl w:val="0"/>
           <w:numId w:val="15"/>
         </w:numPr>
-        <w:spacing w:after="160" w:line="280" w:lineRule="auto"/>
+        <w:spacing w:after="20" w:line="252" w:lineRule="auto"/>
       </w:pPr>
       <w:r>
         <w:rPr>
@@ -11484,7 +11660,7 @@
           <w:ilvl w:val="0"/>
           <w:numId w:val="15"/>
         </w:numPr>
-        <w:spacing w:after="160" w:line="280" w:lineRule="auto"/>
+        <w:spacing w:after="20" w:line="252" w:lineRule="auto"/>
       </w:pPr>
       <w:r>
         <w:rPr>
@@ -11522,7 +11698,7 @@
           <w:ilvl w:val="0"/>
           <w:numId w:val="15"/>
         </w:numPr>
-        <w:spacing w:after="160" w:line="280" w:lineRule="auto"/>
+        <w:spacing w:after="20" w:line="252" w:lineRule="auto"/>
       </w:pPr>
       <w:r>
         <w:rPr>
@@ -11560,7 +11736,7 @@
           <w:ilvl w:val="0"/>
           <w:numId w:val="15"/>
         </w:numPr>
-        <w:spacing w:after="160" w:line="280" w:lineRule="auto"/>
+        <w:spacing w:after="20" w:line="252" w:lineRule="auto"/>
       </w:pPr>
       <w:r>
         <w:rPr>
@@ -11598,7 +11774,7 @@
           <w:ilvl w:val="0"/>
           <w:numId w:val="15"/>
         </w:numPr>
-        <w:spacing w:after="160" w:line="280" w:lineRule="auto"/>
+        <w:spacing w:after="20" w:line="252" w:lineRule="auto"/>
       </w:pPr>
       <w:r>
         <w:rPr>
@@ -11636,7 +11812,7 @@
           <w:ilvl w:val="0"/>
           <w:numId w:val="15"/>
         </w:numPr>
-        <w:spacing w:after="160" w:line="280" w:lineRule="auto"/>
+        <w:spacing w:after="20" w:line="252" w:lineRule="auto"/>
       </w:pPr>
       <w:r>
         <w:rPr>
@@ -11674,7 +11850,7 @@
           <w:ilvl w:val="0"/>
           <w:numId w:val="15"/>
         </w:numPr>
-        <w:spacing w:after="160" w:line="280" w:lineRule="auto"/>
+        <w:spacing w:after="20" w:line="252" w:lineRule="auto"/>
       </w:pPr>
       <w:r>
         <w:rPr>
@@ -11712,7 +11888,7 @@
           <w:ilvl w:val="0"/>
           <w:numId w:val="15"/>
         </w:numPr>
-        <w:spacing w:after="160" w:line="280" w:lineRule="auto"/>
+        <w:spacing w:after="20" w:line="252" w:lineRule="auto"/>
       </w:pPr>
       <w:r>
         <w:rPr>
@@ -11750,7 +11926,7 @@
           <w:ilvl w:val="0"/>
           <w:numId w:val="15"/>
         </w:numPr>
-        <w:spacing w:after="160" w:line="280" w:lineRule="auto"/>
+        <w:spacing w:after="20" w:line="252" w:lineRule="auto"/>
       </w:pPr>
       <w:r>
         <w:rPr>
@@ -11788,7 +11964,7 @@
           <w:ilvl w:val="0"/>
           <w:numId w:val="15"/>
         </w:numPr>
-        <w:spacing w:after="160" w:line="280" w:lineRule="auto"/>
+        <w:spacing w:after="20" w:line="252" w:lineRule="auto"/>
       </w:pPr>
       <w:r>
         <w:rPr>

</xml_diff>

<commit_message>
Implement locked CCR equation engine
</commit_message>
<xml_diff>
--- a/docs/TRKH_5CLASS_RESEARCH_PROCESS_STATUS.docx
+++ b/docs/TRKH_5CLASS_RESEARCH_PROCESS_STATUS.docx
@@ -75,7 +75,7 @@
           <w:color w:val="202124"/>
           <w:sz w:val="21"/>
         </w:rPr>
-        <w:t>2026-07-25 | Revision 17</w:t>
+        <w:t>2026-07-25 | Revision 18</w:t>
       </w:r>
     </w:p>
     <w:p>
@@ -97,7 +97,7 @@
           <w:color w:val="202124"/>
           <w:sz w:val="21"/>
         </w:rPr>
-        <w:t>Đang nghiên cứu - đã khóa CCR same-tensor erratum</w:t>
+        <w:t>Đang nghiên cứu - CCR equation engine đã qua preflight</w:t>
       </w:r>
     </w:p>
     <w:p>
@@ -340,7 +340,7 @@
                 <w:color w:val="5F6368"/>
                 <w:sz w:val="16"/>
               </w:rPr>
-              <w:t>CCR SAME-TENSOR ERRATUM</w:t>
+              <w:t>CCR EQUATION ENGINE</w:t>
             </w:r>
           </w:p>
           <w:p>
@@ -354,7 +354,7 @@
                 <w:color w:val="1F4D78"/>
                 <w:sz w:val="28"/>
               </w:rPr>
-              <w:t>Pre-code, no metric</w:t>
+              <w:t>8/8, chưa có metric</w:t>
             </w:r>
           </w:p>
           <w:p>
@@ -367,7 +367,7 @@
                 <w:color w:val="202124"/>
                 <w:sz w:val="17"/>
               </w:rPr>
-              <w:t>Giữ frozen desaturate_blur; cấm thêm CCR-specific preprocessing</w:t>
+              <w:t>3.004 scratch params; NumPy/gradient/ONNX pass; chưa đọc ảnh</w:t>
             </w:r>
           </w:p>
         </w:tc>
@@ -478,6 +478,19 @@
           <w:sz w:val="22"/>
         </w:rPr>
         <w:t>Revision 17 khóa erratum trước implementation: cùng tensor nghĩa là giữ nguyên frozen keeper eval transform, bao gồm desaturate_blur margin/blur 0,08/7,0 đã có sẵn; CCR không được thêm hoặc đổi suppression. Auditor phải dùng trực tiếp CIDT path và geometry đã khóa thay vì index toàn bộ nhãn train, rồi chứng minh crop-box/valid-mask parity trước descriptor. Erratum SHA f9a901b1...d03b; focused/full test 13/13 và 1938/1938, Word QA 16/16, accessibility 0/0/0; chưa có image pass, fit hay metric.</w:t>
+      </w:r>
+    </w:p>
+    <w:p>
+      <w:pPr>
+        <w:widowControl/>
+      </w:pPr>
+      <w:r>
+        <w:rPr>
+          <w:rFonts w:ascii="Calibri" w:hAnsi="Calibri" w:eastAsia="Calibri"/>
+          <w:color w:val="202124"/>
+          <w:sz w:val="22"/>
+        </w:rPr>
+        <w:t>Revision 18 hoàn tất equation-engine preflight trước dữ liệu: extractor CCR signed, matched plain-colour control và head 3.004 tham số scratch tái lập đúng hash fold/dephase. Tám regression test độc lập xác minh phương trình FP64, bất biến common-shading/per-channel-gain, gradient update và ONNX Runtime batch động dưới sai số 1e-5. Đây chỉ là mechanism-only-preflight: chưa đọc pixel cohort, chưa fit, chưa có score/metric và chưa đổi keeper hay lệnh full-train. Direct loader phải chứng minh identity/crop/model-box/bbox-mask/valid-mask parity trước A0. Focused/full test đạt 21/21 và 1946/1946; Word QA 16/16, accessibility 0/0/0.</w:t>
       </w:r>
     </w:p>
     <w:p>
@@ -8847,6 +8860,92 @@
           </w:p>
         </w:tc>
       </w:tr>
+      <w:tr>
+        <w:trPr>
+          <w:cantSplit/>
+        </w:trPr>
+        <w:tc>
+          <w:tcPr>
+            <w:tcW w:type="dxa" w:w="2550"/>
+            <w:tcMar>
+              <w:top w:w="80" w:type="dxa"/>
+              <w:start w:w="120" w:type="dxa"/>
+              <w:bottom w:w="80" w:type="dxa"/>
+              <w:end w:w="120" w:type="dxa"/>
+            </w:tcMar>
+            <w:vAlign w:val="center"/>
+          </w:tcPr>
+          <w:p>
+            <w:pPr>
+              <w:widowControl/>
+              <w:spacing w:after="0" w:line="247" w:lineRule="auto"/>
+              <w:jc w:val="left"/>
+            </w:pPr>
+            <w:r>
+              <w:rPr>
+                <w:rFonts w:ascii="Calibri" w:hAnsi="Calibri" w:eastAsia="Calibri"/>
+                <w:color w:val="202124"/>
+                <w:sz w:val="18"/>
+              </w:rPr>
+              <w:t>CCR equation engine trước dữ liệu</w:t>
+            </w:r>
+          </w:p>
+        </w:tc>
+        <w:tc>
+          <w:tcPr>
+            <w:tcW w:type="dxa" w:w="3810"/>
+            <w:tcMar>
+              <w:top w:w="80" w:type="dxa"/>
+              <w:start w:w="120" w:type="dxa"/>
+              <w:bottom w:w="80" w:type="dxa"/>
+              <w:end w:w="120" w:type="dxa"/>
+            </w:tcMar>
+            <w:vAlign w:val="center"/>
+          </w:tcPr>
+          <w:p>
+            <w:pPr>
+              <w:widowControl/>
+              <w:spacing w:after="0" w:line="247" w:lineRule="auto"/>
+              <w:jc w:val="left"/>
+            </w:pPr>
+            <w:r>
+              <w:rPr>
+                <w:rFonts w:ascii="Calibri" w:hAnsi="Calibri" w:eastAsia="Calibri"/>
+                <w:color w:val="202124"/>
+                <w:sz w:val="18"/>
+              </w:rPr>
+              <w:t>Khóa signed CCR/control, reliability 7x7 và head scratch 3.004 tham số; kiểm tra NumPy, invariance, fold/dephase, gradient và ONNX batch động.</w:t>
+            </w:r>
+          </w:p>
+        </w:tc>
+        <w:tc>
+          <w:tcPr>
+            <w:tcW w:type="dxa" w:w="3000"/>
+            <w:tcMar>
+              <w:top w:w="80" w:type="dxa"/>
+              <w:start w:w="120" w:type="dxa"/>
+              <w:bottom w:w="80" w:type="dxa"/>
+              <w:end w:w="120" w:type="dxa"/>
+            </w:tcMar>
+            <w:vAlign w:val="center"/>
+          </w:tcPr>
+          <w:p>
+            <w:pPr>
+              <w:widowControl/>
+              <w:spacing w:after="0" w:line="247" w:lineRule="auto"/>
+              <w:jc w:val="left"/>
+            </w:pPr>
+            <w:r>
+              <w:rPr>
+                <w:rFonts w:ascii="Calibri" w:hAnsi="Calibri" w:eastAsia="Calibri"/>
+                <w:color w:val="202124"/>
+                <w:sz w:val="18"/>
+              </w:rPr>
+              <w:t>Xác minh cơ chế và deployment feasibility không cần đọc pixel hay chạy GPU; không nhầm preflight với model gain.</w:t>
+            </w:r>
+          </w:p>
+        </w:tc>
+      </w:tr>
     </w:tbl>
     <w:p>
       <w:pPr>
@@ -9130,6 +9229,24 @@
           <w:sz w:val="22"/>
         </w:rPr>
         <w:t>Commit/push same-tensor erratum SHA f9a901b1...d03b trước engine code; không rewrite protocol/lock gốc và không dùng full dataset constructor trong CCR auditor.</w:t>
+      </w:r>
+    </w:p>
+    <w:p>
+      <w:pPr>
+        <w:widowControl/>
+        <w:numPr>
+          <w:ilvl w:val="0"/>
+          <w:numId w:val="14"/>
+        </w:numPr>
+        <w:spacing w:after="160" w:line="280" w:lineRule="auto"/>
+      </w:pPr>
+      <w:r>
+        <w:rPr>
+          <w:rFonts w:ascii="Calibri" w:hAnsi="Calibri" w:eastAsia="Calibri"/>
+          <w:color w:val="202124"/>
+          <w:sz w:val="22"/>
+        </w:rPr>
+        <w:t>Giữ engine/test/implementation SHA ac610d7c...d26fe9/5a83a138...94c840/18c2dbeb...8c804; trước A0 phải commit direct locked-CIDT materializer và chứng minh identity/crop/model-box/bbox-mask/valid-mask parity fail-closed.</w:t>
       </w:r>
     </w:p>
     <w:p>
@@ -10712,6 +10829,124 @@
           </w:p>
         </w:tc>
       </w:tr>
+      <w:tr>
+        <w:trPr>
+          <w:cantSplit/>
+        </w:trPr>
+        <w:tc>
+          <w:tcPr>
+            <w:tcW w:type="dxa" w:w="4050"/>
+            <w:tcMar>
+              <w:top w:w="80" w:type="dxa"/>
+              <w:start w:w="120" w:type="dxa"/>
+              <w:bottom w:w="80" w:type="dxa"/>
+              <w:end w:w="120" w:type="dxa"/>
+            </w:tcMar>
+            <w:vAlign w:val="center"/>
+          </w:tcPr>
+          <w:p>
+            <w:pPr>
+              <w:widowControl/>
+              <w:spacing w:after="0" w:line="247" w:lineRule="auto"/>
+              <w:jc w:val="left"/>
+            </w:pPr>
+            <w:r>
+              <w:rPr>
+                <w:rFonts w:ascii="Calibri" w:hAnsi="Calibri" w:eastAsia="Calibri"/>
+                <w:color w:val="202124"/>
+                <w:sz w:val="18"/>
+              </w:rPr>
+              <w:t>docs/TRKH_5CLASS_CROSS_COLOUR_RATIO_SURFACE_A0_IMPLEMENTATION_20260725.md</w:t>
+            </w:r>
+          </w:p>
+        </w:tc>
+        <w:tc>
+          <w:tcPr>
+            <w:tcW w:type="dxa" w:w="5310"/>
+            <w:tcMar>
+              <w:top w:w="80" w:type="dxa"/>
+              <w:start w:w="120" w:type="dxa"/>
+              <w:bottom w:w="80" w:type="dxa"/>
+              <w:end w:w="120" w:type="dxa"/>
+            </w:tcMar>
+            <w:vAlign w:val="center"/>
+          </w:tcPr>
+          <w:p>
+            <w:pPr>
+              <w:widowControl/>
+              <w:spacing w:after="0" w:line="247" w:lineRule="auto"/>
+              <w:jc w:val="left"/>
+            </w:pPr>
+            <w:r>
+              <w:rPr>
+                <w:rFonts w:ascii="Calibri" w:hAnsi="Calibri" w:eastAsia="Calibri"/>
+                <w:color w:val="202124"/>
+                <w:sz w:val="18"/>
+              </w:rPr>
+              <w:t>Equation-engine contract, scratch provenance, independent oracles, ONNX preflight và điều kiện mở direct loader.</w:t>
+            </w:r>
+          </w:p>
+        </w:tc>
+      </w:tr>
+      <w:tr>
+        <w:trPr>
+          <w:cantSplit/>
+        </w:trPr>
+        <w:tc>
+          <w:tcPr>
+            <w:tcW w:type="dxa" w:w="4050"/>
+            <w:tcMar>
+              <w:top w:w="80" w:type="dxa"/>
+              <w:start w:w="120" w:type="dxa"/>
+              <w:bottom w:w="80" w:type="dxa"/>
+              <w:end w:w="120" w:type="dxa"/>
+            </w:tcMar>
+            <w:vAlign w:val="center"/>
+          </w:tcPr>
+          <w:p>
+            <w:pPr>
+              <w:widowControl/>
+              <w:spacing w:after="0" w:line="247" w:lineRule="auto"/>
+              <w:jc w:val="left"/>
+            </w:pPr>
+            <w:r>
+              <w:rPr>
+                <w:rFonts w:ascii="Calibri" w:hAnsi="Calibri" w:eastAsia="Calibri"/>
+                <w:color w:val="202124"/>
+                <w:sz w:val="18"/>
+              </w:rPr>
+              <w:t>trkh/tools/cross_colour_ratio_surface_a0_engine.py</w:t>
+            </w:r>
+          </w:p>
+        </w:tc>
+        <w:tc>
+          <w:tcPr>
+            <w:tcW w:type="dxa" w:w="5310"/>
+            <w:tcMar>
+              <w:top w:w="80" w:type="dxa"/>
+              <w:start w:w="120" w:type="dxa"/>
+              <w:bottom w:w="80" w:type="dxa"/>
+              <w:end w:w="120" w:type="dxa"/>
+            </w:tcMar>
+            <w:vAlign w:val="center"/>
+          </w:tcPr>
+          <w:p>
+            <w:pPr>
+              <w:widowControl/>
+              <w:spacing w:after="0" w:line="247" w:lineRule="auto"/>
+              <w:jc w:val="left"/>
+            </w:pPr>
+            <w:r>
+              <w:rPr>
+                <w:rFonts w:ascii="Calibri" w:hAnsi="Calibri" w:eastAsia="Calibri"/>
+                <w:color w:val="202124"/>
+                <w:sz w:val="18"/>
+              </w:rPr>
+              <w:t>Extractor CCR/control signed, reliability support, dephase, head scratch 3.004 tham số và action helpers.</w:t>
+            </w:r>
+          </w:p>
+        </w:tc>
+      </w:tr>
     </w:tbl>
     <w:p>
       <w:pPr>
@@ -10728,7 +10963,7 @@
           <w:color w:val="202124"/>
           <w:sz w:val="22"/>
         </w:rPr>
-        <w:t>Revision 1-3 dựng báo cáo tái lập, full-train/JPEG-DL và synthetic policy. Revision 4-10 đóng SaSPA, LP-A3, NSA, RN-LISDA và Bal-BCE bằng fidelity, causal control, replay và TP/FP gates. Revision 11-14 khóa CAP trước metric, sửa audit-only eval-LSTM, rồi hoàn tất same-lock formal/replay/manual review; CAP đóng negative-but-reusable và retention pass tại SHA 99d1835a...04a636. Revision 15 screen no-run sáu họ successor và cô lập regression OOXML hyperlink. Revision 16 khóa CCR train-only tại protocol/lock SHA 1e408502...f347/6c2a604d...c835, thêm write guard/full-payload check-only; focused/full test 9/9 và 1934/1934, visual/accessibility 16/16 và 0/0/0. Revision 17 khóa same-tensor/direct-loader erratum SHA f9a901b1...d03b trước implementation; focused/full test 13/13 và 1938/1938, visual/accessibility 16/16 và 0/0/0; chưa có image pass, fit, metric, validation/test, production edit hoặc command update.</w:t>
+        <w:t>Revision 1-3 dựng báo cáo tái lập, full-train/JPEG-DL và synthetic policy. Revision 4-10 đóng SaSPA, LP-A3, NSA, RN-LISDA và Bal-BCE bằng fidelity, causal control, replay và TP/FP gates. Revision 11-14 khóa CAP trước metric, sửa audit-only eval-LSTM, rồi hoàn tất same-lock formal/replay/manual review; CAP đóng negative-but-reusable và retention pass tại SHA 99d1835a...04a636. Revision 15 screen no-run sáu họ successor và cô lập regression OOXML hyperlink. Revision 16 khóa CCR train-only tại protocol/lock SHA 1e408502...f347/6c2a604d...c835. Revision 17 khóa same-tensor/direct-loader erratum SHA f9a901b1...d03b trước implementation. Revision 18 thêm equation engine/head scratch 3.004 tham số tại SHA ac610d7c...d26fe9, focused/full test 21/21 và 1946/1946, Word/accessibility QA 16/16 và 0/0/0; vẫn chưa có image pass, fit, metric, validation/test, production edit hoặc command update.</w:t>
       </w:r>
     </w:p>
     <w:p>
@@ -10748,7 +10983,7 @@
           <w:ilvl w:val="0"/>
           <w:numId w:val="15"/>
         </w:numPr>
-        <w:spacing w:after="20" w:line="252" w:lineRule="auto"/>
+        <w:spacing w:after="0" w:line="240" w:lineRule="auto"/>
       </w:pPr>
       <w:r>
         <w:rPr>
@@ -10786,7 +11021,7 @@
           <w:ilvl w:val="0"/>
           <w:numId w:val="15"/>
         </w:numPr>
-        <w:spacing w:after="20" w:line="252" w:lineRule="auto"/>
+        <w:spacing w:after="0" w:line="240" w:lineRule="auto"/>
       </w:pPr>
       <w:r>
         <w:rPr>
@@ -10824,7 +11059,7 @@
           <w:ilvl w:val="0"/>
           <w:numId w:val="15"/>
         </w:numPr>
-        <w:spacing w:after="20" w:line="252" w:lineRule="auto"/>
+        <w:spacing w:after="0" w:line="240" w:lineRule="auto"/>
       </w:pPr>
       <w:r>
         <w:rPr>
@@ -10862,7 +11097,7 @@
           <w:ilvl w:val="0"/>
           <w:numId w:val="15"/>
         </w:numPr>
-        <w:spacing w:after="20" w:line="252" w:lineRule="auto"/>
+        <w:spacing w:after="0" w:line="240" w:lineRule="auto"/>
       </w:pPr>
       <w:r>
         <w:rPr>
@@ -10900,7 +11135,7 @@
           <w:ilvl w:val="0"/>
           <w:numId w:val="15"/>
         </w:numPr>
-        <w:spacing w:after="20" w:line="252" w:lineRule="auto"/>
+        <w:spacing w:after="0" w:line="240" w:lineRule="auto"/>
       </w:pPr>
       <w:r>
         <w:rPr>
@@ -10938,7 +11173,7 @@
           <w:ilvl w:val="0"/>
           <w:numId w:val="15"/>
         </w:numPr>
-        <w:spacing w:after="20" w:line="252" w:lineRule="auto"/>
+        <w:spacing w:after="0" w:line="240" w:lineRule="auto"/>
       </w:pPr>
       <w:r>
         <w:rPr>
@@ -10976,7 +11211,7 @@
           <w:ilvl w:val="0"/>
           <w:numId w:val="15"/>
         </w:numPr>
-        <w:spacing w:after="20" w:line="252" w:lineRule="auto"/>
+        <w:spacing w:after="0" w:line="240" w:lineRule="auto"/>
       </w:pPr>
       <w:r>
         <w:rPr>
@@ -11014,7 +11249,7 @@
           <w:ilvl w:val="0"/>
           <w:numId w:val="15"/>
         </w:numPr>
-        <w:spacing w:after="20" w:line="252" w:lineRule="auto"/>
+        <w:spacing w:after="0" w:line="240" w:lineRule="auto"/>
       </w:pPr>
       <w:r>
         <w:rPr>
@@ -11052,7 +11287,7 @@
           <w:ilvl w:val="0"/>
           <w:numId w:val="15"/>
         </w:numPr>
-        <w:spacing w:after="20" w:line="252" w:lineRule="auto"/>
+        <w:spacing w:after="0" w:line="240" w:lineRule="auto"/>
       </w:pPr>
       <w:r>
         <w:rPr>
@@ -11090,7 +11325,7 @@
           <w:ilvl w:val="0"/>
           <w:numId w:val="15"/>
         </w:numPr>
-        <w:spacing w:after="20" w:line="252" w:lineRule="auto"/>
+        <w:spacing w:after="0" w:line="240" w:lineRule="auto"/>
       </w:pPr>
       <w:r>
         <w:rPr>
@@ -11128,7 +11363,7 @@
           <w:ilvl w:val="0"/>
           <w:numId w:val="15"/>
         </w:numPr>
-        <w:spacing w:after="20" w:line="252" w:lineRule="auto"/>
+        <w:spacing w:after="0" w:line="240" w:lineRule="auto"/>
       </w:pPr>
       <w:r>
         <w:rPr>
@@ -11166,7 +11401,7 @@
           <w:ilvl w:val="0"/>
           <w:numId w:val="15"/>
         </w:numPr>
-        <w:spacing w:after="20" w:line="252" w:lineRule="auto"/>
+        <w:spacing w:after="0" w:line="240" w:lineRule="auto"/>
       </w:pPr>
       <w:r>
         <w:rPr>
@@ -11204,7 +11439,7 @@
           <w:ilvl w:val="0"/>
           <w:numId w:val="15"/>
         </w:numPr>
-        <w:spacing w:after="20" w:line="252" w:lineRule="auto"/>
+        <w:spacing w:after="0" w:line="240" w:lineRule="auto"/>
       </w:pPr>
       <w:r>
         <w:rPr>
@@ -11242,7 +11477,7 @@
           <w:ilvl w:val="0"/>
           <w:numId w:val="15"/>
         </w:numPr>
-        <w:spacing w:after="20" w:line="252" w:lineRule="auto"/>
+        <w:spacing w:after="0" w:line="240" w:lineRule="auto"/>
       </w:pPr>
       <w:r>
         <w:rPr>
@@ -11280,7 +11515,7 @@
           <w:ilvl w:val="0"/>
           <w:numId w:val="15"/>
         </w:numPr>
-        <w:spacing w:after="20" w:line="252" w:lineRule="auto"/>
+        <w:spacing w:after="0" w:line="240" w:lineRule="auto"/>
       </w:pPr>
       <w:r>
         <w:rPr>
@@ -11318,7 +11553,7 @@
           <w:ilvl w:val="0"/>
           <w:numId w:val="15"/>
         </w:numPr>
-        <w:spacing w:after="20" w:line="252" w:lineRule="auto"/>
+        <w:spacing w:after="0" w:line="240" w:lineRule="auto"/>
       </w:pPr>
       <w:r>
         <w:rPr>
@@ -11356,7 +11591,7 @@
           <w:ilvl w:val="0"/>
           <w:numId w:val="15"/>
         </w:numPr>
-        <w:spacing w:after="20" w:line="252" w:lineRule="auto"/>
+        <w:spacing w:after="0" w:line="240" w:lineRule="auto"/>
       </w:pPr>
       <w:r>
         <w:rPr>
@@ -11394,7 +11629,7 @@
           <w:ilvl w:val="0"/>
           <w:numId w:val="15"/>
         </w:numPr>
-        <w:spacing w:after="20" w:line="252" w:lineRule="auto"/>
+        <w:spacing w:after="0" w:line="240" w:lineRule="auto"/>
       </w:pPr>
       <w:r>
         <w:rPr>
@@ -11432,7 +11667,7 @@
           <w:ilvl w:val="0"/>
           <w:numId w:val="15"/>
         </w:numPr>
-        <w:spacing w:after="20" w:line="252" w:lineRule="auto"/>
+        <w:spacing w:after="0" w:line="240" w:lineRule="auto"/>
       </w:pPr>
       <w:r>
         <w:rPr>
@@ -11470,7 +11705,7 @@
           <w:ilvl w:val="0"/>
           <w:numId w:val="15"/>
         </w:numPr>
-        <w:spacing w:after="20" w:line="252" w:lineRule="auto"/>
+        <w:spacing w:after="0" w:line="240" w:lineRule="auto"/>
       </w:pPr>
       <w:r>
         <w:rPr>
@@ -11508,7 +11743,7 @@
           <w:ilvl w:val="0"/>
           <w:numId w:val="15"/>
         </w:numPr>
-        <w:spacing w:after="20" w:line="252" w:lineRule="auto"/>
+        <w:spacing w:after="0" w:line="240" w:lineRule="auto"/>
       </w:pPr>
       <w:r>
         <w:rPr>
@@ -11546,7 +11781,7 @@
           <w:ilvl w:val="0"/>
           <w:numId w:val="15"/>
         </w:numPr>
-        <w:spacing w:after="20" w:line="252" w:lineRule="auto"/>
+        <w:spacing w:after="0" w:line="240" w:lineRule="auto"/>
       </w:pPr>
       <w:r>
         <w:rPr>
@@ -11584,7 +11819,7 @@
           <w:ilvl w:val="0"/>
           <w:numId w:val="15"/>
         </w:numPr>
-        <w:spacing w:after="20" w:line="252" w:lineRule="auto"/>
+        <w:spacing w:after="0" w:line="240" w:lineRule="auto"/>
       </w:pPr>
       <w:r>
         <w:rPr>
@@ -11622,7 +11857,7 @@
           <w:ilvl w:val="0"/>
           <w:numId w:val="15"/>
         </w:numPr>
-        <w:spacing w:after="20" w:line="252" w:lineRule="auto"/>
+        <w:spacing w:after="0" w:line="240" w:lineRule="auto"/>
       </w:pPr>
       <w:r>
         <w:rPr>
@@ -11660,7 +11895,7 @@
           <w:ilvl w:val="0"/>
           <w:numId w:val="15"/>
         </w:numPr>
-        <w:spacing w:after="20" w:line="252" w:lineRule="auto"/>
+        <w:spacing w:after="0" w:line="240" w:lineRule="auto"/>
       </w:pPr>
       <w:r>
         <w:rPr>
@@ -11698,7 +11933,7 @@
           <w:ilvl w:val="0"/>
           <w:numId w:val="15"/>
         </w:numPr>
-        <w:spacing w:after="20" w:line="252" w:lineRule="auto"/>
+        <w:spacing w:after="0" w:line="240" w:lineRule="auto"/>
       </w:pPr>
       <w:r>
         <w:rPr>
@@ -11736,7 +11971,7 @@
           <w:ilvl w:val="0"/>
           <w:numId w:val="15"/>
         </w:numPr>
-        <w:spacing w:after="20" w:line="252" w:lineRule="auto"/>
+        <w:spacing w:after="0" w:line="240" w:lineRule="auto"/>
       </w:pPr>
       <w:r>
         <w:rPr>
@@ -11774,7 +12009,7 @@
           <w:ilvl w:val="0"/>
           <w:numId w:val="15"/>
         </w:numPr>
-        <w:spacing w:after="20" w:line="252" w:lineRule="auto"/>
+        <w:spacing w:after="0" w:line="240" w:lineRule="auto"/>
       </w:pPr>
       <w:r>
         <w:rPr>
@@ -11812,7 +12047,7 @@
           <w:ilvl w:val="0"/>
           <w:numId w:val="15"/>
         </w:numPr>
-        <w:spacing w:after="20" w:line="252" w:lineRule="auto"/>
+        <w:spacing w:after="0" w:line="240" w:lineRule="auto"/>
       </w:pPr>
       <w:r>
         <w:rPr>
@@ -11850,7 +12085,7 @@
           <w:ilvl w:val="0"/>
           <w:numId w:val="15"/>
         </w:numPr>
-        <w:spacing w:after="20" w:line="252" w:lineRule="auto"/>
+        <w:spacing w:after="0" w:line="240" w:lineRule="auto"/>
       </w:pPr>
       <w:r>
         <w:rPr>
@@ -11888,7 +12123,7 @@
           <w:ilvl w:val="0"/>
           <w:numId w:val="15"/>
         </w:numPr>
-        <w:spacing w:after="20" w:line="252" w:lineRule="auto"/>
+        <w:spacing w:after="0" w:line="240" w:lineRule="auto"/>
       </w:pPr>
       <w:r>
         <w:rPr>
@@ -11926,7 +12161,7 @@
           <w:ilvl w:val="0"/>
           <w:numId w:val="15"/>
         </w:numPr>
-        <w:spacing w:after="20" w:line="252" w:lineRule="auto"/>
+        <w:spacing w:after="0" w:line="240" w:lineRule="auto"/>
       </w:pPr>
       <w:r>
         <w:rPr>
@@ -11964,7 +12199,7 @@
           <w:ilvl w:val="0"/>
           <w:numId w:val="15"/>
         </w:numPr>
-        <w:spacing w:after="20" w:line="252" w:lineRule="auto"/>
+        <w:spacing w:after="0" w:line="240" w:lineRule="auto"/>
       </w:pPr>
       <w:r>
         <w:rPr>

</xml_diff>

<commit_message>
Add fail-closed CCR tensor materializer
</commit_message>
<xml_diff>
--- a/docs/TRKH_5CLASS_RESEARCH_PROCESS_STATUS.docx
+++ b/docs/TRKH_5CLASS_RESEARCH_PROCESS_STATUS.docx
@@ -75,7 +75,7 @@
           <w:color w:val="202124"/>
           <w:sz w:val="21"/>
         </w:rPr>
-        <w:t>2026-07-25 | Revision 18</w:t>
+        <w:t>2026-07-25 | Revision 19</w:t>
       </w:r>
     </w:p>
     <w:p>
@@ -97,7 +97,7 @@
           <w:color w:val="202124"/>
           <w:sz w:val="21"/>
         </w:rPr>
-        <w:t>Đang nghiên cứu - CCR equation engine đã qua preflight</w:t>
+        <w:t>Đang nghiên cứu - CCR direct materializer đã qua structural preflight</w:t>
       </w:r>
     </w:p>
     <w:p>
@@ -340,7 +340,7 @@
                 <w:color w:val="5F6368"/>
                 <w:sz w:val="16"/>
               </w:rPr>
-              <w:t>CCR EQUATION ENGINE</w:t>
+              <w:t>CCR MATERIALIZER</w:t>
             </w:r>
           </w:p>
           <w:p>
@@ -354,7 +354,7 @@
                 <w:color w:val="1F4D78"/>
                 <w:sz w:val="28"/>
               </w:rPr>
-              <w:t>8/8, chưa có metric</w:t>
+              <w:t>9/9, chưa đọc ảnh thật</w:t>
             </w:r>
           </w:p>
           <w:p>
@@ -367,7 +367,7 @@
                 <w:color w:val="202124"/>
                 <w:sz w:val="17"/>
               </w:rPr>
-              <w:t>3.004 scratch params; NumPy/gradient/ONNX pass; chưa đọc ảnh</w:t>
+              <w:t>763 rows/735 ảnh; cache &lt;=160.456.704 B; chưa descriptor/fit</w:t>
             </w:r>
           </w:p>
         </w:tc>
@@ -491,6 +491,19 @@
           <w:sz w:val="22"/>
         </w:rPr>
         <w:t>Revision 18 hoàn tất equation-engine preflight trước dữ liệu: extractor CCR signed, matched plain-colour control và head 3.004 tham số scratch tái lập đúng hash fold/dephase. Tám regression test độc lập xác minh phương trình FP64, bất biến common-shading/per-channel-gain, gradient update và ONNX Runtime batch động dưới sai số 1e-5. Đây chỉ là mechanism-only-preflight: chưa đọc pixel cohort, chưa fit, chưa có score/metric và chưa đổi keeper hay lệnh full-train. Direct loader phải chứng minh identity/crop/model-box/bbox-mask/valid-mask parity trước A0. Focused/full test đạt 21/21 và 1946/1946; Word QA 16/16, accessibility 0/0/0.</w:t>
+      </w:r>
+    </w:p>
+    <w:p>
+      <w:pPr>
+        <w:widowControl/>
+      </w:pPr>
+      <w:r>
+        <w:rPr>
+          <w:rFonts w:ascii="Calibri" w:hAnsi="Calibri" w:eastAsia="Calibri"/>
+          <w:color w:val="202124"/>
+          <w:sz w:val="22"/>
+        </w:rPr>
+        <w:t>Revision 19 triển khai direct same-tensor materializer không dựng broad dataset index. Structural preflight ánh xạ đúng 763 hàng thành 735 ảnh/label unique, khóa exact keeper transform, dự toán cache lossless sRGB uint8 + packed valid-mask tối đa 160.456.704 byte và không mở pixel/label cohort. Chín test bao phủ production-parity crop, packed-mask replay, dynamic allowlist, synthetic formal artifact, atomic publish, forced-failure cleanup, khóa exact resource/CPU-only/no-fit và no-write-before-authorization. Resource được kiểm tra trước/trong image loop; replay lỗi xóa partial finalization. Focused CCR đạt 27/27, focused CCR/report đạt 30/30 và full pytest đạt 1955/1955 trong 75,30 giây với 373 cảnh báo hiện hữu. Word QA đạt 17/17 trang, accessibility 0/0/0. Materializer vẫn chưa được phép chạy formal trước commit/push và machine authorization riêng; chưa có descriptor, fit, metric, CUDA, validation/test, integration, full train hay command update.</w:t>
       </w:r>
     </w:p>
     <w:p>
@@ -8946,6 +8959,92 @@
           </w:p>
         </w:tc>
       </w:tr>
+      <w:tr>
+        <w:trPr>
+          <w:cantSplit/>
+        </w:trPr>
+        <w:tc>
+          <w:tcPr>
+            <w:tcW w:type="dxa" w:w="2550"/>
+            <w:tcMar>
+              <w:top w:w="80" w:type="dxa"/>
+              <w:start w:w="120" w:type="dxa"/>
+              <w:bottom w:w="80" w:type="dxa"/>
+              <w:end w:w="120" w:type="dxa"/>
+            </w:tcMar>
+            <w:vAlign w:val="center"/>
+          </w:tcPr>
+          <w:p>
+            <w:pPr>
+              <w:widowControl/>
+              <w:spacing w:after="0" w:line="247" w:lineRule="auto"/>
+              <w:jc w:val="left"/>
+            </w:pPr>
+            <w:r>
+              <w:rPr>
+                <w:rFonts w:ascii="Calibri" w:hAnsi="Calibri" w:eastAsia="Calibri"/>
+                <w:color w:val="202124"/>
+                <w:sz w:val="18"/>
+              </w:rPr>
+              <w:t>CCR direct materializer preflight</w:t>
+            </w:r>
+          </w:p>
+        </w:tc>
+        <w:tc>
+          <w:tcPr>
+            <w:tcW w:type="dxa" w:w="3810"/>
+            <w:tcMar>
+              <w:top w:w="80" w:type="dxa"/>
+              <w:start w:w="120" w:type="dxa"/>
+              <w:bottom w:w="80" w:type="dxa"/>
+              <w:end w:w="120" w:type="dxa"/>
+            </w:tcMar>
+            <w:vAlign w:val="center"/>
+          </w:tcPr>
+          <w:p>
+            <w:pPr>
+              <w:widowControl/>
+              <w:spacing w:after="0" w:line="247" w:lineRule="auto"/>
+              <w:jc w:val="left"/>
+            </w:pPr>
+            <w:r>
+              <w:rPr>
+                <w:rFonts w:ascii="Calibri" w:hAnsi="Calibri" w:eastAsia="Calibri"/>
+                <w:color w:val="202124"/>
+                <w:sz w:val="18"/>
+              </w:rPr>
+              <w:t>Dùng CIDT + geometry để khóa 735 image/label path; exact crop/transform/bbox/mask parity; cache sRGB uint8 + packed valid mask dưới 160.456.704 byte.</w:t>
+            </w:r>
+          </w:p>
+        </w:tc>
+        <w:tc>
+          <w:tcPr>
+            <w:tcW w:type="dxa" w:w="3000"/>
+            <w:tcMar>
+              <w:top w:w="80" w:type="dxa"/>
+              <w:start w:w="120" w:type="dxa"/>
+              <w:bottom w:w="80" w:type="dxa"/>
+              <w:end w:w="120" w:type="dxa"/>
+            </w:tcMar>
+            <w:vAlign w:val="center"/>
+          </w:tcPr>
+          <w:p>
+            <w:pPr>
+              <w:widowControl/>
+              <w:spacing w:after="0" w:line="247" w:lineRule="auto"/>
+              <w:jc w:val="left"/>
+            </w:pPr>
+            <w:r>
+              <w:rPr>
+                <w:rFonts w:ascii="Calibri" w:hAnsi="Calibri" w:eastAsia="Calibri"/>
+                <w:color w:val="202124"/>
+                <w:sz w:val="18"/>
+              </w:rPr>
+              <w:t>Không index 9.215 label rows, không đọc pixel ở preflight; synthetic formal/atomic cleanup và Windows logical-open accounting đều pass.</w:t>
+            </w:r>
+          </w:p>
+        </w:tc>
+      </w:tr>
     </w:tbl>
     <w:p>
       <w:pPr>
@@ -9247,6 +9346,42 @@
           <w:sz w:val="22"/>
         </w:rPr>
         <w:t>Giữ engine/test/implementation SHA ac610d7c...d26fe9/5a83a138...94c840/18c2dbeb...8c804; trước A0 phải commit direct locked-CIDT materializer và chứng minh identity/crop/model-box/bbox-mask/valid-mask parity fail-closed.</w:t>
+      </w:r>
+    </w:p>
+    <w:p>
+      <w:pPr>
+        <w:widowControl/>
+        <w:numPr>
+          <w:ilvl w:val="0"/>
+          <w:numId w:val="14"/>
+        </w:numPr>
+        <w:spacing w:after="160" w:line="280" w:lineRule="auto"/>
+      </w:pPr>
+      <w:r>
+        <w:rPr>
+          <w:rFonts w:ascii="Calibri" w:hAnsi="Calibri" w:eastAsia="Calibri"/>
+          <w:color w:val="202124"/>
+          <w:sz w:val="22"/>
+        </w:rPr>
+        <w:t>Commit/push materializer SHA ff1050bc...7afbfd5 và test SHA b6f76b19...5058013; sau đó mới tạo machine authorization khóa ancestor/output/resource và trạng thái materializer_authorized_no_fit.</w:t>
+      </w:r>
+    </w:p>
+    <w:p>
+      <w:pPr>
+        <w:widowControl/>
+        <w:numPr>
+          <w:ilvl w:val="0"/>
+          <w:numId w:val="14"/>
+        </w:numPr>
+        <w:spacing w:after="160" w:line="280" w:lineRule="auto"/>
+      </w:pPr>
+      <w:r>
+        <w:rPr>
+          <w:rFonts w:ascii="Calibri" w:hAnsi="Calibri" w:eastAsia="Calibri"/>
+          <w:color w:val="202124"/>
+          <w:sz w:val="22"/>
+        </w:rPr>
+        <w:t>Chỉ chạy một formal 735-image materialization và một fresh-process replay; descriptor/head fit vẫn đóng cho đến khi cache, manifest, parity và access-ledger replay exact.</w:t>
       </w:r>
     </w:p>
     <w:p>
@@ -10384,7 +10519,7 @@
                 <w:color w:val="202124"/>
                 <w:sz w:val="18"/>
               </w:rPr>
-              <w:t>C:/Users/ADMIN/.codex/skills/trkh-5class/SKILL.md</w:t>
+              <w:t>~/.codex/skills/trkh-5class/SKILL.md</w:t>
             </w:r>
           </w:p>
         </w:tc>
@@ -10947,6 +11082,124 @@
           </w:p>
         </w:tc>
       </w:tr>
+      <w:tr>
+        <w:trPr>
+          <w:cantSplit/>
+        </w:trPr>
+        <w:tc>
+          <w:tcPr>
+            <w:tcW w:type="dxa" w:w="4050"/>
+            <w:tcMar>
+              <w:top w:w="80" w:type="dxa"/>
+              <w:start w:w="120" w:type="dxa"/>
+              <w:bottom w:w="80" w:type="dxa"/>
+              <w:end w:w="120" w:type="dxa"/>
+            </w:tcMar>
+            <w:vAlign w:val="center"/>
+          </w:tcPr>
+          <w:p>
+            <w:pPr>
+              <w:widowControl/>
+              <w:spacing w:after="0" w:line="247" w:lineRule="auto"/>
+              <w:jc w:val="left"/>
+            </w:pPr>
+            <w:r>
+              <w:rPr>
+                <w:rFonts w:ascii="Calibri" w:hAnsi="Calibri" w:eastAsia="Calibri"/>
+                <w:color w:val="202124"/>
+                <w:sz w:val="18"/>
+              </w:rPr>
+              <w:t>trkh/tools/cross_colour_ratio_surface_a0_materializer.py</w:t>
+            </w:r>
+          </w:p>
+        </w:tc>
+        <w:tc>
+          <w:tcPr>
+            <w:tcW w:type="dxa" w:w="5310"/>
+            <w:tcMar>
+              <w:top w:w="80" w:type="dxa"/>
+              <w:start w:w="120" w:type="dxa"/>
+              <w:bottom w:w="80" w:type="dxa"/>
+              <w:end w:w="120" w:type="dxa"/>
+            </w:tcMar>
+            <w:vAlign w:val="center"/>
+          </w:tcPr>
+          <w:p>
+            <w:pPr>
+              <w:widowControl/>
+              <w:spacing w:after="0" w:line="247" w:lineRule="auto"/>
+              <w:jc w:val="left"/>
+            </w:pPr>
+            <w:r>
+              <w:rPr>
+                <w:rFonts w:ascii="Calibri" w:hAnsi="Calibri" w:eastAsia="Calibri"/>
+                <w:color w:val="202124"/>
+                <w:sz w:val="18"/>
+              </w:rPr>
+              <w:t>Direct locked-CIDT loader, dynamic ledger, exact keeper-tensor parity, lossless cache, atomic publish và fresh-process replay.</w:t>
+            </w:r>
+          </w:p>
+        </w:tc>
+      </w:tr>
+      <w:tr>
+        <w:trPr>
+          <w:cantSplit/>
+        </w:trPr>
+        <w:tc>
+          <w:tcPr>
+            <w:tcW w:type="dxa" w:w="4050"/>
+            <w:tcMar>
+              <w:top w:w="80" w:type="dxa"/>
+              <w:start w:w="120" w:type="dxa"/>
+              <w:bottom w:w="80" w:type="dxa"/>
+              <w:end w:w="120" w:type="dxa"/>
+            </w:tcMar>
+            <w:vAlign w:val="center"/>
+          </w:tcPr>
+          <w:p>
+            <w:pPr>
+              <w:widowControl/>
+              <w:spacing w:after="0" w:line="247" w:lineRule="auto"/>
+              <w:jc w:val="left"/>
+            </w:pPr>
+            <w:r>
+              <w:rPr>
+                <w:rFonts w:ascii="Calibri" w:hAnsi="Calibri" w:eastAsia="Calibri"/>
+                <w:color w:val="202124"/>
+                <w:sz w:val="18"/>
+              </w:rPr>
+              <w:t>tests/test_cross_colour_ratio_surface_a0_materializer.py</w:t>
+            </w:r>
+          </w:p>
+        </w:tc>
+        <w:tc>
+          <w:tcPr>
+            <w:tcW w:type="dxa" w:w="5310"/>
+            <w:tcMar>
+              <w:top w:w="80" w:type="dxa"/>
+              <w:start w:w="120" w:type="dxa"/>
+              <w:bottom w:w="80" w:type="dxa"/>
+              <w:end w:w="120" w:type="dxa"/>
+            </w:tcMar>
+            <w:vAlign w:val="center"/>
+          </w:tcPr>
+          <w:p>
+            <w:pPr>
+              <w:widowControl/>
+              <w:spacing w:after="0" w:line="247" w:lineRule="auto"/>
+              <w:jc w:val="left"/>
+            </w:pPr>
+            <w:r>
+              <w:rPr>
+                <w:rFonts w:ascii="Calibri" w:hAnsi="Calibri" w:eastAsia="Calibri"/>
+                <w:color w:val="202124"/>
+                <w:sz w:val="18"/>
+              </w:rPr>
+              <w:t>Production-parity, packed-mask, path-blocking, no-pixel preflight, synthetic formal và forced-failure cleanup.</w:t>
+            </w:r>
+          </w:p>
+        </w:tc>
+      </w:tr>
     </w:tbl>
     <w:p>
       <w:pPr>
@@ -10963,7 +11216,7 @@
           <w:color w:val="202124"/>
           <w:sz w:val="22"/>
         </w:rPr>
-        <w:t>Revision 1-3 dựng báo cáo tái lập, full-train/JPEG-DL và synthetic policy. Revision 4-10 đóng SaSPA, LP-A3, NSA, RN-LISDA và Bal-BCE bằng fidelity, causal control, replay và TP/FP gates. Revision 11-14 khóa CAP trước metric, sửa audit-only eval-LSTM, rồi hoàn tất same-lock formal/replay/manual review; CAP đóng negative-but-reusable và retention pass tại SHA 99d1835a...04a636. Revision 15 screen no-run sáu họ successor và cô lập regression OOXML hyperlink. Revision 16 khóa CCR train-only tại protocol/lock SHA 1e408502...f347/6c2a604d...c835. Revision 17 khóa same-tensor/direct-loader erratum SHA f9a901b1...d03b trước implementation. Revision 18 thêm equation engine/head scratch 3.004 tham số tại SHA ac610d7c...d26fe9, focused/full test 21/21 và 1946/1946, Word/accessibility QA 16/16 và 0/0/0; vẫn chưa có image pass, fit, metric, validation/test, production edit hoặc command update.</w:t>
+        <w:t>Revision 1-3 dựng báo cáo tái lập, full-train/JPEG-DL và synthetic policy. Revision 4-10 đóng SaSPA, LP-A3, NSA, RN-LISDA và Bal-BCE bằng fidelity, causal control, replay và TP/FP gates. Revision 11-14 khóa CAP trước metric, sửa audit-only eval-LSTM, rồi hoàn tất same-lock formal/replay/manual review; CAP đóng negative-but-reusable và retention pass tại SHA 99d1835a...04a636. Revision 15 screen no-run sáu họ successor và cô lập regression OOXML hyperlink. Revision 16 khóa CCR train-only tại protocol/lock SHA 1e408502...f347/6c2a604d...c835. Revision 17 khóa same-tensor/direct-loader erratum SHA f9a901b1...d03b trước implementation. Revision 18 thêm equation engine/head scratch 3.004 tham số tại SHA ac610d7c...d26fe9. Revision 19 thêm direct materializer SHA ff1050bc...7afbfd5, test SHA b6f76b19...5058013, focused CCR/report 30/30, full pytest 1955/1955, Word QA 17/17 và cache bound 160.456.704 byte; vẫn chưa có image pass thật, descriptor, fit, metric, validation/test, production edit hoặc command update.</w:t>
       </w:r>
     </w:p>
     <w:p>

</xml_diff>

<commit_message>
Authorize one CCR tensor materialization
</commit_message>
<xml_diff>
--- a/docs/TRKH_5CLASS_RESEARCH_PROCESS_STATUS.docx
+++ b/docs/TRKH_5CLASS_RESEARCH_PROCESS_STATUS.docx
@@ -75,7 +75,7 @@
           <w:color w:val="202124"/>
           <w:sz w:val="21"/>
         </w:rPr>
-        <w:t>2026-07-25 | Revision 19</w:t>
+        <w:t>2026-07-25 | Revision 20</w:t>
       </w:r>
     </w:p>
     <w:p>
@@ -97,7 +97,7 @@
           <w:color w:val="202124"/>
           <w:sz w:val="21"/>
         </w:rPr>
-        <w:t>Đang nghiên cứu - CCR direct materializer đã qua structural preflight</w:t>
+        <w:t>Đang nghiên cứu - CCR materializer authorization đã khóa, formal pending</w:t>
       </w:r>
     </w:p>
     <w:p>
@@ -354,7 +354,7 @@
                 <w:color w:val="1F4D78"/>
                 <w:sz w:val="28"/>
               </w:rPr>
-              <w:t>9/9, chưa đọc ảnh thật</w:t>
+              <w:t>10/10, chưa đọc ảnh thật</w:t>
             </w:r>
           </w:p>
           <w:p>
@@ -504,6 +504,19 @@
           <w:sz w:val="22"/>
         </w:rPr>
         <w:t>Revision 19 triển khai direct same-tensor materializer không dựng broad dataset index. Structural preflight ánh xạ đúng 763 hàng thành 735 ảnh/label unique, khóa exact keeper transform, dự toán cache lossless sRGB uint8 + packed valid-mask tối đa 160.456.704 byte và không mở pixel/label cohort. Chín test bao phủ production-parity crop, packed-mask replay, dynamic allowlist, synthetic formal artifact, atomic publish, forced-failure cleanup, khóa exact resource/CPU-only/no-fit và no-write-before-authorization. Resource được kiểm tra trước/trong image loop; replay lỗi xóa partial finalization. Focused CCR đạt 27/27, focused CCR/report đạt 30/30 và full pytest đạt 1955/1955 trong 75,30 giây với 373 cảnh báo hiện hữu. Word QA đạt 17/17 trang, accessibility 0/0/0. Materializer vẫn chưa được phép chạy formal trước commit/push và machine authorization riêng; chưa có descriptor, fit, metric, CUDA, validation/test, integration, full train hay command update.</w:t>
+      </w:r>
+    </w:p>
+    <w:p>
+      <w:pPr>
+        <w:widowControl/>
+      </w:pPr>
+      <w:r>
+        <w:rPr>
+          <w:rFonts w:ascii="Calibri" w:hAnsi="Calibri" w:eastAsia="Calibri"/>
+          <w:color w:val="202124"/>
+          <w:sz w:val="22"/>
+        </w:rPr>
+        <w:t>Revision 20 tái hiện và sửa repository gate trên Windows: Git porcelain hiển thị tên untracked có khoảng trắng bằng chuỗi quoted, làm hai deep-research-report được bảo vệ bị chặn sai. Gate nay dùng porcelain NUL-delimited và regression test đường dẫn literal; bản sửa đã push tại 5b4df3d...02f4b1. Materializer/test SHA mới là 3c7e33e9...e6321f7/2675a37a...7a3808; focused CCR đạt 28/28, focused CCR/report đạt 31/31 và full pytest đạt 1956/1956 trong 74,35 giây với 373 cảnh báo hiện hữu. Authorization SHA e76bd56c...07068 khóa đúng ancestor, output, resource và CPU-only/no-fit/no-validation/test. Word QA đạt 17/17 trang và accessibility 0/0/0. Chưa có image pass thật, descriptor, fit, metric, CUDA, validation/test, integration, full train hay command update.</w:t>
       </w:r>
     </w:p>
     <w:p>
@@ -9363,7 +9376,7 @@
           <w:color w:val="202124"/>
           <w:sz w:val="22"/>
         </w:rPr>
-        <w:t>Commit/push materializer SHA ff1050bc...7afbfd5 và test SHA b6f76b19...5058013; sau đó mới tạo machine authorization khóa ancestor/output/resource và trạng thái materializer_authorized_no_fit.</w:t>
+        <w:t>Giữ materializer SHA 3c7e33e9...e6321f7, test SHA 2675a37a...7a3808 và repository-gate commit 5b4df3d...02f4b1; authorization SHA e76bd56c...07068 khóa ancestor/output/resource cùng trạng thái materializer_authorized_no_fit.</w:t>
       </w:r>
     </w:p>
     <w:p>
@@ -11216,7 +11229,7 @@
           <w:color w:val="202124"/>
           <w:sz w:val="22"/>
         </w:rPr>
-        <w:t>Revision 1-3 dựng báo cáo tái lập, full-train/JPEG-DL và synthetic policy. Revision 4-10 đóng SaSPA, LP-A3, NSA, RN-LISDA và Bal-BCE bằng fidelity, causal control, replay và TP/FP gates. Revision 11-14 khóa CAP trước metric, sửa audit-only eval-LSTM, rồi hoàn tất same-lock formal/replay/manual review; CAP đóng negative-but-reusable và retention pass tại SHA 99d1835a...04a636. Revision 15 screen no-run sáu họ successor và cô lập regression OOXML hyperlink. Revision 16 khóa CCR train-only tại protocol/lock SHA 1e408502...f347/6c2a604d...c835. Revision 17 khóa same-tensor/direct-loader erratum SHA f9a901b1...d03b trước implementation. Revision 18 thêm equation engine/head scratch 3.004 tham số tại SHA ac610d7c...d26fe9. Revision 19 thêm direct materializer SHA ff1050bc...7afbfd5, test SHA b6f76b19...5058013, focused CCR/report 30/30, full pytest 1955/1955, Word QA 17/17 và cache bound 160.456.704 byte; vẫn chưa có image pass thật, descriptor, fit, metric, validation/test, production edit hoặc command update.</w:t>
+        <w:t>Revision 1-3 dựng báo cáo tái lập, full-train/JPEG-DL và synthetic policy. Revision 4-10 đóng SaSPA, LP-A3, NSA, RN-LISDA và Bal-BCE bằng fidelity, causal control, replay và TP/FP gates. Revision 11-14 khóa CAP trước metric, sửa audit-only eval-LSTM, rồi hoàn tất same-lock formal/replay/manual review; CAP đóng negative-but-reusable và retention pass tại SHA 99d1835a...04a636. Revision 15 screen no-run sáu họ successor và cô lập regression OOXML hyperlink. Revision 16 khóa CCR train-only tại protocol/lock SHA 1e408502...f347/6c2a604d...c835. Revision 17 khóa same-tensor/direct-loader erratum SHA f9a901b1...d03b trước implementation. Revision 18 thêm equation engine/head scratch 3.004 tham số tại SHA ac610d7c...d26fe9. Revision 19 thêm direct materializer và cache bound 160.456.704 byte. Revision 20 sửa fail-closed Windows path gate tại commit 5b4df3d...02f4b1, khóa materializer/test SHA 3c7e33e9...e6321f7/2675a37a...7a3808 và authorization SHA e76bd56c...07068; focused CCR/report 31/31 và full pytest 1956/1956. Vẫn chưa có image pass thật, descriptor, fit, metric, validation/test, production edit hoặc command update.</w:t>
       </w:r>
     </w:p>
     <w:p>

</xml_diff>

<commit_message>
Fix CCR crop-box production parity
</commit_message>
<xml_diff>
--- a/docs/TRKH_5CLASS_RESEARCH_PROCESS_STATUS.docx
+++ b/docs/TRKH_5CLASS_RESEARCH_PROCESS_STATUS.docx
@@ -75,7 +75,7 @@
           <w:color w:val="202124"/>
           <w:sz w:val="21"/>
         </w:rPr>
-        <w:t>2026-07-25 | Revision 20</w:t>
+        <w:t>2026-07-25 | Revision 21</w:t>
       </w:r>
     </w:p>
     <w:p>
@@ -97,7 +97,7 @@
           <w:color w:val="202124"/>
           <w:sz w:val="21"/>
         </w:rPr>
-        <w:t>Đang nghiên cứu - CCR materializer authorization đã khóa, formal pending</w:t>
+        <w:t>Đang nghiên cứu - CCR formal attempt 1 fail-closed, recovery fix pending</w:t>
       </w:r>
     </w:p>
     <w:p>
@@ -354,7 +354,7 @@
                 <w:color w:val="1F4D78"/>
                 <w:sz w:val="28"/>
               </w:rPr>
-              <w:t>10/10, chưa đọc ảnh thật</w:t>
+              <w:t>11/11, recovery pending</w:t>
             </w:r>
           </w:p>
           <w:p>
@@ -367,7 +367,7 @@
                 <w:color w:val="202124"/>
                 <w:sz w:val="17"/>
               </w:rPr>
-              <w:t>763 rows/735 ảnh; cache &lt;=160.456.704 B; chưa descriptor/fit</w:t>
+              <w:t>Attempt 1 chỉ fail crop-box 1 ULP; output sạch; chưa descriptor/fit</w:t>
             </w:r>
           </w:p>
         </w:tc>
@@ -517,6 +517,19 @@
           <w:sz w:val="22"/>
         </w:rPr>
         <w:t>Revision 20 tái hiện và sửa repository gate trên Windows: Git porcelain hiển thị tên untracked có khoảng trắng bằng chuỗi quoted, làm hai deep-research-report được bảo vệ bị chặn sai. Gate nay dùng porcelain NUL-delimited và regression test đường dẫn literal; bản sửa đã push tại 5b4df3d...02f4b1. Materializer/test SHA mới là 3c7e33e9...e6321f7/2675a37a...7a3808; focused CCR đạt 28/28, focused CCR/report đạt 31/31 và full pytest đạt 1956/1956 trong 74,35 giây với 373 cảnh báo hiện hữu. Authorization SHA e76bd56c...07068 khóa đúng ancestor, output, resource và CPU-only/no-fit/no-validation/test. Word QA đạt 17/17 trang và accessibility 0/0/0. Chưa có image pass thật, descriptor, fit, metric, CUDA, validation/test, integration, full train hay command update.</w:t>
+      </w:r>
+    </w:p>
+    <w:p>
+      <w:pPr>
+        <w:widowControl/>
+      </w:pPr>
+      <w:r>
+        <w:rPr>
+          <w:rFonts w:ascii="Calibri" w:hAnsi="Calibri" w:eastAsia="Calibri"/>
+          <w:color w:val="202124"/>
+          <w:sz w:val="22"/>
+        </w:rPr>
+        <w:t>Revision 21 ghi nhận formal attempt đầu tiên đã tiêu thụ authorization e76bd56c...07068 và dừng fail-closed sau khoảng 25,4 giây. Cả 763 hàng, image/label manifest, model box, valid mask, bbox mask và tensor round-trip đều exact; chỉ crop_boxes_exact=false. Output và thư mục tạm đều vắng, không có descriptor/state/metric/CUDA/validation/test. Đối chiếu source xác định production lấy crop bounds từ bbox gốc nhưng chuyển object boxes qua float32 trước crop-relative box; direct loader thiếu đúng boundary này, tạo sai khác một ULP 2,98e-8 đến 5,96e-8 dù mask giống. Bản sửa và regression test đạt materializer/CCR/full 11/11, 29/29, 1957/1957 trong 74,10 giây với 373 cảnh báo; module/test SHA mới cc30d973...f24af22/f8b2962f...edf5945. Failure evidence SHA 11714304...a554e9; Word QA đạt 18/18 trang và accessibility 0/0/0. Phải commit/push rồi tạo recovery authorization riêng trước lần đọc ảnh thay thế.</w:t>
       </w:r>
     </w:p>
     <w:p>
@@ -9394,7 +9407,25 @@
           <w:color w:val="202124"/>
           <w:sz w:val="22"/>
         </w:rPr>
-        <w:t>Chỉ chạy một formal 735-image materialization và một fresh-process replay; descriptor/head fit vẫn đóng cho đến khi cache, manifest, parity và access-ledger replay exact.</w:t>
+        <w:t>Giữ authorization e76bd56c...07068 ở trạng thái consumed sau attempt 1 fail crop-box exact; bảo toàn failure SHA 11714304...a554e9 và không tái sử dụng authorization cũ.</w:t>
+      </w:r>
+    </w:p>
+    <w:p>
+      <w:pPr>
+        <w:widowControl/>
+        <w:numPr>
+          <w:ilvl w:val="0"/>
+          <w:numId w:val="14"/>
+        </w:numPr>
+        <w:spacing w:after="160" w:line="280" w:lineRule="auto"/>
+      </w:pPr>
+      <w:r>
+        <w:rPr>
+          <w:rFonts w:ascii="Calibri" w:hAnsi="Calibri" w:eastAsia="Calibri"/>
+          <w:color w:val="202124"/>
+          <w:sz w:val="22"/>
+        </w:rPr>
+        <w:t>Commit/push materializer/test correction cc30d973...f24af22/f8b2962f...edf5945, sau đó khóa recovery authorization riêng trước một replacement materialization và fresh-process replay; descriptor/head fit vẫn đóng.</w:t>
       </w:r>
     </w:p>
     <w:p>
@@ -11208,7 +11239,66 @@
                 <w:color w:val="202124"/>
                 <w:sz w:val="18"/>
               </w:rPr>
-              <w:t>Production-parity, packed-mask, path-blocking, no-pixel preflight, synthetic formal và forced-failure cleanup.</w:t>
+              <w:t>Production-parity, float32 crop-order regression, packed-mask, path-blocking, no-pixel preflight, synthetic formal và forced-failure cleanup.</w:t>
+            </w:r>
+          </w:p>
+        </w:tc>
+      </w:tr>
+      <w:tr>
+        <w:trPr>
+          <w:cantSplit/>
+        </w:trPr>
+        <w:tc>
+          <w:tcPr>
+            <w:tcW w:type="dxa" w:w="4050"/>
+            <w:tcMar>
+              <w:top w:w="80" w:type="dxa"/>
+              <w:start w:w="120" w:type="dxa"/>
+              <w:bottom w:w="80" w:type="dxa"/>
+              <w:end w:w="120" w:type="dxa"/>
+            </w:tcMar>
+            <w:vAlign w:val="center"/>
+          </w:tcPr>
+          <w:p>
+            <w:pPr>
+              <w:widowControl/>
+              <w:spacing w:after="0" w:line="247" w:lineRule="auto"/>
+              <w:jc w:val="left"/>
+            </w:pPr>
+            <w:r>
+              <w:rPr>
+                <w:rFonts w:ascii="Calibri" w:hAnsi="Calibri" w:eastAsia="Calibri"/>
+                <w:color w:val="202124"/>
+                <w:sz w:val="18"/>
+              </w:rPr>
+              <w:t>docs/TRKH_5CLASS_CROSS_COLOUR_RATIO_SURFACE_A0_MATERIALIZER_FAILURE_20260725.json</w:t>
+            </w:r>
+          </w:p>
+        </w:tc>
+        <w:tc>
+          <w:tcPr>
+            <w:tcW w:type="dxa" w:w="5310"/>
+            <w:tcMar>
+              <w:top w:w="80" w:type="dxa"/>
+              <w:start w:w="120" w:type="dxa"/>
+              <w:bottom w:w="80" w:type="dxa"/>
+              <w:end w:w="120" w:type="dxa"/>
+            </w:tcMar>
+            <w:vAlign w:val="center"/>
+          </w:tcPr>
+          <w:p>
+            <w:pPr>
+              <w:widowControl/>
+              <w:spacing w:after="0" w:line="247" w:lineRule="auto"/>
+              <w:jc w:val="left"/>
+            </w:pPr>
+            <w:r>
+              <w:rPr>
+                <w:rFonts w:ascii="Calibri" w:hAnsi="Calibri" w:eastAsia="Calibri"/>
+                <w:color w:val="202124"/>
+                <w:sz w:val="18"/>
+              </w:rPr>
+              <w:t>Failure evidence của formal attempt 1, atomic cleanup, root cause một ULP và recovery boundary.</w:t>
             </w:r>
           </w:p>
         </w:tc>
@@ -11229,7 +11319,7 @@
           <w:color w:val="202124"/>
           <w:sz w:val="22"/>
         </w:rPr>
-        <w:t>Revision 1-3 dựng báo cáo tái lập, full-train/JPEG-DL và synthetic policy. Revision 4-10 đóng SaSPA, LP-A3, NSA, RN-LISDA và Bal-BCE bằng fidelity, causal control, replay và TP/FP gates. Revision 11-14 khóa CAP trước metric, sửa audit-only eval-LSTM, rồi hoàn tất same-lock formal/replay/manual review; CAP đóng negative-but-reusable và retention pass tại SHA 99d1835a...04a636. Revision 15 screen no-run sáu họ successor và cô lập regression OOXML hyperlink. Revision 16 khóa CCR train-only tại protocol/lock SHA 1e408502...f347/6c2a604d...c835. Revision 17 khóa same-tensor/direct-loader erratum SHA f9a901b1...d03b trước implementation. Revision 18 thêm equation engine/head scratch 3.004 tham số tại SHA ac610d7c...d26fe9. Revision 19 thêm direct materializer và cache bound 160.456.704 byte. Revision 20 sửa fail-closed Windows path gate tại commit 5b4df3d...02f4b1, khóa materializer/test SHA 3c7e33e9...e6321f7/2675a37a...7a3808 và authorization SHA e76bd56c...07068; focused CCR/report 31/31 và full pytest 1956/1956. Vẫn chưa có image pass thật, descriptor, fit, metric, validation/test, production edit hoặc command update.</w:t>
+        <w:t>Revision 1-3 dựng báo cáo tái lập, full-train/JPEG-DL và synthetic policy. Revision 4-10 đóng SaSPA, LP-A3, NSA, RN-LISDA và Bal-BCE bằng fidelity, causal control, replay và TP/FP gates. Revision 11-14 khóa CAP trước metric, sửa audit-only eval-LSTM, rồi hoàn tất same-lock formal/replay/manual review; CAP đóng negative-but-reusable và retention pass tại SHA 99d1835a...04a636. Revision 15 screen no-run sáu họ successor và cô lập regression OOXML hyperlink. Revision 16 khóa CCR train-only tại protocol/lock SHA 1e408502...f347/6c2a604d...c835. Revision 17 khóa same-tensor/direct-loader erratum SHA f9a901b1...d03b trước implementation. Revision 18 thêm equation engine/head scratch 3.004 tham số tại SHA ac610d7c...d26fe9. Revision 19 thêm direct materializer và cache bound 160.456.704 byte. Revision 20 sửa Windows path gate và khóa authorization e76bd56c...07068. Revision 21 ghi attempt 1 fail-closed crop-box một ULP, failure SHA 11714304...a554e9 và correction cc30d973...f24af22/f8b2962f...edf5945; full pytest 1957/1957. Chưa có descriptor, fit, metric, validation/test, production edit hoặc command update.</w:t>
       </w:r>
     </w:p>
     <w:p>

</xml_diff>

<commit_message>
Record CCR materializer recovery evidence
</commit_message>
<xml_diff>
--- a/docs/TRKH_5CLASS_RESEARCH_PROCESS_STATUS.docx
+++ b/docs/TRKH_5CLASS_RESEARCH_PROCESS_STATUS.docx
@@ -75,7 +75,7 @@
           <w:color w:val="202124"/>
           <w:sz w:val="21"/>
         </w:rPr>
-        <w:t>2026-07-25 | Revision 21</w:t>
+        <w:t>2026-07-25 | Revision 22</w:t>
       </w:r>
     </w:p>
     <w:p>
@@ -97,7 +97,7 @@
           <w:color w:val="202124"/>
           <w:sz w:val="21"/>
         </w:rPr>
-        <w:t>Đang nghiên cứu - CCR formal attempt 1 fail-closed, recovery fix pending</w:t>
+        <w:t>Đang nghiên cứu - CCR materializer replay exact, descriptor/fit chưa mở</w:t>
       </w:r>
     </w:p>
     <w:p>
@@ -354,7 +354,7 @@
                 <w:color w:val="1F4D78"/>
                 <w:sz w:val="28"/>
               </w:rPr>
-              <w:t>11/11, recovery pending</w:t>
+              <w:t>13/13 replay exact</w:t>
             </w:r>
           </w:p>
           <w:p>
@@ -367,7 +367,7 @@
                 <w:color w:val="202124"/>
                 <w:sz w:val="17"/>
               </w:rPr>
-              <w:t>Attempt 1 chỉ fail crop-box 1 ULP; output sạch; chưa descriptor/fit</w:t>
+              <w:t>763 hàng; parity error 0,0; CPU-only; chưa descriptor/fit</w:t>
             </w:r>
           </w:p>
         </w:tc>
@@ -530,6 +530,19 @@
           <w:sz w:val="22"/>
         </w:rPr>
         <w:t>Revision 21 ghi nhận formal attempt đầu tiên đã tiêu thụ authorization e76bd56c...07068 và dừng fail-closed sau khoảng 25,4 giây. Cả 763 hàng, image/label manifest, model box, valid mask, bbox mask và tensor round-trip đều exact; chỉ crop_boxes_exact=false. Output và thư mục tạm đều vắng, không có descriptor/state/metric/CUDA/validation/test. Đối chiếu source xác định production lấy crop bounds từ bbox gốc nhưng chuyển object boxes qua float32 trước crop-relative box; direct loader thiếu đúng boundary này, tạo sai khác một ULP 2,98e-8 đến 5,96e-8 dù mask giống. Bản sửa và regression test đạt materializer/CCR/full 11/11, 29/29, 1957/1957 trong 74,10 giây với 373 cảnh báo; module/test SHA mới cc30d973...f24af22/f8b2962f...edf5945. Failure evidence SHA 11714304...a554e9; Word QA đạt 18/18 trang và accessibility 0/0/0. Phải commit/push rồi tạo recovery authorization riêng trước lần đọc ảnh thay thế.</w:t>
+      </w:r>
+    </w:p>
+    <w:p>
+      <w:pPr>
+        <w:widowControl/>
+      </w:pPr>
+      <w:r>
+        <w:rPr>
+          <w:rFonts w:ascii="Calibri" w:hAnsi="Calibri" w:eastAsia="Calibri"/>
+          <w:color w:val="202124"/>
+          <w:sz w:val="22"/>
+        </w:rPr>
+        <w:t>Revision 22 dùng recovery authorization SHA 7081cece...16e42 đã push tại 3ac7302c...63be2. Replacement materialization và fresh-process replay hoàn tất trong 22,013373/21,784652 giây với PID độc lập 28104/17800. Cả 763 hàng và mọi manifest/box/mask/tensor parity đều exact, sai số tối đa 0,0; 13/13 replay checks pass. Ledger có 2.958 raw event, 1.479 logical read duy nhất gồm 735 ảnh train, 735 label train và chín input bất biến; zero block/write/validation/test. Peak RSS/cache là 744.726.528/156.728.872 byte, CUDA không dùng. Evidence SHA e992c297...98c3ed; Word QA đạt 18/18 trang và accessibility 0/0/0. Cache cục bộ được giữ như dependency tạm, chưa có descriptor, state, fit, metric, production edit hay command update.</w:t>
       </w:r>
     </w:p>
     <w:p>
@@ -9425,7 +9438,25 @@
           <w:color w:val="202124"/>
           <w:sz w:val="22"/>
         </w:rPr>
-        <w:t>Commit/push materializer/test correction cc30d973...f24af22/f8b2962f...edf5945, sau đó khóa recovery authorization riêng trước một replacement materialization và fresh-process replay; descriptor/head fit vẫn đóng.</w:t>
+        <w:t>Giữ correction commit fb1931e9...3442c và recovery authorization commit/SHA 3ac7302c...63be2/7081cece...16e42; authorization cũ vẫn consumed.</w:t>
+      </w:r>
+    </w:p>
+    <w:p>
+      <w:pPr>
+        <w:widowControl/>
+        <w:numPr>
+          <w:ilvl w:val="0"/>
+          <w:numId w:val="14"/>
+        </w:numPr>
+        <w:spacing w:after="160" w:line="280" w:lineRule="auto"/>
+      </w:pPr>
+      <w:r>
+        <w:rPr>
+          <w:rFonts w:ascii="Calibri" w:hAnsi="Calibri" w:eastAsia="Calibri"/>
+          <w:color w:val="202124"/>
+          <w:sz w:val="22"/>
+        </w:rPr>
+        <w:t>Bảo toàn materialization/replay evidence SHA e992c297...98c3ed và cache cục bộ exact; chỉ mở descriptor/four-role head fit sau một boundary riêng được commit/push.</w:t>
       </w:r>
     </w:p>
     <w:p>
@@ -11303,6 +11334,124 @@
           </w:p>
         </w:tc>
       </w:tr>
+      <w:tr>
+        <w:trPr>
+          <w:cantSplit/>
+        </w:trPr>
+        <w:tc>
+          <w:tcPr>
+            <w:tcW w:type="dxa" w:w="4050"/>
+            <w:tcMar>
+              <w:top w:w="80" w:type="dxa"/>
+              <w:start w:w="120" w:type="dxa"/>
+              <w:bottom w:w="80" w:type="dxa"/>
+              <w:end w:w="120" w:type="dxa"/>
+            </w:tcMar>
+            <w:vAlign w:val="center"/>
+          </w:tcPr>
+          <w:p>
+            <w:pPr>
+              <w:widowControl/>
+              <w:spacing w:after="0" w:line="247" w:lineRule="auto"/>
+              <w:jc w:val="left"/>
+            </w:pPr>
+            <w:r>
+              <w:rPr>
+                <w:rFonts w:ascii="Calibri" w:hAnsi="Calibri" w:eastAsia="Calibri"/>
+                <w:color w:val="202124"/>
+                <w:sz w:val="18"/>
+              </w:rPr>
+              <w:t>docs/TRKH_5CLASS_CROSS_COLOUR_RATIO_SURFACE_A0_MATERIALIZER_RECOVERY_AUTHORIZATION_20260725.json</w:t>
+            </w:r>
+          </w:p>
+        </w:tc>
+        <w:tc>
+          <w:tcPr>
+            <w:tcW w:type="dxa" w:w="5310"/>
+            <w:tcMar>
+              <w:top w:w="80" w:type="dxa"/>
+              <w:start w:w="120" w:type="dxa"/>
+              <w:bottom w:w="80" w:type="dxa"/>
+              <w:end w:w="120" w:type="dxa"/>
+            </w:tcMar>
+            <w:vAlign w:val="center"/>
+          </w:tcPr>
+          <w:p>
+            <w:pPr>
+              <w:widowControl/>
+              <w:spacing w:after="0" w:line="247" w:lineRule="auto"/>
+              <w:jc w:val="left"/>
+            </w:pPr>
+            <w:r>
+              <w:rPr>
+                <w:rFonts w:ascii="Calibri" w:hAnsi="Calibri" w:eastAsia="Calibri"/>
+                <w:color w:val="202124"/>
+                <w:sz w:val="18"/>
+              </w:rPr>
+              <w:t>Authorization một lần đã push cho replacement materialization và fresh-process replay, vẫn no-fit.</w:t>
+            </w:r>
+          </w:p>
+        </w:tc>
+      </w:tr>
+      <w:tr>
+        <w:trPr>
+          <w:cantSplit/>
+        </w:trPr>
+        <w:tc>
+          <w:tcPr>
+            <w:tcW w:type="dxa" w:w="4050"/>
+            <w:tcMar>
+              <w:top w:w="80" w:type="dxa"/>
+              <w:start w:w="120" w:type="dxa"/>
+              <w:bottom w:w="80" w:type="dxa"/>
+              <w:end w:w="120" w:type="dxa"/>
+            </w:tcMar>
+            <w:vAlign w:val="center"/>
+          </w:tcPr>
+          <w:p>
+            <w:pPr>
+              <w:widowControl/>
+              <w:spacing w:after="0" w:line="247" w:lineRule="auto"/>
+              <w:jc w:val="left"/>
+            </w:pPr>
+            <w:r>
+              <w:rPr>
+                <w:rFonts w:ascii="Calibri" w:hAnsi="Calibri" w:eastAsia="Calibri"/>
+                <w:color w:val="202124"/>
+                <w:sz w:val="18"/>
+              </w:rPr>
+              <w:t>docs/TRKH_5CLASS_CROSS_COLOUR_RATIO_SURFACE_A0_MATERIALIZER_RECOVERY_EVIDENCE_20260725.json</w:t>
+            </w:r>
+          </w:p>
+        </w:tc>
+        <w:tc>
+          <w:tcPr>
+            <w:tcW w:type="dxa" w:w="5310"/>
+            <w:tcMar>
+              <w:top w:w="80" w:type="dxa"/>
+              <w:start w:w="120" w:type="dxa"/>
+              <w:bottom w:w="80" w:type="dxa"/>
+              <w:end w:w="120" w:type="dxa"/>
+            </w:tcMar>
+            <w:vAlign w:val="center"/>
+          </w:tcPr>
+          <w:p>
+            <w:pPr>
+              <w:widowControl/>
+              <w:spacing w:after="0" w:line="247" w:lineRule="auto"/>
+              <w:jc w:val="left"/>
+            </w:pPr>
+            <w:r>
+              <w:rPr>
+                <w:rFonts w:ascii="Calibri" w:hAnsi="Calibri" w:eastAsia="Calibri"/>
+                <w:color w:val="202124"/>
+                <w:sz w:val="18"/>
+              </w:rPr>
+              <w:t>Hash, schema, parity, resource, ledger và replay evidence; pin cache cục bộ nhưng không đưa binary lớn vào Git.</w:t>
+            </w:r>
+          </w:p>
+        </w:tc>
+      </w:tr>
     </w:tbl>
     <w:p>
       <w:pPr>
@@ -11319,7 +11468,7 @@
           <w:color w:val="202124"/>
           <w:sz w:val="22"/>
         </w:rPr>
-        <w:t>Revision 1-3 dựng báo cáo tái lập, full-train/JPEG-DL và synthetic policy. Revision 4-10 đóng SaSPA, LP-A3, NSA, RN-LISDA và Bal-BCE bằng fidelity, causal control, replay và TP/FP gates. Revision 11-14 khóa CAP trước metric, sửa audit-only eval-LSTM, rồi hoàn tất same-lock formal/replay/manual review; CAP đóng negative-but-reusable và retention pass tại SHA 99d1835a...04a636. Revision 15 screen no-run sáu họ successor và cô lập regression OOXML hyperlink. Revision 16 khóa CCR train-only tại protocol/lock SHA 1e408502...f347/6c2a604d...c835. Revision 17 khóa same-tensor/direct-loader erratum SHA f9a901b1...d03b trước implementation. Revision 18 thêm equation engine/head scratch 3.004 tham số tại SHA ac610d7c...d26fe9. Revision 19 thêm direct materializer và cache bound 160.456.704 byte. Revision 20 sửa Windows path gate và khóa authorization e76bd56c...07068. Revision 21 ghi attempt 1 fail-closed crop-box một ULP, failure SHA 11714304...a554e9 và correction cc30d973...f24af22/f8b2962f...edf5945; full pytest 1957/1957. Chưa có descriptor, fit, metric, validation/test, production edit hoặc command update.</w:t>
+        <w:t>Revision 1-3 dựng báo cáo tái lập, full-train/JPEG-DL và synthetic policy. Revision 4-10 đóng SaSPA, LP-A3, NSA, RN-LISDA và Bal-BCE bằng fidelity, causal control, replay và TP/FP gates. Revision 11-14 khóa CAP trước metric, sửa audit-only eval-LSTM, rồi hoàn tất same-lock formal/replay/manual review; CAP đóng negative-but-reusable và retention pass tại SHA 99d1835a...04a636. Revision 15 screen no-run sáu họ successor và cô lập regression OOXML hyperlink. Revision 16 khóa CCR train-only tại protocol/lock SHA 1e408502...f347/6c2a604d...c835. Revision 17 khóa same-tensor/direct-loader erratum SHA f9a901b1...d03b trước implementation. Revision 18 thêm equation engine/head scratch 3.004 tham số tại SHA ac610d7c...d26fe9. Revision 19 thêm direct materializer và cache bound 160.456.704 byte. Revision 20 sửa Windows path gate và khóa authorization e76bd56c...07068. Revision 21 ghi attempt 1 fail-closed crop-box một ULP và correction cc30d973...f24af22/f8b2962f...edf5945. Revision 22 hoàn tất recovery materialization/replay exact tại authorization 7081cece...16e42, evidence e992c297...98c3ed, Word QA 18/18 và accessibility 0/0/0. Chưa có descriptor, fit, metric, validation/test, production edit hoặc command update.</w:t>
       </w:r>
     </w:p>
     <w:p>

</xml_diff>

<commit_message>
Add prospective CCR fit runner
</commit_message>
<xml_diff>
--- a/docs/TRKH_5CLASS_RESEARCH_PROCESS_STATUS.docx
+++ b/docs/TRKH_5CLASS_RESEARCH_PROCESS_STATUS.docx
@@ -75,7 +75,7 @@
           <w:color w:val="202124"/>
           <w:sz w:val="21"/>
         </w:rPr>
-        <w:t>2026-07-25 | Revision 22</w:t>
+        <w:t>2026-07-25 | Revision 23</w:t>
       </w:r>
     </w:p>
     <w:p>
@@ -97,7 +97,7 @@
           <w:color w:val="202124"/>
           <w:sz w:val="21"/>
         </w:rPr>
-        <w:t>Đang nghiên cứu - CCR materializer replay exact, descriptor/fit chưa mở</w:t>
+        <w:t>Đang nghiên cứu - CCR fit runner đã triển khai, chưa được ủy quyền chạy</w:t>
       </w:r>
     </w:p>
     <w:p>
@@ -340,7 +340,7 @@
                 <w:color w:val="5F6368"/>
                 <w:sz w:val="16"/>
               </w:rPr>
-              <w:t>CCR MATERIALIZER</w:t>
+              <w:t>CCR FIT RUNNER</w:t>
             </w:r>
           </w:p>
           <w:p>
@@ -354,7 +354,7 @@
                 <w:color w:val="1F4D78"/>
                 <w:sz w:val="28"/>
               </w:rPr>
-              <w:t>13/13 replay exact</w:t>
+              <w:t>44/44 focused pass</w:t>
             </w:r>
           </w:p>
           <w:p>
@@ -367,7 +367,7 @@
                 <w:color w:val="202124"/>
                 <w:sz w:val="17"/>
               </w:rPr>
-              <w:t>763 hàng; parity error 0,0; CPU-only; chưa descriptor/fit</w:t>
+              <w:t>Preflight không descriptor pass; formal fit chưa được ủy quyền</w:t>
             </w:r>
           </w:p>
         </w:tc>
@@ -543,6 +543,19 @@
           <w:sz w:val="22"/>
         </w:rPr>
         <w:t>Revision 22 dùng recovery authorization SHA 7081cece...16e42 đã push tại 3ac7302c...63be2. Replacement materialization và fresh-process replay hoàn tất trong 22,013373/21,784652 giây với PID độc lập 28104/17800. Cả 763 hàng và mọi manifest/box/mask/tensor parity đều exact, sai số tối đa 0,0; 13/13 replay checks pass. Ledger có 2.958 raw event, 1.479 logical read duy nhất gồm 735 ảnh train, 735 label train và chín input bất biến; zero block/write/validation/test. Peak RSS/cache là 744.726.528/156.728.872 byte, CUDA không dùng. Evidence SHA e992c297...98c3ed; Word QA đạt 18/18 trang và accessibility 0/0/0. Cache cục bộ được giữ như dependency tạm, chưa có descriptor, state, fit, metric, production edit hay command update.</w:t>
+      </w:r>
+    </w:p>
+    <w:p>
+      <w:pPr>
+        <w:widowControl/>
+      </w:pPr>
+      <w:r>
+        <w:rPr>
+          <w:rFonts w:ascii="Calibri" w:hAnsi="Calibri" w:eastAsia="Calibri"/>
+          <w:color w:val="202124"/>
+          <w:sz w:val="22"/>
+        </w:rPr>
+        <w:t>Revision 23 triển khai prospective CCR fit runner riêng sau khi evidence được push tại afa38ce...5481. Runner dùng duy nhất cache exact và CIDT clean train CSV, huấn luyện bốn vai trò scratch 3.004 tham số trên năm source-held folds, giữ một descriptor family tại một thời điểm, khóa threshold reuse cho same-weight dephase, ledger fail-closed và replay fresh-process 1e-7. Focused runner/CCR/full đạt 15/15, 44/44 và 1972/1972; post-fit snapshot chặn worker Python/TensorRT còn sống. Preflight không tạo descriptor dự báo 333.700.752/429.496.730 byte, CUDA BF16 sẵn sàng, GPU 19%, VRAM nền 771/8188 MiB và không có Python/TensorRT GPU lạ. Word QA đạt 18/18 trang và accessibility 0/0/0. Đây vẫn là engineering boundary chưa được ủy quyền: chưa có descriptor, fit, state, metric, validation/test, integration, full train hay command update.</w:t>
       </w:r>
     </w:p>
     <w:p>
@@ -11302,6 +11315,65 @@
                 <w:color w:val="202124"/>
                 <w:sz w:val="18"/>
               </w:rPr>
+              <w:t>CCR fit runner / test / implementation note</w:t>
+            </w:r>
+          </w:p>
+        </w:tc>
+        <w:tc>
+          <w:tcPr>
+            <w:tcW w:type="dxa" w:w="5310"/>
+            <w:tcMar>
+              <w:top w:w="80" w:type="dxa"/>
+              <w:start w:w="120" w:type="dxa"/>
+              <w:bottom w:w="80" w:type="dxa"/>
+              <w:end w:w="120" w:type="dxa"/>
+            </w:tcMar>
+            <w:vAlign w:val="center"/>
+          </w:tcPr>
+          <w:p>
+            <w:pPr>
+              <w:widowControl/>
+              <w:spacing w:after="0" w:line="247" w:lineRule="auto"/>
+              <w:jc w:val="left"/>
+            </w:pPr>
+            <w:r>
+              <w:rPr>
+                <w:rFonts w:ascii="Calibri" w:hAnsi="Calibri" w:eastAsia="Calibri"/>
+                <w:color w:val="202124"/>
+                <w:sz w:val="18"/>
+              </w:rPr>
+              <w:t>Four-role/five-fold clean gate, ledger/resource/atomic replay, threshold reuse và prospective downstream closure.</w:t>
+            </w:r>
+          </w:p>
+        </w:tc>
+      </w:tr>
+      <w:tr>
+        <w:trPr>
+          <w:cantSplit/>
+        </w:trPr>
+        <w:tc>
+          <w:tcPr>
+            <w:tcW w:type="dxa" w:w="4050"/>
+            <w:tcMar>
+              <w:top w:w="80" w:type="dxa"/>
+              <w:start w:w="120" w:type="dxa"/>
+              <w:bottom w:w="80" w:type="dxa"/>
+              <w:end w:w="120" w:type="dxa"/>
+            </w:tcMar>
+            <w:vAlign w:val="center"/>
+          </w:tcPr>
+          <w:p>
+            <w:pPr>
+              <w:widowControl/>
+              <w:spacing w:after="0" w:line="247" w:lineRule="auto"/>
+              <w:jc w:val="left"/>
+            </w:pPr>
+            <w:r>
+              <w:rPr>
+                <w:rFonts w:ascii="Calibri" w:hAnsi="Calibri" w:eastAsia="Calibri"/>
+                <w:color w:val="202124"/>
+                <w:sz w:val="18"/>
+              </w:rPr>
               <w:t>docs/TRKH_5CLASS_CROSS_COLOUR_RATIO_SURFACE_A0_MATERIALIZER_FAILURE_20260725.json</w:t>
             </w:r>
           </w:p>

</xml_diff>

<commit_message>
Harden CCR fit recovery harness
</commit_message>
<xml_diff>
--- a/docs/TRKH_5CLASS_RESEARCH_PROCESS_STATUS.docx
+++ b/docs/TRKH_5CLASS_RESEARCH_PROCESS_STATUS.docx
@@ -75,7 +75,7 @@
           <w:color w:val="202124"/>
           <w:sz w:val="21"/>
         </w:rPr>
-        <w:t>2026-07-25 | Revision 23</w:t>
+        <w:t>2026-07-25 | Revision 24</w:t>
       </w:r>
     </w:p>
     <w:p>
@@ -97,7 +97,7 @@
           <w:color w:val="202124"/>
           <w:sz w:val="21"/>
         </w:rPr>
-        <w:t>Đang nghiên cứu - CCR fit runner đã triển khai, chưa được ủy quyền chạy</w:t>
+        <w:t>Đang nghiên cứu - CCR fit attempt 1 dừng ở harness, recovery chưa được ủy quyền</w:t>
       </w:r>
     </w:p>
     <w:p>
@@ -340,7 +340,7 @@
                 <w:color w:val="5F6368"/>
                 <w:sz w:val="16"/>
               </w:rPr>
-              <w:t>CCR FIT RUNNER</w:t>
+              <w:t>CCR FIT ATTEMPT 1</w:t>
             </w:r>
           </w:p>
           <w:p>
@@ -354,7 +354,7 @@
                 <w:color w:val="1F4D78"/>
                 <w:sz w:val="28"/>
               </w:rPr>
-              <w:t>44/44 focused pass</w:t>
+              <w:t>Chưa có candidate metric</w:t>
             </w:r>
           </w:p>
           <w:p>
@@ -367,7 +367,7 @@
                 <w:color w:val="202124"/>
                 <w:sz w:val="17"/>
               </w:rPr>
-              <w:t>Preflight không descriptor pass; formal fit chưa được ủy quyền</w:t>
+              <w:t>cuBLAS deterministic fail; recovery-chain đạt 19/19, 48/48, 1976/1976</w:t>
             </w:r>
           </w:p>
         </w:tc>
@@ -556,6 +556,19 @@
           <w:sz w:val="22"/>
         </w:rPr>
         <w:t>Revision 23 triển khai prospective CCR fit runner riêng sau khi evidence được push tại afa38ce...5481. Runner dùng duy nhất cache exact và CIDT clean train CSV, huấn luyện bốn vai trò scratch 3.004 tham số trên năm source-held folds, giữ một descriptor family tại một thời điểm, khóa threshold reuse cho same-weight dephase, ledger fail-closed và replay fresh-process 1e-7. Focused runner/CCR/full đạt 15/15, 44/44 và 1972/1972; post-fit snapshot chặn worker Python/TensorRT còn sống. Preflight không tạo descriptor dự báo 333.700.752/429.496.730 byte, CUDA BF16 sẵn sàng, GPU 19%, VRAM nền 771/8188 MiB và không có Python/TensorRT GPU lạ. Word QA đạt 18/18 trang và accessibility 0/0/0. Đây vẫn là engineering boundary chưa được ủy quyền: chưa có descriptor, fit, state, metric, validation/test, integration, full train hay command update.</w:t>
+      </w:r>
+    </w:p>
+    <w:p>
+      <w:pPr>
+        <w:widowControl/>
+      </w:pPr>
+      <w:r>
+        <w:rPr>
+          <w:rFonts w:ascii="Calibri" w:hAnsi="Calibri" w:eastAsia="Calibri"/>
+          <w:color w:val="202124"/>
+          <w:sz w:val="22"/>
+        </w:rPr>
+        <w:t>Revision 24 ghi formal attempt 1 dưới authorization SHA 3ecb6a82...d1697b5 đã push tại b24c16c...5b8ae. Preflight sạch pass, nhưng attempt dừng sau 52,8 giây ở descriptor CCR: năm plain colour-ratio control fold chỉ hoàn tất trong RAM rồi deterministic cuBLAS matmul yêu cầu CUBLAS_WORKSPACE_CONFIG trước CUDA init. Traceback giữ memmap làm cleanup tức thời gặp WinError 32; sau khi process thoát, đúng hai scratch file 168.763.520/7.031.936 byte và thư mục tạm đã được xóa, formal output vắng. Không có candidate state/score/threshold/action/metric hay validation/test. Correction chỉ đặt :4096:8 trước Torch import, đóng memmap trong finally và yêu cầu recovery authorization pin failure SHA cùng consumed authorization SHA; fresh CUDA matmul, live-handle deletion, runner/CCR/full test đạt 19/19, 48/48 và 1976/1976. Authorization cũ đã consumed; recovery phải commit/push và có authorization mới.</w:t>
       </w:r>
     </w:p>
     <w:p>
@@ -11342,7 +11355,66 @@
                 <w:color w:val="202124"/>
                 <w:sz w:val="18"/>
               </w:rPr>
-              <w:t>Four-role/five-fold clean gate, ledger/resource/atomic replay, threshold reuse và prospective downstream closure.</w:t>
+              <w:t>Four-role/five-fold clean gate, deterministic cuBLAS init, explicit memmap cleanup, ledger/resource/atomic replay và threshold reuse.</w:t>
+            </w:r>
+          </w:p>
+        </w:tc>
+      </w:tr>
+      <w:tr>
+        <w:trPr>
+          <w:cantSplit/>
+        </w:trPr>
+        <w:tc>
+          <w:tcPr>
+            <w:tcW w:type="dxa" w:w="4050"/>
+            <w:tcMar>
+              <w:top w:w="80" w:type="dxa"/>
+              <w:start w:w="120" w:type="dxa"/>
+              <w:bottom w:w="80" w:type="dxa"/>
+              <w:end w:w="120" w:type="dxa"/>
+            </w:tcMar>
+            <w:vAlign w:val="center"/>
+          </w:tcPr>
+          <w:p>
+            <w:pPr>
+              <w:widowControl/>
+              <w:spacing w:after="0" w:line="247" w:lineRule="auto"/>
+              <w:jc w:val="left"/>
+            </w:pPr>
+            <w:r>
+              <w:rPr>
+                <w:rFonts w:ascii="Calibri" w:hAnsi="Calibri" w:eastAsia="Calibri"/>
+                <w:color w:val="202124"/>
+                <w:sz w:val="18"/>
+              </w:rPr>
+              <w:t>docs/TRKH_5CLASS_CROSS_COLOUR_RATIO_SURFACE_A0_FIT_FAILURE_20260725.json</w:t>
+            </w:r>
+          </w:p>
+        </w:tc>
+        <w:tc>
+          <w:tcPr>
+            <w:tcW w:type="dxa" w:w="5310"/>
+            <w:tcMar>
+              <w:top w:w="80" w:type="dxa"/>
+              <w:start w:w="120" w:type="dxa"/>
+              <w:bottom w:w="80" w:type="dxa"/>
+              <w:end w:w="120" w:type="dxa"/>
+            </w:tcMar>
+            <w:vAlign w:val="center"/>
+          </w:tcPr>
+          <w:p>
+            <w:pPr>
+              <w:widowControl/>
+              <w:spacing w:after="0" w:line="247" w:lineRule="auto"/>
+              <w:jc w:val="left"/>
+            </w:pPr>
+            <w:r>
+              <w:rPr>
+                <w:rFonts w:ascii="Calibri" w:hAnsi="Calibri" w:eastAsia="Calibri"/>
+                <w:color w:val="202124"/>
+                <w:sz w:val="18"/>
+              </w:rPr>
+              <w:t>Attempt-1 harness failure, exact temporary artifacts, post-process cleanup, consumed authorization và narrow recovery scope.</w:t>
             </w:r>
           </w:p>
         </w:tc>
@@ -11540,7 +11612,7 @@
           <w:color w:val="202124"/>
           <w:sz w:val="22"/>
         </w:rPr>
-        <w:t>Revision 1-3 dựng báo cáo tái lập, full-train/JPEG-DL và synthetic policy. Revision 4-10 đóng SaSPA, LP-A3, NSA, RN-LISDA và Bal-BCE bằng fidelity, causal control, replay và TP/FP gates. Revision 11-14 khóa CAP trước metric, sửa audit-only eval-LSTM, rồi hoàn tất same-lock formal/replay/manual review; CAP đóng negative-but-reusable và retention pass tại SHA 99d1835a...04a636. Revision 15 screen no-run sáu họ successor và cô lập regression OOXML hyperlink. Revision 16 khóa CCR train-only tại protocol/lock SHA 1e408502...f347/6c2a604d...c835. Revision 17 khóa same-tensor/direct-loader erratum SHA f9a901b1...d03b trước implementation. Revision 18 thêm equation engine/head scratch 3.004 tham số tại SHA ac610d7c...d26fe9. Revision 19 thêm direct materializer và cache bound 160.456.704 byte. Revision 20 sửa Windows path gate và khóa authorization e76bd56c...07068. Revision 21 ghi attempt 1 fail-closed crop-box một ULP và correction cc30d973...f24af22/f8b2962f...edf5945. Revision 22 hoàn tất recovery materialization/replay exact tại authorization 7081cece...16e42, evidence e992c297...98c3ed, Word QA 18/18 và accessibility 0/0/0. Chưa có descriptor, fit, metric, validation/test, production edit hoặc command update.</w:t>
+        <w:t>Revision 1-3 dựng báo cáo tái lập, full-train/JPEG-DL và synthetic policy. Revision 4-10 đóng SaSPA, LP-A3, NSA, RN-LISDA và Bal-BCE bằng fidelity, causal control, replay và TP/FP gates. Revision 11-14 khóa CAP trước metric, sửa audit-only eval-LSTM, rồi hoàn tất same-lock formal/replay/manual review; CAP đóng negative-but-reusable và retention pass tại SHA 99d1835a...04a636. Revision 15 screen no-run sáu họ successor và cô lập regression OOXML hyperlink. Revision 16-18 khóa CCR train-only, same-tensor erratum và equation engine/head scratch 3.004 tham số. Revision 19-22 hoàn tất direct materializer, Windows path gate, one-ULP recovery và exact cache evidence e992c297...98c3ed. Revision 23 push four-role fit runner tại 0289a94. Revision 24 ghi authorization 3ecb6a82...d1697b5 đã consumed bởi deterministic-cuBLAS harness failure trước candidate metric; correction :4096:8, explicit memmap close và exact recovery-chain verifier phải được commit/push rồi cấp recovery authorization riêng. Chưa có candidate state, score, threshold, action, metric, validation/test, production edit hoặc command update.</w:t>
       </w:r>
     </w:p>
     <w:p>

</xml_diff>

<commit_message>
Close CCR surface fit experiment
</commit_message>
<xml_diff>
--- a/docs/TRKH_5CLASS_RESEARCH_PROCESS_STATUS.docx
+++ b/docs/TRKH_5CLASS_RESEARCH_PROCESS_STATUS.docx
@@ -75,7 +75,7 @@
           <w:color w:val="202124"/>
           <w:sz w:val="21"/>
         </w:rPr>
-        <w:t>2026-07-25 | Revision 24</w:t>
+        <w:t>2026-07-25 | Revision 25</w:t>
       </w:r>
     </w:p>
     <w:p>
@@ -97,7 +97,7 @@
           <w:color w:val="202124"/>
           <w:sz w:val="21"/>
         </w:rPr>
-        <w:t>Đang nghiên cứu - CCR fit attempt 1 dừng ở harness, recovery chưa được ủy quyền</w:t>
+        <w:t>Đang nghiên cứu - CCR A0 đã đóng negative-but-reusable; successor khác biệt đang được sàng lọc</w:t>
       </w:r>
     </w:p>
     <w:p>
@@ -340,7 +340,7 @@
                 <w:color w:val="5F6368"/>
                 <w:sz w:val="16"/>
               </w:rPr>
-              <w:t>CCR FIT ATTEMPT 1</w:t>
+              <w:t>CCR SURFACE A0</w:t>
             </w:r>
           </w:p>
           <w:p>
@@ -354,7 +354,7 @@
                 <w:color w:val="1F4D78"/>
                 <w:sz w:val="28"/>
               </w:rPr>
-              <w:t>Chưa có candidate metric</w:t>
+              <w:t>Rejected: AUROC 0.535520</w:t>
             </w:r>
           </w:p>
           <w:p>
@@ -367,7 +367,7 @@
                 <w:color w:val="202124"/>
                 <w:sz w:val="17"/>
               </w:rPr>
-              <w:t>cuBLAS deterministic fail; recovery-chain đạt 19/19, 48/48, 1976/1976</w:t>
+              <w:t>Chỉ sửa 2 FP nhưng phá 30 TP; macro/class-1 F1 giảm 0.006738/0.026845</w:t>
             </w:r>
           </w:p>
         </w:tc>
@@ -412,7 +412,7 @@
           <w:color w:val="202124"/>
           <w:sz w:val="21"/>
         </w:rPr>
-        <w:t>Giữ nguyên keeper và file lệnh full-train tốt nhất. CAP rerun cùng lock đã hoàn tất formal, fresh-process replay và review đủ 20 hàng XAI nhưng bị loại: AUROC 0,560111, chỉ sửa 5 restricted FP và phá 14 TP lớp 1; macro/class-1 F1 giảm còn 0,937491/0,805643. Sau CAP, sáu họ Self-ONN, learnable morphology, PointNet/Deep Sets, DeepEMD/optimal transport, normalizing flow và hierarchical material recognition đều bị screen no-run vì trùng cơ chế, thiếu tín hiệu bề mặt lớp-điều-kiện hoặc không phù hợp deployment. Không integration, validation/test, probe/full train hoặc command update. Mọi classifier đề xuất vẫn scratch-only; pretrained baseline chỉ được dùng đối chiếu.</w:t>
+        <w:t>Giữ nguyên keeper và file lệnh full-train tốt nhất. CCR Surface A0 đã hoàn tất formal và fresh-process replay exact nhưng bị loại: AUROC 0,535520 thấp hơn keeper margin 0,816697, chỉ sửa 2 restricted FP và phá 30 TP lớp 1; macro/class-1 F1 giảm 0,006738/0,026845. Same-weight dephase chứng minh head dùng bố cục không gian nhưng tín hiệu không đủ phân biệt hoặc an toàn. Không chạy XAI/downstream vì clean gate đã fail; không integration, validation/test, probe/full train hoặc command update. Mọi classifier đề xuất vẫn scratch-only; pretrained baseline chỉ được dùng đối chiếu.</w:t>
       </w:r>
     </w:p>
     <w:p>
@@ -569,6 +569,19 @@
           <w:sz w:val="22"/>
         </w:rPr>
         <w:t>Revision 24 ghi formal attempt 1 dưới authorization SHA 3ecb6a82...d1697b5 đã push tại b24c16c...5b8ae. Preflight sạch pass, nhưng attempt dừng sau 52,8 giây ở descriptor CCR: năm plain colour-ratio control fold chỉ hoàn tất trong RAM rồi deterministic cuBLAS matmul yêu cầu CUBLAS_WORKSPACE_CONFIG trước CUDA init. Traceback giữ memmap làm cleanup tức thời gặp WinError 32; sau khi process thoát, đúng hai scratch file 168.763.520/7.031.936 byte và thư mục tạm đã được xóa, formal output vắng. Không có candidate state/score/threshold/action/metric hay validation/test. Correction chỉ đặt :4096:8 trước Torch import, đóng memmap trong finally và yêu cầu recovery authorization pin failure SHA cùng consumed authorization SHA; fresh CUDA matmul, live-handle deletion, runner/CCR/full test đạt 19/19, 48/48 và 1976/1976. Authorization cũ đã consumed; recovery phải commit/push và có authorization mới.</w:t>
+      </w:r>
+    </w:p>
+    <w:p>
+      <w:pPr>
+        <w:widowControl/>
+      </w:pPr>
+      <w:r>
+        <w:rPr>
+          <w:rFonts w:ascii="Calibri" w:hAnsi="Calibri" w:eastAsia="Calibri"/>
+          <w:color w:val="202124"/>
+          <w:sz w:val="22"/>
+        </w:rPr>
+        <w:t>Revision 25 ghi correction/failure evidence đã push tại 0218379...ef0b71 và recovery authorization SHA b7cda19b...a36770 tại 54c3e5c...748df. Sole replacement formal/replay hoàn tất trong 190,493/188,756 giây; 180 state arrays và 46 output arrays exact với sai số 0,0, không đọc raw/validation/test và mọi resource/ledger/worker gate đều pass. Clean science gate fail: CCR AUROC/AUPRC 0,535520/0,757140 so với keeper 0,816697/0,921070; chỉ sửa 2/222 restricted FP nhưng phá 30 TP, giảm macro/class-1 F1 0,006738/0,026845. Seed repeat ổn định nhưng cũng âm; same-weight dephase chứng minh spatial use chứ không chứng minh phân biệt lớp. XAI và downstream không được mở. Evidence/closure SHA là 868f8e40...dcfa9/a3cc3e36...bb634; exact CCR neighborhood được đóng và keeper/lệnh full-train/history giữ nguyên.</w:t>
       </w:r>
     </w:p>
     <w:p>
@@ -2579,6 +2592,146 @@
                 <w:sz w:val="18"/>
               </w:rPr>
               <w:t>Rejected; AUROC 0,5601, net -9, XAI fail</w:t>
+            </w:r>
+          </w:p>
+        </w:tc>
+      </w:tr>
+      <w:tr>
+        <w:trPr>
+          <w:cantSplit/>
+        </w:trPr>
+        <w:tc>
+          <w:tcPr>
+            <w:tcW w:type="dxa" w:w="1500"/>
+            <w:tcMar>
+              <w:top w:w="80" w:type="dxa"/>
+              <w:start w:w="120" w:type="dxa"/>
+              <w:bottom w:w="80" w:type="dxa"/>
+              <w:end w:w="120" w:type="dxa"/>
+            </w:tcMar>
+            <w:vAlign w:val="center"/>
+          </w:tcPr>
+          <w:p>
+            <w:pPr>
+              <w:widowControl/>
+              <w:spacing w:after="0" w:line="247" w:lineRule="auto"/>
+              <w:jc w:val="left"/>
+            </w:pPr>
+            <w:r>
+              <w:rPr>
+                <w:rFonts w:ascii="Calibri" w:hAnsi="Calibri" w:eastAsia="Calibri"/>
+                <w:color w:val="202124"/>
+                <w:sz w:val="18"/>
+              </w:rPr>
+              <w:t>CCR Surface A0</w:t>
+            </w:r>
+          </w:p>
+        </w:tc>
+        <w:tc>
+          <w:tcPr>
+            <w:tcW w:type="dxa" w:w="2250"/>
+            <w:tcMar>
+              <w:top w:w="80" w:type="dxa"/>
+              <w:start w:w="120" w:type="dxa"/>
+              <w:bottom w:w="80" w:type="dxa"/>
+              <w:end w:w="120" w:type="dxa"/>
+            </w:tcMar>
+            <w:vAlign w:val="center"/>
+          </w:tcPr>
+          <w:p>
+            <w:pPr>
+              <w:widowControl/>
+              <w:spacing w:after="0" w:line="247" w:lineRule="auto"/>
+              <w:jc w:val="left"/>
+            </w:pPr>
+            <w:r>
+              <w:rPr>
+                <w:rFonts w:ascii="Calibri" w:hAnsi="Calibri" w:eastAsia="Calibri"/>
+                <w:color w:val="202124"/>
+                <w:sz w:val="18"/>
+              </w:rPr>
+              <w:t>Cohort 763; 5 source-held folds; train-only</w:t>
+            </w:r>
+          </w:p>
+        </w:tc>
+        <w:tc>
+          <w:tcPr>
+            <w:tcW w:type="dxa" w:w="1050"/>
+            <w:tcMar>
+              <w:top w:w="80" w:type="dxa"/>
+              <w:start w:w="120" w:type="dxa"/>
+              <w:bottom w:w="80" w:type="dxa"/>
+              <w:end w:w="120" w:type="dxa"/>
+            </w:tcMar>
+            <w:vAlign w:val="center"/>
+          </w:tcPr>
+          <w:p>
+            <w:pPr>
+              <w:widowControl/>
+              <w:spacing w:after="0" w:line="247" w:lineRule="auto"/>
+              <w:jc w:val="center"/>
+            </w:pPr>
+            <w:r>
+              <w:rPr>
+                <w:rFonts w:ascii="Calibri" w:hAnsi="Calibri" w:eastAsia="Calibri"/>
+                <w:color w:val="202124"/>
+                <w:sz w:val="18"/>
+              </w:rPr>
+              <w:t>0,933138</w:t>
+            </w:r>
+          </w:p>
+        </w:tc>
+        <w:tc>
+          <w:tcPr>
+            <w:tcW w:type="dxa" w:w="2450"/>
+            <w:tcMar>
+              <w:top w:w="80" w:type="dxa"/>
+              <w:start w:w="120" w:type="dxa"/>
+              <w:bottom w:w="80" w:type="dxa"/>
+              <w:end w:w="120" w:type="dxa"/>
+            </w:tcMar>
+            <w:vAlign w:val="center"/>
+          </w:tcPr>
+          <w:p>
+            <w:pPr>
+              <w:widowControl/>
+              <w:spacing w:after="0" w:line="247" w:lineRule="auto"/>
+              <w:jc w:val="left"/>
+            </w:pPr>
+            <w:r>
+              <w:rPr>
+                <w:rFonts w:ascii="Calibri" w:hAnsi="Calibri" w:eastAsia="Calibri"/>
+                <w:color w:val="202124"/>
+                <w:sz w:val="18"/>
+              </w:rPr>
+              <w:t>0,689751 / 0,920518 / 0,788599</w:t>
+            </w:r>
+          </w:p>
+        </w:tc>
+        <w:tc>
+          <w:tcPr>
+            <w:tcW w:type="dxa" w:w="2110"/>
+            <w:tcMar>
+              <w:top w:w="80" w:type="dxa"/>
+              <w:start w:w="120" w:type="dxa"/>
+              <w:bottom w:w="80" w:type="dxa"/>
+              <w:end w:w="120" w:type="dxa"/>
+            </w:tcMar>
+            <w:vAlign w:val="center"/>
+          </w:tcPr>
+          <w:p>
+            <w:pPr>
+              <w:widowControl/>
+              <w:spacing w:after="0" w:line="247" w:lineRule="auto"/>
+              <w:jc w:val="left"/>
+            </w:pPr>
+            <w:r>
+              <w:rPr>
+                <w:rFonts w:ascii="Calibri" w:hAnsi="Calibri" w:eastAsia="Calibri"/>
+                <w:color w:val="202124"/>
+                <w:sz w:val="18"/>
+              </w:rPr>
+              <w:t>Rejected; AUROC 0,5355, 2 corrections / 30 harms</w:t>
             </w:r>
           </w:p>
         </w:tc>
@@ -9110,6 +9263,178 @@
           </w:p>
         </w:tc>
       </w:tr>
+      <w:tr>
+        <w:trPr>
+          <w:cantSplit/>
+        </w:trPr>
+        <w:tc>
+          <w:tcPr>
+            <w:tcW w:type="dxa" w:w="2550"/>
+            <w:tcMar>
+              <w:top w:w="80" w:type="dxa"/>
+              <w:start w:w="120" w:type="dxa"/>
+              <w:bottom w:w="80" w:type="dxa"/>
+              <w:end w:w="120" w:type="dxa"/>
+            </w:tcMar>
+            <w:vAlign w:val="center"/>
+          </w:tcPr>
+          <w:p>
+            <w:pPr>
+              <w:widowControl/>
+              <w:spacing w:after="0" w:line="247" w:lineRule="auto"/>
+              <w:jc w:val="left"/>
+            </w:pPr>
+            <w:r>
+              <w:rPr>
+                <w:rFonts w:ascii="Calibri" w:hAnsi="Calibri" w:eastAsia="Calibri"/>
+                <w:color w:val="202124"/>
+                <w:sz w:val="18"/>
+              </w:rPr>
+              <w:t>CCR recovery chain</w:t>
+            </w:r>
+          </w:p>
+        </w:tc>
+        <w:tc>
+          <w:tcPr>
+            <w:tcW w:type="dxa" w:w="3810"/>
+            <w:tcMar>
+              <w:top w:w="80" w:type="dxa"/>
+              <w:start w:w="120" w:type="dxa"/>
+              <w:bottom w:w="80" w:type="dxa"/>
+              <w:end w:w="120" w:type="dxa"/>
+            </w:tcMar>
+            <w:vAlign w:val="center"/>
+          </w:tcPr>
+          <w:p>
+            <w:pPr>
+              <w:widowControl/>
+              <w:spacing w:after="0" w:line="247" w:lineRule="auto"/>
+              <w:jc w:val="left"/>
+            </w:pPr>
+            <w:r>
+              <w:rPr>
+                <w:rFonts w:ascii="Calibri" w:hAnsi="Calibri" w:eastAsia="Calibri"/>
+                <w:color w:val="202124"/>
+                <w:sz w:val="18"/>
+              </w:rPr>
+              <w:t>Authorization đầu bị consumed bởi lỗi deterministic-cuBLAS; correction chỉ đặt :4096:8 trước Torch import, đóng memmap và pin exact failure/authorization chain.</w:t>
+            </w:r>
+          </w:p>
+        </w:tc>
+        <w:tc>
+          <w:tcPr>
+            <w:tcW w:type="dxa" w:w="3000"/>
+            <w:tcMar>
+              <w:top w:w="80" w:type="dxa"/>
+              <w:start w:w="120" w:type="dxa"/>
+              <w:bottom w:w="80" w:type="dxa"/>
+              <w:end w:w="120" w:type="dxa"/>
+            </w:tcMar>
+            <w:vAlign w:val="center"/>
+          </w:tcPr>
+          <w:p>
+            <w:pPr>
+              <w:widowControl/>
+              <w:spacing w:after="0" w:line="247" w:lineRule="auto"/>
+              <w:jc w:val="left"/>
+            </w:pPr>
+            <w:r>
+              <w:rPr>
+                <w:rFonts w:ascii="Calibri" w:hAnsi="Calibri" w:eastAsia="Calibri"/>
+                <w:color w:val="202124"/>
+                <w:sz w:val="18"/>
+              </w:rPr>
+              <w:t>Ngăn reuse quyền chạy một lần và chứng minh lỗi harness không làm thay đổi equation, cohort, fold, seed, optimizer, threshold hay science gate.</w:t>
+            </w:r>
+          </w:p>
+        </w:tc>
+      </w:tr>
+      <w:tr>
+        <w:trPr>
+          <w:cantSplit/>
+        </w:trPr>
+        <w:tc>
+          <w:tcPr>
+            <w:tcW w:type="dxa" w:w="2550"/>
+            <w:tcMar>
+              <w:top w:w="80" w:type="dxa"/>
+              <w:start w:w="120" w:type="dxa"/>
+              <w:bottom w:w="80" w:type="dxa"/>
+              <w:end w:w="120" w:type="dxa"/>
+            </w:tcMar>
+            <w:vAlign w:val="center"/>
+          </w:tcPr>
+          <w:p>
+            <w:pPr>
+              <w:widowControl/>
+              <w:spacing w:after="0" w:line="247" w:lineRule="auto"/>
+              <w:jc w:val="left"/>
+            </w:pPr>
+            <w:r>
+              <w:rPr>
+                <w:rFonts w:ascii="Calibri" w:hAnsi="Calibri" w:eastAsia="Calibri"/>
+                <w:color w:val="202124"/>
+                <w:sz w:val="18"/>
+              </w:rPr>
+              <w:t>CCR formal/replay closure</w:t>
+            </w:r>
+          </w:p>
+        </w:tc>
+        <w:tc>
+          <w:tcPr>
+            <w:tcW w:type="dxa" w:w="3810"/>
+            <w:tcMar>
+              <w:top w:w="80" w:type="dxa"/>
+              <w:start w:w="120" w:type="dxa"/>
+              <w:bottom w:w="80" w:type="dxa"/>
+              <w:end w:w="120" w:type="dxa"/>
+            </w:tcMar>
+            <w:vAlign w:val="center"/>
+          </w:tcPr>
+          <w:p>
+            <w:pPr>
+              <w:widowControl/>
+              <w:spacing w:after="0" w:line="247" w:lineRule="auto"/>
+              <w:jc w:val="left"/>
+            </w:pPr>
+            <w:r>
+              <w:rPr>
+                <w:rFonts w:ascii="Calibri" w:hAnsi="Calibri" w:eastAsia="Calibri"/>
+                <w:color w:val="202124"/>
+                <w:sz w:val="18"/>
+              </w:rPr>
+              <w:t>Formal/replay 190,493/188,756 giây; 180 state và 46 output arrays exact; AUROC 0,535520, 2 corrections/30 harms, macro/class-1 F1 giảm.</w:t>
+            </w:r>
+          </w:p>
+        </w:tc>
+        <w:tc>
+          <w:tcPr>
+            <w:tcW w:type="dxa" w:w="3000"/>
+            <w:tcMar>
+              <w:top w:w="80" w:type="dxa"/>
+              <w:start w:w="120" w:type="dxa"/>
+              <w:bottom w:w="80" w:type="dxa"/>
+              <w:end w:w="120" w:type="dxa"/>
+            </w:tcMar>
+            <w:vAlign w:val="center"/>
+          </w:tcPr>
+          <w:p>
+            <w:pPr>
+              <w:widowControl/>
+              <w:spacing w:after="0" w:line="247" w:lineRule="auto"/>
+              <w:jc w:val="left"/>
+            </w:pPr>
+            <w:r>
+              <w:rPr>
+                <w:rFonts w:ascii="Calibri" w:hAnsi="Calibri" w:eastAsia="Calibri"/>
+                <w:color w:val="202124"/>
+                <w:sz w:val="18"/>
+              </w:rPr>
+              <w:t>Reproducibility và convergence pass không cứu utility fail; đóng exact neighborhood, không chạy XAI/downstream hoặc update lệnh full-train.</w:t>
+            </w:r>
+          </w:p>
+        </w:tc>
+      </w:tr>
     </w:tbl>
     <w:p>
       <w:pPr>
@@ -9483,6 +9808,60 @@
           <w:sz w:val="22"/>
         </w:rPr>
         <w:t>Bảo toàn materialization/replay evidence SHA e992c297...98c3ed và cache cục bộ exact; chỉ mở descriptor/four-role head fit sau một boundary riêng được commit/push.</w:t>
+      </w:r>
+    </w:p>
+    <w:p>
+      <w:pPr>
+        <w:widowControl/>
+        <w:numPr>
+          <w:ilvl w:val="0"/>
+          <w:numId w:val="14"/>
+        </w:numPr>
+        <w:spacing w:after="160" w:line="280" w:lineRule="auto"/>
+      </w:pPr>
+      <w:r>
+        <w:rPr>
+          <w:rFonts w:ascii="Calibri" w:hAnsi="Calibri" w:eastAsia="Calibri"/>
+          <w:color w:val="202124"/>
+          <w:sz w:val="22"/>
+        </w:rPr>
+        <w:t>Giữ correction/recovery commits 0218379...ef0b71/54c3e5c...748df và recovery authorization SHA b7cda19b...a36770; authorization fit ban đầu 3ecb6a82...d1697b5 đã consumed và không được reuse.</w:t>
+      </w:r>
+    </w:p>
+    <w:p>
+      <w:pPr>
+        <w:widowControl/>
+        <w:numPr>
+          <w:ilvl w:val="0"/>
+          <w:numId w:val="14"/>
+        </w:numPr>
+        <w:spacing w:after="160" w:line="280" w:lineRule="auto"/>
+      </w:pPr>
+      <w:r>
+        <w:rPr>
+          <w:rFonts w:ascii="Calibri" w:hAnsi="Calibri" w:eastAsia="Calibri"/>
+          <w:color w:val="202124"/>
+          <w:sz w:val="22"/>
+        </w:rPr>
+        <w:t>Bảo toàn CCR formal/replay tại runs/audit_cross_colour_ratio_surface_a0_20260725 cùng evidence/closure SHA 868f8e40...dcfa9/a3cc3e36...bb634. Clean gate fail nên cấm XAI, shifted conditions, deployment, integration, validation/test, full train và command update.</w:t>
+      </w:r>
+    </w:p>
+    <w:p>
+      <w:pPr>
+        <w:widowControl/>
+        <w:numPr>
+          <w:ilvl w:val="0"/>
+          <w:numId w:val="14"/>
+        </w:numPr>
+        <w:spacing w:after="160" w:line="280" w:lineRule="auto"/>
+      </w:pPr>
+      <w:r>
+        <w:rPr>
+          <w:rFonts w:ascii="Calibri" w:hAnsi="Calibri" w:eastAsia="Calibri"/>
+          <w:color w:val="202124"/>
+          <w:sz w:val="22"/>
+        </w:rPr>
+        <w:t>Đóng exact CCR và mọi sweep gần kề về sigma/epsilon/channel order/reliability/head/epoch/LR/seed/fold/loss/threshold/dephase. Successor phải equation-distinct, sample-conditional, pair-specific, scratch-only và có standard-op inference gate prospective.</w:t>
       </w:r>
     </w:p>
     <w:p>
@@ -11446,6 +11825,183 @@
                 <w:color w:val="202124"/>
                 <w:sz w:val="18"/>
               </w:rPr>
+              <w:t>docs/TRKH_5CLASS_CROSS_COLOUR_RATIO_SURFACE_A0_FIT_RECOVERY_AUTHORIZATION_20260725.json</w:t>
+            </w:r>
+          </w:p>
+        </w:tc>
+        <w:tc>
+          <w:tcPr>
+            <w:tcW w:type="dxa" w:w="5310"/>
+            <w:tcMar>
+              <w:top w:w="80" w:type="dxa"/>
+              <w:start w:w="120" w:type="dxa"/>
+              <w:bottom w:w="80" w:type="dxa"/>
+              <w:end w:w="120" w:type="dxa"/>
+            </w:tcMar>
+            <w:vAlign w:val="center"/>
+          </w:tcPr>
+          <w:p>
+            <w:pPr>
+              <w:widowControl/>
+              <w:spacing w:after="0" w:line="247" w:lineRule="auto"/>
+              <w:jc w:val="left"/>
+            </w:pPr>
+            <w:r>
+              <w:rPr>
+                <w:rFonts w:ascii="Calibri" w:hAnsi="Calibri" w:eastAsia="Calibri"/>
+                <w:color w:val="202124"/>
+                <w:sz w:val="18"/>
+              </w:rPr>
+              <w:t>One-use authorization pin correction commit, failure chain, exact fit implementation, resource limit và clean-only boundary.</w:t>
+            </w:r>
+          </w:p>
+        </w:tc>
+      </w:tr>
+      <w:tr>
+        <w:trPr>
+          <w:cantSplit/>
+        </w:trPr>
+        <w:tc>
+          <w:tcPr>
+            <w:tcW w:type="dxa" w:w="4050"/>
+            <w:tcMar>
+              <w:top w:w="80" w:type="dxa"/>
+              <w:start w:w="120" w:type="dxa"/>
+              <w:bottom w:w="80" w:type="dxa"/>
+              <w:end w:w="120" w:type="dxa"/>
+            </w:tcMar>
+            <w:vAlign w:val="center"/>
+          </w:tcPr>
+          <w:p>
+            <w:pPr>
+              <w:widowControl/>
+              <w:spacing w:after="0" w:line="247" w:lineRule="auto"/>
+              <w:jc w:val="left"/>
+            </w:pPr>
+            <w:r>
+              <w:rPr>
+                <w:rFonts w:ascii="Calibri" w:hAnsi="Calibri" w:eastAsia="Calibri"/>
+                <w:color w:val="202124"/>
+                <w:sz w:val="18"/>
+              </w:rPr>
+              <w:t>docs/TRKH_5CLASS_CROSS_COLOUR_RATIO_SURFACE_A0_FIT_EVIDENCE_20260725.json</w:t>
+            </w:r>
+          </w:p>
+        </w:tc>
+        <w:tc>
+          <w:tcPr>
+            <w:tcW w:type="dxa" w:w="5310"/>
+            <w:tcMar>
+              <w:top w:w="80" w:type="dxa"/>
+              <w:start w:w="120" w:type="dxa"/>
+              <w:bottom w:w="80" w:type="dxa"/>
+              <w:end w:w="120" w:type="dxa"/>
+            </w:tcMar>
+            <w:vAlign w:val="center"/>
+          </w:tcPr>
+          <w:p>
+            <w:pPr>
+              <w:widowControl/>
+              <w:spacing w:after="0" w:line="247" w:lineRule="auto"/>
+              <w:jc w:val="left"/>
+            </w:pPr>
+            <w:r>
+              <w:rPr>
+                <w:rFonts w:ascii="Calibri" w:hAnsi="Calibri" w:eastAsia="Calibri"/>
+                <w:color w:val="202124"/>
+                <w:sz w:val="18"/>
+              </w:rPr>
+              <w:t>Machine-readable formal/replay metrics, training, controls, resource, ledger, immutable hashes và downstream denial.</w:t>
+            </w:r>
+          </w:p>
+        </w:tc>
+      </w:tr>
+      <w:tr>
+        <w:trPr>
+          <w:cantSplit/>
+        </w:trPr>
+        <w:tc>
+          <w:tcPr>
+            <w:tcW w:type="dxa" w:w="4050"/>
+            <w:tcMar>
+              <w:top w:w="80" w:type="dxa"/>
+              <w:start w:w="120" w:type="dxa"/>
+              <w:bottom w:w="80" w:type="dxa"/>
+              <w:end w:w="120" w:type="dxa"/>
+            </w:tcMar>
+            <w:vAlign w:val="center"/>
+          </w:tcPr>
+          <w:p>
+            <w:pPr>
+              <w:widowControl/>
+              <w:spacing w:after="0" w:line="247" w:lineRule="auto"/>
+              <w:jc w:val="left"/>
+            </w:pPr>
+            <w:r>
+              <w:rPr>
+                <w:rFonts w:ascii="Calibri" w:hAnsi="Calibri" w:eastAsia="Calibri"/>
+                <w:color w:val="202124"/>
+                <w:sz w:val="18"/>
+              </w:rPr>
+              <w:t>docs/TRKH_5CLASS_CROSS_COLOUR_RATIO_SURFACE_A0_FIT_CLOSURE_20260725.md</w:t>
+            </w:r>
+          </w:p>
+        </w:tc>
+        <w:tc>
+          <w:tcPr>
+            <w:tcW w:type="dxa" w:w="5310"/>
+            <w:tcMar>
+              <w:top w:w="80" w:type="dxa"/>
+              <w:start w:w="120" w:type="dxa"/>
+              <w:bottom w:w="80" w:type="dxa"/>
+              <w:end w:w="120" w:type="dxa"/>
+            </w:tcMar>
+            <w:vAlign w:val="center"/>
+          </w:tcPr>
+          <w:p>
+            <w:pPr>
+              <w:widowControl/>
+              <w:spacing w:after="0" w:line="247" w:lineRule="auto"/>
+              <w:jc w:val="left"/>
+            </w:pPr>
+            <w:r>
+              <w:rPr>
+                <w:rFonts w:ascii="Calibri" w:hAnsi="Calibri" w:eastAsia="Calibri"/>
+                <w:color w:val="202124"/>
+                <w:sz w:val="18"/>
+              </w:rPr>
+              <w:t>Human closure, scientific interpretation, no-XAI reason, no-repeat boundary và successor admission rule.</w:t>
+            </w:r>
+          </w:p>
+        </w:tc>
+      </w:tr>
+      <w:tr>
+        <w:trPr>
+          <w:cantSplit/>
+        </w:trPr>
+        <w:tc>
+          <w:tcPr>
+            <w:tcW w:type="dxa" w:w="4050"/>
+            <w:tcMar>
+              <w:top w:w="80" w:type="dxa"/>
+              <w:start w:w="120" w:type="dxa"/>
+              <w:bottom w:w="80" w:type="dxa"/>
+              <w:end w:w="120" w:type="dxa"/>
+            </w:tcMar>
+            <w:vAlign w:val="center"/>
+          </w:tcPr>
+          <w:p>
+            <w:pPr>
+              <w:widowControl/>
+              <w:spacing w:after="0" w:line="247" w:lineRule="auto"/>
+              <w:jc w:val="left"/>
+            </w:pPr>
+            <w:r>
+              <w:rPr>
+                <w:rFonts w:ascii="Calibri" w:hAnsi="Calibri" w:eastAsia="Calibri"/>
+                <w:color w:val="202124"/>
+                <w:sz w:val="18"/>
+              </w:rPr>
               <w:t>docs/TRKH_5CLASS_CROSS_COLOUR_RATIO_SURFACE_A0_MATERIALIZER_FAILURE_20260725.json</w:t>
             </w:r>
           </w:p>
@@ -11612,7 +12168,7 @@
           <w:color w:val="202124"/>
           <w:sz w:val="22"/>
         </w:rPr>
-        <w:t>Revision 1-3 dựng báo cáo tái lập, full-train/JPEG-DL và synthetic policy. Revision 4-10 đóng SaSPA, LP-A3, NSA, RN-LISDA và Bal-BCE bằng fidelity, causal control, replay và TP/FP gates. Revision 11-14 khóa CAP trước metric, sửa audit-only eval-LSTM, rồi hoàn tất same-lock formal/replay/manual review; CAP đóng negative-but-reusable và retention pass tại SHA 99d1835a...04a636. Revision 15 screen no-run sáu họ successor và cô lập regression OOXML hyperlink. Revision 16-18 khóa CCR train-only, same-tensor erratum và equation engine/head scratch 3.004 tham số. Revision 19-22 hoàn tất direct materializer, Windows path gate, one-ULP recovery và exact cache evidence e992c297...98c3ed. Revision 23 push four-role fit runner tại 0289a94. Revision 24 ghi authorization 3ecb6a82...d1697b5 đã consumed bởi deterministic-cuBLAS harness failure trước candidate metric; correction :4096:8, explicit memmap close và exact recovery-chain verifier phải được commit/push rồi cấp recovery authorization riêng. Chưa có candidate state, score, threshold, action, metric, validation/test, production edit hoặc command update.</w:t>
+        <w:t>Revision 1-3 dựng báo cáo tái lập, full-train/JPEG-DL và synthetic policy. Revision 4-10 đóng SaSPA, LP-A3, NSA, RN-LISDA và Bal-BCE bằng fidelity, causal control, replay và TP/FP gates. Revision 11-14 khóa CAP trước metric, sửa audit-only eval-LSTM, rồi hoàn tất same-lock formal/replay/manual review; CAP đóng negative-but-reusable và retention pass tại SHA 99d1835a...04a636. Revision 15 screen no-run sáu họ successor và cô lập regression OOXML hyperlink. Revision 16-18 khóa CCR train-only, same-tensor erratum và equation engine/head scratch 3.004 tham số. Revision 19-22 hoàn tất direct materializer, Windows path gate, one-ULP recovery và exact cache evidence e992c297...98c3ed. Revision 23 push four-role fit runner tại 0289a94. Revision 24 ghi consumed authorization và correction harness fail-closed. Revision 25 hoàn tất one-use recovery formal/replay exact nhưng clean gate fail: AUROC 0,535520, 2 corrections/30 harms, macro/class-1 F1 giảm; evidence/closure SHA 868f8e40...dcfa9/a3cc3e36...bb634. CCR đóng negative-but-reusable; không XAI/downstream, validation/test, production edit hoặc command update.</w:t>
       </w:r>
     </w:p>
     <w:p>

</xml_diff>